<commit_message>
modified:   .gitignore 	modified:   admin.html 	modified:   admin.js 	modified:   app.js 	modified:   calculator.html 	modified:   data/market-data.json 	modified:   data/offer-project-numbers.json 	modified:   data/offer-revisions.json 	modified:   data/offer-sequence.json 	modified:   data/project-archive.json 	modified:   index.html 	modified:   server/mail.js 	modified:   server/templates/tilbud/tilbud-stromskinner-template.docx 	modified:   styles.css
</commit_message>
<xml_diff>
--- a/server/templates/tilbud/tilbud-stromskinner-template.docx
+++ b/server/templates/tilbud/tilbud-stromskinner-template.docx
@@ -8,6 +8,14 @@
         <w:tblpPr w:leftFromText="141" w:rightFromText="141" w:vertAnchor="text" w:horzAnchor="margin" w:tblpXSpec="center" w:tblpYSpec="top"/>
         <w:tblW w:w="10729" w:type="dxa"/>
         <w:jc w:val="center"/>
+        <w:tblBorders>
+          <w:top w:val="none" w:sz="0" w:space="0" w:color="auto"/>
+          <w:left w:val="none" w:sz="0" w:space="0" w:color="auto"/>
+          <w:bottom w:val="none" w:sz="0" w:space="0" w:color="auto"/>
+          <w:right w:val="none" w:sz="0" w:space="0" w:color="auto"/>
+          <w:insideH w:val="none" w:sz="0" w:space="0" w:color="auto"/>
+          <w:insideV w:val="none" w:sz="0" w:space="0" w:color="auto"/>
+        </w:tblBorders>
         <w:tblLayout w:type="fixed"/>
         <w:tblLook w:val="0000" w:firstRow="0" w:lastRow="0" w:firstColumn="0" w:lastColumn="0" w:noHBand="0" w:noVBand="0"/>
       </w:tblPr>
@@ -46,6 +54,7 @@
         <w:tc>
           <w:tcPr>
             <w:tcW w:w="3576" w:type="dxa"/>
+            <w:vAlign w:val="bottom"/>
           </w:tcPr>
           <w:p>
             <w:pPr>
@@ -67,6 +76,7 @@
         <w:tc>
           <w:tcPr>
             <w:tcW w:w="3577" w:type="dxa"/>
+            <w:vAlign w:val="bottom"/>
           </w:tcPr>
           <w:p>
             <w:pPr>
@@ -170,25 +180,7 @@
                 <w:bCs/>
                 <w:sz w:val="20"/>
               </w:rPr>
-              <w:t>{{</w:t>
-            </w:r>
-            <w:proofErr w:type="spellStart"/>
-            <w:r>
-              <w:rPr>
-                <w:rFonts w:cs="Arial"/>
-                <w:bCs/>
-                <w:sz w:val="20"/>
-              </w:rPr>
-              <w:t>tilbud_nr</w:t>
-            </w:r>
-            <w:proofErr w:type="spellEnd"/>
-            <w:r>
-              <w:rPr>
-                <w:rFonts w:cs="Arial"/>
-                <w:bCs/>
-                <w:sz w:val="20"/>
-              </w:rPr>
-              <w:t>}}</w:t>
+              <w:t>{{tilbud_nr}}</w:t>
             </w:r>
           </w:p>
         </w:tc>
@@ -221,11 +213,21 @@
               </w:rPr>
               <w:t xml:space="preserve">Tlf.: </w:t>
             </w:r>
+            <w:r>
+              <w:rPr>
+                <w:rFonts w:ascii="Verdana" w:hAnsi="Verdana"/>
+                <w:sz w:val="20"/>
+                <w:szCs w:val="20"/>
+                <w:lang w:val="sv-SE"/>
+              </w:rPr>
+              <w:t>{{telefon_kontaktperson}}</w:t>
+            </w:r>
           </w:p>
         </w:tc>
         <w:tc>
           <w:tcPr>
             <w:tcW w:w="3576" w:type="dxa"/>
+            <w:vAlign w:val="bottom"/>
           </w:tcPr>
           <w:p>
             <w:pPr>
@@ -247,6 +249,7 @@
         <w:tc>
           <w:tcPr>
             <w:tcW w:w="3577" w:type="dxa"/>
+            <w:vAlign w:val="bottom"/>
           </w:tcPr>
           <w:p>
             <w:pPr>
@@ -330,6 +333,7 @@
         <w:tc>
           <w:tcPr>
             <w:tcW w:w="3576" w:type="dxa"/>
+            <w:vAlign w:val="bottom"/>
           </w:tcPr>
           <w:p>
             <w:pPr>
@@ -352,6 +356,7 @@
         <w:tc>
           <w:tcPr>
             <w:tcW w:w="3576" w:type="dxa"/>
+            <w:vAlign w:val="bottom"/>
           </w:tcPr>
           <w:p>
             <w:pPr>
@@ -373,6 +378,7 @@
         <w:tc>
           <w:tcPr>
             <w:tcW w:w="3577" w:type="dxa"/>
+            <w:vAlign w:val="bottom"/>
           </w:tcPr>
           <w:p>
             <w:pPr>
@@ -412,6 +418,15 @@
                 <w:szCs w:val="20"/>
               </w:rPr>
             </w:pPr>
+            <w:r>
+              <w:rPr>
+                <w:rFonts w:ascii="Verdana" w:hAnsi="Verdana" w:cs="Calibri"/>
+                <w:color w:val="000000"/>
+                <w:sz w:val="20"/>
+                <w:szCs w:val="20"/>
+              </w:rPr>
+              <w:t>{{kunde_adresse}}</w:t>
+            </w:r>
           </w:p>
         </w:tc>
         <w:tc>
@@ -436,7 +451,7 @@
                 <w:szCs w:val="22"/>
                 <w:lang w:val="nb-NO"/>
               </w:rPr>
-              <w:t>Hans-Jakob Risnes</w:t>
+              <w:t>{{bruker_navn}}</w:t>
             </w:r>
           </w:p>
         </w:tc>
@@ -458,23 +473,7 @@
                 <w:rFonts w:cs="Arial"/>
                 <w:sz w:val="20"/>
               </w:rPr>
-              <w:t>{{</w:t>
-            </w:r>
-            <w:proofErr w:type="spellStart"/>
-            <w:r>
-              <w:rPr>
-                <w:rFonts w:cs="Arial"/>
-                <w:sz w:val="20"/>
-              </w:rPr>
-              <w:t>revisjon</w:t>
-            </w:r>
-            <w:proofErr w:type="spellEnd"/>
-            <w:r>
-              <w:rPr>
-                <w:rFonts w:cs="Arial"/>
-                <w:sz w:val="20"/>
-              </w:rPr>
-              <w:t>}}</w:t>
+              <w:t>{{revisjon}}</w:t>
             </w:r>
           </w:p>
         </w:tc>
@@ -499,6 +498,15 @@
                 <w:szCs w:val="20"/>
               </w:rPr>
             </w:pPr>
+            <w:r>
+              <w:rPr>
+                <w:rFonts w:ascii="Verdana" w:hAnsi="Verdana" w:cs="Calibri"/>
+                <w:color w:val="000000"/>
+                <w:sz w:val="20"/>
+                <w:szCs w:val="20"/>
+              </w:rPr>
+              <w:t>{{postnummer_sted}}</w:t>
+            </w:r>
           </w:p>
         </w:tc>
         <w:tc>
@@ -523,7 +531,7 @@
                 <w:szCs w:val="22"/>
                 <w:lang w:val="nb-NO"/>
               </w:rPr>
-              <w:t>Hans.jakob.risnes@busbar.no</w:t>
+              <w:t>{{bruker_epost}}</w:t>
             </w:r>
           </w:p>
         </w:tc>
@@ -549,7 +557,16 @@
                 <w:szCs w:val="22"/>
                 <w:lang w:val="nb-NO"/>
               </w:rPr>
-              <w:t>Tlf.: 95 77 37 11</w:t>
+              <w:t xml:space="preserve">Tlf.: </w:t>
+            </w:r>
+            <w:r>
+              <w:rPr>
+                <w:rFonts w:cs="Arial"/>
+                <w:sz w:val="20"/>
+                <w:szCs w:val="22"/>
+                <w:lang w:val="nb-NO"/>
+              </w:rPr>
+              <w:t>{{bruker_telefon}}</w:t>
             </w:r>
           </w:p>
         </w:tc>
@@ -756,25 +773,7 @@
           <w:sz w:val="20"/>
           <w:szCs w:val="20"/>
         </w:rPr>
-        <w:t>{{</w:t>
-      </w:r>
-      <w:proofErr w:type="spellStart"/>
-      <w:r>
-        <w:rPr>
-          <w:rFonts w:ascii="Verdana" w:hAnsi="Verdana" w:cs="Arial"/>
-          <w:sz w:val="20"/>
-          <w:szCs w:val="20"/>
-        </w:rPr>
-        <w:t>lss</w:t>
-      </w:r>
-      <w:proofErr w:type="spellEnd"/>
-      <w:r>
-        <w:rPr>
-          <w:rFonts w:ascii="Verdana" w:hAnsi="Verdana" w:cs="Arial"/>
-          <w:sz w:val="20"/>
-          <w:szCs w:val="20"/>
-        </w:rPr>
-        <w:t>}}</w:t>
+        <w:t>{{lss}}</w:t>
       </w:r>
     </w:p>
     <w:tbl>
@@ -811,25 +810,7 @@
                 <w:sz w:val="20"/>
                 <w:szCs w:val="20"/>
               </w:rPr>
-              <w:t>Strømskinne – {{</w:t>
-            </w:r>
-            <w:proofErr w:type="spellStart"/>
-            <w:r>
-              <w:rPr>
-                <w:rFonts w:ascii="Verdana" w:hAnsi="Verdana" w:cs="Arial"/>
-                <w:sz w:val="20"/>
-                <w:szCs w:val="20"/>
-              </w:rPr>
-              <w:t>lnr</w:t>
-            </w:r>
-            <w:proofErr w:type="spellEnd"/>
-            <w:r>
-              <w:rPr>
-                <w:rFonts w:ascii="Verdana" w:hAnsi="Verdana" w:cs="Arial"/>
-                <w:sz w:val="20"/>
-                <w:szCs w:val="20"/>
-              </w:rPr>
-              <w:t>}}</w:t>
+              <w:t>Strømskinne – {{lnr}}</w:t>
             </w:r>
           </w:p>
           <w:p>
@@ -849,7 +830,6 @@
               </w:rPr>
               <w:t>{{</w:t>
             </w:r>
-            <w:proofErr w:type="spellStart"/>
             <w:r>
               <w:rPr>
                 <w:rFonts w:ascii="Verdana" w:hAnsi="Verdana" w:cs="Arial"/>
@@ -858,7 +838,6 @@
               </w:rPr>
               <w:t>amp</w:t>
             </w:r>
-            <w:proofErr w:type="spellEnd"/>
             <w:r>
               <w:rPr>
                 <w:rFonts w:ascii="Verdana" w:hAnsi="Verdana" w:cs="Arial"/>
@@ -897,7 +876,15 @@
                 <w:sz w:val="20"/>
                 <w:szCs w:val="20"/>
               </w:rPr>
-              <w:t xml:space="preserve"> {{led}} – IP55</w:t>
+              <w:t xml:space="preserve"> {{led}} – </w:t>
+            </w:r>
+            <w:r>
+              <w:rPr>
+                <w:rFonts w:ascii="Verdana" w:hAnsi="Verdana" w:cs="Arial"/>
+                <w:sz w:val="20"/>
+                <w:szCs w:val="20"/>
+              </w:rPr>
+              <w:t>{{ip_grad}}</w:t>
             </w:r>
           </w:p>
         </w:tc>
@@ -930,25 +917,7 @@
                 <w:sz w:val="20"/>
                 <w:szCs w:val="20"/>
               </w:rPr>
-              <w:t>{{</w:t>
-            </w:r>
-            <w:proofErr w:type="spellStart"/>
-            <w:r>
-              <w:rPr>
-                <w:rFonts w:ascii="Verdana" w:hAnsi="Verdana" w:cs="Arial"/>
-                <w:sz w:val="20"/>
-                <w:szCs w:val="20"/>
-              </w:rPr>
-              <w:t>total_ex_montasje_nok</w:t>
-            </w:r>
-            <w:proofErr w:type="spellEnd"/>
-            <w:r>
-              <w:rPr>
-                <w:rFonts w:ascii="Verdana" w:hAnsi="Verdana" w:cs="Arial"/>
-                <w:sz w:val="20"/>
-                <w:szCs w:val="20"/>
-              </w:rPr>
-              <w:t>}}</w:t>
+              <w:t>{{total_ex_montasje_nok}}</w:t>
             </w:r>
           </w:p>
         </w:tc>
@@ -969,25 +938,23 @@
           <w:sz w:val="20"/>
           <w:szCs w:val="20"/>
         </w:rPr>
-        <w:t>{{</w:t>
-      </w:r>
-      <w:proofErr w:type="spellStart"/>
+        <w:t>{{mtr}}</w:t>
+      </w:r>
       <w:r>
         <w:rPr>
           <w:rFonts w:ascii="Verdana" w:hAnsi="Verdana" w:cs="Arial"/>
           <w:sz w:val="20"/>
           <w:szCs w:val="20"/>
         </w:rPr>
-        <w:t>mtr</w:t>
-      </w:r>
-      <w:proofErr w:type="spellEnd"/>
+        <w:t xml:space="preserve"> m</w:t>
+      </w:r>
       <w:r>
         <w:rPr>
           <w:rFonts w:ascii="Verdana" w:hAnsi="Verdana" w:cs="Arial"/>
           <w:sz w:val="20"/>
           <w:szCs w:val="20"/>
         </w:rPr>
-        <w:t>}}</w:t>
+        <w:t>eter</w:t>
       </w:r>
       <w:r>
         <w:rPr>
@@ -995,23 +962,58 @@
           <w:sz w:val="20"/>
           <w:szCs w:val="20"/>
         </w:rPr>
-        <w:t xml:space="preserve"> m</w:t>
-      </w:r>
-      <w:r>
+        <w:t xml:space="preserve"> total lengde</w:t>
+      </w:r>
+    </w:p>
+    <w:p>
+      <w:pPr>
+        <w:spacing w:after="0" w:line="240" w:lineRule="auto"/>
+        <w:ind w:left="720"/>
         <w:rPr>
           <w:rFonts w:ascii="Verdana" w:hAnsi="Verdana" w:cs="Arial"/>
           <w:sz w:val="20"/>
           <w:szCs w:val="20"/>
         </w:rPr>
-        <w:t>eter</w:t>
-      </w:r>
+      </w:pPr>
       <w:r>
         <w:rPr>
           <w:rFonts w:ascii="Verdana" w:hAnsi="Verdana" w:cs="Arial"/>
           <w:sz w:val="20"/>
           <w:szCs w:val="20"/>
         </w:rPr>
-        <w:t xml:space="preserve"> total lengde</w:t>
+        <w:t>{{vvk}}</w:t>
+      </w:r>
+      <w:r>
+        <w:rPr>
+          <w:rFonts w:ascii="Verdana" w:hAnsi="Verdana" w:cs="Arial"/>
+          <w:sz w:val="20"/>
+          <w:szCs w:val="20"/>
+        </w:rPr>
+        <w:t xml:space="preserve"> stk. </w:t>
+      </w:r>
+      <w:r>
+        <w:rPr>
+          <w:rFonts w:ascii="Verdana" w:hAnsi="Verdana" w:cs="Arial"/>
+          <w:sz w:val="20"/>
+          <w:szCs w:val="20"/>
+        </w:rPr>
+        <w:t>Vertikal v</w:t>
+      </w:r>
+      <w:r>
+        <w:rPr>
+          <w:rFonts w:ascii="Verdana" w:hAnsi="Verdana" w:cs="Arial"/>
+          <w:sz w:val="20"/>
+          <w:szCs w:val="20"/>
+        </w:rPr>
+        <w:t>in</w:t>
+      </w:r>
+      <w:r>
+        <w:rPr>
+          <w:rFonts w:ascii="Verdana" w:hAnsi="Verdana" w:cs="Arial"/>
+          <w:sz w:val="20"/>
+          <w:szCs w:val="20"/>
+        </w:rPr>
+        <w:t>kel</w:t>
       </w:r>
     </w:p>
     <w:p>
@@ -1030,33 +1032,34 @@
           <w:sz w:val="20"/>
           <w:szCs w:val="20"/>
         </w:rPr>
-        <w:t>{{</w:t>
-      </w:r>
-      <w:proofErr w:type="spellStart"/>
+        <w:t>{{hvk}}</w:t>
+      </w:r>
       <w:r>
         <w:rPr>
           <w:rFonts w:ascii="Verdana" w:hAnsi="Verdana" w:cs="Arial"/>
           <w:sz w:val="20"/>
           <w:szCs w:val="20"/>
         </w:rPr>
-        <w:t>vvk</w:t>
-      </w:r>
-      <w:proofErr w:type="spellEnd"/>
-      <w:r>
+        <w:t xml:space="preserve"> stk. Horisontal vinkel </w:t>
+      </w:r>
+    </w:p>
+    <w:p>
+      <w:pPr>
+        <w:spacing w:after="0" w:line="240" w:lineRule="auto"/>
+        <w:ind w:left="720"/>
         <w:rPr>
           <w:rFonts w:ascii="Verdana" w:hAnsi="Verdana" w:cs="Arial"/>
           <w:sz w:val="20"/>
           <w:szCs w:val="20"/>
         </w:rPr>
-        <w:t>}}</w:t>
-      </w:r>
+      </w:pPr>
       <w:r>
         <w:rPr>
           <w:rFonts w:ascii="Verdana" w:hAnsi="Verdana" w:cs="Arial"/>
           <w:sz w:val="20"/>
           <w:szCs w:val="20"/>
         </w:rPr>
-        <w:t xml:space="preserve"> stk. </w:t>
+        <w:t xml:space="preserve">1 </w:t>
       </w:r>
       <w:r>
         <w:rPr>
@@ -1064,7 +1067,7 @@
           <w:sz w:val="20"/>
           <w:szCs w:val="20"/>
         </w:rPr>
-        <w:t>Vertikal v</w:t>
+        <w:t xml:space="preserve">stk. </w:t>
       </w:r>
       <w:r>
         <w:rPr>
@@ -1072,15 +1075,42 @@
           <w:sz w:val="20"/>
           <w:szCs w:val="20"/>
         </w:rPr>
-        <w:t>in</w:t>
-      </w:r>
-      <w:r>
+        <w:t>{{ste}}</w:t>
+      </w:r>
+    </w:p>
+    <w:p>
+      <w:pPr>
+        <w:spacing w:after="0" w:line="240" w:lineRule="auto"/>
+        <w:ind w:left="720"/>
         <w:rPr>
           <w:rFonts w:ascii="Verdana" w:hAnsi="Verdana" w:cs="Arial"/>
           <w:sz w:val="20"/>
           <w:szCs w:val="20"/>
         </w:rPr>
-        <w:t>kel</w:t>
+      </w:pPr>
+      <w:r>
+        <w:rPr>
+          <w:rFonts w:ascii="Verdana" w:hAnsi="Verdana" w:cs="Arial"/>
+          <w:sz w:val="20"/>
+          <w:szCs w:val="20"/>
+        </w:rPr>
+        <w:t xml:space="preserve">1 </w:t>
+      </w:r>
+      <w:r>
+        <w:rPr>
+          <w:rFonts w:ascii="Verdana" w:hAnsi="Verdana" w:cs="Arial"/>
+          <w:sz w:val="20"/>
+          <w:szCs w:val="20"/>
+        </w:rPr>
+        <w:t xml:space="preserve">stk. </w:t>
+      </w:r>
+      <w:r>
+        <w:rPr>
+          <w:rFonts w:ascii="Verdana" w:hAnsi="Verdana" w:cs="Arial"/>
+          <w:sz w:val="20"/>
+          <w:szCs w:val="20"/>
+        </w:rPr>
+        <w:t>{{sle}}</w:t>
       </w:r>
     </w:p>
     <w:p>
@@ -1099,145 +1129,32 @@
           <w:sz w:val="20"/>
           <w:szCs w:val="20"/>
         </w:rPr>
-        <w:t>{{</w:t>
-      </w:r>
-      <w:proofErr w:type="spellStart"/>
-      <w:r>
+        <w:t>{{ekspansjonselement}}</w:t>
+      </w:r>
+    </w:p>
+    <w:p>
+      <w:pPr>
+        <w:spacing w:after="0" w:line="240" w:lineRule="auto"/>
+        <w:ind w:left="720"/>
         <w:rPr>
           <w:rFonts w:ascii="Verdana" w:hAnsi="Verdana" w:cs="Arial"/>
           <w:sz w:val="20"/>
           <w:szCs w:val="20"/>
         </w:rPr>
-        <w:t>hvk</w:t>
-      </w:r>
-      <w:proofErr w:type="spellEnd"/>
+      </w:pPr>
       <w:r>
         <w:rPr>
           <w:rFonts w:ascii="Verdana" w:hAnsi="Verdana" w:cs="Arial"/>
           <w:sz w:val="20"/>
           <w:szCs w:val="20"/>
         </w:rPr>
-        <w:t>}}</w:t>
-      </w:r>
-      <w:r>
-        <w:rPr>
-          <w:rFonts w:ascii="Verdana" w:hAnsi="Verdana" w:cs="Arial"/>
-          <w:sz w:val="20"/>
-          <w:szCs w:val="20"/>
-        </w:rPr>
-        <w:t xml:space="preserve"> stk. Horisontal vinkel </w:t>
+        <w:t>{{bre}}</w:t>
       </w:r>
     </w:p>
     <w:p>
       <w:pPr>
         <w:spacing w:after="0" w:line="240" w:lineRule="auto"/>
         <w:ind w:left="720"/>
-        <w:rPr>
-          <w:rFonts w:ascii="Verdana" w:hAnsi="Verdana" w:cs="Arial"/>
-          <w:sz w:val="20"/>
-          <w:szCs w:val="20"/>
-        </w:rPr>
-      </w:pPr>
-      <w:r>
-        <w:rPr>
-          <w:rFonts w:ascii="Verdana" w:hAnsi="Verdana" w:cs="Arial"/>
-          <w:sz w:val="20"/>
-          <w:szCs w:val="20"/>
-        </w:rPr>
-        <w:t xml:space="preserve">1 </w:t>
-      </w:r>
-      <w:r>
-        <w:rPr>
-          <w:rFonts w:ascii="Verdana" w:hAnsi="Verdana" w:cs="Arial"/>
-          <w:sz w:val="20"/>
-          <w:szCs w:val="20"/>
-        </w:rPr>
-        <w:t xml:space="preserve">stk. </w:t>
-      </w:r>
-      <w:r>
-        <w:rPr>
-          <w:rFonts w:ascii="Verdana" w:hAnsi="Verdana" w:cs="Arial"/>
-          <w:sz w:val="20"/>
-          <w:szCs w:val="20"/>
-        </w:rPr>
-        <w:t>{{ste}}</w:t>
-      </w:r>
-    </w:p>
-    <w:p>
-      <w:pPr>
-        <w:spacing w:after="0" w:line="240" w:lineRule="auto"/>
-        <w:ind w:left="720"/>
-        <w:rPr>
-          <w:rFonts w:ascii="Verdana" w:hAnsi="Verdana" w:cs="Arial"/>
-          <w:sz w:val="20"/>
-          <w:szCs w:val="20"/>
-        </w:rPr>
-      </w:pPr>
-      <w:r>
-        <w:rPr>
-          <w:rFonts w:ascii="Verdana" w:hAnsi="Verdana" w:cs="Arial"/>
-          <w:sz w:val="20"/>
-          <w:szCs w:val="20"/>
-        </w:rPr>
-        <w:t xml:space="preserve">1 </w:t>
-      </w:r>
-      <w:r>
-        <w:rPr>
-          <w:rFonts w:ascii="Verdana" w:hAnsi="Verdana" w:cs="Arial"/>
-          <w:sz w:val="20"/>
-          <w:szCs w:val="20"/>
-        </w:rPr>
-        <w:t xml:space="preserve">stk. </w:t>
-      </w:r>
-      <w:r>
-        <w:rPr>
-          <w:rFonts w:ascii="Verdana" w:hAnsi="Verdana" w:cs="Arial"/>
-          <w:sz w:val="20"/>
-          <w:szCs w:val="20"/>
-        </w:rPr>
-        <w:t>{{</w:t>
-      </w:r>
-      <w:proofErr w:type="spellStart"/>
-      <w:r>
-        <w:rPr>
-          <w:rFonts w:ascii="Verdana" w:hAnsi="Verdana" w:cs="Arial"/>
-          <w:sz w:val="20"/>
-          <w:szCs w:val="20"/>
-        </w:rPr>
-        <w:t>sle</w:t>
-      </w:r>
-      <w:proofErr w:type="spellEnd"/>
-      <w:r>
-        <w:rPr>
-          <w:rFonts w:ascii="Verdana" w:hAnsi="Verdana" w:cs="Arial"/>
-          <w:sz w:val="20"/>
-          <w:szCs w:val="20"/>
-        </w:rPr>
-        <w:t>}}</w:t>
-      </w:r>
-    </w:p>
-    <w:p>
-      <w:pPr>
-        <w:spacing w:after="0" w:line="240" w:lineRule="auto"/>
-        <w:ind w:left="720"/>
-        <w:rPr>
-          <w:rFonts w:ascii="Verdana" w:hAnsi="Verdana" w:cs="Arial"/>
-          <w:sz w:val="20"/>
-          <w:szCs w:val="20"/>
-        </w:rPr>
-      </w:pPr>
-      <w:r>
-        <w:rPr>
-          <w:rFonts w:ascii="Verdana" w:hAnsi="Verdana" w:cs="Arial"/>
-          <w:sz w:val="20"/>
-          <w:szCs w:val="20"/>
-        </w:rPr>
-        <w:t>{{bre}}</w:t>
-      </w:r>
-    </w:p>
-    <w:p>
-      <w:pPr>
-        <w:spacing w:after="0" w:line="240" w:lineRule="auto"/>
         <w:rPr>
           <w:rFonts w:ascii="Verdana" w:hAnsi="Verdana" w:cs="Arial"/>
           <w:sz w:val="20"/>
@@ -1278,25 +1195,7 @@
                 <w:sz w:val="20"/>
                 <w:szCs w:val="20"/>
               </w:rPr>
-              <w:t>{{</w:t>
-            </w:r>
-            <w:proofErr w:type="spellStart"/>
-            <w:r>
-              <w:rPr>
-                <w:rFonts w:ascii="Verdana" w:hAnsi="Verdana" w:cs="Arial"/>
-                <w:sz w:val="20"/>
-                <w:szCs w:val="20"/>
-              </w:rPr>
-              <w:t>mtl</w:t>
-            </w:r>
-            <w:proofErr w:type="spellEnd"/>
-            <w:r>
-              <w:rPr>
-                <w:rFonts w:ascii="Verdana" w:hAnsi="Verdana" w:cs="Arial"/>
-                <w:sz w:val="20"/>
-                <w:szCs w:val="20"/>
-              </w:rPr>
-              <w:t>}}</w:t>
+              <w:t>{{avb_tekst}}</w:t>
             </w:r>
           </w:p>
         </w:tc>
@@ -1322,25 +1221,7 @@
                 <w:sz w:val="20"/>
                 <w:szCs w:val="20"/>
               </w:rPr>
-              <w:t>{{</w:t>
-            </w:r>
-            <w:proofErr w:type="spellStart"/>
-            <w:r>
-              <w:rPr>
-                <w:rFonts w:ascii="Verdana" w:hAnsi="Verdana" w:cs="Arial"/>
-                <w:sz w:val="20"/>
-                <w:szCs w:val="20"/>
-              </w:rPr>
-              <w:t>mtp</w:t>
-            </w:r>
-            <w:proofErr w:type="spellEnd"/>
-            <w:r>
-              <w:rPr>
-                <w:rFonts w:ascii="Verdana" w:hAnsi="Verdana" w:cs="Arial"/>
-                <w:sz w:val="20"/>
-                <w:szCs w:val="20"/>
-              </w:rPr>
-              <w:t>}}</w:t>
+              <w:t>{{avb_pris}}</w:t>
             </w:r>
           </w:p>
         </w:tc>
@@ -1348,47 +1229,19 @@
     </w:tbl>
     <w:p>
       <w:pPr>
-        <w:pStyle w:val="Listeavsnitt"/>
+        <w:spacing w:after="0" w:line="240" w:lineRule="auto"/>
         <w:rPr>
           <w:rFonts w:ascii="Verdana" w:hAnsi="Verdana" w:cs="Arial"/>
           <w:sz w:val="20"/>
           <w:szCs w:val="20"/>
         </w:rPr>
       </w:pPr>
-      <w:r>
-        <w:rPr>
-          <w:rFonts w:ascii="Verdana" w:hAnsi="Verdana" w:cs="Arial"/>
-          <w:sz w:val="20"/>
-          <w:szCs w:val="20"/>
-        </w:rPr>
-        <w:t>{{</w:t>
-      </w:r>
-      <w:proofErr w:type="spellStart"/>
-      <w:r>
-        <w:rPr>
-          <w:rFonts w:ascii="Verdana" w:hAnsi="Verdana" w:cs="Arial"/>
-          <w:sz w:val="20"/>
-          <w:szCs w:val="20"/>
-        </w:rPr>
-        <w:t>ttm</w:t>
-      </w:r>
-      <w:proofErr w:type="spellEnd"/>
-      <w:r>
-        <w:rPr>
-          <w:rFonts w:ascii="Verdana" w:hAnsi="Verdana" w:cs="Arial"/>
-          <w:sz w:val="20"/>
-          <w:szCs w:val="20"/>
-        </w:rPr>
-        <w:t>}}</w:t>
-      </w:r>
     </w:p>
     <w:p>
       <w:pPr>
         <w:spacing w:after="0" w:line="240" w:lineRule="auto"/>
         <w:rPr>
           <w:rFonts w:ascii="Verdana" w:hAnsi="Verdana" w:cs="Arial"/>
-          <w:b/>
-          <w:bCs/>
           <w:sz w:val="20"/>
           <w:szCs w:val="20"/>
         </w:rPr>
@@ -1427,25 +1280,7 @@
                 <w:sz w:val="20"/>
                 <w:szCs w:val="20"/>
               </w:rPr>
-              <w:t>{{</w:t>
-            </w:r>
-            <w:proofErr w:type="spellStart"/>
-            <w:r>
-              <w:rPr>
-                <w:rFonts w:ascii="Verdana" w:hAnsi="Verdana" w:cs="Arial"/>
-                <w:sz w:val="20"/>
-                <w:szCs w:val="20"/>
-              </w:rPr>
-              <w:t>itl</w:t>
-            </w:r>
-            <w:proofErr w:type="spellEnd"/>
-            <w:r>
-              <w:rPr>
-                <w:rFonts w:ascii="Verdana" w:hAnsi="Verdana" w:cs="Arial"/>
-                <w:sz w:val="20"/>
-                <w:szCs w:val="20"/>
-              </w:rPr>
-              <w:t>}}</w:t>
+              <w:t>{{mtl}}</w:t>
             </w:r>
           </w:p>
         </w:tc>
@@ -1471,25 +1306,102 @@
                 <w:sz w:val="20"/>
                 <w:szCs w:val="20"/>
               </w:rPr>
-              <w:t>{{</w:t>
-            </w:r>
-            <w:proofErr w:type="spellStart"/>
-            <w:r>
+              <w:t>{{mtp}}</w:t>
+            </w:r>
+          </w:p>
+        </w:tc>
+      </w:tr>
+    </w:tbl>
+    <w:p>
+      <w:pPr>
+        <w:pStyle w:val="Listeavsnitt"/>
+        <w:rPr>
+          <w:rFonts w:ascii="Verdana" w:hAnsi="Verdana" w:cs="Arial"/>
+          <w:sz w:val="20"/>
+          <w:szCs w:val="20"/>
+        </w:rPr>
+      </w:pPr>
+      <w:r>
+        <w:rPr>
+          <w:rFonts w:ascii="Verdana" w:hAnsi="Verdana" w:cs="Arial"/>
+          <w:sz w:val="20"/>
+          <w:szCs w:val="20"/>
+        </w:rPr>
+        <w:t>{{ttm}}</w:t>
+      </w:r>
+    </w:p>
+    <w:p>
+      <w:pPr>
+        <w:spacing w:after="0" w:line="240" w:lineRule="auto"/>
+        <w:rPr>
+          <w:rFonts w:ascii="Verdana" w:hAnsi="Verdana" w:cs="Arial"/>
+          <w:b/>
+          <w:bCs/>
+          <w:sz w:val="20"/>
+          <w:szCs w:val="20"/>
+        </w:rPr>
+      </w:pPr>
+    </w:p>
+    <w:tbl>
+      <w:tblPr>
+        <w:tblStyle w:val="Vanligtabell4"/>
+        <w:tblW w:w="5000" w:type="pct"/>
+        <w:tblLook w:val="04A0" w:firstRow="1" w:lastRow="0" w:firstColumn="1" w:lastColumn="0" w:noHBand="0" w:noVBand="1"/>
+      </w:tblPr>
+      <w:tblGrid>
+        <w:gridCol w:w="7653"/>
+        <w:gridCol w:w="2813"/>
+      </w:tblGrid>
+      <w:tr>
+        <w:trPr>
+          <w:cnfStyle w:val="100000000000" w:firstRow="1" w:lastRow="0" w:firstColumn="0" w:lastColumn="0" w:oddVBand="0" w:evenVBand="0" w:oddHBand="0" w:evenHBand="0" w:firstRowFirstColumn="0" w:firstRowLastColumn="0" w:lastRowFirstColumn="0" w:lastRowLastColumn="0"/>
+        </w:trPr>
+        <w:tc>
+          <w:tcPr>
+            <w:cnfStyle w:val="001000000000" w:firstRow="0" w:lastRow="0" w:firstColumn="1" w:lastColumn="0" w:oddVBand="0" w:evenVBand="0" w:oddHBand="0" w:evenHBand="0" w:firstRowFirstColumn="0" w:firstRowLastColumn="0" w:lastRowFirstColumn="0" w:lastRowLastColumn="0"/>
+            <w:tcW w:w="3656" w:type="pct"/>
+          </w:tcPr>
+          <w:p>
+            <w:pPr>
               <w:rPr>
                 <w:rFonts w:ascii="Verdana" w:hAnsi="Verdana" w:cs="Arial"/>
                 <w:sz w:val="20"/>
                 <w:szCs w:val="20"/>
               </w:rPr>
-              <w:t>itp</w:t>
-            </w:r>
-            <w:proofErr w:type="spellEnd"/>
+            </w:pPr>
             <w:r>
               <w:rPr>
                 <w:rFonts w:ascii="Verdana" w:hAnsi="Verdana" w:cs="Arial"/>
                 <w:sz w:val="20"/>
                 <w:szCs w:val="20"/>
               </w:rPr>
-              <w:t>}}</w:t>
+              <w:t>{{itl}}</w:t>
+            </w:r>
+          </w:p>
+        </w:tc>
+        <w:tc>
+          <w:tcPr>
+            <w:tcW w:w="1344" w:type="pct"/>
+          </w:tcPr>
+          <w:p>
+            <w:pPr>
+              <w:jc w:val="right"/>
+              <w:cnfStyle w:val="100000000000" w:firstRow="1" w:lastRow="0" w:firstColumn="0" w:lastColumn="0" w:oddVBand="0" w:evenVBand="0" w:oddHBand="0" w:evenHBand="0" w:firstRowFirstColumn="0" w:firstRowLastColumn="0" w:lastRowFirstColumn="0" w:lastRowLastColumn="0"/>
+              <w:rPr>
+                <w:rFonts w:ascii="Verdana" w:hAnsi="Verdana" w:cs="Arial"/>
+                <w:b w:val="0"/>
+                <w:bCs w:val="0"/>
+                <w:sz w:val="20"/>
+                <w:szCs w:val="20"/>
+              </w:rPr>
+            </w:pPr>
+            <w:r>
+              <w:rPr>
+                <w:rFonts w:ascii="Verdana" w:hAnsi="Verdana" w:cs="Arial"/>
+                <w:sz w:val="20"/>
+                <w:szCs w:val="20"/>
+              </w:rPr>
+              <w:t>{{itp}}</w:t>
             </w:r>
           </w:p>
         </w:tc>
@@ -1510,25 +1422,7 @@
           <w:sz w:val="20"/>
           <w:szCs w:val="20"/>
         </w:rPr>
-        <w:t>{{</w:t>
-      </w:r>
-      <w:proofErr w:type="spellStart"/>
-      <w:r>
-        <w:rPr>
-          <w:rFonts w:ascii="Verdana" w:hAnsi="Verdana" w:cs="Arial"/>
-          <w:sz w:val="20"/>
-          <w:szCs w:val="20"/>
-        </w:rPr>
-        <w:t>tti</w:t>
-      </w:r>
-      <w:proofErr w:type="spellEnd"/>
-      <w:r>
-        <w:rPr>
-          <w:rFonts w:ascii="Verdana" w:hAnsi="Verdana" w:cs="Arial"/>
-          <w:sz w:val="20"/>
-          <w:szCs w:val="20"/>
-        </w:rPr>
-        <w:t>}}</w:t>
+        <w:t>{{tti}}</w:t>
       </w:r>
     </w:p>
     <w:p>
@@ -1575,25 +1469,7 @@
                 <w:sz w:val="20"/>
                 <w:szCs w:val="20"/>
               </w:rPr>
-              <w:t>{{</w:t>
-            </w:r>
-            <w:proofErr w:type="spellStart"/>
-            <w:r>
-              <w:rPr>
-                <w:rFonts w:ascii="Verdana" w:hAnsi="Verdana" w:cs="Arial"/>
-                <w:sz w:val="20"/>
-                <w:szCs w:val="20"/>
-              </w:rPr>
-              <w:t>tol</w:t>
-            </w:r>
-            <w:proofErr w:type="spellEnd"/>
-            <w:r>
-              <w:rPr>
-                <w:rFonts w:ascii="Verdana" w:hAnsi="Verdana" w:cs="Arial"/>
-                <w:sz w:val="20"/>
-                <w:szCs w:val="20"/>
-              </w:rPr>
-              <w:t>}}</w:t>
+              <w:t>{{tol}}</w:t>
             </w:r>
           </w:p>
         </w:tc>
@@ -1619,25 +1495,7 @@
                 <w:sz w:val="20"/>
                 <w:szCs w:val="20"/>
               </w:rPr>
-              <w:t>{{</w:t>
-            </w:r>
-            <w:proofErr w:type="spellStart"/>
-            <w:r>
-              <w:rPr>
-                <w:rFonts w:ascii="Verdana" w:hAnsi="Verdana" w:cs="Arial"/>
-                <w:sz w:val="20"/>
-                <w:szCs w:val="20"/>
-              </w:rPr>
-              <w:t>top</w:t>
-            </w:r>
-            <w:proofErr w:type="spellEnd"/>
-            <w:r>
-              <w:rPr>
-                <w:rFonts w:ascii="Verdana" w:hAnsi="Verdana" w:cs="Arial"/>
-                <w:sz w:val="20"/>
-                <w:szCs w:val="20"/>
-              </w:rPr>
-              <w:t>}}</w:t>
+              <w:t>{{top}}</w:t>
             </w:r>
           </w:p>
         </w:tc>
@@ -1658,25 +1516,7 @@
           <w:sz w:val="20"/>
           <w:szCs w:val="20"/>
         </w:rPr>
-        <w:t>{{</w:t>
-      </w:r>
-      <w:proofErr w:type="spellStart"/>
-      <w:r>
-        <w:rPr>
-          <w:rFonts w:ascii="Verdana" w:hAnsi="Verdana" w:cs="Arial"/>
-          <w:sz w:val="20"/>
-          <w:szCs w:val="20"/>
-        </w:rPr>
-        <w:t>tod</w:t>
-      </w:r>
-      <w:proofErr w:type="spellEnd"/>
-      <w:r>
-        <w:rPr>
-          <w:rFonts w:ascii="Verdana" w:hAnsi="Verdana" w:cs="Arial"/>
-          <w:sz w:val="20"/>
-          <w:szCs w:val="20"/>
-        </w:rPr>
-        <w:t>}}</w:t>
+        <w:t>{{tod}}</w:t>
       </w:r>
     </w:p>
     <w:tbl>
@@ -1728,27 +1568,7 @@
           <w:sz w:val="20"/>
           <w:szCs w:val="20"/>
         </w:rPr>
-        <w:t>{{</w:t>
-      </w:r>
-      <w:proofErr w:type="spellStart"/>
-      <w:r>
-        <w:rPr>
-          <w:rFonts w:ascii="Verdana" w:hAnsi="Verdana" w:cs="Arial"/>
-          <w:bCs/>
-          <w:sz w:val="20"/>
-          <w:szCs w:val="20"/>
-        </w:rPr>
-        <w:t>lse</w:t>
-      </w:r>
-      <w:proofErr w:type="spellEnd"/>
-      <w:r>
-        <w:rPr>
-          <w:rFonts w:ascii="Verdana" w:hAnsi="Verdana" w:cs="Arial"/>
-          <w:bCs/>
-          <w:sz w:val="20"/>
-          <w:szCs w:val="20"/>
-        </w:rPr>
-        <w:t>}}</w:t>
+        <w:t>{{lse}}</w:t>
       </w:r>
       <w:r>
         <w:rPr>
@@ -1818,9 +1638,8 @@
                 <w:sz w:val="20"/>
                 <w:szCs w:val="20"/>
               </w:rPr>
-              <w:t xml:space="preserve">Brannelement er pris </w:t>
-            </w:r>
-            <w:proofErr w:type="spellStart"/>
+              <w:t>Brannelement er pris pr.st</w:t>
+            </w:r>
             <w:r>
               <w:rPr>
                 <w:rFonts w:ascii="Verdana" w:hAnsi="Verdana" w:cs="Arial"/>
@@ -1831,7 +1650,7 @@
                 <w:sz w:val="20"/>
                 <w:szCs w:val="20"/>
               </w:rPr>
-              <w:t>pr.st</w:t>
+              <w:t>k -</w:t>
             </w:r>
             <w:r>
               <w:rPr>
@@ -1843,47 +1662,8 @@
                 <w:sz w:val="20"/>
                 <w:szCs w:val="20"/>
               </w:rPr>
-              <w:t>k</w:t>
-            </w:r>
-            <w:proofErr w:type="spellEnd"/>
-            <w:r>
-              <w:rPr>
-                <w:rFonts w:ascii="Verdana" w:hAnsi="Verdana" w:cs="Arial"/>
-                <w:b w:val="0"/>
-                <w:bCs w:val="0"/>
-                <w:i/>
-                <w:iCs/>
-                <w:sz w:val="20"/>
-                <w:szCs w:val="20"/>
-              </w:rPr>
-              <w:t xml:space="preserve"> -</w:t>
-            </w:r>
-            <w:r>
-              <w:rPr>
-                <w:rFonts w:ascii="Verdana" w:hAnsi="Verdana" w:cs="Arial"/>
-                <w:b w:val="0"/>
-                <w:bCs w:val="0"/>
-                <w:i/>
-                <w:iCs/>
-                <w:sz w:val="20"/>
-                <w:szCs w:val="20"/>
-              </w:rPr>
-              <w:t xml:space="preserve"> </w:t>
-            </w:r>
-            <w:proofErr w:type="spellStart"/>
-            <w:r>
-              <w:rPr>
-                <w:rFonts w:ascii="Verdana" w:hAnsi="Verdana" w:cs="Arial"/>
-                <w:b w:val="0"/>
-                <w:bCs w:val="0"/>
-                <w:i/>
-                <w:iCs/>
-                <w:sz w:val="20"/>
-                <w:szCs w:val="20"/>
-              </w:rPr>
-              <w:t>pr.strømskinne</w:t>
-            </w:r>
-            <w:proofErr w:type="spellEnd"/>
+              <w:t xml:space="preserve"> pr.strømskinne</w:t>
+            </w:r>
           </w:p>
         </w:tc>
         <w:tc>
@@ -1910,21 +1690,7 @@
         <w:rPr>
           <w:rFonts w:ascii="Verdana" w:hAnsi="Verdana" w:cs="Arial"/>
         </w:rPr>
-        <w:t>{{</w:t>
-      </w:r>
-      <w:proofErr w:type="spellStart"/>
-      <w:r>
-        <w:rPr>
-          <w:rFonts w:ascii="Verdana" w:hAnsi="Verdana" w:cs="Arial"/>
-        </w:rPr>
-        <w:t>bss</w:t>
-      </w:r>
-      <w:proofErr w:type="spellEnd"/>
-      <w:r>
-        <w:rPr>
-          <w:rFonts w:ascii="Verdana" w:hAnsi="Verdana" w:cs="Arial"/>
-        </w:rPr>
-        <w:t>}}</w:t>
+        <w:t>{{bss}}</w:t>
       </w:r>
     </w:p>
     <w:tbl>
@@ -1978,10 +1744,18 @@
                 <w:i/>
                 <w:iCs/>
               </w:rPr>
-              <w:t xml:space="preserve"> {{</w:t>
-            </w:r>
-            <w:proofErr w:type="spellStart"/>
-            <w:r>
+              <w:t xml:space="preserve"> {{lnr}}: {{brt}}</w:t>
+            </w:r>
+          </w:p>
+        </w:tc>
+        <w:tc>
+          <w:tcPr>
+            <w:tcW w:w="1726" w:type="dxa"/>
+          </w:tcPr>
+          <w:p>
+            <w:pPr>
+              <w:jc w:val="right"/>
+              <w:cnfStyle w:val="100000000000" w:firstRow="1" w:lastRow="0" w:firstColumn="0" w:lastColumn="0" w:oddVBand="0" w:evenVBand="0" w:oddHBand="0" w:evenHBand="0" w:firstRowFirstColumn="0" w:firstRowLastColumn="0" w:lastRowFirstColumn="0" w:lastRowLastColumn="0"/>
               <w:rPr>
                 <w:rFonts w:ascii="Verdana" w:hAnsi="Verdana" w:cs="Arial"/>
                 <w:b w:val="0"/>
@@ -1989,9 +1763,7 @@
                 <w:i/>
                 <w:iCs/>
               </w:rPr>
-              <w:t>lnr</w:t>
-            </w:r>
-            <w:proofErr w:type="spellEnd"/>
+            </w:pPr>
             <w:r>
               <w:rPr>
                 <w:rFonts w:ascii="Verdana" w:hAnsi="Verdana" w:cs="Arial"/>
@@ -2000,79 +1772,7 @@
                 <w:i/>
                 <w:iCs/>
               </w:rPr>
-              <w:t>}}: {{</w:t>
-            </w:r>
-            <w:proofErr w:type="spellStart"/>
-            <w:r>
-              <w:rPr>
-                <w:rFonts w:ascii="Verdana" w:hAnsi="Verdana" w:cs="Arial"/>
-                <w:b w:val="0"/>
-                <w:bCs w:val="0"/>
-                <w:i/>
-                <w:iCs/>
-              </w:rPr>
-              <w:t>brt</w:t>
-            </w:r>
-            <w:proofErr w:type="spellEnd"/>
-            <w:r>
-              <w:rPr>
-                <w:rFonts w:ascii="Verdana" w:hAnsi="Verdana" w:cs="Arial"/>
-                <w:b w:val="0"/>
-                <w:bCs w:val="0"/>
-                <w:i/>
-                <w:iCs/>
-              </w:rPr>
-              <w:t>}}</w:t>
-            </w:r>
-          </w:p>
-        </w:tc>
-        <w:tc>
-          <w:tcPr>
-            <w:tcW w:w="1726" w:type="dxa"/>
-          </w:tcPr>
-          <w:p>
-            <w:pPr>
-              <w:jc w:val="right"/>
-              <w:cnfStyle w:val="100000000000" w:firstRow="1" w:lastRow="0" w:firstColumn="0" w:lastColumn="0" w:oddVBand="0" w:evenVBand="0" w:oddHBand="0" w:evenHBand="0" w:firstRowFirstColumn="0" w:firstRowLastColumn="0" w:lastRowFirstColumn="0" w:lastRowLastColumn="0"/>
-              <w:rPr>
-                <w:rFonts w:ascii="Verdana" w:hAnsi="Verdana" w:cs="Arial"/>
-                <w:b w:val="0"/>
-                <w:bCs w:val="0"/>
-                <w:i/>
-                <w:iCs/>
-              </w:rPr>
-            </w:pPr>
-            <w:r>
-              <w:rPr>
-                <w:rFonts w:ascii="Verdana" w:hAnsi="Verdana" w:cs="Arial"/>
-                <w:b w:val="0"/>
-                <w:bCs w:val="0"/>
-                <w:i/>
-                <w:iCs/>
-              </w:rPr>
-              <w:t>kr. {{</w:t>
-            </w:r>
-            <w:proofErr w:type="spellStart"/>
-            <w:r>
-              <w:rPr>
-                <w:rFonts w:ascii="Verdana" w:hAnsi="Verdana" w:cs="Arial"/>
-                <w:b w:val="0"/>
-                <w:bCs w:val="0"/>
-                <w:i/>
-                <w:iCs/>
-              </w:rPr>
-              <w:t>brp</w:t>
-            </w:r>
-            <w:proofErr w:type="spellEnd"/>
-            <w:r>
-              <w:rPr>
-                <w:rFonts w:ascii="Verdana" w:hAnsi="Verdana" w:cs="Arial"/>
-                <w:b w:val="0"/>
-                <w:bCs w:val="0"/>
-                <w:i/>
-                <w:iCs/>
-              </w:rPr>
-              <w:t>}}</w:t>
+              <w:t>kr. {{brp}}</w:t>
             </w:r>
           </w:p>
         </w:tc>
@@ -2089,21 +1789,7 @@
         <w:rPr>
           <w:rFonts w:ascii="Verdana" w:hAnsi="Verdana" w:cs="Arial"/>
         </w:rPr>
-        <w:t>{{</w:t>
-      </w:r>
-      <w:proofErr w:type="spellStart"/>
-      <w:r>
-        <w:rPr>
-          <w:rFonts w:ascii="Verdana" w:hAnsi="Verdana" w:cs="Arial"/>
-        </w:rPr>
-        <w:t>bse</w:t>
-      </w:r>
-      <w:proofErr w:type="spellEnd"/>
-      <w:r>
-        <w:rPr>
-          <w:rFonts w:ascii="Verdana" w:hAnsi="Verdana" w:cs="Arial"/>
-        </w:rPr>
-        <w:t>}}</w:t>
+        <w:t>{{bse}}</w:t>
       </w:r>
     </w:p>
     <w:p>
@@ -2169,10 +1855,18 @@
                 <w:i/>
                 <w:iCs/>
               </w:rPr>
-              <w:t>{{</w:t>
-            </w:r>
-            <w:proofErr w:type="spellStart"/>
-            <w:r>
+              <w:t>{{lnr}}: {{tol}}</w:t>
+            </w:r>
+          </w:p>
+        </w:tc>
+        <w:tc>
+          <w:tcPr>
+            <w:tcW w:w="1726" w:type="dxa"/>
+          </w:tcPr>
+          <w:p>
+            <w:pPr>
+              <w:jc w:val="right"/>
+              <w:cnfStyle w:val="100000000000" w:firstRow="1" w:lastRow="0" w:firstColumn="0" w:lastColumn="0" w:oddVBand="0" w:evenVBand="0" w:oddHBand="0" w:evenHBand="0" w:firstRowFirstColumn="0" w:firstRowLastColumn="0" w:lastRowFirstColumn="0" w:lastRowLastColumn="0"/>
               <w:rPr>
                 <w:rFonts w:ascii="Verdana" w:hAnsi="Verdana" w:cs="Arial"/>
                 <w:b w:val="0"/>
@@ -2180,9 +1874,7 @@
                 <w:i/>
                 <w:iCs/>
               </w:rPr>
-              <w:t>lnr</w:t>
-            </w:r>
-            <w:proofErr w:type="spellEnd"/>
+            </w:pPr>
             <w:r>
               <w:rPr>
                 <w:rFonts w:ascii="Verdana" w:hAnsi="Verdana" w:cs="Arial"/>
@@ -2191,10 +1883,23 @@
                 <w:i/>
                 <w:iCs/>
               </w:rPr>
-              <w:t>}}: {{</w:t>
-            </w:r>
-            <w:proofErr w:type="spellStart"/>
-            <w:r>
+              <w:t>{{top}}</w:t>
+            </w:r>
+          </w:p>
+        </w:tc>
+      </w:tr>
+      <w:tr>
+        <w:trPr>
+          <w:cnfStyle w:val="000000100000" w:firstRow="0" w:lastRow="0" w:firstColumn="0" w:lastColumn="0" w:oddVBand="0" w:evenVBand="0" w:oddHBand="1" w:evenHBand="0" w:firstRowFirstColumn="0" w:firstRowLastColumn="0" w:lastRowFirstColumn="0" w:lastRowLastColumn="0"/>
+        </w:trPr>
+        <w:tc>
+          <w:tcPr>
+            <w:cnfStyle w:val="001000000000" w:firstRow="0" w:lastRow="0" w:firstColumn="1" w:lastColumn="0" w:oddVBand="0" w:evenVBand="0" w:oddHBand="0" w:evenHBand="0" w:firstRowFirstColumn="0" w:firstRowLastColumn="0" w:lastRowFirstColumn="0" w:lastRowLastColumn="0"/>
+            <w:tcW w:w="5228" w:type="dxa"/>
+            <w:shd w:val="clear" w:color="auto" w:fill="auto"/>
+          </w:tcPr>
+          <w:p>
+            <w:pPr>
               <w:rPr>
                 <w:rFonts w:ascii="Verdana" w:hAnsi="Verdana" w:cs="Arial"/>
                 <w:b w:val="0"/>
@@ -2202,9 +1907,7 @@
                 <w:i/>
                 <w:iCs/>
               </w:rPr>
-              <w:t>tol</w:t>
-            </w:r>
-            <w:proofErr w:type="spellEnd"/>
+            </w:pPr>
             <w:r>
               <w:rPr>
                 <w:rFonts w:ascii="Verdana" w:hAnsi="Verdana" w:cs="Arial"/>
@@ -2213,112 +1916,7 @@
                 <w:i/>
                 <w:iCs/>
               </w:rPr>
-              <w:t>}}</w:t>
-            </w:r>
-          </w:p>
-        </w:tc>
-        <w:tc>
-          <w:tcPr>
-            <w:tcW w:w="1726" w:type="dxa"/>
-          </w:tcPr>
-          <w:p>
-            <w:pPr>
-              <w:jc w:val="right"/>
-              <w:cnfStyle w:val="100000000000" w:firstRow="1" w:lastRow="0" w:firstColumn="0" w:lastColumn="0" w:oddVBand="0" w:evenVBand="0" w:oddHBand="0" w:evenHBand="0" w:firstRowFirstColumn="0" w:firstRowLastColumn="0" w:lastRowFirstColumn="0" w:lastRowLastColumn="0"/>
-              <w:rPr>
-                <w:rFonts w:ascii="Verdana" w:hAnsi="Verdana" w:cs="Arial"/>
-                <w:b w:val="0"/>
-                <w:bCs w:val="0"/>
-                <w:i/>
-                <w:iCs/>
-              </w:rPr>
-            </w:pPr>
-            <w:r>
-              <w:rPr>
-                <w:rFonts w:ascii="Verdana" w:hAnsi="Verdana" w:cs="Arial"/>
-                <w:b w:val="0"/>
-                <w:bCs w:val="0"/>
-                <w:i/>
-                <w:iCs/>
-              </w:rPr>
-              <w:t>{{</w:t>
-            </w:r>
-            <w:proofErr w:type="spellStart"/>
-            <w:r>
-              <w:rPr>
-                <w:rFonts w:ascii="Verdana" w:hAnsi="Verdana" w:cs="Arial"/>
-                <w:b w:val="0"/>
-                <w:bCs w:val="0"/>
-                <w:i/>
-                <w:iCs/>
-              </w:rPr>
-              <w:t>top</w:t>
-            </w:r>
-            <w:proofErr w:type="spellEnd"/>
-            <w:r>
-              <w:rPr>
-                <w:rFonts w:ascii="Verdana" w:hAnsi="Verdana" w:cs="Arial"/>
-                <w:b w:val="0"/>
-                <w:bCs w:val="0"/>
-                <w:i/>
-                <w:iCs/>
-              </w:rPr>
-              <w:t>}}</w:t>
-            </w:r>
-          </w:p>
-        </w:tc>
-      </w:tr>
-      <w:tr>
-        <w:trPr>
-          <w:cnfStyle w:val="000000100000" w:firstRow="0" w:lastRow="0" w:firstColumn="0" w:lastColumn="0" w:oddVBand="0" w:evenVBand="0" w:oddHBand="1" w:evenHBand="0" w:firstRowFirstColumn="0" w:firstRowLastColumn="0" w:lastRowFirstColumn="0" w:lastRowLastColumn="0"/>
-        </w:trPr>
-        <w:tc>
-          <w:tcPr>
-            <w:cnfStyle w:val="001000000000" w:firstRow="0" w:lastRow="0" w:firstColumn="1" w:lastColumn="0" w:oddVBand="0" w:evenVBand="0" w:oddHBand="0" w:evenHBand="0" w:firstRowFirstColumn="0" w:firstRowLastColumn="0" w:lastRowFirstColumn="0" w:lastRowLastColumn="0"/>
-            <w:tcW w:w="5228" w:type="dxa"/>
-            <w:shd w:val="clear" w:color="auto" w:fill="auto"/>
-          </w:tcPr>
-          <w:p>
-            <w:pPr>
-              <w:rPr>
-                <w:rFonts w:ascii="Verdana" w:hAnsi="Verdana" w:cs="Arial"/>
-                <w:b w:val="0"/>
-                <w:bCs w:val="0"/>
-                <w:i/>
-                <w:iCs/>
-              </w:rPr>
-            </w:pPr>
-            <w:r>
-              <w:rPr>
-                <w:rFonts w:ascii="Verdana" w:hAnsi="Verdana" w:cs="Arial"/>
-                <w:b w:val="0"/>
-                <w:bCs w:val="0"/>
-                <w:i/>
-                <w:iCs/>
-              </w:rPr>
-              <w:t>{{</w:t>
-            </w:r>
-            <w:proofErr w:type="spellStart"/>
-            <w:r>
-              <w:rPr>
-                <w:rFonts w:ascii="Verdana" w:hAnsi="Verdana" w:cs="Arial"/>
-                <w:b w:val="0"/>
-                <w:bCs w:val="0"/>
-                <w:i/>
-                <w:iCs/>
-              </w:rPr>
-              <w:t>tod</w:t>
-            </w:r>
-            <w:proofErr w:type="spellEnd"/>
-            <w:r>
-              <w:rPr>
-                <w:rFonts w:ascii="Verdana" w:hAnsi="Verdana" w:cs="Arial"/>
-                <w:b w:val="0"/>
-                <w:bCs w:val="0"/>
-                <w:i/>
-                <w:iCs/>
-              </w:rPr>
-              <w:t>}}</w:t>
+              <w:t>{{tod}}</w:t>
             </w:r>
           </w:p>
         </w:tc>
@@ -2640,7 +2238,7 @@
           <w:szCs w:val="18"/>
           <w:lang w:eastAsia="en-US"/>
         </w:rPr>
-        <w:t>Hva gjør vi med betingelser råvarer og valuta?</w:t>
+        <w:t>Hva gjør vi med betingelser råvarer?</w:t>
       </w:r>
     </w:p>
     <w:p>
@@ -2708,6 +2306,39 @@
           <w:szCs w:val="18"/>
         </w:rPr>
         <w:t>Montasje</w:t>
+      </w:r>
+    </w:p>
+    <w:p>
+      <w:pPr>
+        <w:rPr>
+          <w:rFonts w:ascii="Verdana" w:hAnsi="Verdana" w:cs="Arial"/>
+          <w:sz w:val="18"/>
+          <w:szCs w:val="18"/>
+        </w:rPr>
+      </w:pPr>
+      <w:r>
+        <w:rPr>
+          <w:rFonts w:ascii="Verdana" w:hAnsi="Verdana" w:cs="Arial"/>
+          <w:sz w:val="18"/>
+          <w:szCs w:val="18"/>
+        </w:rPr>
+        <w:t>•</w:t>
+      </w:r>
+      <w:r>
+        <w:rPr>
+          <w:rFonts w:ascii="Verdana" w:hAnsi="Verdana" w:cs="Arial"/>
+          <w:sz w:val="18"/>
+          <w:szCs w:val="18"/>
+        </w:rPr>
+        <w:tab/>
+      </w:r>
+      <w:r>
+        <w:rPr>
+          <w:rFonts w:ascii="Verdana" w:hAnsi="Verdana" w:cs="Arial"/>
+          <w:sz w:val="18"/>
+          <w:szCs w:val="18"/>
+        </w:rPr>
+        <w:t>Standard prosjektering</w:t>
       </w:r>
     </w:p>
     <w:p>
@@ -2873,7 +2504,6 @@
         <w:rPr>
           <w:rFonts w:ascii="Verdana" w:eastAsia="Times New Roman" w:hAnsi="Verdana" w:cs="Arial"/>
           <w:bCs/>
-          <w:color w:val="FF0000"/>
           <w:sz w:val="18"/>
           <w:szCs w:val="18"/>
           <w:lang w:eastAsia="en-US"/>
@@ -2883,7 +2513,6 @@
         <w:rPr>
           <w:rFonts w:ascii="Verdana" w:eastAsia="Times New Roman" w:hAnsi="Verdana" w:cs="Arial"/>
           <w:bCs/>
-          <w:color w:val="FF0000"/>
           <w:sz w:val="18"/>
           <w:szCs w:val="18"/>
           <w:lang w:eastAsia="en-US"/>
@@ -2894,18 +2523,25 @@
       <w:r>
         <w:rPr>
           <w:rFonts w:ascii="Verdana" w:eastAsia="Times New Roman" w:hAnsi="Verdana" w:cs="Arial"/>
-          <w:color w:val="FF0000"/>
           <w:sz w:val="18"/>
           <w:szCs w:val="18"/>
           <w:lang w:eastAsia="en-US"/>
         </w:rPr>
-        <w:t>MICROMATIC</w:t>
+        <w:t xml:space="preserve">BUSBAR / </w:t>
+      </w:r>
+      <w:r>
+        <w:rPr>
+          <w:rFonts w:ascii="Verdana" w:eastAsia="Times New Roman" w:hAnsi="Verdana" w:cs="Arial"/>
+          <w:sz w:val="18"/>
+          <w:szCs w:val="18"/>
+          <w:lang w:eastAsia="en-US"/>
+        </w:rPr>
+        <w:t>MCS</w:t>
       </w:r>
       <w:r>
         <w:rPr>
           <w:rFonts w:ascii="Verdana" w:eastAsia="Times New Roman" w:hAnsi="Verdana" w:cs="Arial"/>
           <w:bCs/>
-          <w:color w:val="FF0000"/>
           <w:sz w:val="18"/>
           <w:szCs w:val="18"/>
           <w:lang w:eastAsia="en-US"/>
@@ -2916,906 +2552,746 @@
     <w:p>
       <w:pPr>
         <w:spacing w:after="0" w:line="240" w:lineRule="auto"/>
-        <w:ind w:left="705" w:hanging="705"/>
         <w:rPr>
           <w:rFonts w:ascii="Verdana" w:eastAsia="Times New Roman" w:hAnsi="Verdana" w:cs="Arial"/>
-          <w:color w:val="FF0000"/>
+          <w:bCs/>
           <w:sz w:val="18"/>
           <w:szCs w:val="18"/>
           <w:lang w:eastAsia="en-US"/>
         </w:rPr>
       </w:pPr>
-      <w:r>
+    </w:p>
+    <w:p>
+      <w:pPr>
+        <w:pStyle w:val="Listeavsnitt"/>
+        <w:numPr>
+          <w:ilvl w:val="0"/>
+          <w:numId w:val="11"/>
+        </w:numPr>
+        <w:rPr>
+          <w:rFonts w:ascii="Verdana" w:hAnsi="Verdana" w:cs="Arial"/>
+          <w:sz w:val="18"/>
+          <w:szCs w:val="18"/>
+          <w:lang w:eastAsia="en-US"/>
+        </w:rPr>
+      </w:pPr>
+      <w:r>
+        <w:rPr>
+          <w:rFonts w:ascii="Verdana" w:hAnsi="Verdana" w:cs="Arial"/>
+          <w:sz w:val="18"/>
+          <w:szCs w:val="18"/>
+          <w:lang w:eastAsia="en-US"/>
+        </w:rPr>
+        <w:t xml:space="preserve">Pris på montasjen er basert på kontinuerlig arbeidsprosess uten opphold innenfor normal arbeidstid (07:00-19:00), fri adkomst der skinne skal monteres, tilgang til minimum 16A byggstrøm og tilstrekkelig lys. </w:t>
+      </w:r>
+    </w:p>
+    <w:p>
+      <w:pPr>
+        <w:pStyle w:val="Listeavsnitt"/>
+        <w:numPr>
+          <w:ilvl w:val="0"/>
+          <w:numId w:val="11"/>
+        </w:numPr>
+        <w:rPr>
+          <w:rFonts w:ascii="Verdana" w:hAnsi="Verdana" w:cs="Arial"/>
+          <w:sz w:val="18"/>
+          <w:szCs w:val="18"/>
+          <w:lang w:eastAsia="en-US"/>
+        </w:rPr>
+      </w:pPr>
+      <w:r>
+        <w:rPr>
+          <w:rFonts w:ascii="Verdana" w:hAnsi="Verdana" w:cs="Arial"/>
+          <w:sz w:val="18"/>
+          <w:szCs w:val="18"/>
+          <w:lang w:eastAsia="en-US"/>
+        </w:rPr>
+        <w:t xml:space="preserve">Over 3,0 meter høyde må oppdragsgiver beregne leie av stillas / lift. </w:t>
+      </w:r>
+    </w:p>
+    <w:p>
+      <w:pPr>
+        <w:pStyle w:val="Listeavsnitt"/>
+        <w:numPr>
+          <w:ilvl w:val="0"/>
+          <w:numId w:val="11"/>
+        </w:numPr>
+        <w:rPr>
+          <w:rFonts w:ascii="Verdana" w:hAnsi="Verdana" w:cs="Arial"/>
+          <w:sz w:val="18"/>
+          <w:szCs w:val="18"/>
+          <w:lang w:eastAsia="en-US"/>
+        </w:rPr>
+      </w:pPr>
+      <w:r>
+        <w:rPr>
+          <w:rFonts w:ascii="Verdana" w:hAnsi="Verdana" w:cs="Arial"/>
+          <w:sz w:val="18"/>
+          <w:szCs w:val="18"/>
+          <w:lang w:eastAsia="en-US"/>
+        </w:rPr>
+        <w:t xml:space="preserve">Demontering av eksisterende skinne er ikke inkludert i prisen. </w:t>
+      </w:r>
+    </w:p>
+    <w:p>
+      <w:pPr>
+        <w:pStyle w:val="Listeavsnitt"/>
+        <w:numPr>
+          <w:ilvl w:val="0"/>
+          <w:numId w:val="11"/>
+        </w:numPr>
+        <w:rPr>
+          <w:rFonts w:ascii="Verdana" w:hAnsi="Verdana" w:cs="Arial"/>
+          <w:sz w:val="18"/>
+          <w:szCs w:val="18"/>
+          <w:lang w:eastAsia="en-US"/>
+        </w:rPr>
+      </w:pPr>
+      <w:r>
+        <w:rPr>
+          <w:rFonts w:ascii="Verdana" w:hAnsi="Verdana" w:cs="Arial"/>
+          <w:sz w:val="18"/>
+          <w:szCs w:val="18"/>
+          <w:lang w:eastAsia="en-US"/>
+        </w:rPr>
+        <w:t xml:space="preserve">Hulltaking i sikringsskap, vegger og tak er ikke inkludert i prisen. </w:t>
+      </w:r>
+    </w:p>
+    <w:p>
+      <w:pPr>
+        <w:pStyle w:val="Listeavsnitt"/>
+        <w:numPr>
+          <w:ilvl w:val="0"/>
+          <w:numId w:val="11"/>
+        </w:numPr>
+        <w:rPr>
+          <w:rFonts w:ascii="Verdana" w:hAnsi="Verdana" w:cs="Arial"/>
+          <w:sz w:val="18"/>
+          <w:szCs w:val="18"/>
+          <w:lang w:eastAsia="en-US"/>
+        </w:rPr>
+      </w:pPr>
+      <w:r>
+        <w:rPr>
+          <w:rFonts w:ascii="Verdana" w:hAnsi="Verdana" w:cs="Arial"/>
+          <w:sz w:val="18"/>
+          <w:szCs w:val="18"/>
+          <w:lang w:eastAsia="en-US"/>
+        </w:rPr>
+        <w:t>Jording av utsatte deler og branntetting er ikke inkludert i prisen.</w:t>
+      </w:r>
+    </w:p>
+    <w:p>
+      <w:pPr>
+        <w:spacing w:after="0" w:line="240" w:lineRule="auto"/>
         <w:rPr>
           <w:rFonts w:ascii="Verdana" w:eastAsia="Times New Roman" w:hAnsi="Verdana" w:cs="Arial"/>
-          <w:color w:val="FF0000"/>
           <w:sz w:val="18"/>
           <w:szCs w:val="18"/>
           <w:lang w:eastAsia="en-US"/>
         </w:rPr>
-        <w:t>•</w:t>
-      </w:r>
+      </w:pPr>
       <w:r>
         <w:rPr>
           <w:rFonts w:ascii="Verdana" w:eastAsia="Times New Roman" w:hAnsi="Verdana" w:cs="Arial"/>
-          <w:color w:val="FF0000"/>
           <w:sz w:val="18"/>
           <w:szCs w:val="18"/>
           <w:lang w:eastAsia="en-US"/>
         </w:rPr>
         <w:tab/>
       </w:r>
-      <w:proofErr w:type="spellStart"/>
-      <w:r>
+    </w:p>
+    <w:p>
+      <w:pPr>
+        <w:spacing w:after="0" w:line="240" w:lineRule="auto"/>
         <w:rPr>
           <w:rFonts w:ascii="Verdana" w:eastAsia="Times New Roman" w:hAnsi="Verdana" w:cs="Arial"/>
-          <w:color w:val="FF0000"/>
           <w:sz w:val="18"/>
           <w:szCs w:val="18"/>
           <w:lang w:eastAsia="en-US"/>
         </w:rPr>
-        <w:t>MicroMatic</w:t>
-      </w:r>
-      <w:proofErr w:type="spellEnd"/>
+      </w:pPr>
       <w:r>
         <w:rPr>
           <w:rFonts w:ascii="Verdana" w:eastAsia="Times New Roman" w:hAnsi="Verdana" w:cs="Arial"/>
-          <w:color w:val="FF0000"/>
           <w:sz w:val="18"/>
           <w:szCs w:val="18"/>
           <w:lang w:eastAsia="en-US"/>
         </w:rPr>
-        <w:t xml:space="preserve"> er ikke ansvarlig installatør og forbeholder seg muligheten til å bruke ekstern montasjepartner.</w:t>
-      </w:r>
-    </w:p>
-    <w:p>
-      <w:pPr>
-        <w:spacing w:after="0" w:line="240" w:lineRule="auto"/>
-        <w:ind w:left="705" w:hanging="705"/>
+        <w:t xml:space="preserve">Oppdragsgiver er ansvarlig for at strømskinnene blir losset og lagret under tak i nærheten av montasje stedet. Hvis det oppstår forsinkelser på byggeplassen utenfor </w:t>
+      </w:r>
+      <w:r>
         <w:rPr>
           <w:rFonts w:ascii="Verdana" w:eastAsia="Times New Roman" w:hAnsi="Verdana" w:cs="Arial"/>
-          <w:color w:val="FF0000"/>
           <w:sz w:val="18"/>
           <w:szCs w:val="18"/>
           <w:lang w:eastAsia="en-US"/>
         </w:rPr>
-      </w:pPr>
+        <w:t>BUSBAR / MCS</w:t>
+      </w:r>
       <w:r>
         <w:rPr>
           <w:rFonts w:ascii="Verdana" w:eastAsia="Times New Roman" w:hAnsi="Verdana" w:cs="Arial"/>
-          <w:color w:val="FF0000"/>
           <w:sz w:val="18"/>
           <w:szCs w:val="18"/>
           <w:lang w:eastAsia="en-US"/>
         </w:rPr>
-        <w:t>•</w:t>
+        <w:t xml:space="preserve"> sin kontroll under montasjeprosessen eller endringer av opprinnelig strømskinne løsning faktureres dette fortløpende i henhold til </w:t>
       </w:r>
       <w:r>
         <w:rPr>
           <w:rFonts w:ascii="Verdana" w:eastAsia="Times New Roman" w:hAnsi="Verdana" w:cs="Arial"/>
-          <w:color w:val="FF0000"/>
           <w:sz w:val="18"/>
           <w:szCs w:val="18"/>
           <w:lang w:eastAsia="en-US"/>
         </w:rPr>
-        <w:tab/>
-        <w:t xml:space="preserve">Pris på montasjen er basert på kontinuerlig arbeidsprosess uten opphold innenfor normal arbeidstid (07:00-19:00), fri adkomst der skinne skal monteres, tilgang til minimum 16A </w:t>
-      </w:r>
-      <w:proofErr w:type="spellStart"/>
+        <w:t>BUSBAR / MCS</w:t>
+      </w:r>
       <w:r>
         <w:rPr>
           <w:rFonts w:ascii="Verdana" w:eastAsia="Times New Roman" w:hAnsi="Verdana" w:cs="Arial"/>
-          <w:color w:val="FF0000"/>
           <w:sz w:val="18"/>
           <w:szCs w:val="18"/>
           <w:lang w:eastAsia="en-US"/>
         </w:rPr>
-        <w:t>byggstrøm</w:t>
-      </w:r>
-      <w:proofErr w:type="spellEnd"/>
+        <w:t xml:space="preserve"> sine generelle salgsbetingelser og prisliste.</w:t>
+      </w:r>
+      <w:r>
+        <w:t xml:space="preserve"> </w:t>
+      </w:r>
       <w:r>
         <w:rPr>
           <w:rFonts w:ascii="Verdana" w:eastAsia="Times New Roman" w:hAnsi="Verdana" w:cs="Arial"/>
-          <w:color w:val="FF0000"/>
           <w:sz w:val="18"/>
           <w:szCs w:val="18"/>
           <w:lang w:eastAsia="en-US"/>
         </w:rPr>
-        <w:t xml:space="preserve"> og tilstrekkelig lys. </w:t>
-      </w:r>
-    </w:p>
-    <w:p>
-      <w:pPr>
-        <w:spacing w:after="0" w:line="240" w:lineRule="auto"/>
+        <w:t>Generell garantitid er 12 måneder fra overlevering til oppdragsgiver. Ansvar er begrenset til utbedring av feil eller mangler.</w:t>
+      </w:r>
+      <w:r>
         <w:rPr>
           <w:rFonts w:ascii="Verdana" w:eastAsia="Times New Roman" w:hAnsi="Verdana" w:cs="Arial"/>
-          <w:color w:val="FF0000"/>
           <w:sz w:val="18"/>
           <w:szCs w:val="18"/>
           <w:lang w:eastAsia="en-US"/>
         </w:rPr>
+        <w:t xml:space="preserve"> </w:t>
+      </w:r>
+    </w:p>
+    <w:p>
+      <w:pPr>
+        <w:rPr>
+          <w:rFonts w:ascii="Verdana" w:hAnsi="Verdana" w:cs="Arial"/>
+          <w:sz w:val="18"/>
+          <w:szCs w:val="18"/>
+        </w:rPr>
+      </w:pPr>
+    </w:p>
+    <w:p>
+      <w:pPr>
+        <w:rPr>
+          <w:rFonts w:ascii="Verdana" w:hAnsi="Verdana" w:cs="Arial"/>
+          <w:sz w:val="18"/>
+          <w:szCs w:val="18"/>
+        </w:rPr>
+      </w:pPr>
+      <w:r>
+        <w:rPr>
+          <w:rFonts w:ascii="Verdana" w:hAnsi="Verdana" w:cs="Arial"/>
+          <w:sz w:val="18"/>
+          <w:szCs w:val="18"/>
+        </w:rPr>
+        <w:t>Vi gjør oppmerksom på, at hvis kortslutningsnivå ikke er kjent, kan dette ha påvirkning på valg av vern</w:t>
+      </w:r>
+      <w:r>
+        <w:rPr>
+          <w:rFonts w:ascii="Verdana" w:hAnsi="Verdana" w:cs="Arial"/>
+          <w:sz w:val="18"/>
+          <w:szCs w:val="18"/>
+        </w:rPr>
+        <w:t>/strømskinne</w:t>
+      </w:r>
+      <w:r>
+        <w:rPr>
+          <w:rFonts w:ascii="Verdana" w:hAnsi="Verdana" w:cs="Arial"/>
+          <w:sz w:val="18"/>
+          <w:szCs w:val="18"/>
+        </w:rPr>
+        <w:t xml:space="preserve"> og dertil pris.</w:t>
+      </w:r>
+    </w:p>
+    <w:p>
+      <w:pPr>
+        <w:rPr>
+          <w:rFonts w:ascii="Verdana" w:hAnsi="Verdana" w:cs="Arial"/>
+          <w:sz w:val="18"/>
+          <w:szCs w:val="18"/>
+        </w:rPr>
+      </w:pPr>
+      <w:r>
+        <w:rPr>
+          <w:rFonts w:ascii="Verdana" w:hAnsi="Verdana" w:cs="Arial"/>
+          <w:sz w:val="18"/>
+          <w:szCs w:val="18"/>
+        </w:rPr>
+        <w:t>Ved feil og/eller mangler i mottatt underlag, eller endring av opprinnelig spesifikasjon/underlag, må en priskonsekvens påregnes.</w:t>
+      </w:r>
+    </w:p>
+    <w:p>
+      <w:pPr>
+        <w:rPr>
+          <w:rFonts w:ascii="Verdana" w:hAnsi="Verdana" w:cs="Arial"/>
+          <w:sz w:val="18"/>
+          <w:szCs w:val="18"/>
+        </w:rPr>
+      </w:pPr>
+      <w:r>
+        <w:rPr>
+          <w:rFonts w:ascii="Verdana" w:hAnsi="Verdana" w:cs="Arial"/>
+          <w:sz w:val="18"/>
+          <w:szCs w:val="18"/>
+        </w:rPr>
+        <w:t>Prisgrunnlag (stykklister, skisser og beskrivelser m.m.) skal kontrolleres og godkjennes før en eventuell bestilling plasseres.</w:t>
+      </w:r>
+    </w:p>
+    <w:p>
+      <w:pPr>
+        <w:rPr>
+          <w:rFonts w:ascii="Verdana" w:hAnsi="Verdana" w:cs="Arial"/>
+          <w:sz w:val="18"/>
+          <w:szCs w:val="18"/>
+        </w:rPr>
       </w:pPr>
       <w:r>
         <w:rPr>
           <w:rFonts w:ascii="Verdana" w:eastAsia="Times New Roman" w:hAnsi="Verdana" w:cs="Arial"/>
-          <w:color w:val="FF0000"/>
           <w:sz w:val="18"/>
           <w:szCs w:val="18"/>
           <w:lang w:eastAsia="en-US"/>
         </w:rPr>
-        <w:t>•</w:t>
+        <w:t>BUSBAR / MCS</w:t>
+      </w:r>
+      <w:r>
+        <w:rPr>
+          <w:rFonts w:ascii="Verdana" w:hAnsi="Verdana" w:cs="Arial"/>
+          <w:sz w:val="18"/>
+          <w:szCs w:val="18"/>
+        </w:rPr>
+        <w:t xml:space="preserve"> sine leveringsbetingelser er iht. siste utgave av Incoterm sine betingelser.</w:t>
+      </w:r>
+      <w:r>
+        <w:rPr>
+          <w:rFonts w:ascii="Verdana" w:hAnsi="Verdana" w:cs="Arial"/>
+          <w:sz w:val="18"/>
+          <w:szCs w:val="18"/>
+        </w:rPr>
+        <w:br/>
       </w:r>
       <w:r>
         <w:rPr>
           <w:rFonts w:ascii="Verdana" w:eastAsia="Times New Roman" w:hAnsi="Verdana" w:cs="Arial"/>
-          <w:color w:val="FF0000"/>
           <w:sz w:val="18"/>
           <w:szCs w:val="18"/>
           <w:lang w:eastAsia="en-US"/>
         </w:rPr>
-        <w:tab/>
-        <w:t xml:space="preserve">Over 3,0 meter høyde må oppdragsgiver beregne leie av stillas / lift. </w:t>
-      </w:r>
-    </w:p>
-    <w:p>
-      <w:pPr>
-        <w:spacing w:after="0" w:line="240" w:lineRule="auto"/>
+        <w:t>BUSBAR / MCS</w:t>
+      </w:r>
+      <w:r>
+        <w:rPr>
+          <w:rFonts w:ascii="Verdana" w:hAnsi="Verdana" w:cs="Arial"/>
+          <w:sz w:val="18"/>
+          <w:szCs w:val="18"/>
+        </w:rPr>
+        <w:t xml:space="preserve"> </w:t>
+      </w:r>
+      <w:r>
+        <w:rPr>
+          <w:rFonts w:ascii="Verdana" w:hAnsi="Verdana" w:cs="Arial"/>
+          <w:sz w:val="18"/>
+          <w:szCs w:val="18"/>
+        </w:rPr>
+        <w:t>leverer normalt EXW – Ex Works.</w:t>
+      </w:r>
+    </w:p>
+    <w:p>
+      <w:pPr>
+        <w:rPr>
+          <w:rFonts w:ascii="Verdana" w:hAnsi="Verdana" w:cs="Arial"/>
+          <w:sz w:val="18"/>
+          <w:szCs w:val="18"/>
+        </w:rPr>
+      </w:pPr>
+      <w:r>
+        <w:rPr>
+          <w:rFonts w:ascii="Verdana" w:hAnsi="Verdana" w:cs="Arial"/>
+          <w:sz w:val="18"/>
+          <w:szCs w:val="18"/>
+        </w:rPr>
+        <w:t xml:space="preserve">I de tilfeller fraktkostnader </w:t>
+      </w:r>
+      <w:r>
+        <w:rPr>
+          <w:rFonts w:ascii="Verdana" w:hAnsi="Verdana" w:cs="Arial"/>
+          <w:sz w:val="18"/>
+          <w:szCs w:val="18"/>
+        </w:rPr>
+        <w:t>er</w:t>
+      </w:r>
+      <w:r>
+        <w:rPr>
+          <w:rFonts w:ascii="Verdana" w:hAnsi="Verdana" w:cs="Arial"/>
+          <w:sz w:val="18"/>
+          <w:szCs w:val="18"/>
+        </w:rPr>
+        <w:t xml:space="preserve"> inkludert i tilbudet, benyttes rimeligste fraktalternativ. Ved eventuelle tilleggskrav (f.eks. klimanøytral leveranse, kran, kundespesifiserte krav o.l. som ikke kommer tydelig fram i forespørsel) faktureres dette etterskuddsvis.</w:t>
+      </w:r>
+    </w:p>
+    <w:p>
+      <w:pPr>
+        <w:rPr>
+          <w:rFonts w:ascii="Verdana" w:hAnsi="Verdana" w:cs="Arial"/>
+          <w:sz w:val="18"/>
+          <w:szCs w:val="18"/>
+        </w:rPr>
+      </w:pPr>
+      <w:r>
+        <w:rPr>
+          <w:rFonts w:ascii="Verdana" w:hAnsi="Verdana" w:cs="Arial"/>
+          <w:sz w:val="18"/>
+          <w:szCs w:val="18"/>
+        </w:rPr>
+        <w:t xml:space="preserve">Standard betalingsbetingelser: </w:t>
+      </w:r>
+      <w:r>
+        <w:rPr>
+          <w:rFonts w:ascii="Verdana" w:hAnsi="Verdana" w:cs="Arial"/>
+          <w:sz w:val="18"/>
+          <w:szCs w:val="18"/>
+        </w:rPr>
+        <w:t>3</w:t>
+      </w:r>
+      <w:r>
+        <w:rPr>
+          <w:rFonts w:ascii="Verdana" w:hAnsi="Verdana" w:cs="Arial"/>
+          <w:sz w:val="18"/>
+          <w:szCs w:val="18"/>
+        </w:rPr>
+        <w:t>0 dager</w:t>
+      </w:r>
+    </w:p>
+    <w:p>
+      <w:pPr>
+        <w:rPr>
+          <w:rFonts w:ascii="Verdana" w:hAnsi="Verdana" w:cs="Arial"/>
+          <w:sz w:val="18"/>
+          <w:szCs w:val="18"/>
+        </w:rPr>
+      </w:pPr>
+      <w:r>
+        <w:rPr>
+          <w:rFonts w:ascii="Verdana" w:hAnsi="Verdana" w:cs="Arial"/>
+          <w:sz w:val="18"/>
+          <w:szCs w:val="18"/>
+        </w:rPr>
+        <w:t xml:space="preserve">Prisene er basert på dagens valuta / EUR, USD ut </w:t>
+      </w:r>
+      <w:r>
+        <w:rPr>
+          <w:rFonts w:ascii="Verdana" w:hAnsi="Verdana" w:cs="Arial"/>
+          <w:sz w:val="18"/>
+          <w:szCs w:val="18"/>
+        </w:rPr>
+        <w:t>ifra</w:t>
+      </w:r>
+      <w:r>
+        <w:rPr>
+          <w:rFonts w:ascii="Verdana" w:hAnsi="Verdana" w:cs="Arial"/>
+          <w:sz w:val="18"/>
+          <w:szCs w:val="18"/>
+        </w:rPr>
+        <w:t xml:space="preserve"> hvilket produkt som leveres.</w:t>
+      </w:r>
+    </w:p>
+    <w:p>
+      <w:pPr>
+        <w:rPr>
+          <w:rFonts w:ascii="Verdana" w:hAnsi="Verdana" w:cs="Arial"/>
+          <w:sz w:val="18"/>
+          <w:szCs w:val="18"/>
+        </w:rPr>
+      </w:pPr>
+      <w:r>
+        <w:rPr>
+          <w:rFonts w:ascii="Verdana" w:hAnsi="Verdana" w:cs="Arial"/>
+          <w:sz w:val="18"/>
+          <w:szCs w:val="18"/>
+        </w:rPr>
+        <w:t>{{</w:t>
+      </w:r>
+      <w:r>
+        <w:rPr>
+          <w:rFonts w:ascii="Verdana" w:hAnsi="Verdana" w:cs="Arial"/>
+          <w:sz w:val="18"/>
+          <w:szCs w:val="18"/>
+        </w:rPr>
+        <w:t>EUR</w:t>
+      </w:r>
+      <w:r>
+        <w:rPr>
+          <w:rFonts w:ascii="Verdana" w:hAnsi="Verdana" w:cs="Arial"/>
+          <w:sz w:val="18"/>
+          <w:szCs w:val="18"/>
+        </w:rPr>
+        <w:t>_NOK_DAGENS}}</w:t>
+      </w:r>
+      <w:r>
+        <w:rPr>
+          <w:rFonts w:ascii="Verdana" w:hAnsi="Verdana" w:cs="Arial"/>
+          <w:sz w:val="18"/>
+          <w:szCs w:val="18"/>
+        </w:rPr>
+        <w:br/>
+      </w:r>
+      <w:r>
+        <w:rPr>
+          <w:rFonts w:ascii="Verdana" w:hAnsi="Verdana" w:cs="Arial"/>
+          <w:sz w:val="18"/>
+          <w:szCs w:val="18"/>
+        </w:rPr>
+        <w:t>{{USD_NOK_DAGENS}}</w:t>
+      </w:r>
+    </w:p>
+    <w:p>
+      <w:pPr>
+        <w:rPr>
+          <w:rFonts w:ascii="Verdana" w:hAnsi="Verdana" w:cs="Arial"/>
+          <w:sz w:val="18"/>
+          <w:szCs w:val="18"/>
+        </w:rPr>
+      </w:pPr>
+    </w:p>
+    <w:p>
+      <w:pPr>
+        <w:rPr>
+          <w:rFonts w:ascii="Verdana" w:hAnsi="Verdana" w:cs="Arial"/>
+          <w:sz w:val="18"/>
+          <w:szCs w:val="18"/>
+        </w:rPr>
+      </w:pPr>
+      <w:r>
+        <w:rPr>
+          <w:rFonts w:ascii="Verdana" w:hAnsi="Verdana" w:cs="Arial"/>
+          <w:sz w:val="18"/>
+          <w:szCs w:val="18"/>
+        </w:rPr>
+        <w:t>Leveringstid er beregnet til: 8</w:t>
+      </w:r>
+      <w:r>
+        <w:rPr>
+          <w:rFonts w:ascii="Verdana" w:hAnsi="Verdana" w:cs="Arial"/>
+          <w:sz w:val="18"/>
+          <w:szCs w:val="18"/>
+        </w:rPr>
+        <w:t xml:space="preserve">-10 </w:t>
+      </w:r>
+      <w:r>
+        <w:rPr>
+          <w:rFonts w:ascii="Verdana" w:hAnsi="Verdana" w:cs="Arial"/>
+          <w:sz w:val="18"/>
+          <w:szCs w:val="18"/>
+        </w:rPr>
+        <w:t>uker etter godkjent tegning</w:t>
+      </w:r>
+    </w:p>
+    <w:p>
+      <w:pPr>
+        <w:rPr>
+          <w:rFonts w:ascii="Verdana" w:hAnsi="Verdana" w:cs="Arial"/>
+          <w:sz w:val="18"/>
+          <w:szCs w:val="18"/>
+        </w:rPr>
+      </w:pPr>
+      <w:r>
+        <w:rPr>
+          <w:rFonts w:ascii="Verdana" w:hAnsi="Verdana" w:cs="Arial"/>
+          <w:sz w:val="18"/>
+          <w:szCs w:val="18"/>
+        </w:rPr>
+        <w:t>Forutsetninger:</w:t>
+      </w:r>
+    </w:p>
+    <w:p>
+      <w:pPr>
+        <w:pStyle w:val="Listeavsnitt"/>
+        <w:numPr>
+          <w:ilvl w:val="0"/>
+          <w:numId w:val="12"/>
+        </w:numPr>
+        <w:rPr>
+          <w:rFonts w:ascii="Verdana" w:hAnsi="Verdana" w:cs="Arial"/>
+          <w:sz w:val="18"/>
+          <w:szCs w:val="18"/>
+        </w:rPr>
+      </w:pPr>
+      <w:r>
+        <w:rPr>
+          <w:rFonts w:ascii="Verdana" w:hAnsi="Verdana" w:cs="Arial"/>
+          <w:sz w:val="18"/>
+          <w:szCs w:val="18"/>
+        </w:rPr>
+        <w:t xml:space="preserve">Underlag fra kunde </w:t>
+      </w:r>
+    </w:p>
+    <w:p>
+      <w:pPr>
+        <w:pStyle w:val="Listeavsnitt"/>
+        <w:numPr>
+          <w:ilvl w:val="0"/>
+          <w:numId w:val="11"/>
+        </w:numPr>
+        <w:rPr>
+          <w:rFonts w:ascii="Verdana" w:hAnsi="Verdana" w:cs="Arial"/>
+          <w:sz w:val="18"/>
+          <w:szCs w:val="18"/>
+        </w:rPr>
+      </w:pPr>
+      <w:r>
+        <w:rPr>
+          <w:rFonts w:ascii="Verdana" w:hAnsi="Verdana" w:cs="Arial"/>
+          <w:sz w:val="18"/>
+          <w:szCs w:val="18"/>
+        </w:rPr>
+        <w:t xml:space="preserve">Tegninger og skisser er skriftlig godkjent </w:t>
+      </w:r>
+      <w:r>
+        <w:rPr>
+          <w:rFonts w:ascii="Verdana" w:hAnsi="Verdana" w:cs="Arial"/>
+          <w:sz w:val="18"/>
+          <w:szCs w:val="18"/>
+        </w:rPr>
+        <w:t>fra kunde</w:t>
+      </w:r>
+    </w:p>
+    <w:p>
+      <w:pPr>
+        <w:rPr>
+          <w:rFonts w:ascii="Verdana" w:hAnsi="Verdana" w:cs="Arial"/>
+          <w:sz w:val="18"/>
+          <w:szCs w:val="18"/>
+        </w:rPr>
+      </w:pPr>
+    </w:p>
+    <w:p>
+      <w:pPr>
+        <w:rPr>
+          <w:rFonts w:ascii="Verdana" w:hAnsi="Verdana" w:cs="Arial"/>
+          <w:sz w:val="18"/>
+          <w:szCs w:val="18"/>
+        </w:rPr>
+      </w:pPr>
+      <w:r>
+        <w:rPr>
+          <w:rFonts w:ascii="Verdana" w:hAnsi="Verdana" w:cs="Arial"/>
+          <w:sz w:val="18"/>
+          <w:szCs w:val="18"/>
+        </w:rPr>
+        <w:t>S</w:t>
+      </w:r>
+      <w:r>
+        <w:rPr>
+          <w:rFonts w:ascii="Verdana" w:hAnsi="Verdana" w:cs="Arial"/>
+          <w:sz w:val="18"/>
+          <w:szCs w:val="18"/>
+        </w:rPr>
+        <w:t>kulle det være behov for ytterligere opplysninger, står vi gjerne til tjeneste.</w:t>
+      </w:r>
+    </w:p>
+    <w:p>
+      <w:pPr>
+        <w:rPr>
+          <w:rFonts w:ascii="Verdana" w:hAnsi="Verdana" w:cs="Arial"/>
+          <w:sz w:val="18"/>
+          <w:szCs w:val="18"/>
+        </w:rPr>
+      </w:pPr>
+    </w:p>
+    <w:p>
+      <w:pPr>
+        <w:rPr>
+          <w:rFonts w:ascii="Verdana" w:hAnsi="Verdana" w:cs="Arial"/>
+          <w:sz w:val="18"/>
+          <w:szCs w:val="18"/>
+        </w:rPr>
+      </w:pPr>
+    </w:p>
+    <w:p>
+      <w:pPr>
+        <w:rPr>
+          <w:rFonts w:ascii="Verdana" w:hAnsi="Verdana" w:cs="Arial"/>
+          <w:sz w:val="18"/>
+          <w:szCs w:val="18"/>
+        </w:rPr>
+      </w:pPr>
+      <w:r>
+        <w:rPr>
+          <w:rFonts w:ascii="Verdana" w:hAnsi="Verdana" w:cs="Arial"/>
+          <w:sz w:val="18"/>
+          <w:szCs w:val="18"/>
+        </w:rPr>
+        <w:t xml:space="preserve">Med hilsen </w:t>
+      </w:r>
+      <w:r>
         <w:rPr>
           <w:rFonts w:ascii="Verdana" w:eastAsia="Times New Roman" w:hAnsi="Verdana" w:cs="Arial"/>
-          <w:color w:val="FF0000"/>
           <w:sz w:val="18"/>
           <w:szCs w:val="18"/>
           <w:lang w:eastAsia="en-US"/>
         </w:rPr>
-      </w:pPr>
-      <w:r>
-        <w:rPr>
-          <w:rFonts w:ascii="Verdana" w:eastAsia="Times New Roman" w:hAnsi="Verdana" w:cs="Arial"/>
-          <w:color w:val="FF0000"/>
-          <w:sz w:val="18"/>
-          <w:szCs w:val="18"/>
-          <w:lang w:eastAsia="en-US"/>
-        </w:rPr>
-        <w:t>•</w:t>
-      </w:r>
-      <w:r>
-        <w:rPr>
-          <w:rFonts w:ascii="Verdana" w:eastAsia="Times New Roman" w:hAnsi="Verdana" w:cs="Arial"/>
-          <w:color w:val="FF0000"/>
-          <w:sz w:val="18"/>
-          <w:szCs w:val="18"/>
-          <w:lang w:eastAsia="en-US"/>
-        </w:rPr>
-        <w:tab/>
-        <w:t xml:space="preserve">Demontering av eksisterende skinne er ikke inkludert i prisen. </w:t>
-      </w:r>
-    </w:p>
-    <w:p>
-      <w:pPr>
-        <w:spacing w:after="0" w:line="240" w:lineRule="auto"/>
-        <w:rPr>
-          <w:rFonts w:ascii="Verdana" w:eastAsia="Times New Roman" w:hAnsi="Verdana" w:cs="Arial"/>
-          <w:color w:val="FF0000"/>
-          <w:sz w:val="18"/>
-          <w:szCs w:val="18"/>
-          <w:lang w:eastAsia="en-US"/>
-        </w:rPr>
-      </w:pPr>
-      <w:r>
-        <w:rPr>
-          <w:rFonts w:ascii="Verdana" w:eastAsia="Times New Roman" w:hAnsi="Verdana" w:cs="Arial"/>
-          <w:color w:val="FF0000"/>
-          <w:sz w:val="18"/>
-          <w:szCs w:val="18"/>
-          <w:lang w:eastAsia="en-US"/>
-        </w:rPr>
-        <w:t>•</w:t>
-      </w:r>
-      <w:r>
-        <w:rPr>
-          <w:rFonts w:ascii="Verdana" w:eastAsia="Times New Roman" w:hAnsi="Verdana" w:cs="Arial"/>
-          <w:color w:val="FF0000"/>
-          <w:sz w:val="18"/>
-          <w:szCs w:val="18"/>
-          <w:lang w:eastAsia="en-US"/>
-        </w:rPr>
-        <w:tab/>
-        <w:t xml:space="preserve">Hulltaking i sikringsskap, vegger og tak er ikke inkludert i prisen. </w:t>
-      </w:r>
-    </w:p>
-    <w:p>
-      <w:pPr>
-        <w:spacing w:after="0" w:line="240" w:lineRule="auto"/>
-        <w:rPr>
-          <w:rFonts w:ascii="Verdana" w:eastAsia="Times New Roman" w:hAnsi="Verdana" w:cs="Arial"/>
-          <w:color w:val="FF0000"/>
-          <w:sz w:val="18"/>
-          <w:szCs w:val="18"/>
-          <w:lang w:eastAsia="en-US"/>
-        </w:rPr>
-      </w:pPr>
-      <w:r>
-        <w:rPr>
-          <w:rFonts w:ascii="Verdana" w:eastAsia="Times New Roman" w:hAnsi="Verdana" w:cs="Arial"/>
-          <w:color w:val="FF0000"/>
-          <w:sz w:val="18"/>
-          <w:szCs w:val="18"/>
-          <w:lang w:eastAsia="en-US"/>
-        </w:rPr>
-        <w:t>•</w:t>
-      </w:r>
-      <w:r>
-        <w:rPr>
-          <w:rFonts w:ascii="Verdana" w:eastAsia="Times New Roman" w:hAnsi="Verdana" w:cs="Arial"/>
-          <w:color w:val="FF0000"/>
-          <w:sz w:val="18"/>
-          <w:szCs w:val="18"/>
-          <w:lang w:eastAsia="en-US"/>
-        </w:rPr>
-        <w:tab/>
-        <w:t xml:space="preserve">Montering og tilkobling av </w:t>
-      </w:r>
-      <w:proofErr w:type="spellStart"/>
-      <w:r>
-        <w:rPr>
-          <w:rFonts w:ascii="Verdana" w:eastAsia="Times New Roman" w:hAnsi="Verdana" w:cs="Arial"/>
-          <w:color w:val="FF0000"/>
-          <w:sz w:val="18"/>
-          <w:szCs w:val="18"/>
-          <w:lang w:eastAsia="en-US"/>
-        </w:rPr>
-        <w:t>talve</w:t>
-      </w:r>
-      <w:proofErr w:type="spellEnd"/>
-      <w:r>
-        <w:rPr>
-          <w:rFonts w:ascii="Verdana" w:eastAsia="Times New Roman" w:hAnsi="Verdana" w:cs="Arial"/>
-          <w:color w:val="FF0000"/>
-          <w:sz w:val="18"/>
-          <w:szCs w:val="18"/>
-          <w:lang w:eastAsia="en-US"/>
-        </w:rPr>
-        <w:t xml:space="preserve">-elementer er ikke inkludert i prisen. </w:t>
-      </w:r>
-    </w:p>
-    <w:p>
-      <w:pPr>
-        <w:spacing w:after="0" w:line="240" w:lineRule="auto"/>
-        <w:rPr>
-          <w:rFonts w:ascii="Verdana" w:eastAsia="Times New Roman" w:hAnsi="Verdana" w:cs="Arial"/>
-          <w:color w:val="FF0000"/>
-          <w:sz w:val="18"/>
-          <w:szCs w:val="18"/>
-          <w:lang w:eastAsia="en-US"/>
-        </w:rPr>
-      </w:pPr>
-      <w:r>
-        <w:rPr>
-          <w:rFonts w:ascii="Verdana" w:eastAsia="Times New Roman" w:hAnsi="Verdana" w:cs="Arial"/>
-          <w:color w:val="FF0000"/>
-          <w:sz w:val="18"/>
-          <w:szCs w:val="18"/>
-          <w:lang w:eastAsia="en-US"/>
-        </w:rPr>
-        <w:t>•</w:t>
-      </w:r>
-      <w:r>
-        <w:rPr>
-          <w:rFonts w:ascii="Verdana" w:eastAsia="Times New Roman" w:hAnsi="Verdana" w:cs="Arial"/>
-          <w:color w:val="FF0000"/>
-          <w:sz w:val="18"/>
-          <w:szCs w:val="18"/>
-          <w:lang w:eastAsia="en-US"/>
-        </w:rPr>
-        <w:tab/>
-        <w:t>Jording av utsatte deler og branntetting er ikke inkludert i prisen.</w:t>
-      </w:r>
-    </w:p>
-    <w:p>
-      <w:pPr>
-        <w:spacing w:after="0" w:line="240" w:lineRule="auto"/>
-        <w:rPr>
-          <w:rFonts w:ascii="Verdana" w:eastAsia="Times New Roman" w:hAnsi="Verdana" w:cs="Arial"/>
-          <w:color w:val="FF0000"/>
-          <w:sz w:val="18"/>
-          <w:szCs w:val="18"/>
-          <w:lang w:eastAsia="en-US"/>
-        </w:rPr>
-      </w:pPr>
-      <w:r>
-        <w:rPr>
-          <w:rFonts w:ascii="Verdana" w:eastAsia="Times New Roman" w:hAnsi="Verdana" w:cs="Arial"/>
-          <w:color w:val="FF0000"/>
-          <w:sz w:val="18"/>
-          <w:szCs w:val="18"/>
-          <w:lang w:eastAsia="en-US"/>
-        </w:rPr>
-        <w:tab/>
-      </w:r>
-    </w:p>
-    <w:p>
-      <w:pPr>
-        <w:spacing w:after="0" w:line="240" w:lineRule="auto"/>
-        <w:rPr>
-          <w:rFonts w:ascii="Verdana" w:eastAsia="Times New Roman" w:hAnsi="Verdana" w:cs="Arial"/>
-          <w:color w:val="FF0000"/>
-          <w:sz w:val="18"/>
-          <w:szCs w:val="18"/>
-          <w:lang w:eastAsia="en-US"/>
-        </w:rPr>
-      </w:pPr>
-      <w:r>
-        <w:rPr>
-          <w:rFonts w:ascii="Verdana" w:eastAsia="Times New Roman" w:hAnsi="Verdana" w:cs="Arial"/>
-          <w:color w:val="FF0000"/>
-          <w:sz w:val="18"/>
-          <w:szCs w:val="18"/>
-          <w:lang w:eastAsia="en-US"/>
-        </w:rPr>
-        <w:t xml:space="preserve">Oppdragsgiver er ansvarlig for at strømskinnene blir losset og lagret under tak i nærheten av montasje stedet. Hvis det oppstår forsinkelser på byggeplassen utenfor </w:t>
-      </w:r>
-      <w:proofErr w:type="spellStart"/>
-      <w:r>
-        <w:rPr>
-          <w:rFonts w:ascii="Verdana" w:eastAsia="Times New Roman" w:hAnsi="Verdana" w:cs="Arial"/>
-          <w:color w:val="FF0000"/>
-          <w:sz w:val="18"/>
-          <w:szCs w:val="18"/>
-          <w:lang w:eastAsia="en-US"/>
-        </w:rPr>
-        <w:t>MicroMatic</w:t>
-      </w:r>
-      <w:proofErr w:type="spellEnd"/>
-      <w:r>
-        <w:rPr>
-          <w:rFonts w:ascii="Verdana" w:eastAsia="Times New Roman" w:hAnsi="Verdana" w:cs="Arial"/>
-          <w:color w:val="FF0000"/>
-          <w:sz w:val="18"/>
-          <w:szCs w:val="18"/>
-          <w:lang w:eastAsia="en-US"/>
-        </w:rPr>
-        <w:t xml:space="preserve"> sin kontroll under montasjeprosessen eller endringer av opprinnelig strømskinne løsning faktureres dette fortløpende i henhold til </w:t>
-      </w:r>
-      <w:proofErr w:type="spellStart"/>
-      <w:r>
-        <w:rPr>
-          <w:rFonts w:ascii="Verdana" w:eastAsia="Times New Roman" w:hAnsi="Verdana" w:cs="Arial"/>
-          <w:color w:val="FF0000"/>
-          <w:sz w:val="18"/>
-          <w:szCs w:val="18"/>
-          <w:lang w:eastAsia="en-US"/>
-        </w:rPr>
-        <w:t>MicroMatic</w:t>
-      </w:r>
-      <w:proofErr w:type="spellEnd"/>
-      <w:r>
-        <w:rPr>
-          <w:rFonts w:ascii="Verdana" w:eastAsia="Times New Roman" w:hAnsi="Verdana" w:cs="Arial"/>
-          <w:color w:val="FF0000"/>
-          <w:sz w:val="18"/>
-          <w:szCs w:val="18"/>
-          <w:lang w:eastAsia="en-US"/>
-        </w:rPr>
-        <w:t xml:space="preserve"> sine generelle salgsbetingelser og prisliste. </w:t>
-      </w:r>
-    </w:p>
-    <w:p>
-      <w:pPr>
-        <w:rPr>
-          <w:rFonts w:ascii="Verdana" w:hAnsi="Verdana" w:cs="Arial"/>
-          <w:sz w:val="18"/>
-          <w:szCs w:val="18"/>
-        </w:rPr>
-      </w:pPr>
-      <w:r>
-        <w:rPr>
-          <w:rFonts w:ascii="Verdana" w:eastAsia="Times New Roman" w:hAnsi="Verdana" w:cs="Arial"/>
-          <w:color w:val="FF0000"/>
-          <w:sz w:val="18"/>
-          <w:szCs w:val="18"/>
-          <w:lang w:eastAsia="en-US"/>
-        </w:rPr>
-        <w:t>Generell garantitid er 12 måneder fra overlevering til oppdragsgiver. Ansvar er begrenset til utbedring av feil eller</w:t>
-      </w:r>
-    </w:p>
-    <w:p>
-      <w:pPr>
-        <w:rPr>
-          <w:rFonts w:ascii="Verdana" w:hAnsi="Verdana" w:cs="Arial"/>
-          <w:sz w:val="18"/>
-          <w:szCs w:val="18"/>
-        </w:rPr>
-      </w:pPr>
-    </w:p>
-    <w:p>
-      <w:pPr>
-        <w:rPr>
-          <w:rFonts w:ascii="Verdana" w:hAnsi="Verdana" w:cs="Arial"/>
-          <w:sz w:val="18"/>
-          <w:szCs w:val="18"/>
-        </w:rPr>
-      </w:pPr>
-      <w:r>
-        <w:rPr>
-          <w:rFonts w:ascii="Verdana" w:hAnsi="Verdana" w:cs="Arial"/>
-          <w:sz w:val="18"/>
-          <w:szCs w:val="18"/>
-        </w:rPr>
-        <w:t>Vi gjør oppmerksom på, at hvis kortslutningsnivå ikke er kjent, kan dette ha påvirkning på valg av vern</w:t>
-      </w:r>
-      <w:r>
-        <w:rPr>
-          <w:rFonts w:ascii="Verdana" w:hAnsi="Verdana" w:cs="Arial"/>
-          <w:sz w:val="18"/>
-          <w:szCs w:val="18"/>
-        </w:rPr>
-        <w:t>/strømskinne</w:t>
-      </w:r>
-      <w:r>
-        <w:rPr>
-          <w:rFonts w:ascii="Verdana" w:hAnsi="Verdana" w:cs="Arial"/>
-          <w:sz w:val="18"/>
-          <w:szCs w:val="18"/>
-        </w:rPr>
-        <w:t xml:space="preserve"> og dertil pris.</w:t>
-      </w:r>
-    </w:p>
-    <w:p>
-      <w:pPr>
-        <w:rPr>
-          <w:rFonts w:ascii="Verdana" w:hAnsi="Verdana" w:cs="Arial"/>
-          <w:sz w:val="18"/>
-          <w:szCs w:val="18"/>
-        </w:rPr>
-      </w:pPr>
-      <w:r>
-        <w:rPr>
-          <w:rFonts w:ascii="Verdana" w:hAnsi="Verdana" w:cs="Arial"/>
-          <w:sz w:val="18"/>
-          <w:szCs w:val="18"/>
-        </w:rPr>
-        <w:t>Ved feil og/eller mangler i mottatt underlag, eller endring av opprinnelig spesifikasjon/underlag, må en priskonsekvens påregnes.</w:t>
-      </w:r>
-    </w:p>
-    <w:p>
-      <w:pPr>
-        <w:rPr>
-          <w:rFonts w:ascii="Verdana" w:hAnsi="Verdana" w:cs="Arial"/>
-          <w:sz w:val="18"/>
-          <w:szCs w:val="18"/>
-        </w:rPr>
-      </w:pPr>
-      <w:r>
-        <w:rPr>
-          <w:rFonts w:ascii="Verdana" w:hAnsi="Verdana" w:cs="Arial"/>
-          <w:sz w:val="18"/>
-          <w:szCs w:val="18"/>
-        </w:rPr>
-        <w:t>Prisgrunnlag (</w:t>
-      </w:r>
-      <w:proofErr w:type="spellStart"/>
-      <w:r>
-        <w:rPr>
-          <w:rFonts w:ascii="Verdana" w:hAnsi="Verdana" w:cs="Arial"/>
-          <w:sz w:val="18"/>
-          <w:szCs w:val="18"/>
-        </w:rPr>
-        <w:t>stykklister</w:t>
-      </w:r>
-      <w:proofErr w:type="spellEnd"/>
-      <w:r>
-        <w:rPr>
-          <w:rFonts w:ascii="Verdana" w:hAnsi="Verdana" w:cs="Arial"/>
-          <w:sz w:val="18"/>
-          <w:szCs w:val="18"/>
-        </w:rPr>
-        <w:t>, skisser og beskrivelser m.m.) skal kontrolleres og godkjennes før en eventuell bestilling plasseres.</w:t>
-      </w:r>
-    </w:p>
-    <w:p>
-      <w:pPr>
-        <w:rPr>
-          <w:rFonts w:ascii="Verdana" w:hAnsi="Verdana" w:cs="Arial"/>
-          <w:color w:val="FF0000"/>
-          <w:sz w:val="18"/>
-          <w:szCs w:val="18"/>
-        </w:rPr>
-      </w:pPr>
-      <w:proofErr w:type="spellStart"/>
-      <w:r>
-        <w:rPr>
-          <w:rFonts w:ascii="Verdana" w:hAnsi="Verdana" w:cs="Arial"/>
-          <w:color w:val="FF0000"/>
-          <w:sz w:val="18"/>
-          <w:szCs w:val="18"/>
-        </w:rPr>
-        <w:t>Ernström</w:t>
-      </w:r>
-      <w:proofErr w:type="spellEnd"/>
-      <w:r>
-        <w:rPr>
-          <w:rFonts w:ascii="Verdana" w:hAnsi="Verdana" w:cs="Arial"/>
-          <w:color w:val="FF0000"/>
-          <w:sz w:val="18"/>
-          <w:szCs w:val="18"/>
-        </w:rPr>
-        <w:t xml:space="preserve"> </w:t>
-      </w:r>
-      <w:proofErr w:type="spellStart"/>
-      <w:r>
-        <w:rPr>
-          <w:rFonts w:ascii="Verdana" w:hAnsi="Verdana" w:cs="Arial"/>
-          <w:color w:val="FF0000"/>
-          <w:sz w:val="18"/>
-          <w:szCs w:val="18"/>
-        </w:rPr>
-        <w:t>Electro</w:t>
-      </w:r>
-      <w:proofErr w:type="spellEnd"/>
-      <w:r>
-        <w:rPr>
-          <w:rFonts w:ascii="Verdana" w:hAnsi="Verdana" w:cs="Arial"/>
-          <w:color w:val="FF0000"/>
-          <w:sz w:val="18"/>
-          <w:szCs w:val="18"/>
-        </w:rPr>
-        <w:t xml:space="preserve"> AS sine leveringsbetingelser er iht. siste utgave av </w:t>
-      </w:r>
-      <w:proofErr w:type="spellStart"/>
-      <w:r>
-        <w:rPr>
-          <w:rFonts w:ascii="Verdana" w:hAnsi="Verdana" w:cs="Arial"/>
-          <w:color w:val="FF0000"/>
-          <w:sz w:val="18"/>
-          <w:szCs w:val="18"/>
-        </w:rPr>
-        <w:t>Incoterm</w:t>
-      </w:r>
-      <w:proofErr w:type="spellEnd"/>
-      <w:r>
-        <w:rPr>
-          <w:rFonts w:ascii="Verdana" w:hAnsi="Verdana" w:cs="Arial"/>
-          <w:color w:val="FF0000"/>
-          <w:sz w:val="18"/>
-          <w:szCs w:val="18"/>
-        </w:rPr>
-        <w:t xml:space="preserve"> sine betingelser. </w:t>
-      </w:r>
-      <w:proofErr w:type="spellStart"/>
-      <w:r>
-        <w:rPr>
-          <w:rFonts w:ascii="Verdana" w:hAnsi="Verdana" w:cs="Arial"/>
-          <w:color w:val="FF0000"/>
-          <w:sz w:val="18"/>
-          <w:szCs w:val="18"/>
-        </w:rPr>
-        <w:t>Ernström</w:t>
-      </w:r>
-      <w:proofErr w:type="spellEnd"/>
-      <w:r>
-        <w:rPr>
-          <w:rFonts w:ascii="Verdana" w:hAnsi="Verdana" w:cs="Arial"/>
-          <w:color w:val="FF0000"/>
-          <w:sz w:val="18"/>
-          <w:szCs w:val="18"/>
-        </w:rPr>
-        <w:t xml:space="preserve"> </w:t>
-      </w:r>
-      <w:proofErr w:type="spellStart"/>
-      <w:r>
-        <w:rPr>
-          <w:rFonts w:ascii="Verdana" w:hAnsi="Verdana" w:cs="Arial"/>
-          <w:color w:val="FF0000"/>
-          <w:sz w:val="18"/>
-          <w:szCs w:val="18"/>
-        </w:rPr>
-        <w:t>Electro</w:t>
-      </w:r>
-      <w:proofErr w:type="spellEnd"/>
-      <w:r>
-        <w:rPr>
-          <w:rFonts w:ascii="Verdana" w:hAnsi="Verdana" w:cs="Arial"/>
-          <w:color w:val="FF0000"/>
-          <w:sz w:val="18"/>
-          <w:szCs w:val="18"/>
-        </w:rPr>
-        <w:t xml:space="preserve"> AS leverer normalt EXW – Ex Works.</w:t>
-      </w:r>
-    </w:p>
-    <w:p>
-      <w:pPr>
-        <w:rPr>
-          <w:rFonts w:ascii="Verdana" w:hAnsi="Verdana" w:cs="Arial"/>
-          <w:color w:val="FF0000"/>
-          <w:sz w:val="18"/>
-          <w:szCs w:val="18"/>
-        </w:rPr>
-      </w:pPr>
-      <w:r>
-        <w:rPr>
-          <w:rFonts w:ascii="Verdana" w:hAnsi="Verdana" w:cs="Arial"/>
-          <w:color w:val="FF0000"/>
-          <w:sz w:val="18"/>
-          <w:szCs w:val="18"/>
-        </w:rPr>
-        <w:t>I de tilfeller fraktkostnader kreves inkludert i tilbudet, benyttes rimeligste fraktalternativ. Ved eventuelle tilleggskrav (f.eks. klimanøytral leveranse, kran, kundespesifiserte krav o.l. som ikke kommer tydelig fram i forespørsel) faktureres dette etterskuddsvis.</w:t>
-      </w:r>
-    </w:p>
-    <w:p>
-      <w:pPr>
-        <w:rPr>
-          <w:rFonts w:ascii="Verdana" w:hAnsi="Verdana" w:cs="Arial"/>
-          <w:sz w:val="18"/>
-          <w:szCs w:val="18"/>
-        </w:rPr>
-      </w:pPr>
-      <w:r>
-        <w:rPr>
-          <w:rFonts w:ascii="Verdana" w:hAnsi="Verdana" w:cs="Arial"/>
-          <w:sz w:val="18"/>
-          <w:szCs w:val="18"/>
-        </w:rPr>
-        <w:t>Standard betalingsbetingelser: 20 dager</w:t>
-      </w:r>
-    </w:p>
-    <w:p>
-      <w:pPr>
-        <w:rPr>
-          <w:rFonts w:ascii="Verdana" w:hAnsi="Verdana" w:cs="Arial"/>
-          <w:sz w:val="18"/>
-          <w:szCs w:val="18"/>
-        </w:rPr>
-      </w:pPr>
-    </w:p>
-    <w:p>
-      <w:pPr>
-        <w:rPr>
-          <w:rFonts w:ascii="Verdana" w:hAnsi="Verdana" w:cs="Arial"/>
-          <w:sz w:val="18"/>
-          <w:szCs w:val="18"/>
-        </w:rPr>
-      </w:pPr>
-      <w:r>
-        <w:rPr>
-          <w:rFonts w:ascii="Verdana" w:hAnsi="Verdana" w:cs="Arial"/>
-          <w:sz w:val="18"/>
-          <w:szCs w:val="18"/>
-        </w:rPr>
-        <w:t>Leveringstid er beregnet til: 8</w:t>
-      </w:r>
-      <w:r>
-        <w:rPr>
-          <w:rFonts w:ascii="Verdana" w:hAnsi="Verdana" w:cs="Arial"/>
-          <w:sz w:val="18"/>
-          <w:szCs w:val="18"/>
-        </w:rPr>
-        <w:t xml:space="preserve">-10 </w:t>
-      </w:r>
-      <w:r>
-        <w:rPr>
-          <w:rFonts w:ascii="Verdana" w:hAnsi="Verdana" w:cs="Arial"/>
-          <w:sz w:val="18"/>
-          <w:szCs w:val="18"/>
-        </w:rPr>
-        <w:t>uker etter godkjent tegning</w:t>
-      </w:r>
-    </w:p>
-    <w:p>
-      <w:pPr>
-        <w:rPr>
-          <w:rFonts w:ascii="Verdana" w:hAnsi="Verdana" w:cs="Arial"/>
-          <w:sz w:val="18"/>
-          <w:szCs w:val="18"/>
-        </w:rPr>
-      </w:pPr>
-      <w:r>
-        <w:rPr>
-          <w:rFonts w:ascii="Verdana" w:hAnsi="Verdana" w:cs="Arial"/>
-          <w:sz w:val="18"/>
-          <w:szCs w:val="18"/>
-        </w:rPr>
-        <w:t>Forutsetninger:</w:t>
-      </w:r>
-    </w:p>
-    <w:p>
-      <w:pPr>
-        <w:rPr>
-          <w:rFonts w:ascii="Verdana" w:hAnsi="Verdana" w:cs="Arial"/>
-          <w:sz w:val="18"/>
-          <w:szCs w:val="18"/>
-        </w:rPr>
-      </w:pPr>
-      <w:r>
-        <w:rPr>
-          <w:rFonts w:ascii="Verdana" w:hAnsi="Verdana" w:cs="Arial"/>
-          <w:sz w:val="18"/>
-          <w:szCs w:val="18"/>
-        </w:rPr>
-        <w:t>•</w:t>
-      </w:r>
-      <w:r>
-        <w:rPr>
-          <w:rFonts w:ascii="Verdana" w:hAnsi="Verdana" w:cs="Arial"/>
-          <w:sz w:val="18"/>
-          <w:szCs w:val="18"/>
-        </w:rPr>
-        <w:tab/>
-        <w:t xml:space="preserve">Underlag fra kunde </w:t>
-      </w:r>
-    </w:p>
-    <w:p>
-      <w:pPr>
-        <w:rPr>
-          <w:rFonts w:ascii="Verdana" w:hAnsi="Verdana" w:cs="Arial"/>
-          <w:sz w:val="18"/>
-          <w:szCs w:val="18"/>
-        </w:rPr>
-      </w:pPr>
-      <w:r>
-        <w:rPr>
-          <w:rFonts w:ascii="Verdana" w:hAnsi="Verdana" w:cs="Arial"/>
-          <w:sz w:val="18"/>
-          <w:szCs w:val="18"/>
-        </w:rPr>
-        <w:t>•</w:t>
-      </w:r>
-      <w:r>
-        <w:rPr>
-          <w:rFonts w:ascii="Verdana" w:hAnsi="Verdana" w:cs="Arial"/>
-          <w:sz w:val="18"/>
-          <w:szCs w:val="18"/>
-        </w:rPr>
-        <w:tab/>
-        <w:t>Tegninger og skisser er skriftlig godkjent i god tid før byggestart</w:t>
-      </w:r>
-    </w:p>
-    <w:p>
-      <w:pPr>
-        <w:rPr>
-          <w:rFonts w:ascii="Verdana" w:hAnsi="Verdana" w:cs="Arial"/>
-          <w:sz w:val="18"/>
-          <w:szCs w:val="18"/>
-        </w:rPr>
-      </w:pPr>
-      <w:r>
-        <w:rPr>
-          <w:rFonts w:ascii="Verdana" w:hAnsi="Verdana" w:cs="Arial"/>
-          <w:sz w:val="18"/>
-          <w:szCs w:val="18"/>
-        </w:rPr>
-        <w:t>Vi håper med dette å ha tjent Dem på beste måte, og skulle det være behov for ytterligere opplysninger, står vi gjerne til tjeneste.</w:t>
-      </w:r>
-    </w:p>
-    <w:p>
-      <w:pPr>
-        <w:rPr>
-          <w:rFonts w:ascii="Verdana" w:hAnsi="Verdana" w:cs="Arial"/>
-          <w:sz w:val="18"/>
-          <w:szCs w:val="18"/>
-        </w:rPr>
-      </w:pPr>
-    </w:p>
-    <w:p>
-      <w:pPr>
-        <w:rPr>
-          <w:rFonts w:ascii="Verdana" w:hAnsi="Verdana" w:cs="Arial"/>
-          <w:sz w:val="18"/>
-          <w:szCs w:val="18"/>
-        </w:rPr>
-      </w:pPr>
-      <w:r>
-        <w:rPr>
-          <w:rFonts w:ascii="Verdana" w:hAnsi="Verdana" w:cs="Arial"/>
-          <w:sz w:val="18"/>
-          <w:szCs w:val="18"/>
-        </w:rPr>
-        <w:t xml:space="preserve">Med hilsen </w:t>
-      </w:r>
-      <w:proofErr w:type="spellStart"/>
-      <w:r>
-        <w:rPr>
-          <w:rFonts w:ascii="Verdana" w:hAnsi="Verdana" w:cs="Arial"/>
-          <w:sz w:val="18"/>
-          <w:szCs w:val="18"/>
-        </w:rPr>
-        <w:t>Ernström</w:t>
-      </w:r>
-      <w:proofErr w:type="spellEnd"/>
-      <w:r>
-        <w:rPr>
-          <w:rFonts w:ascii="Verdana" w:hAnsi="Verdana" w:cs="Arial"/>
-          <w:sz w:val="18"/>
-          <w:szCs w:val="18"/>
-        </w:rPr>
-        <w:t xml:space="preserve"> </w:t>
-      </w:r>
-      <w:proofErr w:type="spellStart"/>
-      <w:r>
-        <w:rPr>
-          <w:rFonts w:ascii="Verdana" w:hAnsi="Verdana" w:cs="Arial"/>
-          <w:sz w:val="18"/>
-          <w:szCs w:val="18"/>
-        </w:rPr>
-        <w:t>Electro</w:t>
-      </w:r>
-      <w:proofErr w:type="spellEnd"/>
-      <w:r>
-        <w:rPr>
-          <w:rFonts w:ascii="Verdana" w:hAnsi="Verdana" w:cs="Arial"/>
-          <w:sz w:val="18"/>
-          <w:szCs w:val="18"/>
-        </w:rPr>
-        <w:t xml:space="preserve"> AS</w:t>
-      </w:r>
-    </w:p>
-    <w:p>
-      <w:pPr>
-        <w:rPr>
-          <w:rFonts w:ascii="Verdana" w:hAnsi="Verdana" w:cs="Arial"/>
-          <w:sz w:val="18"/>
-          <w:szCs w:val="18"/>
-        </w:rPr>
-      </w:pPr>
-    </w:p>
-    <w:p>
-      <w:pPr>
-        <w:rPr>
-          <w:rFonts w:ascii="Verdana" w:hAnsi="Verdana" w:cs="Arial"/>
-          <w:sz w:val="18"/>
-          <w:szCs w:val="18"/>
-        </w:rPr>
-      </w:pPr>
-      <w:r>
-        <w:rPr>
-          <w:rFonts w:ascii="Verdana" w:hAnsi="Verdana" w:cs="Arial"/>
-          <w:sz w:val="18"/>
-          <w:szCs w:val="18"/>
-        </w:rPr>
-        <w:t>Hans-Jakob Risnes</w:t>
-      </w:r>
-    </w:p>
-    <w:p>
-      <w:pPr>
-        <w:rPr>
-          <w:rFonts w:ascii="Verdana" w:hAnsi="Verdana" w:cs="Arial"/>
-          <w:sz w:val="18"/>
-          <w:szCs w:val="18"/>
-        </w:rPr>
-      </w:pPr>
-      <w:r>
-        <w:rPr>
-          <w:rFonts w:ascii="Verdana" w:hAnsi="Verdana" w:cs="Arial"/>
-          <w:sz w:val="18"/>
-          <w:szCs w:val="18"/>
-        </w:rPr>
-        <w:t>Teknisk Leder</w:t>
-      </w:r>
-    </w:p>
-    <w:p>
-      <w:pPr>
-        <w:rPr>
-          <w:rFonts w:ascii="Verdana" w:hAnsi="Verdana" w:cs="Arial"/>
-          <w:sz w:val="18"/>
-          <w:szCs w:val="18"/>
-        </w:rPr>
-      </w:pPr>
-      <w:r>
-        <w:rPr>
-          <w:rFonts w:ascii="Verdana" w:hAnsi="Verdana" w:cs="Arial"/>
-          <w:sz w:val="18"/>
-          <w:szCs w:val="18"/>
-        </w:rPr>
-        <w:t>Busbar</w:t>
-      </w:r>
-    </w:p>
-    <w:p>
-      <w:pPr>
-        <w:rPr>
-          <w:rFonts w:ascii="Verdana" w:hAnsi="Verdana" w:cs="Arial"/>
-          <w:sz w:val="18"/>
-          <w:szCs w:val="18"/>
-        </w:rPr>
-      </w:pPr>
+        <w:t>BUSBAR / MCS</w:t>
+      </w:r>
+    </w:p>
+    <w:p>
+      <w:pPr>
+        <w:rPr>
+          <w:rFonts w:ascii="Verdana" w:hAnsi="Verdana" w:cs="Arial"/>
+          <w:sz w:val="18"/>
+          <w:szCs w:val="18"/>
+        </w:rPr>
+      </w:pPr>
+    </w:p>
+    <w:p>
+      <w:pPr>
+        <w:rPr>
+          <w:rFonts w:ascii="Verdana" w:hAnsi="Verdana" w:cs="Arial"/>
+          <w:sz w:val="18"/>
+          <w:szCs w:val="18"/>
+        </w:rPr>
+      </w:pPr>
+      <w:r>
+        <w:rPr>
+          <w:rFonts w:ascii="Verdana" w:hAnsi="Verdana" w:cs="Arial"/>
+          <w:sz w:val="18"/>
+          <w:szCs w:val="18"/>
+        </w:rPr>
+        <w:t>{{bruker_navn}}</w:t>
+      </w:r>
+    </w:p>
+    <w:p>
+      <w:pPr>
+        <w:rPr>
+          <w:rFonts w:ascii="Verdana" w:hAnsi="Verdana" w:cs="Arial"/>
+          <w:sz w:val="18"/>
+          <w:szCs w:val="18"/>
+        </w:rPr>
+      </w:pPr>
+      <w:r>
+        <w:rPr>
+          <w:rFonts w:ascii="Verdana" w:hAnsi="Verdana" w:cs="Arial"/>
+          <w:sz w:val="18"/>
+          <w:szCs w:val="18"/>
+        </w:rPr>
+        <w:t>{{bruker_stilling}}</w:t>
+      </w:r>
       <w:r>
         <w:rPr>
           <w:rFonts w:ascii="Verdana" w:hAnsi="Verdana" w:cs="Arial"/>
@@ -3886,15 +3362,13 @@
       <w:pPr>
         <w:rPr>
           <w:rFonts w:ascii="Verdana" w:hAnsi="Verdana" w:cs="Arial"/>
-          <w:color w:val="FF0000"/>
-          <w:sz w:val="18"/>
-          <w:szCs w:val="18"/>
-        </w:rPr>
-      </w:pPr>
-      <w:r>
-        <w:rPr>
-          <w:rFonts w:ascii="Verdana" w:hAnsi="Verdana" w:cs="Arial"/>
-          <w:color w:val="FF0000"/>
+          <w:sz w:val="18"/>
+          <w:szCs w:val="18"/>
+        </w:rPr>
+      </w:pPr>
+      <w:r>
+        <w:rPr>
+          <w:rFonts w:ascii="Verdana" w:hAnsi="Verdana" w:cs="Arial"/>
           <w:sz w:val="18"/>
           <w:szCs w:val="18"/>
         </w:rPr>
@@ -3923,97 +3397,15 @@
           <w:sz w:val="18"/>
           <w:szCs w:val="18"/>
         </w:rPr>
-        <w:t xml:space="preserve">OPPDRAGSGIVER har ansvaret for å </w:t>
-      </w:r>
-      <w:proofErr w:type="spellStart"/>
-      <w:r>
-        <w:rPr>
-          <w:rFonts w:ascii="Verdana" w:hAnsi="Verdana" w:cs="Arial"/>
-          <w:sz w:val="18"/>
-          <w:szCs w:val="18"/>
-        </w:rPr>
-        <w:t>Ernström</w:t>
-      </w:r>
-      <w:proofErr w:type="spellEnd"/>
-      <w:r>
-        <w:rPr>
-          <w:rFonts w:ascii="Verdana" w:hAnsi="Verdana" w:cs="Arial"/>
-          <w:sz w:val="18"/>
-          <w:szCs w:val="18"/>
-        </w:rPr>
-        <w:t xml:space="preserve"> </w:t>
-      </w:r>
-      <w:proofErr w:type="spellStart"/>
-      <w:r>
-        <w:rPr>
-          <w:rFonts w:ascii="Verdana" w:hAnsi="Verdana" w:cs="Arial"/>
-          <w:sz w:val="18"/>
-          <w:szCs w:val="18"/>
-        </w:rPr>
-        <w:t>Electro</w:t>
-      </w:r>
-      <w:proofErr w:type="spellEnd"/>
-      <w:r>
-        <w:rPr>
-          <w:rFonts w:ascii="Verdana" w:hAnsi="Verdana" w:cs="Arial"/>
-          <w:sz w:val="18"/>
-          <w:szCs w:val="18"/>
-        </w:rPr>
-        <w:t xml:space="preserve"> AS alle nødvendige og relevanteopplysninger som er nødvendig for å kunne gi et komplett tilbud på forespørselen. Herunder grensesnittet til andre sidestilte </w:t>
-      </w:r>
-      <w:proofErr w:type="spellStart"/>
-      <w:r>
-        <w:rPr>
-          <w:rFonts w:ascii="Verdana" w:hAnsi="Verdana" w:cs="Arial"/>
-          <w:sz w:val="18"/>
-          <w:szCs w:val="18"/>
-        </w:rPr>
-        <w:t>entreprenører.Det</w:t>
-      </w:r>
-      <w:proofErr w:type="spellEnd"/>
-      <w:r>
-        <w:rPr>
-          <w:rFonts w:ascii="Verdana" w:hAnsi="Verdana" w:cs="Arial"/>
-          <w:sz w:val="18"/>
-          <w:szCs w:val="18"/>
-        </w:rPr>
-        <w:t xml:space="preserve"> forutsettes at oppdraget har en klar funksjonsbeskrivelse. Merkostnader som følge av mangelfulle eller uriktige opplysninger kan kreves dekket som tillegg. </w:t>
-      </w:r>
-      <w:proofErr w:type="spellStart"/>
-      <w:r>
-        <w:rPr>
-          <w:rFonts w:ascii="Verdana" w:hAnsi="Verdana" w:cs="Arial"/>
-          <w:sz w:val="18"/>
-          <w:szCs w:val="18"/>
-        </w:rPr>
-        <w:t>Ernström</w:t>
-      </w:r>
-      <w:proofErr w:type="spellEnd"/>
-      <w:r>
-        <w:rPr>
-          <w:rFonts w:ascii="Verdana" w:hAnsi="Verdana" w:cs="Arial"/>
-          <w:sz w:val="18"/>
-          <w:szCs w:val="18"/>
-        </w:rPr>
-        <w:t xml:space="preserve"> </w:t>
-      </w:r>
-      <w:proofErr w:type="spellStart"/>
-      <w:r>
-        <w:rPr>
-          <w:rFonts w:ascii="Verdana" w:hAnsi="Verdana" w:cs="Arial"/>
-          <w:sz w:val="18"/>
-          <w:szCs w:val="18"/>
-        </w:rPr>
-        <w:t>Electro</w:t>
-      </w:r>
-      <w:proofErr w:type="spellEnd"/>
-      <w:r>
-        <w:rPr>
-          <w:rFonts w:ascii="Verdana" w:hAnsi="Verdana" w:cs="Arial"/>
-          <w:sz w:val="18"/>
-          <w:szCs w:val="18"/>
-        </w:rPr>
-        <w:t xml:space="preserve"> AS</w:t>
+        <w:t xml:space="preserve">OPPDRAGSGIVER har ansvaret for å Ernström Electro AS alle nødvendige og relevanteopplysninger som er nødvendig for å kunne gi et komplett tilbud på forespørselen. Herunder grensesnittet til andre sidestilte entreprenører.Det forutsettes at oppdraget har en klar funksjonsbeskrivelse. Merkostnader som følge av mangelfulle eller uriktige opplysninger kan kreves dekket som tillegg. </w:t>
+      </w:r>
+      <w:r>
+        <w:rPr>
+          <w:rFonts w:ascii="Verdana" w:hAnsi="Verdana" w:cs="Arial"/>
+          <w:sz w:val="18"/>
+          <w:szCs w:val="18"/>
+        </w:rPr>
+        <w:t>Ernström Electro AS</w:t>
       </w:r>
       <w:r>
         <w:rPr>
@@ -4127,50 +3519,90 @@
       <w:pPr>
         <w:rPr>
           <w:rFonts w:ascii="Verdana" w:hAnsi="Verdana" w:cs="Arial"/>
-          <w:color w:val="FF0000"/>
-          <w:sz w:val="18"/>
-          <w:szCs w:val="18"/>
-        </w:rPr>
-      </w:pPr>
-      <w:proofErr w:type="spellStart"/>
-      <w:r>
-        <w:rPr>
-          <w:rFonts w:ascii="Verdana" w:hAnsi="Verdana" w:cs="Arial"/>
-          <w:color w:val="FF0000"/>
-          <w:sz w:val="18"/>
-          <w:szCs w:val="18"/>
-        </w:rPr>
-        <w:t>Ernström</w:t>
-      </w:r>
-      <w:proofErr w:type="spellEnd"/>
-      <w:r>
-        <w:rPr>
-          <w:rFonts w:ascii="Verdana" w:hAnsi="Verdana" w:cs="Arial"/>
-          <w:color w:val="FF0000"/>
+          <w:sz w:val="18"/>
+          <w:szCs w:val="18"/>
+        </w:rPr>
+      </w:pPr>
+      <w:r>
+        <w:rPr>
+          <w:rFonts w:ascii="Verdana" w:hAnsi="Verdana" w:cs="Arial"/>
+          <w:sz w:val="18"/>
+          <w:szCs w:val="18"/>
+        </w:rPr>
+        <w:t xml:space="preserve">Ernström Electro AS forholder seg til den fremdriftsplan som er lagt ved kontrakten eller som er utarbeidet iht. NS 8417 pkt. 21.2 (4 uker etter kontraktsignatur) og kan kreve tillegg for endringer fra denne. Eventuell forsering fra avtalt fremdrift forutsetter skriftlig endringsordre. </w:t>
+      </w:r>
+    </w:p>
+    <w:p>
+      <w:pPr>
+        <w:pStyle w:val="Overskrift2"/>
+      </w:pPr>
+      <w:r>
+        <w:t>5. TILLEGG OG ENDRINGER</w:t>
+      </w:r>
+    </w:p>
+    <w:p>
+      <w:pPr>
+        <w:rPr>
+          <w:rFonts w:ascii="Verdana" w:hAnsi="Verdana" w:cs="Arial"/>
+          <w:sz w:val="18"/>
+          <w:szCs w:val="18"/>
+        </w:rPr>
+      </w:pPr>
+      <w:r>
+        <w:rPr>
+          <w:rFonts w:ascii="Verdana" w:hAnsi="Verdana" w:cs="Arial"/>
+          <w:sz w:val="18"/>
+          <w:szCs w:val="18"/>
+        </w:rPr>
+        <w:t>Ernström Electro AS plikter å varsle endringer og tillegg iht. NS 8417 pkt. 31.1. Krav om forsering av fremdrift forutsettes fremmet som endringsordre, jf. 31.3.</w:t>
+      </w:r>
+      <w:r>
+        <w:rPr>
+          <w:rFonts w:ascii="Verdana" w:hAnsi="Verdana" w:cs="Arial"/>
+          <w:sz w:val="18"/>
+          <w:szCs w:val="18"/>
+        </w:rPr>
+        <w:br/>
+      </w:r>
+      <w:r>
+        <w:rPr>
+          <w:rFonts w:ascii="Verdana" w:hAnsi="Verdana" w:cs="Arial"/>
+          <w:sz w:val="18"/>
+          <w:szCs w:val="18"/>
+        </w:rPr>
+        <w:t>I den grad det er begrensninger i henhold til NS 8417 pkt. 32.1 om hvem som kan bestille endringer på vegne av OPPDRAGSGIVER, må det være nedfelt i protokoll eller lignende.</w:t>
+      </w:r>
+      <w:r>
+        <w:rPr>
+          <w:rFonts w:ascii="Verdana" w:hAnsi="Verdana" w:cs="Arial"/>
+          <w:sz w:val="18"/>
+          <w:szCs w:val="18"/>
+        </w:rPr>
+        <w:br/>
+      </w:r>
+      <w:r>
+        <w:rPr>
+          <w:rFonts w:ascii="Verdana" w:hAnsi="Verdana" w:cs="Arial"/>
+          <w:sz w:val="18"/>
+          <w:szCs w:val="18"/>
+        </w:rPr>
+        <w:t>Når Ernström Electro AS har fremmet et krav om endring i tid eller vederlag, anses endringen som akseptert i den grad svar ikke er mottatt innen den svarfrist som er satt. Er det ikke gitt en frist for innsigelser forutsettes eventuelle innsigelser å være mottatt innen 14 kalenderdager.</w:t>
+      </w:r>
+      <w:r>
+        <w:rPr>
+          <w:rFonts w:ascii="Verdana" w:hAnsi="Verdana" w:cs="Arial"/>
           <w:sz w:val="18"/>
           <w:szCs w:val="18"/>
         </w:rPr>
         <w:t xml:space="preserve"> </w:t>
       </w:r>
-      <w:proofErr w:type="spellStart"/>
-      <w:r>
-        <w:rPr>
-          <w:rFonts w:ascii="Verdana" w:hAnsi="Verdana" w:cs="Arial"/>
-          <w:color w:val="FF0000"/>
-          <w:sz w:val="18"/>
-          <w:szCs w:val="18"/>
-        </w:rPr>
-        <w:t>Electro</w:t>
-      </w:r>
-      <w:proofErr w:type="spellEnd"/>
-      <w:r>
-        <w:rPr>
-          <w:rFonts w:ascii="Verdana" w:hAnsi="Verdana" w:cs="Arial"/>
-          <w:color w:val="FF0000"/>
-          <w:sz w:val="18"/>
-          <w:szCs w:val="18"/>
-        </w:rPr>
-        <w:t xml:space="preserve"> AS forholder seg til den fremdriftsplan som er lagt ved kontrakten eller som er utarbeidet iht. NS 8417 pkt. 21.2 (4 uker etter kontraktsignatur) og kan kreve tillegg for endringer fra denne. Eventuell forsering fra avtalt fremdrift forutsetter skriftlig endringsordre. </w:t>
+      <w:r>
+        <w:rPr>
+          <w:rFonts w:ascii="Verdana" w:hAnsi="Verdana" w:cs="Arial"/>
+          <w:sz w:val="18"/>
+          <w:szCs w:val="18"/>
+        </w:rPr>
+        <w:t xml:space="preserve">Benyttes web-hotell regnes svarfristen fra den dato endringsvarselet er lagt inn på web-hotellet. </w:t>
       </w:r>
     </w:p>
     <w:p>
@@ -4178,62 +3610,60 @@
         <w:pStyle w:val="Overskrift2"/>
       </w:pPr>
       <w:r>
-        <w:t>5. TILLEGG OG ENDRINGER</w:t>
-      </w:r>
-    </w:p>
-    <w:p>
-      <w:pPr>
-        <w:rPr>
-          <w:rFonts w:ascii="Verdana" w:hAnsi="Verdana" w:cs="Arial"/>
-          <w:color w:val="FF0000"/>
-          <w:sz w:val="18"/>
-          <w:szCs w:val="18"/>
-        </w:rPr>
-      </w:pPr>
-      <w:proofErr w:type="spellStart"/>
-      <w:r>
-        <w:rPr>
-          <w:rFonts w:ascii="Verdana" w:hAnsi="Verdana" w:cs="Arial"/>
-          <w:color w:val="FF0000"/>
-          <w:sz w:val="18"/>
-          <w:szCs w:val="18"/>
-        </w:rPr>
-        <w:t>Ernström</w:t>
-      </w:r>
-      <w:proofErr w:type="spellEnd"/>
-      <w:r>
-        <w:rPr>
-          <w:rFonts w:ascii="Verdana" w:hAnsi="Verdana" w:cs="Arial"/>
-          <w:color w:val="FF0000"/>
+        <w:t>6. FAKTURERING OG BETALING</w:t>
+      </w:r>
+    </w:p>
+    <w:p>
+      <w:pPr>
+        <w:rPr>
+          <w:rFonts w:ascii="Verdana" w:hAnsi="Verdana" w:cs="Arial"/>
+          <w:sz w:val="18"/>
+          <w:szCs w:val="18"/>
+        </w:rPr>
+      </w:pPr>
+      <w:r>
+        <w:rPr>
+          <w:rFonts w:ascii="Verdana" w:hAnsi="Verdana" w:cs="Arial"/>
+          <w:sz w:val="18"/>
+          <w:szCs w:val="18"/>
+        </w:rPr>
+        <w:t>Oppdraget faktureres i henhold til fremdrift med</w:t>
+      </w:r>
+      <w:r>
+        <w:rPr>
+          <w:rFonts w:ascii="Verdana" w:hAnsi="Verdana" w:cs="Arial"/>
           <w:sz w:val="18"/>
           <w:szCs w:val="18"/>
         </w:rPr>
         <w:t xml:space="preserve"> </w:t>
       </w:r>
-      <w:proofErr w:type="spellStart"/>
-      <w:r>
-        <w:rPr>
-          <w:rFonts w:ascii="Verdana" w:hAnsi="Verdana" w:cs="Arial"/>
-          <w:color w:val="FF0000"/>
-          <w:sz w:val="18"/>
-          <w:szCs w:val="18"/>
-        </w:rPr>
-        <w:t>Electro</w:t>
-      </w:r>
-      <w:proofErr w:type="spellEnd"/>
-      <w:r>
-        <w:rPr>
-          <w:rFonts w:ascii="Verdana" w:hAnsi="Verdana" w:cs="Arial"/>
-          <w:color w:val="FF0000"/>
-          <w:sz w:val="18"/>
-          <w:szCs w:val="18"/>
-        </w:rPr>
-        <w:t xml:space="preserve"> AS plikter å varsle endringer og tillegg iht. NS 8417 pkt. 31.1. Krav om forsering av fremdrift forutsettes fremmet som endringsordre, jf. 31.3.</w:t>
-      </w:r>
-      <w:r>
-        <w:rPr>
-          <w:rFonts w:ascii="Verdana" w:hAnsi="Verdana" w:cs="Arial"/>
-          <w:color w:val="FF0000"/>
+      <w:r>
+        <w:rPr>
+          <w:rFonts w:ascii="Verdana" w:hAnsi="Verdana" w:cs="Arial"/>
+          <w:sz w:val="18"/>
+          <w:szCs w:val="18"/>
+        </w:rPr>
+        <w:t xml:space="preserve">mindre det er avtalt en betalingsplan. Ernström Electro AS forbeholder seg rett til å a konto-fakturere 50% ved bestilling. Ved betalingsmislighold har MCS Elektrotavler Øst AS rett til å stanse arbeidene og har ikke ansvar for eventuelle merkostnader som følge av en berettiget stans. Ved betalingsmislighold utover 14 dager har </w:t>
+      </w:r>
+      <w:r>
+        <w:rPr>
+          <w:rFonts w:ascii="Verdana" w:hAnsi="Verdana" w:cs="Arial"/>
+          <w:sz w:val="18"/>
+          <w:szCs w:val="18"/>
+        </w:rPr>
+        <w:t xml:space="preserve">Ernström Electro AS </w:t>
+      </w:r>
+      <w:r>
+        <w:rPr>
+          <w:rFonts w:ascii="Verdana" w:hAnsi="Verdana" w:cs="Arial"/>
+          <w:sz w:val="18"/>
+          <w:szCs w:val="18"/>
+        </w:rPr>
+        <w:t>rett til å heve kontrakten og kreveerstatning.</w:t>
+      </w:r>
+      <w:r>
+        <w:rPr>
+          <w:rFonts w:ascii="Verdana" w:hAnsi="Verdana" w:cs="Arial"/>
           <w:sz w:val="18"/>
           <w:szCs w:val="18"/>
         </w:rPr>
@@ -4242,16 +3672,39 @@
       <w:r>
         <w:rPr>
           <w:rFonts w:ascii="Verdana" w:hAnsi="Verdana" w:cs="Arial"/>
-          <w:color w:val="FF0000"/>
-          <w:sz w:val="18"/>
-          <w:szCs w:val="18"/>
-        </w:rPr>
-        <w:t>I den grad det er begrensninger i henhold til NS 8417 pkt. 32.1 om hvem som kan bestille endringer på vegne av OPPDRAGSGIVER, må det være nedfelt i protokoll eller lignende.</w:t>
-      </w:r>
-      <w:r>
-        <w:rPr>
-          <w:rFonts w:ascii="Verdana" w:hAnsi="Verdana" w:cs="Arial"/>
-          <w:color w:val="FF0000"/>
+          <w:sz w:val="18"/>
+          <w:szCs w:val="18"/>
+        </w:rPr>
+        <w:t xml:space="preserve">Det tillates ikke motregning mot annet mellomværende med mindre det skriftlig er avtalt. </w:t>
+      </w:r>
+    </w:p>
+    <w:p>
+      <w:pPr>
+        <w:pStyle w:val="Overskrift2"/>
+      </w:pPr>
+      <w:r>
+        <w:t>7. AVSLUTNING AV PROSJEKTET. OVERTAGELSE</w:t>
+      </w:r>
+    </w:p>
+    <w:p>
+      <w:pPr>
+        <w:rPr>
+          <w:rFonts w:ascii="Verdana" w:hAnsi="Verdana" w:cs="Arial"/>
+          <w:sz w:val="18"/>
+          <w:szCs w:val="18"/>
+        </w:rPr>
+      </w:pPr>
+      <w:r>
+        <w:rPr>
+          <w:rFonts w:ascii="Verdana" w:hAnsi="Verdana" w:cs="Arial"/>
+          <w:sz w:val="18"/>
+          <w:szCs w:val="18"/>
+        </w:rPr>
+        <w:t>Registreringsforretning iht. NS 8417 pkt. 36.4 skjer</w:t>
+      </w:r>
+      <w:r>
+        <w:rPr>
+          <w:rFonts w:ascii="Verdana" w:hAnsi="Verdana" w:cs="Arial"/>
           <w:sz w:val="18"/>
           <w:szCs w:val="18"/>
         </w:rPr>
@@ -4263,59 +3716,23 @@
           <w:sz w:val="18"/>
           <w:szCs w:val="18"/>
         </w:rPr>
-        <w:t xml:space="preserve">Når </w:t>
-      </w:r>
-      <w:proofErr w:type="spellStart"/>
-      <w:r>
-        <w:rPr>
-          <w:rFonts w:ascii="Verdana" w:hAnsi="Verdana" w:cs="Arial"/>
-          <w:sz w:val="18"/>
-          <w:szCs w:val="18"/>
-        </w:rPr>
-        <w:t>Ernström</w:t>
-      </w:r>
-      <w:proofErr w:type="spellEnd"/>
-      <w:r>
-        <w:rPr>
-          <w:rFonts w:ascii="Verdana" w:hAnsi="Verdana" w:cs="Arial"/>
-          <w:sz w:val="18"/>
-          <w:szCs w:val="18"/>
-        </w:rPr>
-        <w:t xml:space="preserve"> </w:t>
-      </w:r>
-      <w:proofErr w:type="spellStart"/>
-      <w:r>
-        <w:rPr>
-          <w:rFonts w:ascii="Verdana" w:hAnsi="Verdana" w:cs="Arial"/>
-          <w:sz w:val="18"/>
-          <w:szCs w:val="18"/>
-        </w:rPr>
-        <w:t>Electro</w:t>
-      </w:r>
-      <w:proofErr w:type="spellEnd"/>
-      <w:r>
-        <w:rPr>
-          <w:rFonts w:ascii="Verdana" w:hAnsi="Verdana" w:cs="Arial"/>
-          <w:sz w:val="18"/>
-          <w:szCs w:val="18"/>
-        </w:rPr>
-        <w:t xml:space="preserve"> AS har fremmet et krav om endring i tid eller vederlag, anses endringen som akseptert i den grad svar ikke er mottatt innen den svarfrist som er satt. Er det ikke gitt en frist for innsigelser forutsettes eventuelle innsigelser å være mottatt innen 14 kalenderdager.</w:t>
-      </w:r>
-      <w:r>
-        <w:rPr>
-          <w:rFonts w:ascii="Verdana" w:hAnsi="Verdana" w:cs="Arial"/>
-          <w:sz w:val="18"/>
-          <w:szCs w:val="18"/>
-        </w:rPr>
-        <w:t xml:space="preserve"> </w:t>
-      </w:r>
-      <w:r>
-        <w:rPr>
-          <w:rFonts w:ascii="Verdana" w:hAnsi="Verdana" w:cs="Arial"/>
-          <w:sz w:val="18"/>
-          <w:szCs w:val="18"/>
-        </w:rPr>
-        <w:t xml:space="preserve">Benyttes web-hotell regnes svarfristen fra den dato endringsvarselet er lagt inn på web-hotellet. </w:t>
+        <w:t>ved at Ernström Electro AS avtaler med OPPDRAGSGIVER et omforent tidspunkt som ikke er lengre enn 5 arbeidsdager frem i tid.</w:t>
+      </w:r>
+      <w:r>
+        <w:rPr>
+          <w:rFonts w:ascii="Verdana" w:hAnsi="Verdana" w:cs="Arial"/>
+          <w:sz w:val="18"/>
+          <w:szCs w:val="18"/>
+        </w:rPr>
+        <w:br/>
+      </w:r>
+      <w:r>
+        <w:rPr>
+          <w:rFonts w:ascii="Verdana" w:hAnsi="Verdana" w:cs="Arial"/>
+          <w:sz w:val="18"/>
+          <w:szCs w:val="18"/>
+        </w:rPr>
+        <w:t xml:space="preserve">Ernström Electro AS fremlegger FDV-dokumentasjon senest ved registreringsforretningen. </w:t>
       </w:r>
     </w:p>
     <w:p>
@@ -4323,120 +3740,24 @@
         <w:pStyle w:val="Overskrift2"/>
       </w:pPr>
       <w:r>
-        <w:t>6. FAKTURERING OG BETALING</w:t>
-      </w:r>
-    </w:p>
-    <w:p>
-      <w:pPr>
-        <w:rPr>
-          <w:rFonts w:ascii="Verdana" w:hAnsi="Verdana" w:cs="Arial"/>
-          <w:sz w:val="18"/>
-          <w:szCs w:val="18"/>
-        </w:rPr>
-      </w:pPr>
-      <w:r>
-        <w:rPr>
-          <w:rFonts w:ascii="Verdana" w:hAnsi="Verdana" w:cs="Arial"/>
-          <w:sz w:val="18"/>
-          <w:szCs w:val="18"/>
-        </w:rPr>
-        <w:t>Oppdraget faktureres i henhold til fremdrift med</w:t>
-      </w:r>
-      <w:r>
-        <w:rPr>
-          <w:rFonts w:ascii="Verdana" w:hAnsi="Verdana" w:cs="Arial"/>
-          <w:sz w:val="18"/>
-          <w:szCs w:val="18"/>
-        </w:rPr>
-        <w:t xml:space="preserve"> </w:t>
-      </w:r>
-      <w:r>
-        <w:rPr>
-          <w:rFonts w:ascii="Verdana" w:hAnsi="Verdana" w:cs="Arial"/>
-          <w:sz w:val="18"/>
-          <w:szCs w:val="18"/>
-        </w:rPr>
-        <w:t xml:space="preserve">mindre det er avtalt en betalingsplan. </w:t>
-      </w:r>
-      <w:proofErr w:type="spellStart"/>
-      <w:r>
-        <w:rPr>
-          <w:rFonts w:ascii="Verdana" w:hAnsi="Verdana" w:cs="Arial"/>
-          <w:sz w:val="18"/>
-          <w:szCs w:val="18"/>
-        </w:rPr>
-        <w:t>Ernström</w:t>
-      </w:r>
-      <w:proofErr w:type="spellEnd"/>
-      <w:r>
-        <w:rPr>
-          <w:rFonts w:ascii="Verdana" w:hAnsi="Verdana" w:cs="Arial"/>
-          <w:sz w:val="18"/>
-          <w:szCs w:val="18"/>
-        </w:rPr>
-        <w:t xml:space="preserve"> </w:t>
-      </w:r>
-      <w:proofErr w:type="spellStart"/>
-      <w:r>
-        <w:rPr>
-          <w:rFonts w:ascii="Verdana" w:hAnsi="Verdana" w:cs="Arial"/>
-          <w:sz w:val="18"/>
-          <w:szCs w:val="18"/>
-        </w:rPr>
-        <w:t>Electro</w:t>
-      </w:r>
-      <w:proofErr w:type="spellEnd"/>
-      <w:r>
-        <w:rPr>
-          <w:rFonts w:ascii="Verdana" w:hAnsi="Verdana" w:cs="Arial"/>
-          <w:sz w:val="18"/>
-          <w:szCs w:val="18"/>
-        </w:rPr>
-        <w:t xml:space="preserve"> AS forbeholder seg rett til å a konto-fakturere 50% ved bestilling. Ved betalingsmislighold har MCS Elektrotavler Øst AS rett til å stanse arbeidene og har ikke ansvar for eventuelle merkostnader som følge av en berettiget stans. Ved betalingsmislighold utover 14 dager har </w:t>
-      </w:r>
-      <w:proofErr w:type="spellStart"/>
-      <w:r>
-        <w:rPr>
-          <w:rFonts w:ascii="Verdana" w:hAnsi="Verdana" w:cs="Arial"/>
-          <w:sz w:val="18"/>
-          <w:szCs w:val="18"/>
-        </w:rPr>
-        <w:t>Ernström</w:t>
-      </w:r>
-      <w:proofErr w:type="spellEnd"/>
-      <w:r>
-        <w:rPr>
-          <w:rFonts w:ascii="Verdana" w:hAnsi="Verdana" w:cs="Arial"/>
-          <w:sz w:val="18"/>
-          <w:szCs w:val="18"/>
-        </w:rPr>
-        <w:t xml:space="preserve"> </w:t>
-      </w:r>
-      <w:proofErr w:type="spellStart"/>
-      <w:r>
-        <w:rPr>
-          <w:rFonts w:ascii="Verdana" w:hAnsi="Verdana" w:cs="Arial"/>
-          <w:sz w:val="18"/>
-          <w:szCs w:val="18"/>
-        </w:rPr>
-        <w:t>Electro</w:t>
-      </w:r>
-      <w:proofErr w:type="spellEnd"/>
-      <w:r>
-        <w:rPr>
-          <w:rFonts w:ascii="Verdana" w:hAnsi="Verdana" w:cs="Arial"/>
-          <w:sz w:val="18"/>
-          <w:szCs w:val="18"/>
-        </w:rPr>
-        <w:t xml:space="preserve"> AS </w:t>
-      </w:r>
-      <w:r>
-        <w:rPr>
-          <w:rFonts w:ascii="Verdana" w:hAnsi="Verdana" w:cs="Arial"/>
-          <w:sz w:val="18"/>
-          <w:szCs w:val="18"/>
-        </w:rPr>
-        <w:t>rett til å heve kontrakten og kreveerstatning.</w:t>
+        <w:t>8. REKLAMASJON</w:t>
+      </w:r>
+    </w:p>
+    <w:p>
+      <w:pPr>
+        <w:rPr>
+          <w:rFonts w:ascii="Verdana" w:hAnsi="Verdana" w:cs="Arial"/>
+          <w:sz w:val="18"/>
+          <w:szCs w:val="18"/>
+        </w:rPr>
+      </w:pPr>
+      <w:r>
+        <w:rPr>
+          <w:rFonts w:ascii="Verdana" w:hAnsi="Verdana" w:cs="Arial"/>
+          <w:sz w:val="18"/>
+          <w:szCs w:val="18"/>
+        </w:rPr>
+        <w:t>Reklamasjoner etter overtagelse</w:t>
       </w:r>
       <w:r>
         <w:rPr>
@@ -4452,7 +3773,23 @@
           <w:sz w:val="18"/>
           <w:szCs w:val="18"/>
         </w:rPr>
-        <w:t xml:space="preserve">Det tillates ikke motregning mot annet mellomværende med mindre det skriftlig er avtalt. </w:t>
+        <w:t>forutsettes fremsatt senest innen én måned etter at det kunne vært reklamert, jf. NS 8417 pkt. 42.2.2. Senere reklamasjoner kan kreves avvist.</w:t>
+      </w:r>
+      <w:r>
+        <w:rPr>
+          <w:rFonts w:ascii="Verdana" w:hAnsi="Verdana" w:cs="Arial"/>
+          <w:sz w:val="18"/>
+          <w:szCs w:val="18"/>
+        </w:rPr>
+        <w:br/>
+      </w:r>
+      <w:r>
+        <w:rPr>
+          <w:rFonts w:ascii="Verdana" w:hAnsi="Verdana" w:cs="Arial"/>
+          <w:sz w:val="18"/>
+          <w:szCs w:val="18"/>
+        </w:rPr>
+        <w:t>Ernström Electro AS har rett til å utbedre eventuelle berettigede reklamasjoner. Slik utbedring skal skje innen rimelig tid etter at mangelen er reklamert og ansvarsforholdet er klarlagt.</w:t>
       </w:r>
     </w:p>
     <w:p>
@@ -4460,31 +3797,28 @@
         <w:pStyle w:val="Overskrift2"/>
       </w:pPr>
       <w:r>
-        <w:t>7. AVSLUTNING AV PROSJEKTET. OVERTAGELSE</w:t>
-      </w:r>
-    </w:p>
-    <w:p>
-      <w:pPr>
-        <w:rPr>
-          <w:rFonts w:ascii="Verdana" w:hAnsi="Verdana" w:cs="Arial"/>
-          <w:color w:val="FF0000"/>
-          <w:sz w:val="18"/>
-          <w:szCs w:val="18"/>
-        </w:rPr>
-      </w:pPr>
-      <w:r>
-        <w:rPr>
-          <w:rFonts w:ascii="Verdana" w:hAnsi="Verdana" w:cs="Arial"/>
-          <w:color w:val="FF0000"/>
-          <w:sz w:val="18"/>
-          <w:szCs w:val="18"/>
-        </w:rPr>
-        <w:t>Registreringsforretning iht. NS 8417 pkt. 36.4 skjer</w:t>
-      </w:r>
-      <w:r>
-        <w:rPr>
-          <w:rFonts w:ascii="Verdana" w:hAnsi="Verdana" w:cs="Arial"/>
-          <w:color w:val="FF0000"/>
+        <w:t>9. ERSTATNING</w:t>
+      </w:r>
+    </w:p>
+    <w:p>
+      <w:pPr>
+        <w:rPr>
+          <w:rFonts w:ascii="Verdana" w:hAnsi="Verdana" w:cs="Arial"/>
+          <w:sz w:val="18"/>
+          <w:szCs w:val="18"/>
+        </w:rPr>
+      </w:pPr>
+      <w:r>
+        <w:rPr>
+          <w:rFonts w:ascii="Verdana" w:hAnsi="Verdana" w:cs="Arial"/>
+          <w:sz w:val="18"/>
+          <w:szCs w:val="18"/>
+        </w:rPr>
+        <w:t>Ernström Electro AS har ikke ansvar for skader utover å utbedre med mindre OPPDRAGSGIVER kan påvise at skaden skyldes utvist uaktsomhet fra Ernström Electro AS.</w:t>
+      </w:r>
+      <w:r>
+        <w:rPr>
+          <w:rFonts w:ascii="Verdana" w:hAnsi="Verdana" w:cs="Arial"/>
           <w:sz w:val="18"/>
           <w:szCs w:val="18"/>
         </w:rPr>
@@ -4496,88 +3830,7 @@
           <w:sz w:val="18"/>
           <w:szCs w:val="18"/>
         </w:rPr>
-        <w:t xml:space="preserve">ved at </w:t>
-      </w:r>
-      <w:proofErr w:type="spellStart"/>
-      <w:r>
-        <w:rPr>
-          <w:rFonts w:ascii="Verdana" w:hAnsi="Verdana" w:cs="Arial"/>
-          <w:sz w:val="18"/>
-          <w:szCs w:val="18"/>
-        </w:rPr>
-        <w:t>Ernström</w:t>
-      </w:r>
-      <w:proofErr w:type="spellEnd"/>
-      <w:r>
-        <w:rPr>
-          <w:rFonts w:ascii="Verdana" w:hAnsi="Verdana" w:cs="Arial"/>
-          <w:sz w:val="18"/>
-          <w:szCs w:val="18"/>
-        </w:rPr>
-        <w:t xml:space="preserve"> </w:t>
-      </w:r>
-      <w:proofErr w:type="spellStart"/>
-      <w:r>
-        <w:rPr>
-          <w:rFonts w:ascii="Verdana" w:hAnsi="Verdana" w:cs="Arial"/>
-          <w:sz w:val="18"/>
-          <w:szCs w:val="18"/>
-        </w:rPr>
-        <w:t>Electro</w:t>
-      </w:r>
-      <w:proofErr w:type="spellEnd"/>
-      <w:r>
-        <w:rPr>
-          <w:rFonts w:ascii="Verdana" w:hAnsi="Verdana" w:cs="Arial"/>
-          <w:sz w:val="18"/>
-          <w:szCs w:val="18"/>
-        </w:rPr>
-        <w:t xml:space="preserve"> AS avtaler med OPPDRAGSGIVER et omforent tidspunkt som ikke er lengre enn 5 arbeidsdager frem i tid.</w:t>
-      </w:r>
-      <w:r>
-        <w:rPr>
-          <w:rFonts w:ascii="Verdana" w:hAnsi="Verdana" w:cs="Arial"/>
-          <w:color w:val="FF0000"/>
-          <w:sz w:val="18"/>
-          <w:szCs w:val="18"/>
-        </w:rPr>
-        <w:br/>
-      </w:r>
-      <w:proofErr w:type="spellStart"/>
-      <w:r>
-        <w:rPr>
-          <w:rFonts w:ascii="Verdana" w:hAnsi="Verdana" w:cs="Arial"/>
-          <w:sz w:val="18"/>
-          <w:szCs w:val="18"/>
-        </w:rPr>
-        <w:t>Ernström</w:t>
-      </w:r>
-      <w:proofErr w:type="spellEnd"/>
-      <w:r>
-        <w:rPr>
-          <w:rFonts w:ascii="Verdana" w:hAnsi="Verdana" w:cs="Arial"/>
-          <w:sz w:val="18"/>
-          <w:szCs w:val="18"/>
-        </w:rPr>
-        <w:t xml:space="preserve"> </w:t>
-      </w:r>
-      <w:proofErr w:type="spellStart"/>
-      <w:r>
-        <w:rPr>
-          <w:rFonts w:ascii="Verdana" w:hAnsi="Verdana" w:cs="Arial"/>
-          <w:sz w:val="18"/>
-          <w:szCs w:val="18"/>
-        </w:rPr>
-        <w:t>Electro</w:t>
-      </w:r>
-      <w:proofErr w:type="spellEnd"/>
-      <w:r>
-        <w:rPr>
-          <w:rFonts w:ascii="Verdana" w:hAnsi="Verdana" w:cs="Arial"/>
-          <w:sz w:val="18"/>
-          <w:szCs w:val="18"/>
-        </w:rPr>
-        <w:t xml:space="preserve"> AS fremlegger FDV-dokumentasjon senest ved registreringsforretningen. </w:t>
+        <w:t>Under enhver omstendighet begrenses det erstatningsansvaret Ernström Electro AS måtte ha oppad til kontraktsummen med mindre erstatningskravet er oppstått som følge av grov uaktsomhet.</w:t>
       </w:r>
     </w:p>
     <w:p>
@@ -4585,233 +3838,6 @@
         <w:pStyle w:val="Overskrift2"/>
       </w:pPr>
       <w:r>
-        <w:t>8. REKLAMASJON</w:t>
-      </w:r>
-    </w:p>
-    <w:p>
-      <w:pPr>
-        <w:rPr>
-          <w:rFonts w:ascii="Verdana" w:hAnsi="Verdana" w:cs="Arial"/>
-          <w:sz w:val="18"/>
-          <w:szCs w:val="18"/>
-        </w:rPr>
-      </w:pPr>
-      <w:r>
-        <w:rPr>
-          <w:rFonts w:ascii="Verdana" w:hAnsi="Verdana" w:cs="Arial"/>
-          <w:sz w:val="18"/>
-          <w:szCs w:val="18"/>
-        </w:rPr>
-        <w:t>Reklamasjoner etter overtagelse</w:t>
-      </w:r>
-      <w:r>
-        <w:rPr>
-          <w:rFonts w:ascii="Verdana" w:hAnsi="Verdana" w:cs="Arial"/>
-          <w:sz w:val="18"/>
-          <w:szCs w:val="18"/>
-        </w:rPr>
-        <w:br/>
-      </w:r>
-      <w:r>
-        <w:rPr>
-          <w:rFonts w:ascii="Verdana" w:hAnsi="Verdana" w:cs="Arial"/>
-          <w:color w:val="FF0000"/>
-          <w:sz w:val="18"/>
-          <w:szCs w:val="18"/>
-        </w:rPr>
-        <w:t>forutsettes fremsatt senest innen én måned etter at det kunne vært reklamert, jf. NS 8417 pkt. 42.2.2. Senere reklamasjoner kan kreves avvist.</w:t>
-      </w:r>
-      <w:r>
-        <w:rPr>
-          <w:rFonts w:ascii="Verdana" w:hAnsi="Verdana" w:cs="Arial"/>
-          <w:sz w:val="18"/>
-          <w:szCs w:val="18"/>
-        </w:rPr>
-        <w:br/>
-      </w:r>
-      <w:proofErr w:type="spellStart"/>
-      <w:r>
-        <w:rPr>
-          <w:rFonts w:ascii="Verdana" w:hAnsi="Verdana" w:cs="Arial"/>
-          <w:sz w:val="18"/>
-          <w:szCs w:val="18"/>
-        </w:rPr>
-        <w:t>Ernström</w:t>
-      </w:r>
-      <w:proofErr w:type="spellEnd"/>
-      <w:r>
-        <w:rPr>
-          <w:rFonts w:ascii="Verdana" w:hAnsi="Verdana" w:cs="Arial"/>
-          <w:sz w:val="18"/>
-          <w:szCs w:val="18"/>
-        </w:rPr>
-        <w:t xml:space="preserve"> </w:t>
-      </w:r>
-      <w:proofErr w:type="spellStart"/>
-      <w:r>
-        <w:rPr>
-          <w:rFonts w:ascii="Verdana" w:hAnsi="Verdana" w:cs="Arial"/>
-          <w:sz w:val="18"/>
-          <w:szCs w:val="18"/>
-        </w:rPr>
-        <w:t>Electro</w:t>
-      </w:r>
-      <w:proofErr w:type="spellEnd"/>
-      <w:r>
-        <w:rPr>
-          <w:rFonts w:ascii="Verdana" w:hAnsi="Verdana" w:cs="Arial"/>
-          <w:sz w:val="18"/>
-          <w:szCs w:val="18"/>
-        </w:rPr>
-        <w:t xml:space="preserve"> AS har rett til å utbedre eventuelle berettigede reklamasjoner. Slik utbedring skal skje innen rimelig tid etter at mangelen er reklamert og ansvarsforholdet er klarlagt.</w:t>
-      </w:r>
-    </w:p>
-    <w:p>
-      <w:pPr>
-        <w:pStyle w:val="Overskrift2"/>
-      </w:pPr>
-      <w:r>
-        <w:t>9. ERSTATNING</w:t>
-      </w:r>
-    </w:p>
-    <w:p>
-      <w:pPr>
-        <w:rPr>
-          <w:rFonts w:ascii="Verdana" w:hAnsi="Verdana" w:cs="Arial"/>
-          <w:sz w:val="18"/>
-          <w:szCs w:val="18"/>
-        </w:rPr>
-      </w:pPr>
-      <w:proofErr w:type="spellStart"/>
-      <w:r>
-        <w:rPr>
-          <w:rFonts w:ascii="Verdana" w:hAnsi="Verdana" w:cs="Arial"/>
-          <w:sz w:val="18"/>
-          <w:szCs w:val="18"/>
-        </w:rPr>
-        <w:t>Ernström</w:t>
-      </w:r>
-      <w:proofErr w:type="spellEnd"/>
-      <w:r>
-        <w:rPr>
-          <w:rFonts w:ascii="Verdana" w:hAnsi="Verdana" w:cs="Arial"/>
-          <w:sz w:val="18"/>
-          <w:szCs w:val="18"/>
-        </w:rPr>
-        <w:t xml:space="preserve"> </w:t>
-      </w:r>
-      <w:proofErr w:type="spellStart"/>
-      <w:r>
-        <w:rPr>
-          <w:rFonts w:ascii="Verdana" w:hAnsi="Verdana" w:cs="Arial"/>
-          <w:sz w:val="18"/>
-          <w:szCs w:val="18"/>
-        </w:rPr>
-        <w:t>Electro</w:t>
-      </w:r>
-      <w:proofErr w:type="spellEnd"/>
-      <w:r>
-        <w:rPr>
-          <w:rFonts w:ascii="Verdana" w:hAnsi="Verdana" w:cs="Arial"/>
-          <w:sz w:val="18"/>
-          <w:szCs w:val="18"/>
-        </w:rPr>
-        <w:t xml:space="preserve"> AS har ikke ansvar for skader utover å utbedre med mindre OPPDRAGSGIVER kan påvise at skaden skyldes utvist uaktsomhet fra </w:t>
-      </w:r>
-      <w:proofErr w:type="spellStart"/>
-      <w:r>
-        <w:rPr>
-          <w:rFonts w:ascii="Verdana" w:hAnsi="Verdana" w:cs="Arial"/>
-          <w:sz w:val="18"/>
-          <w:szCs w:val="18"/>
-        </w:rPr>
-        <w:t>Ernström</w:t>
-      </w:r>
-      <w:proofErr w:type="spellEnd"/>
-      <w:r>
-        <w:rPr>
-          <w:rFonts w:ascii="Verdana" w:hAnsi="Verdana" w:cs="Arial"/>
-          <w:sz w:val="18"/>
-          <w:szCs w:val="18"/>
-        </w:rPr>
-        <w:t xml:space="preserve"> </w:t>
-      </w:r>
-      <w:proofErr w:type="spellStart"/>
-      <w:r>
-        <w:rPr>
-          <w:rFonts w:ascii="Verdana" w:hAnsi="Verdana" w:cs="Arial"/>
-          <w:sz w:val="18"/>
-          <w:szCs w:val="18"/>
-        </w:rPr>
-        <w:t>Electro</w:t>
-      </w:r>
-      <w:proofErr w:type="spellEnd"/>
-      <w:r>
-        <w:rPr>
-          <w:rFonts w:ascii="Verdana" w:hAnsi="Verdana" w:cs="Arial"/>
-          <w:sz w:val="18"/>
-          <w:szCs w:val="18"/>
-        </w:rPr>
-        <w:t xml:space="preserve"> AS.</w:t>
-      </w:r>
-      <w:r>
-        <w:rPr>
-          <w:rFonts w:ascii="Verdana" w:hAnsi="Verdana" w:cs="Arial"/>
-          <w:sz w:val="18"/>
-          <w:szCs w:val="18"/>
-        </w:rPr>
-        <w:br/>
-      </w:r>
-      <w:r>
-        <w:rPr>
-          <w:rFonts w:ascii="Verdana" w:hAnsi="Verdana" w:cs="Arial"/>
-          <w:sz w:val="18"/>
-          <w:szCs w:val="18"/>
-        </w:rPr>
-        <w:t xml:space="preserve">Under enhver omstendighet begrenses det erstatningsansvaret </w:t>
-      </w:r>
-      <w:proofErr w:type="spellStart"/>
-      <w:r>
-        <w:rPr>
-          <w:rFonts w:ascii="Verdana" w:hAnsi="Verdana" w:cs="Arial"/>
-          <w:sz w:val="18"/>
-          <w:szCs w:val="18"/>
-        </w:rPr>
-        <w:t>Ernström</w:t>
-      </w:r>
-      <w:proofErr w:type="spellEnd"/>
-      <w:r>
-        <w:rPr>
-          <w:rFonts w:ascii="Verdana" w:hAnsi="Verdana" w:cs="Arial"/>
-          <w:sz w:val="18"/>
-          <w:szCs w:val="18"/>
-        </w:rPr>
-        <w:t xml:space="preserve"> </w:t>
-      </w:r>
-      <w:proofErr w:type="spellStart"/>
-      <w:r>
-        <w:rPr>
-          <w:rFonts w:ascii="Verdana" w:hAnsi="Verdana" w:cs="Arial"/>
-          <w:sz w:val="18"/>
-          <w:szCs w:val="18"/>
-        </w:rPr>
-        <w:t>Electro</w:t>
-      </w:r>
-      <w:proofErr w:type="spellEnd"/>
-      <w:r>
-        <w:rPr>
-          <w:rFonts w:ascii="Verdana" w:hAnsi="Verdana" w:cs="Arial"/>
-          <w:sz w:val="18"/>
-          <w:szCs w:val="18"/>
-        </w:rPr>
-        <w:t xml:space="preserve"> AS måtte ha oppad til kontraktsummen med mindre erstatningskravet er oppstått som følge av grov uaktsomhet.</w:t>
-      </w:r>
-    </w:p>
-    <w:p>
-      <w:pPr>
-        <w:pStyle w:val="Overskrift2"/>
-      </w:pPr>
-      <w:r>
         <w:t>10. TVISTER</w:t>
       </w:r>
     </w:p>
@@ -4819,7 +3845,6 @@
       <w:pPr>
         <w:rPr>
           <w:rFonts w:ascii="Verdana" w:hAnsi="Verdana" w:cs="Arial"/>
-          <w:color w:val="FF0000"/>
           <w:sz w:val="18"/>
           <w:szCs w:val="18"/>
         </w:rPr>
@@ -4836,7 +3861,6 @@
       <w:r>
         <w:rPr>
           <w:rFonts w:ascii="Verdana" w:hAnsi="Verdana" w:cs="Arial"/>
-          <w:color w:val="FF0000"/>
           <w:sz w:val="18"/>
           <w:szCs w:val="18"/>
         </w:rPr>
@@ -4845,7 +3869,6 @@
       <w:r>
         <w:rPr>
           <w:rFonts w:ascii="Verdana" w:hAnsi="Verdana" w:cs="Arial"/>
-          <w:color w:val="FF0000"/>
           <w:sz w:val="18"/>
           <w:szCs w:val="18"/>
         </w:rPr>
@@ -4854,7 +3877,6 @@
       <w:r>
         <w:rPr>
           <w:rFonts w:ascii="Verdana" w:hAnsi="Verdana" w:cs="Arial"/>
-          <w:color w:val="FF0000"/>
           <w:sz w:val="18"/>
           <w:szCs w:val="18"/>
         </w:rPr>
@@ -4937,7 +3959,6 @@
       <w:r>
         <w:rPr>
           <w:rFonts w:ascii="Verdana" w:eastAsia="Times New Roman" w:hAnsi="Verdana" w:cs="Times New Roman"/>
-          <w:color w:val="FF0000"/>
           <w:sz w:val="18"/>
           <w:szCs w:val="18"/>
         </w:rPr>
@@ -4946,7 +3967,6 @@
       <w:r>
         <w:rPr>
           <w:rFonts w:ascii="Verdana" w:eastAsia="Times New Roman" w:hAnsi="Verdana" w:cs="Times New Roman"/>
-          <w:color w:val="FF0000"/>
           <w:sz w:val="18"/>
           <w:szCs w:val="18"/>
         </w:rPr>
@@ -9515,6 +8535,118 @@
     </w:lvl>
   </w:abstractNum>
   <w:abstractNum w:abstractNumId="6" w15:restartNumberingAfterBreak="0">
+    <w:nsid w:val="28F034DD"/>
+    <w:multiLevelType w:val="hybridMultilevel"/>
+    <w:tmpl w:val="0470ABC8"/>
+    <w:lvl w:ilvl="0" w:tplc="AD88DAB6">
+      <w:numFmt w:val="bullet"/>
+      <w:lvlText w:val="•"/>
+      <w:lvlJc w:val="left"/>
+      <w:pPr>
+        <w:ind w:left="720" w:hanging="360"/>
+      </w:pPr>
+      <w:rPr>
+        <w:rFonts w:ascii="Verdana" w:eastAsia="Times New Roman" w:hAnsi="Verdana" w:cs="Arial" w:hint="default"/>
+      </w:rPr>
+    </w:lvl>
+    <w:lvl w:ilvl="1" w:tplc="04140003" w:tentative="1">
+      <w:start w:val="1"/>
+      <w:numFmt w:val="bullet"/>
+      <w:lvlText w:val="o"/>
+      <w:lvlJc w:val="left"/>
+      <w:pPr>
+        <w:ind w:left="1440" w:hanging="360"/>
+      </w:pPr>
+      <w:rPr>
+        <w:rFonts w:ascii="Courier New" w:hAnsi="Courier New" w:cs="Courier New" w:hint="default"/>
+      </w:rPr>
+    </w:lvl>
+    <w:lvl w:ilvl="2" w:tplc="04140005" w:tentative="1">
+      <w:start w:val="1"/>
+      <w:numFmt w:val="bullet"/>
+      <w:lvlText w:val=""/>
+      <w:lvlJc w:val="left"/>
+      <w:pPr>
+        <w:ind w:left="2160" w:hanging="360"/>
+      </w:pPr>
+      <w:rPr>
+        <w:rFonts w:ascii="Wingdings" w:hAnsi="Wingdings" w:hint="default"/>
+      </w:rPr>
+    </w:lvl>
+    <w:lvl w:ilvl="3" w:tplc="04140001" w:tentative="1">
+      <w:start w:val="1"/>
+      <w:numFmt w:val="bullet"/>
+      <w:lvlText w:val=""/>
+      <w:lvlJc w:val="left"/>
+      <w:pPr>
+        <w:ind w:left="2880" w:hanging="360"/>
+      </w:pPr>
+      <w:rPr>
+        <w:rFonts w:ascii="Symbol" w:hAnsi="Symbol" w:hint="default"/>
+      </w:rPr>
+    </w:lvl>
+    <w:lvl w:ilvl="4" w:tplc="04140003" w:tentative="1">
+      <w:start w:val="1"/>
+      <w:numFmt w:val="bullet"/>
+      <w:lvlText w:val="o"/>
+      <w:lvlJc w:val="left"/>
+      <w:pPr>
+        <w:ind w:left="3600" w:hanging="360"/>
+      </w:pPr>
+      <w:rPr>
+        <w:rFonts w:ascii="Courier New" w:hAnsi="Courier New" w:cs="Courier New" w:hint="default"/>
+      </w:rPr>
+    </w:lvl>
+    <w:lvl w:ilvl="5" w:tplc="04140005" w:tentative="1">
+      <w:start w:val="1"/>
+      <w:numFmt w:val="bullet"/>
+      <w:lvlText w:val=""/>
+      <w:lvlJc w:val="left"/>
+      <w:pPr>
+        <w:ind w:left="4320" w:hanging="360"/>
+      </w:pPr>
+      <w:rPr>
+        <w:rFonts w:ascii="Wingdings" w:hAnsi="Wingdings" w:hint="default"/>
+      </w:rPr>
+    </w:lvl>
+    <w:lvl w:ilvl="6" w:tplc="04140001" w:tentative="1">
+      <w:start w:val="1"/>
+      <w:numFmt w:val="bullet"/>
+      <w:lvlText w:val=""/>
+      <w:lvlJc w:val="left"/>
+      <w:pPr>
+        <w:ind w:left="5040" w:hanging="360"/>
+      </w:pPr>
+      <w:rPr>
+        <w:rFonts w:ascii="Symbol" w:hAnsi="Symbol" w:hint="default"/>
+      </w:rPr>
+    </w:lvl>
+    <w:lvl w:ilvl="7" w:tplc="04140003" w:tentative="1">
+      <w:start w:val="1"/>
+      <w:numFmt w:val="bullet"/>
+      <w:lvlText w:val="o"/>
+      <w:lvlJc w:val="left"/>
+      <w:pPr>
+        <w:ind w:left="5760" w:hanging="360"/>
+      </w:pPr>
+      <w:rPr>
+        <w:rFonts w:ascii="Courier New" w:hAnsi="Courier New" w:cs="Courier New" w:hint="default"/>
+      </w:rPr>
+    </w:lvl>
+    <w:lvl w:ilvl="8" w:tplc="04140005" w:tentative="1">
+      <w:start w:val="1"/>
+      <w:numFmt w:val="bullet"/>
+      <w:lvlText w:val=""/>
+      <w:lvlJc w:val="left"/>
+      <w:pPr>
+        <w:ind w:left="6480" w:hanging="360"/>
+      </w:pPr>
+      <w:rPr>
+        <w:rFonts w:ascii="Wingdings" w:hAnsi="Wingdings" w:hint="default"/>
+      </w:rPr>
+    </w:lvl>
+  </w:abstractNum>
+  <w:abstractNum w:abstractNumId="7" w15:restartNumberingAfterBreak="0">
     <w:nsid w:val="33F74906"/>
     <w:multiLevelType w:val="hybridMultilevel"/>
     <w:tmpl w:val="73226BA2"/>
@@ -9626,7 +8758,7 @@
       </w:rPr>
     </w:lvl>
   </w:abstractNum>
-  <w:abstractNum w:abstractNumId="7" w15:restartNumberingAfterBreak="0">
+  <w:abstractNum w:abstractNumId="8" w15:restartNumberingAfterBreak="0">
     <w:nsid w:val="3BCD620C"/>
     <w:multiLevelType w:val="multilevel"/>
     <w:tmpl w:val="5A98FA94"/>
@@ -9772,6 +8904,381 @@
       <w:rPr>
         <w:rFonts w:ascii="Symbol" w:hAnsi="Symbol" w:hint="default"/>
         <w:sz w:val="20"/>
+      </w:rPr>
+    </w:lvl>
+  </w:abstractNum>
+  <w:abstractNum w:abstractNumId="9" w15:restartNumberingAfterBreak="0">
+    <w:nsid w:val="40931A9D"/>
+    <w:multiLevelType w:val="hybridMultilevel"/>
+    <w:tmpl w:val="5FD8759A"/>
+    <w:lvl w:ilvl="0" w:tplc="04140001">
+      <w:start w:val="1"/>
+      <w:numFmt w:val="bullet"/>
+      <w:lvlText w:val=""/>
+      <w:lvlJc w:val="left"/>
+      <w:pPr>
+        <w:ind w:left="720" w:hanging="360"/>
+      </w:pPr>
+      <w:rPr>
+        <w:rFonts w:ascii="Symbol" w:hAnsi="Symbol" w:hint="default"/>
+      </w:rPr>
+    </w:lvl>
+    <w:lvl w:ilvl="1" w:tplc="04140003" w:tentative="1">
+      <w:start w:val="1"/>
+      <w:numFmt w:val="bullet"/>
+      <w:lvlText w:val="o"/>
+      <w:lvlJc w:val="left"/>
+      <w:pPr>
+        <w:ind w:left="1440" w:hanging="360"/>
+      </w:pPr>
+      <w:rPr>
+        <w:rFonts w:ascii="Courier New" w:hAnsi="Courier New" w:cs="Courier New" w:hint="default"/>
+      </w:rPr>
+    </w:lvl>
+    <w:lvl w:ilvl="2" w:tplc="04140005" w:tentative="1">
+      <w:start w:val="1"/>
+      <w:numFmt w:val="bullet"/>
+      <w:lvlText w:val=""/>
+      <w:lvlJc w:val="left"/>
+      <w:pPr>
+        <w:ind w:left="2160" w:hanging="360"/>
+      </w:pPr>
+      <w:rPr>
+        <w:rFonts w:ascii="Wingdings" w:hAnsi="Wingdings" w:hint="default"/>
+      </w:rPr>
+    </w:lvl>
+    <w:lvl w:ilvl="3" w:tplc="04140001" w:tentative="1">
+      <w:start w:val="1"/>
+      <w:numFmt w:val="bullet"/>
+      <w:lvlText w:val=""/>
+      <w:lvlJc w:val="left"/>
+      <w:pPr>
+        <w:ind w:left="2880" w:hanging="360"/>
+      </w:pPr>
+      <w:rPr>
+        <w:rFonts w:ascii="Symbol" w:hAnsi="Symbol" w:hint="default"/>
+      </w:rPr>
+    </w:lvl>
+    <w:lvl w:ilvl="4" w:tplc="04140003" w:tentative="1">
+      <w:start w:val="1"/>
+      <w:numFmt w:val="bullet"/>
+      <w:lvlText w:val="o"/>
+      <w:lvlJc w:val="left"/>
+      <w:pPr>
+        <w:ind w:left="3600" w:hanging="360"/>
+      </w:pPr>
+      <w:rPr>
+        <w:rFonts w:ascii="Courier New" w:hAnsi="Courier New" w:cs="Courier New" w:hint="default"/>
+      </w:rPr>
+    </w:lvl>
+    <w:lvl w:ilvl="5" w:tplc="04140005" w:tentative="1">
+      <w:start w:val="1"/>
+      <w:numFmt w:val="bullet"/>
+      <w:lvlText w:val=""/>
+      <w:lvlJc w:val="left"/>
+      <w:pPr>
+        <w:ind w:left="4320" w:hanging="360"/>
+      </w:pPr>
+      <w:rPr>
+        <w:rFonts w:ascii="Wingdings" w:hAnsi="Wingdings" w:hint="default"/>
+      </w:rPr>
+    </w:lvl>
+    <w:lvl w:ilvl="6" w:tplc="04140001" w:tentative="1">
+      <w:start w:val="1"/>
+      <w:numFmt w:val="bullet"/>
+      <w:lvlText w:val=""/>
+      <w:lvlJc w:val="left"/>
+      <w:pPr>
+        <w:ind w:left="5040" w:hanging="360"/>
+      </w:pPr>
+      <w:rPr>
+        <w:rFonts w:ascii="Symbol" w:hAnsi="Symbol" w:hint="default"/>
+      </w:rPr>
+    </w:lvl>
+    <w:lvl w:ilvl="7" w:tplc="04140003" w:tentative="1">
+      <w:start w:val="1"/>
+      <w:numFmt w:val="bullet"/>
+      <w:lvlText w:val="o"/>
+      <w:lvlJc w:val="left"/>
+      <w:pPr>
+        <w:ind w:left="5760" w:hanging="360"/>
+      </w:pPr>
+      <w:rPr>
+        <w:rFonts w:ascii="Courier New" w:hAnsi="Courier New" w:cs="Courier New" w:hint="default"/>
+      </w:rPr>
+    </w:lvl>
+    <w:lvl w:ilvl="8" w:tplc="04140005" w:tentative="1">
+      <w:start w:val="1"/>
+      <w:numFmt w:val="bullet"/>
+      <w:lvlText w:val=""/>
+      <w:lvlJc w:val="left"/>
+      <w:pPr>
+        <w:ind w:left="6480" w:hanging="360"/>
+      </w:pPr>
+      <w:rPr>
+        <w:rFonts w:ascii="Wingdings" w:hAnsi="Wingdings" w:hint="default"/>
+      </w:rPr>
+    </w:lvl>
+  </w:abstractNum>
+  <w:abstractNum w:abstractNumId="10" w15:restartNumberingAfterBreak="0">
+    <w:nsid w:val="74066C03"/>
+    <w:multiLevelType w:val="multilevel"/>
+    <w:tmpl w:val="FE36E5C8"/>
+    <w:lvl w:ilvl="0">
+      <w:start w:val="1"/>
+      <w:numFmt w:val="bullet"/>
+      <w:lvlText w:val=""/>
+      <w:lvlJc w:val="left"/>
+      <w:pPr>
+        <w:tabs>
+          <w:tab w:val="num" w:pos="720"/>
+        </w:tabs>
+        <w:ind w:left="720" w:hanging="360"/>
+      </w:pPr>
+      <w:rPr>
+        <w:rFonts w:ascii="Symbol" w:hAnsi="Symbol" w:hint="default"/>
+        <w:sz w:val="20"/>
+      </w:rPr>
+    </w:lvl>
+    <w:lvl w:ilvl="1" w:tentative="1">
+      <w:start w:val="1"/>
+      <w:numFmt w:val="bullet"/>
+      <w:lvlText w:val=""/>
+      <w:lvlJc w:val="left"/>
+      <w:pPr>
+        <w:tabs>
+          <w:tab w:val="num" w:pos="1440"/>
+        </w:tabs>
+        <w:ind w:left="1440" w:hanging="360"/>
+      </w:pPr>
+      <w:rPr>
+        <w:rFonts w:ascii="Symbol" w:hAnsi="Symbol" w:hint="default"/>
+        <w:sz w:val="20"/>
+      </w:rPr>
+    </w:lvl>
+    <w:lvl w:ilvl="2" w:tentative="1">
+      <w:start w:val="1"/>
+      <w:numFmt w:val="bullet"/>
+      <w:lvlText w:val=""/>
+      <w:lvlJc w:val="left"/>
+      <w:pPr>
+        <w:tabs>
+          <w:tab w:val="num" w:pos="2160"/>
+        </w:tabs>
+        <w:ind w:left="2160" w:hanging="360"/>
+      </w:pPr>
+      <w:rPr>
+        <w:rFonts w:ascii="Symbol" w:hAnsi="Symbol" w:hint="default"/>
+        <w:sz w:val="20"/>
+      </w:rPr>
+    </w:lvl>
+    <w:lvl w:ilvl="3" w:tentative="1">
+      <w:start w:val="1"/>
+      <w:numFmt w:val="bullet"/>
+      <w:lvlText w:val=""/>
+      <w:lvlJc w:val="left"/>
+      <w:pPr>
+        <w:tabs>
+          <w:tab w:val="num" w:pos="2880"/>
+        </w:tabs>
+        <w:ind w:left="2880" w:hanging="360"/>
+      </w:pPr>
+      <w:rPr>
+        <w:rFonts w:ascii="Symbol" w:hAnsi="Symbol" w:hint="default"/>
+        <w:sz w:val="20"/>
+      </w:rPr>
+    </w:lvl>
+    <w:lvl w:ilvl="4" w:tentative="1">
+      <w:start w:val="1"/>
+      <w:numFmt w:val="bullet"/>
+      <w:lvlText w:val=""/>
+      <w:lvlJc w:val="left"/>
+      <w:pPr>
+        <w:tabs>
+          <w:tab w:val="num" w:pos="3600"/>
+        </w:tabs>
+        <w:ind w:left="3600" w:hanging="360"/>
+      </w:pPr>
+      <w:rPr>
+        <w:rFonts w:ascii="Symbol" w:hAnsi="Symbol" w:hint="default"/>
+        <w:sz w:val="20"/>
+      </w:rPr>
+    </w:lvl>
+    <w:lvl w:ilvl="5" w:tentative="1">
+      <w:start w:val="1"/>
+      <w:numFmt w:val="bullet"/>
+      <w:lvlText w:val=""/>
+      <w:lvlJc w:val="left"/>
+      <w:pPr>
+        <w:tabs>
+          <w:tab w:val="num" w:pos="4320"/>
+        </w:tabs>
+        <w:ind w:left="4320" w:hanging="360"/>
+      </w:pPr>
+      <w:rPr>
+        <w:rFonts w:ascii="Symbol" w:hAnsi="Symbol" w:hint="default"/>
+        <w:sz w:val="20"/>
+      </w:rPr>
+    </w:lvl>
+    <w:lvl w:ilvl="6" w:tentative="1">
+      <w:start w:val="1"/>
+      <w:numFmt w:val="bullet"/>
+      <w:lvlText w:val=""/>
+      <w:lvlJc w:val="left"/>
+      <w:pPr>
+        <w:tabs>
+          <w:tab w:val="num" w:pos="5040"/>
+        </w:tabs>
+        <w:ind w:left="5040" w:hanging="360"/>
+      </w:pPr>
+      <w:rPr>
+        <w:rFonts w:ascii="Symbol" w:hAnsi="Symbol" w:hint="default"/>
+        <w:sz w:val="20"/>
+      </w:rPr>
+    </w:lvl>
+    <w:lvl w:ilvl="7" w:tentative="1">
+      <w:start w:val="1"/>
+      <w:numFmt w:val="bullet"/>
+      <w:lvlText w:val=""/>
+      <w:lvlJc w:val="left"/>
+      <w:pPr>
+        <w:tabs>
+          <w:tab w:val="num" w:pos="5760"/>
+        </w:tabs>
+        <w:ind w:left="5760" w:hanging="360"/>
+      </w:pPr>
+      <w:rPr>
+        <w:rFonts w:ascii="Symbol" w:hAnsi="Symbol" w:hint="default"/>
+        <w:sz w:val="20"/>
+      </w:rPr>
+    </w:lvl>
+    <w:lvl w:ilvl="8" w:tentative="1">
+      <w:start w:val="1"/>
+      <w:numFmt w:val="bullet"/>
+      <w:lvlText w:val=""/>
+      <w:lvlJc w:val="left"/>
+      <w:pPr>
+        <w:tabs>
+          <w:tab w:val="num" w:pos="6480"/>
+        </w:tabs>
+        <w:ind w:left="6480" w:hanging="360"/>
+      </w:pPr>
+      <w:rPr>
+        <w:rFonts w:ascii="Symbol" w:hAnsi="Symbol" w:hint="default"/>
+        <w:sz w:val="20"/>
+      </w:rPr>
+    </w:lvl>
+  </w:abstractNum>
+  <w:abstractNum w:abstractNumId="11" w15:restartNumberingAfterBreak="0">
+    <w:nsid w:val="76C23F2D"/>
+    <w:multiLevelType w:val="hybridMultilevel"/>
+    <w:tmpl w:val="DBD295A0"/>
+    <w:lvl w:ilvl="0" w:tplc="04140001">
+      <w:start w:val="1"/>
+      <w:numFmt w:val="bullet"/>
+      <w:lvlText w:val=""/>
+      <w:lvlJc w:val="left"/>
+      <w:pPr>
+        <w:ind w:left="720" w:hanging="360"/>
+      </w:pPr>
+      <w:rPr>
+        <w:rFonts w:ascii="Symbol" w:hAnsi="Symbol" w:hint="default"/>
+      </w:rPr>
+    </w:lvl>
+    <w:lvl w:ilvl="1" w:tplc="04140003" w:tentative="1">
+      <w:start w:val="1"/>
+      <w:numFmt w:val="bullet"/>
+      <w:lvlText w:val="o"/>
+      <w:lvlJc w:val="left"/>
+      <w:pPr>
+        <w:ind w:left="1440" w:hanging="360"/>
+      </w:pPr>
+      <w:rPr>
+        <w:rFonts w:ascii="Courier New" w:hAnsi="Courier New" w:cs="Courier New" w:hint="default"/>
+      </w:rPr>
+    </w:lvl>
+    <w:lvl w:ilvl="2" w:tplc="04140005" w:tentative="1">
+      <w:start w:val="1"/>
+      <w:numFmt w:val="bullet"/>
+      <w:lvlText w:val=""/>
+      <w:lvlJc w:val="left"/>
+      <w:pPr>
+        <w:ind w:left="2160" w:hanging="360"/>
+      </w:pPr>
+      <w:rPr>
+        <w:rFonts w:ascii="Wingdings" w:hAnsi="Wingdings" w:hint="default"/>
+      </w:rPr>
+    </w:lvl>
+    <w:lvl w:ilvl="3" w:tplc="04140001" w:tentative="1">
+      <w:start w:val="1"/>
+      <w:numFmt w:val="bullet"/>
+      <w:lvlText w:val=""/>
+      <w:lvlJc w:val="left"/>
+      <w:pPr>
+        <w:ind w:left="2880" w:hanging="360"/>
+      </w:pPr>
+      <w:rPr>
+        <w:rFonts w:ascii="Symbol" w:hAnsi="Symbol" w:hint="default"/>
+      </w:rPr>
+    </w:lvl>
+    <w:lvl w:ilvl="4" w:tplc="04140003" w:tentative="1">
+      <w:start w:val="1"/>
+      <w:numFmt w:val="bullet"/>
+      <w:lvlText w:val="o"/>
+      <w:lvlJc w:val="left"/>
+      <w:pPr>
+        <w:ind w:left="3600" w:hanging="360"/>
+      </w:pPr>
+      <w:rPr>
+        <w:rFonts w:ascii="Courier New" w:hAnsi="Courier New" w:cs="Courier New" w:hint="default"/>
+      </w:rPr>
+    </w:lvl>
+    <w:lvl w:ilvl="5" w:tplc="04140005" w:tentative="1">
+      <w:start w:val="1"/>
+      <w:numFmt w:val="bullet"/>
+      <w:lvlText w:val=""/>
+      <w:lvlJc w:val="left"/>
+      <w:pPr>
+        <w:ind w:left="4320" w:hanging="360"/>
+      </w:pPr>
+      <w:rPr>
+        <w:rFonts w:ascii="Wingdings" w:hAnsi="Wingdings" w:hint="default"/>
+      </w:rPr>
+    </w:lvl>
+    <w:lvl w:ilvl="6" w:tplc="04140001" w:tentative="1">
+      <w:start w:val="1"/>
+      <w:numFmt w:val="bullet"/>
+      <w:lvlText w:val=""/>
+      <w:lvlJc w:val="left"/>
+      <w:pPr>
+        <w:ind w:left="5040" w:hanging="360"/>
+      </w:pPr>
+      <w:rPr>
+        <w:rFonts w:ascii="Symbol" w:hAnsi="Symbol" w:hint="default"/>
+      </w:rPr>
+    </w:lvl>
+    <w:lvl w:ilvl="7" w:tplc="04140003" w:tentative="1">
+      <w:start w:val="1"/>
+      <w:numFmt w:val="bullet"/>
+      <w:lvlText w:val="o"/>
+      <w:lvlJc w:val="left"/>
+      <w:pPr>
+        <w:ind w:left="5760" w:hanging="360"/>
+      </w:pPr>
+      <w:rPr>
+        <w:rFonts w:ascii="Courier New" w:hAnsi="Courier New" w:cs="Courier New" w:hint="default"/>
+      </w:rPr>
+    </w:lvl>
+    <w:lvl w:ilvl="8" w:tplc="04140005" w:tentative="1">
+      <w:start w:val="1"/>
+      <w:numFmt w:val="bullet"/>
+      <w:lvlText w:val=""/>
+      <w:lvlJc w:val="left"/>
+      <w:pPr>
+        <w:ind w:left="6480" w:hanging="360"/>
+      </w:pPr>
+      <w:rPr>
+        <w:rFonts w:ascii="Wingdings" w:hAnsi="Wingdings" w:hint="default"/>
       </w:rPr>
     </w:lvl>
   </w:abstractNum>
@@ -9806,13 +9313,13 @@
     </w:lvlOverride>
   </w:num>
   <w:num w:numId="2" w16cid:durableId="64038316">
-    <w:abstractNumId w:val="6"/>
+    <w:abstractNumId w:val="7"/>
   </w:num>
   <w:num w:numId="3" w16cid:durableId="272440084">
     <w:abstractNumId w:val="2"/>
   </w:num>
   <w:num w:numId="4" w16cid:durableId="1374576423">
-    <w:abstractNumId w:val="6"/>
+    <w:abstractNumId w:val="7"/>
   </w:num>
   <w:num w:numId="5" w16cid:durableId="606041466">
     <w:abstractNumId w:val="0"/>
@@ -9830,7 +9337,19 @@
     <w:abstractNumId w:val="1"/>
   </w:num>
   <w:num w:numId="10" w16cid:durableId="1489516913">
-    <w:abstractNumId w:val="7"/>
+    <w:abstractNumId w:val="8"/>
+  </w:num>
+  <w:num w:numId="11" w16cid:durableId="884024143">
+    <w:abstractNumId w:val="6"/>
+  </w:num>
+  <w:num w:numId="12" w16cid:durableId="874074787">
+    <w:abstractNumId w:val="11"/>
+  </w:num>
+  <w:num w:numId="13" w16cid:durableId="1444575619">
+    <w:abstractNumId w:val="10"/>
+  </w:num>
+  <w:num w:numId="14" w16cid:durableId="1979870743">
+    <w:abstractNumId w:val="9"/>
   </w:num>
 </w:numbering>
 </file>
@@ -10233,7 +9752,7 @@
   <w:style w:type="paragraph" w:default="1" w:styleId="Normal">
     <w:name w:val="Normal"/>
     <w:qFormat/>
-    <w:rsid w:val="00C60381"/>
+    <w:rsid w:val="005F1824"/>
   </w:style>
   <w:style w:type="paragraph" w:styleId="Overskrift2">
     <w:name w:val="heading 2"/>

</xml_diff>

<commit_message>
modified:   app.js 	modified:   calculator.html 	modified:   server/mail.js 	modified:   server/templates/tilbud/tilbud-stromskinner-template.docx
</commit_message>
<xml_diff>
--- a/server/templates/tilbud/tilbud-stromskinner-template.docx
+++ b/server/templates/tilbud/tilbud-stromskinner-template.docx
@@ -180,7 +180,25 @@
                 <w:bCs/>
                 <w:sz w:val="20"/>
               </w:rPr>
-              <w:t>{{tilbud_nr}}</w:t>
+              <w:t>{{</w:t>
+            </w:r>
+            <w:proofErr w:type="spellStart"/>
+            <w:r>
+              <w:rPr>
+                <w:rFonts w:cs="Arial"/>
+                <w:bCs/>
+                <w:sz w:val="20"/>
+              </w:rPr>
+              <w:t>tilbud_nr</w:t>
+            </w:r>
+            <w:proofErr w:type="spellEnd"/>
+            <w:r>
+              <w:rPr>
+                <w:rFonts w:cs="Arial"/>
+                <w:bCs/>
+                <w:sz w:val="20"/>
+              </w:rPr>
+              <w:t>}}</w:t>
             </w:r>
           </w:p>
         </w:tc>
@@ -425,7 +443,27 @@
                 <w:sz w:val="20"/>
                 <w:szCs w:val="20"/>
               </w:rPr>
-              <w:t>{{kunde_adresse}}</w:t>
+              <w:t>{{</w:t>
+            </w:r>
+            <w:proofErr w:type="spellStart"/>
+            <w:r>
+              <w:rPr>
+                <w:rFonts w:ascii="Verdana" w:hAnsi="Verdana" w:cs="Calibri"/>
+                <w:color w:val="000000"/>
+                <w:sz w:val="20"/>
+                <w:szCs w:val="20"/>
+              </w:rPr>
+              <w:t>kunde_adresse</w:t>
+            </w:r>
+            <w:proofErr w:type="spellEnd"/>
+            <w:r>
+              <w:rPr>
+                <w:rFonts w:ascii="Verdana" w:hAnsi="Verdana" w:cs="Calibri"/>
+                <w:color w:val="000000"/>
+                <w:sz w:val="20"/>
+                <w:szCs w:val="20"/>
+              </w:rPr>
+              <w:t>}}</w:t>
             </w:r>
           </w:p>
         </w:tc>
@@ -451,7 +489,27 @@
                 <w:szCs w:val="22"/>
                 <w:lang w:val="nb-NO"/>
               </w:rPr>
-              <w:t>{{bruker_navn}}</w:t>
+              <w:t>{{</w:t>
+            </w:r>
+            <w:proofErr w:type="spellStart"/>
+            <w:r>
+              <w:rPr>
+                <w:rFonts w:cs="Arial"/>
+                <w:sz w:val="20"/>
+                <w:szCs w:val="22"/>
+                <w:lang w:val="nb-NO"/>
+              </w:rPr>
+              <w:t>bruker_navn</w:t>
+            </w:r>
+            <w:proofErr w:type="spellEnd"/>
+            <w:r>
+              <w:rPr>
+                <w:rFonts w:cs="Arial"/>
+                <w:sz w:val="20"/>
+                <w:szCs w:val="22"/>
+                <w:lang w:val="nb-NO"/>
+              </w:rPr>
+              <w:t>}}</w:t>
             </w:r>
           </w:p>
         </w:tc>
@@ -473,7 +531,23 @@
                 <w:rFonts w:cs="Arial"/>
                 <w:sz w:val="20"/>
               </w:rPr>
-              <w:t>{{revisjon}}</w:t>
+              <w:t>{{</w:t>
+            </w:r>
+            <w:proofErr w:type="spellStart"/>
+            <w:r>
+              <w:rPr>
+                <w:rFonts w:cs="Arial"/>
+                <w:sz w:val="20"/>
+              </w:rPr>
+              <w:t>revisjon</w:t>
+            </w:r>
+            <w:proofErr w:type="spellEnd"/>
+            <w:r>
+              <w:rPr>
+                <w:rFonts w:cs="Arial"/>
+                <w:sz w:val="20"/>
+              </w:rPr>
+              <w:t>}}</w:t>
             </w:r>
           </w:p>
         </w:tc>
@@ -505,7 +579,27 @@
                 <w:sz w:val="20"/>
                 <w:szCs w:val="20"/>
               </w:rPr>
-              <w:t>{{postnummer_sted}}</w:t>
+              <w:t>{{</w:t>
+            </w:r>
+            <w:proofErr w:type="spellStart"/>
+            <w:r>
+              <w:rPr>
+                <w:rFonts w:ascii="Verdana" w:hAnsi="Verdana" w:cs="Calibri"/>
+                <w:color w:val="000000"/>
+                <w:sz w:val="20"/>
+                <w:szCs w:val="20"/>
+              </w:rPr>
+              <w:t>postnummer_sted</w:t>
+            </w:r>
+            <w:proofErr w:type="spellEnd"/>
+            <w:r>
+              <w:rPr>
+                <w:rFonts w:ascii="Verdana" w:hAnsi="Verdana" w:cs="Calibri"/>
+                <w:color w:val="000000"/>
+                <w:sz w:val="20"/>
+                <w:szCs w:val="20"/>
+              </w:rPr>
+              <w:t>}}</w:t>
             </w:r>
           </w:p>
         </w:tc>
@@ -531,7 +625,27 @@
                 <w:szCs w:val="22"/>
                 <w:lang w:val="nb-NO"/>
               </w:rPr>
-              <w:t>{{bruker_epost}}</w:t>
+              <w:t>{{</w:t>
+            </w:r>
+            <w:proofErr w:type="spellStart"/>
+            <w:r>
+              <w:rPr>
+                <w:rFonts w:cs="Arial"/>
+                <w:sz w:val="20"/>
+                <w:szCs w:val="22"/>
+                <w:lang w:val="nb-NO"/>
+              </w:rPr>
+              <w:t>bruker_epost</w:t>
+            </w:r>
+            <w:proofErr w:type="spellEnd"/>
+            <w:r>
+              <w:rPr>
+                <w:rFonts w:cs="Arial"/>
+                <w:sz w:val="20"/>
+                <w:szCs w:val="22"/>
+                <w:lang w:val="nb-NO"/>
+              </w:rPr>
+              <w:t>}}</w:t>
             </w:r>
           </w:p>
         </w:tc>
@@ -566,7 +680,27 @@
                 <w:szCs w:val="22"/>
                 <w:lang w:val="nb-NO"/>
               </w:rPr>
-              <w:t>{{bruker_telefon}}</w:t>
+              <w:t>{{</w:t>
+            </w:r>
+            <w:proofErr w:type="spellStart"/>
+            <w:r>
+              <w:rPr>
+                <w:rFonts w:cs="Arial"/>
+                <w:sz w:val="20"/>
+                <w:szCs w:val="22"/>
+                <w:lang w:val="nb-NO"/>
+              </w:rPr>
+              <w:t>bruker_telefon</w:t>
+            </w:r>
+            <w:proofErr w:type="spellEnd"/>
+            <w:r>
+              <w:rPr>
+                <w:rFonts w:cs="Arial"/>
+                <w:sz w:val="20"/>
+                <w:szCs w:val="22"/>
+                <w:lang w:val="nb-NO"/>
+              </w:rPr>
+              <w:t>}}</w:t>
             </w:r>
           </w:p>
         </w:tc>
@@ -773,7 +907,25 @@
           <w:sz w:val="20"/>
           <w:szCs w:val="20"/>
         </w:rPr>
-        <w:t>{{lss}}</w:t>
+        <w:t>{{</w:t>
+      </w:r>
+      <w:proofErr w:type="spellStart"/>
+      <w:r>
+        <w:rPr>
+          <w:rFonts w:ascii="Verdana" w:hAnsi="Verdana" w:cs="Arial"/>
+          <w:sz w:val="20"/>
+          <w:szCs w:val="20"/>
+        </w:rPr>
+        <w:t>lss</w:t>
+      </w:r>
+      <w:proofErr w:type="spellEnd"/>
+      <w:r>
+        <w:rPr>
+          <w:rFonts w:ascii="Verdana" w:hAnsi="Verdana" w:cs="Arial"/>
+          <w:sz w:val="20"/>
+          <w:szCs w:val="20"/>
+        </w:rPr>
+        <w:t>}}</w:t>
       </w:r>
     </w:p>
     <w:tbl>
@@ -810,7 +962,25 @@
                 <w:sz w:val="20"/>
                 <w:szCs w:val="20"/>
               </w:rPr>
-              <w:t>Strømskinne – {{lnr}}</w:t>
+              <w:t>Strømskinne – {{</w:t>
+            </w:r>
+            <w:proofErr w:type="spellStart"/>
+            <w:r>
+              <w:rPr>
+                <w:rFonts w:ascii="Verdana" w:hAnsi="Verdana" w:cs="Arial"/>
+                <w:sz w:val="20"/>
+                <w:szCs w:val="20"/>
+              </w:rPr>
+              <w:t>lnr</w:t>
+            </w:r>
+            <w:proofErr w:type="spellEnd"/>
+            <w:r>
+              <w:rPr>
+                <w:rFonts w:ascii="Verdana" w:hAnsi="Verdana" w:cs="Arial"/>
+                <w:sz w:val="20"/>
+                <w:szCs w:val="20"/>
+              </w:rPr>
+              <w:t>}}</w:t>
             </w:r>
           </w:p>
           <w:p>
@@ -830,6 +1000,7 @@
               </w:rPr>
               <w:t>{{</w:t>
             </w:r>
+            <w:proofErr w:type="spellStart"/>
             <w:r>
               <w:rPr>
                 <w:rFonts w:ascii="Verdana" w:hAnsi="Verdana" w:cs="Arial"/>
@@ -838,6 +1009,8 @@
               </w:rPr>
               <w:t>amp</w:t>
             </w:r>
+            <w:proofErr w:type="spellEnd"/>
+            <w:proofErr w:type="gramStart"/>
             <w:r>
               <w:rPr>
                 <w:rFonts w:ascii="Verdana" w:hAnsi="Verdana" w:cs="Arial"/>
@@ -854,6 +1027,7 @@
               </w:rPr>
               <w:t>A</w:t>
             </w:r>
+            <w:proofErr w:type="gramEnd"/>
             <w:r>
               <w:rPr>
                 <w:rFonts w:ascii="Verdana" w:hAnsi="Verdana" w:cs="Arial"/>
@@ -884,7 +1058,25 @@
                 <w:sz w:val="20"/>
                 <w:szCs w:val="20"/>
               </w:rPr>
-              <w:t>{{ip_grad}}</w:t>
+              <w:t>{{</w:t>
+            </w:r>
+            <w:proofErr w:type="spellStart"/>
+            <w:r>
+              <w:rPr>
+                <w:rFonts w:ascii="Verdana" w:hAnsi="Verdana" w:cs="Arial"/>
+                <w:sz w:val="20"/>
+                <w:szCs w:val="20"/>
+              </w:rPr>
+              <w:t>ip_grad</w:t>
+            </w:r>
+            <w:proofErr w:type="spellEnd"/>
+            <w:r>
+              <w:rPr>
+                <w:rFonts w:ascii="Verdana" w:hAnsi="Verdana" w:cs="Arial"/>
+                <w:sz w:val="20"/>
+                <w:szCs w:val="20"/>
+              </w:rPr>
+              <w:t>}}</w:t>
             </w:r>
           </w:p>
         </w:tc>
@@ -917,7 +1109,25 @@
                 <w:sz w:val="20"/>
                 <w:szCs w:val="20"/>
               </w:rPr>
-              <w:t>{{total_ex_montasje_nok}}</w:t>
+              <w:t>{{</w:t>
+            </w:r>
+            <w:proofErr w:type="spellStart"/>
+            <w:r>
+              <w:rPr>
+                <w:rFonts w:ascii="Verdana" w:hAnsi="Verdana" w:cs="Arial"/>
+                <w:sz w:val="20"/>
+                <w:szCs w:val="20"/>
+              </w:rPr>
+              <w:t>total_ex_montasje_nok</w:t>
+            </w:r>
+            <w:proofErr w:type="spellEnd"/>
+            <w:r>
+              <w:rPr>
+                <w:rFonts w:ascii="Verdana" w:hAnsi="Verdana" w:cs="Arial"/>
+                <w:sz w:val="20"/>
+                <w:szCs w:val="20"/>
+              </w:rPr>
+              <w:t>}}</w:t>
             </w:r>
           </w:p>
         </w:tc>
@@ -925,236 +1135,575 @@
     </w:tbl>
     <w:p>
       <w:pPr>
-        <w:pStyle w:val="Listeavsnitt"/>
+        <w:spacing w:after="0" w:line="240" w:lineRule="auto"/>
         <w:rPr>
           <w:rFonts w:ascii="Verdana" w:hAnsi="Verdana" w:cs="Arial"/>
           <w:sz w:val="20"/>
           <w:szCs w:val="20"/>
         </w:rPr>
       </w:pPr>
-      <w:r>
+    </w:p>
+    <w:tbl>
+      <w:tblPr>
+        <w:tblStyle w:val="Tabellrutenett"/>
+        <w:tblW w:w="0" w:type="auto"/>
+        <w:tblInd w:w="720" w:type="dxa"/>
+        <w:tblBorders>
+          <w:top w:val="none" w:sz="0" w:space="0" w:color="auto"/>
+          <w:left w:val="none" w:sz="0" w:space="0" w:color="auto"/>
+          <w:bottom w:val="none" w:sz="0" w:space="0" w:color="auto"/>
+          <w:right w:val="none" w:sz="0" w:space="0" w:color="auto"/>
+          <w:insideH w:val="none" w:sz="0" w:space="0" w:color="auto"/>
+          <w:insideV w:val="none" w:sz="0" w:space="0" w:color="auto"/>
+        </w:tblBorders>
+        <w:tblLook w:val="04A0" w:firstRow="1" w:lastRow="0" w:firstColumn="1" w:lastColumn="0" w:noHBand="0" w:noVBand="1"/>
+      </w:tblPr>
+      <w:tblGrid>
+        <w:gridCol w:w="4859"/>
+        <w:gridCol w:w="4887"/>
+      </w:tblGrid>
+      <w:tr>
+        <w:tc>
+          <w:tcPr>
+            <w:tcW w:w="5228" w:type="dxa"/>
+          </w:tcPr>
+          <w:p>
+            <w:pPr>
+              <w:jc w:val="both"/>
+              <w:rPr>
+                <w:rFonts w:ascii="Verdana" w:hAnsi="Verdana" w:cs="Arial"/>
+                <w:sz w:val="20"/>
+                <w:szCs w:val="20"/>
+              </w:rPr>
+            </w:pPr>
+            <w:r>
+              <w:rPr>
+                <w:rFonts w:ascii="Verdana" w:hAnsi="Verdana" w:cs="Arial"/>
+                <w:sz w:val="20"/>
+                <w:szCs w:val="20"/>
+              </w:rPr>
+              <w:t>{{</w:t>
+            </w:r>
+            <w:proofErr w:type="spellStart"/>
+            <w:r>
+              <w:rPr>
+                <w:rFonts w:ascii="Verdana" w:hAnsi="Verdana" w:cs="Arial"/>
+                <w:sz w:val="20"/>
+                <w:szCs w:val="20"/>
+              </w:rPr>
+              <w:t>mtr</w:t>
+            </w:r>
+            <w:proofErr w:type="spellEnd"/>
+            <w:r>
+              <w:rPr>
+                <w:rFonts w:ascii="Verdana" w:hAnsi="Verdana" w:cs="Arial"/>
+                <w:sz w:val="20"/>
+                <w:szCs w:val="20"/>
+              </w:rPr>
+              <w:t>}} meter total lengde</w:t>
+            </w:r>
+          </w:p>
+        </w:tc>
+        <w:tc>
+          <w:tcPr>
+            <w:tcW w:w="5228" w:type="dxa"/>
+          </w:tcPr>
+          <w:p>
+            <w:pPr>
+              <w:rPr>
+                <w:rFonts w:ascii="Verdana" w:hAnsi="Verdana" w:cs="Arial"/>
+                <w:sz w:val="20"/>
+                <w:szCs w:val="20"/>
+              </w:rPr>
+            </w:pPr>
+            <w:r>
+              <w:rPr>
+                <w:rFonts w:ascii="Verdana" w:hAnsi="Verdana" w:cs="Arial"/>
+                <w:sz w:val="20"/>
+                <w:szCs w:val="20"/>
+              </w:rPr>
+              <w:t>{{</w:t>
+            </w:r>
+            <w:proofErr w:type="spellStart"/>
+            <w:r>
+              <w:rPr>
+                <w:rFonts w:ascii="Verdana" w:hAnsi="Verdana" w:cs="Arial"/>
+                <w:sz w:val="20"/>
+                <w:szCs w:val="20"/>
+              </w:rPr>
+              <w:t>mtr_enhetspris</w:t>
+            </w:r>
+            <w:proofErr w:type="spellEnd"/>
+            <w:r>
+              <w:rPr>
+                <w:rFonts w:ascii="Verdana" w:hAnsi="Verdana" w:cs="Arial"/>
+                <w:sz w:val="20"/>
+                <w:szCs w:val="20"/>
+              </w:rPr>
+              <w:t>}}</w:t>
+            </w:r>
+          </w:p>
+        </w:tc>
+      </w:tr>
+      <w:tr>
+        <w:tc>
+          <w:tcPr>
+            <w:tcW w:w="5228" w:type="dxa"/>
+          </w:tcPr>
+          <w:p>
+            <w:pPr>
+              <w:jc w:val="both"/>
+              <w:rPr>
+                <w:rFonts w:ascii="Verdana" w:hAnsi="Verdana" w:cs="Arial"/>
+                <w:sz w:val="20"/>
+                <w:szCs w:val="20"/>
+              </w:rPr>
+            </w:pPr>
+            <w:r>
+              <w:rPr>
+                <w:rFonts w:ascii="Verdana" w:hAnsi="Verdana" w:cs="Arial"/>
+                <w:sz w:val="20"/>
+                <w:szCs w:val="20"/>
+              </w:rPr>
+              <w:t>{{</w:t>
+            </w:r>
+            <w:proofErr w:type="spellStart"/>
+            <w:r>
+              <w:rPr>
+                <w:rFonts w:ascii="Verdana" w:hAnsi="Verdana" w:cs="Arial"/>
+                <w:sz w:val="20"/>
+                <w:szCs w:val="20"/>
+              </w:rPr>
+              <w:t>vvk</w:t>
+            </w:r>
+            <w:proofErr w:type="spellEnd"/>
+            <w:r>
+              <w:rPr>
+                <w:rFonts w:ascii="Verdana" w:hAnsi="Verdana" w:cs="Arial"/>
+                <w:sz w:val="20"/>
+                <w:szCs w:val="20"/>
+              </w:rPr>
+              <w:t>}} stk. Vertikal vinkel</w:t>
+            </w:r>
+          </w:p>
+        </w:tc>
+        <w:tc>
+          <w:tcPr>
+            <w:tcW w:w="5228" w:type="dxa"/>
+          </w:tcPr>
+          <w:p>
+            <w:pPr>
+              <w:rPr>
+                <w:rFonts w:ascii="Verdana" w:hAnsi="Verdana" w:cs="Arial"/>
+                <w:sz w:val="20"/>
+                <w:szCs w:val="20"/>
+              </w:rPr>
+            </w:pPr>
+            <w:r>
+              <w:rPr>
+                <w:rFonts w:ascii="Verdana" w:hAnsi="Verdana" w:cs="Arial"/>
+                <w:sz w:val="20"/>
+                <w:szCs w:val="20"/>
+              </w:rPr>
+              <w:t>{{</w:t>
+            </w:r>
+            <w:proofErr w:type="spellStart"/>
+            <w:r>
+              <w:rPr>
+                <w:rFonts w:ascii="Verdana" w:hAnsi="Verdana" w:cs="Arial"/>
+                <w:sz w:val="20"/>
+                <w:szCs w:val="20"/>
+              </w:rPr>
+              <w:t>vvk_enhetspris</w:t>
+            </w:r>
+            <w:proofErr w:type="spellEnd"/>
+            <w:r>
+              <w:rPr>
+                <w:rFonts w:ascii="Verdana" w:hAnsi="Verdana" w:cs="Arial"/>
+                <w:sz w:val="20"/>
+                <w:szCs w:val="20"/>
+              </w:rPr>
+              <w:t>}}</w:t>
+            </w:r>
+          </w:p>
+        </w:tc>
+      </w:tr>
+      <w:tr>
+        <w:tc>
+          <w:tcPr>
+            <w:tcW w:w="5228" w:type="dxa"/>
+          </w:tcPr>
+          <w:p>
+            <w:pPr>
+              <w:jc w:val="both"/>
+              <w:rPr>
+                <w:rFonts w:ascii="Verdana" w:hAnsi="Verdana" w:cs="Arial"/>
+                <w:sz w:val="20"/>
+                <w:szCs w:val="20"/>
+              </w:rPr>
+            </w:pPr>
+            <w:r>
+              <w:rPr>
+                <w:rFonts w:ascii="Verdana" w:hAnsi="Verdana" w:cs="Arial"/>
+                <w:sz w:val="20"/>
+                <w:szCs w:val="20"/>
+              </w:rPr>
+              <w:t>{{</w:t>
+            </w:r>
+            <w:proofErr w:type="spellStart"/>
+            <w:r>
+              <w:rPr>
+                <w:rFonts w:ascii="Verdana" w:hAnsi="Verdana" w:cs="Arial"/>
+                <w:sz w:val="20"/>
+                <w:szCs w:val="20"/>
+              </w:rPr>
+              <w:t>hvk</w:t>
+            </w:r>
+            <w:proofErr w:type="spellEnd"/>
+            <w:r>
+              <w:rPr>
+                <w:rFonts w:ascii="Verdana" w:hAnsi="Verdana" w:cs="Arial"/>
+                <w:sz w:val="20"/>
+                <w:szCs w:val="20"/>
+              </w:rPr>
+              <w:t xml:space="preserve">}} stk. Horisontal vinkel </w:t>
+            </w:r>
+          </w:p>
+        </w:tc>
+        <w:tc>
+          <w:tcPr>
+            <w:tcW w:w="5228" w:type="dxa"/>
+          </w:tcPr>
+          <w:p>
+            <w:pPr>
+              <w:rPr>
+                <w:rFonts w:ascii="Verdana" w:hAnsi="Verdana" w:cs="Arial"/>
+                <w:sz w:val="20"/>
+                <w:szCs w:val="20"/>
+              </w:rPr>
+            </w:pPr>
+            <w:r>
+              <w:rPr>
+                <w:rFonts w:ascii="Verdana" w:hAnsi="Verdana" w:cs="Arial"/>
+                <w:sz w:val="20"/>
+                <w:szCs w:val="20"/>
+              </w:rPr>
+              <w:t>{{</w:t>
+            </w:r>
+            <w:proofErr w:type="spellStart"/>
+            <w:r>
+              <w:rPr>
+                <w:rFonts w:ascii="Verdana" w:hAnsi="Verdana" w:cs="Arial"/>
+                <w:sz w:val="20"/>
+                <w:szCs w:val="20"/>
+              </w:rPr>
+              <w:t>hvk_enhetspris</w:t>
+            </w:r>
+            <w:proofErr w:type="spellEnd"/>
+            <w:r>
+              <w:rPr>
+                <w:rFonts w:ascii="Verdana" w:hAnsi="Verdana" w:cs="Arial"/>
+                <w:sz w:val="20"/>
+                <w:szCs w:val="20"/>
+              </w:rPr>
+              <w:t>}}</w:t>
+            </w:r>
+          </w:p>
+        </w:tc>
+      </w:tr>
+      <w:tr>
+        <w:tc>
+          <w:tcPr>
+            <w:tcW w:w="5228" w:type="dxa"/>
+          </w:tcPr>
+          <w:p>
+            <w:pPr>
+              <w:jc w:val="both"/>
+              <w:rPr>
+                <w:rFonts w:ascii="Verdana" w:hAnsi="Verdana" w:cs="Arial"/>
+                <w:sz w:val="20"/>
+                <w:szCs w:val="20"/>
+              </w:rPr>
+            </w:pPr>
+            <w:r>
+              <w:rPr>
+                <w:rFonts w:ascii="Verdana" w:hAnsi="Verdana" w:cs="Arial"/>
+                <w:sz w:val="20"/>
+                <w:szCs w:val="20"/>
+              </w:rPr>
+              <w:t>1 stk. {{ste}}</w:t>
+            </w:r>
+          </w:p>
+        </w:tc>
+        <w:tc>
+          <w:tcPr>
+            <w:tcW w:w="5228" w:type="dxa"/>
+          </w:tcPr>
+          <w:p>
+            <w:pPr>
+              <w:rPr>
+                <w:rFonts w:ascii="Verdana" w:hAnsi="Verdana" w:cs="Arial"/>
+                <w:sz w:val="20"/>
+                <w:szCs w:val="20"/>
+              </w:rPr>
+            </w:pPr>
+            <w:r>
+              <w:rPr>
+                <w:rFonts w:ascii="Verdana" w:hAnsi="Verdana" w:cs="Arial"/>
+                <w:sz w:val="20"/>
+                <w:szCs w:val="20"/>
+              </w:rPr>
+              <w:t>{{</w:t>
+            </w:r>
+            <w:proofErr w:type="spellStart"/>
+            <w:r>
+              <w:rPr>
+                <w:rFonts w:ascii="Verdana" w:hAnsi="Verdana" w:cs="Arial"/>
+                <w:sz w:val="20"/>
+                <w:szCs w:val="20"/>
+              </w:rPr>
+              <w:t>ste_enhetspris</w:t>
+            </w:r>
+            <w:proofErr w:type="spellEnd"/>
+            <w:r>
+              <w:rPr>
+                <w:rFonts w:ascii="Verdana" w:hAnsi="Verdana" w:cs="Arial"/>
+                <w:sz w:val="20"/>
+                <w:szCs w:val="20"/>
+              </w:rPr>
+              <w:t>}}</w:t>
+            </w:r>
+          </w:p>
+        </w:tc>
+      </w:tr>
+      <w:tr>
+        <w:tc>
+          <w:tcPr>
+            <w:tcW w:w="5228" w:type="dxa"/>
+          </w:tcPr>
+          <w:p>
+            <w:pPr>
+              <w:jc w:val="both"/>
+              <w:rPr>
+                <w:rFonts w:ascii="Verdana" w:hAnsi="Verdana" w:cs="Arial"/>
+                <w:sz w:val="20"/>
+                <w:szCs w:val="20"/>
+              </w:rPr>
+            </w:pPr>
+            <w:r>
+              <w:rPr>
+                <w:rFonts w:ascii="Verdana" w:hAnsi="Verdana" w:cs="Arial"/>
+                <w:sz w:val="20"/>
+                <w:szCs w:val="20"/>
+              </w:rPr>
+              <w:t>1 stk. {{</w:t>
+            </w:r>
+            <w:proofErr w:type="spellStart"/>
+            <w:r>
+              <w:rPr>
+                <w:rFonts w:ascii="Verdana" w:hAnsi="Verdana" w:cs="Arial"/>
+                <w:sz w:val="20"/>
+                <w:szCs w:val="20"/>
+              </w:rPr>
+              <w:t>sle</w:t>
+            </w:r>
+            <w:proofErr w:type="spellEnd"/>
+            <w:r>
+              <w:rPr>
+                <w:rFonts w:ascii="Verdana" w:hAnsi="Verdana" w:cs="Arial"/>
+                <w:sz w:val="20"/>
+                <w:szCs w:val="20"/>
+              </w:rPr>
+              <w:t>}}</w:t>
+            </w:r>
+          </w:p>
+        </w:tc>
+        <w:tc>
+          <w:tcPr>
+            <w:tcW w:w="5228" w:type="dxa"/>
+          </w:tcPr>
+          <w:p>
+            <w:pPr>
+              <w:rPr>
+                <w:rFonts w:ascii="Verdana" w:hAnsi="Verdana" w:cs="Arial"/>
+                <w:sz w:val="20"/>
+                <w:szCs w:val="20"/>
+              </w:rPr>
+            </w:pPr>
+            <w:r>
+              <w:rPr>
+                <w:rFonts w:ascii="Verdana" w:hAnsi="Verdana" w:cs="Arial"/>
+                <w:sz w:val="20"/>
+                <w:szCs w:val="20"/>
+              </w:rPr>
+              <w:t>{{</w:t>
+            </w:r>
+            <w:proofErr w:type="spellStart"/>
+            <w:r>
+              <w:rPr>
+                <w:rFonts w:ascii="Verdana" w:hAnsi="Verdana" w:cs="Arial"/>
+                <w:sz w:val="20"/>
+                <w:szCs w:val="20"/>
+              </w:rPr>
+              <w:t>sle_enhetspris</w:t>
+            </w:r>
+            <w:proofErr w:type="spellEnd"/>
+            <w:r>
+              <w:rPr>
+                <w:rFonts w:ascii="Verdana" w:hAnsi="Verdana" w:cs="Arial"/>
+                <w:sz w:val="20"/>
+                <w:szCs w:val="20"/>
+              </w:rPr>
+              <w:t>}}</w:t>
+            </w:r>
+          </w:p>
+        </w:tc>
+      </w:tr>
+      <w:tr>
+        <w:tc>
+          <w:tcPr>
+            <w:tcW w:w="5228" w:type="dxa"/>
+          </w:tcPr>
+          <w:p>
+            <w:pPr>
+              <w:jc w:val="both"/>
+              <w:rPr>
+                <w:rFonts w:ascii="Verdana" w:hAnsi="Verdana" w:cs="Arial"/>
+                <w:sz w:val="20"/>
+                <w:szCs w:val="20"/>
+              </w:rPr>
+            </w:pPr>
+            <w:r>
+              <w:rPr>
+                <w:rFonts w:ascii="Verdana" w:hAnsi="Verdana" w:cs="Arial"/>
+                <w:sz w:val="20"/>
+                <w:szCs w:val="20"/>
+              </w:rPr>
+              <w:t>{{ekspansjonselement}}</w:t>
+            </w:r>
+          </w:p>
+        </w:tc>
+        <w:tc>
+          <w:tcPr>
+            <w:tcW w:w="5228" w:type="dxa"/>
+          </w:tcPr>
+          <w:p>
+            <w:pPr>
+              <w:ind w:firstLine="708"/>
+              <w:rPr>
+                <w:rFonts w:ascii="Verdana" w:hAnsi="Verdana" w:cs="Arial"/>
+                <w:sz w:val="20"/>
+                <w:szCs w:val="20"/>
+              </w:rPr>
+            </w:pPr>
+            <w:r>
+              <w:rPr>
+                <w:rFonts w:ascii="Verdana" w:hAnsi="Verdana" w:cs="Arial"/>
+                <w:sz w:val="20"/>
+                <w:szCs w:val="20"/>
+              </w:rPr>
+              <w:t>{{</w:t>
+            </w:r>
+            <w:proofErr w:type="spellStart"/>
+            <w:r>
+              <w:rPr>
+                <w:rFonts w:ascii="Verdana" w:hAnsi="Verdana" w:cs="Arial"/>
+                <w:sz w:val="20"/>
+                <w:szCs w:val="20"/>
+              </w:rPr>
+              <w:t>exp_enhetspris</w:t>
+            </w:r>
+            <w:proofErr w:type="spellEnd"/>
+            <w:r>
+              <w:rPr>
+                <w:rFonts w:ascii="Verdana" w:hAnsi="Verdana" w:cs="Arial"/>
+                <w:sz w:val="20"/>
+                <w:szCs w:val="20"/>
+              </w:rPr>
+              <w:t>}}</w:t>
+            </w:r>
+          </w:p>
+        </w:tc>
+      </w:tr>
+      <w:tr>
+        <w:tc>
+          <w:tcPr>
+            <w:tcW w:w="5228" w:type="dxa"/>
+          </w:tcPr>
+          <w:p>
+            <w:pPr>
+              <w:jc w:val="both"/>
+              <w:rPr>
+                <w:rFonts w:ascii="Verdana" w:hAnsi="Verdana" w:cs="Arial"/>
+                <w:sz w:val="20"/>
+                <w:szCs w:val="20"/>
+              </w:rPr>
+            </w:pPr>
+            <w:r>
+              <w:rPr>
+                <w:rFonts w:ascii="Verdana" w:hAnsi="Verdana" w:cs="Arial"/>
+                <w:sz w:val="20"/>
+                <w:szCs w:val="20"/>
+              </w:rPr>
+              <w:t>{{bre}}</w:t>
+            </w:r>
+          </w:p>
+        </w:tc>
+        <w:tc>
+          <w:tcPr>
+            <w:tcW w:w="5228" w:type="dxa"/>
+          </w:tcPr>
+          <w:p>
+            <w:pPr>
+              <w:rPr>
+                <w:rFonts w:ascii="Verdana" w:hAnsi="Verdana" w:cs="Arial"/>
+                <w:sz w:val="20"/>
+                <w:szCs w:val="20"/>
+              </w:rPr>
+            </w:pPr>
+            <w:r>
+              <w:rPr>
+                <w:rFonts w:ascii="Verdana" w:hAnsi="Verdana" w:cs="Arial"/>
+                <w:sz w:val="20"/>
+                <w:szCs w:val="20"/>
+              </w:rPr>
+              <w:t>{{</w:t>
+            </w:r>
+            <w:proofErr w:type="spellStart"/>
+            <w:r>
+              <w:rPr>
+                <w:rFonts w:ascii="Verdana" w:hAnsi="Verdana" w:cs="Arial"/>
+                <w:sz w:val="20"/>
+                <w:szCs w:val="20"/>
+              </w:rPr>
+              <w:t>bre_enhetspris</w:t>
+            </w:r>
+            <w:proofErr w:type="spellEnd"/>
+            <w:r>
+              <w:rPr>
+                <w:rFonts w:ascii="Verdana" w:hAnsi="Verdana" w:cs="Arial"/>
+                <w:sz w:val="20"/>
+                <w:szCs w:val="20"/>
+              </w:rPr>
+              <w:t>}}</w:t>
+            </w:r>
+          </w:p>
+        </w:tc>
+      </w:tr>
+    </w:tbl>
+    <w:p>
+      <w:pPr>
+        <w:spacing w:after="0" w:line="240" w:lineRule="auto"/>
         <w:rPr>
           <w:rFonts w:ascii="Verdana" w:hAnsi="Verdana" w:cs="Arial"/>
           <w:sz w:val="20"/>
           <w:szCs w:val="20"/>
         </w:rPr>
-        <w:t>{{mtr}}</w:t>
-      </w:r>
-      <w:r>
-        <w:rPr>
-          <w:rFonts w:ascii="Verdana" w:hAnsi="Verdana" w:cs="Arial"/>
-          <w:sz w:val="20"/>
-          <w:szCs w:val="20"/>
-        </w:rPr>
-        <w:t xml:space="preserve"> m</w:t>
-      </w:r>
-      <w:r>
-        <w:rPr>
-          <w:rFonts w:ascii="Verdana" w:hAnsi="Verdana" w:cs="Arial"/>
-          <w:sz w:val="20"/>
-          <w:szCs w:val="20"/>
-        </w:rPr>
-        <w:t>eter</w:t>
-      </w:r>
-      <w:r>
-        <w:rPr>
-          <w:rFonts w:ascii="Verdana" w:hAnsi="Verdana" w:cs="Arial"/>
-          <w:sz w:val="20"/>
-          <w:szCs w:val="20"/>
-        </w:rPr>
-        <w:t xml:space="preserve"> total lengde</w:t>
-      </w:r>
+      </w:pPr>
     </w:p>
     <w:p>
       <w:pPr>
         <w:spacing w:after="0" w:line="240" w:lineRule="auto"/>
-        <w:ind w:left="720"/>
-        <w:rPr>
-          <w:rFonts w:ascii="Verdana" w:hAnsi="Verdana" w:cs="Arial"/>
-          <w:sz w:val="20"/>
-          <w:szCs w:val="20"/>
-        </w:rPr>
-      </w:pPr>
-      <w:r>
-        <w:rPr>
-          <w:rFonts w:ascii="Verdana" w:hAnsi="Verdana" w:cs="Arial"/>
-          <w:sz w:val="20"/>
-          <w:szCs w:val="20"/>
-        </w:rPr>
-        <w:t>{{vvk}}</w:t>
-      </w:r>
-      <w:r>
-        <w:rPr>
-          <w:rFonts w:ascii="Verdana" w:hAnsi="Verdana" w:cs="Arial"/>
-          <w:sz w:val="20"/>
-          <w:szCs w:val="20"/>
-        </w:rPr>
-        <w:t xml:space="preserve"> stk. </w:t>
-      </w:r>
-      <w:r>
-        <w:rPr>
-          <w:rFonts w:ascii="Verdana" w:hAnsi="Verdana" w:cs="Arial"/>
-          <w:sz w:val="20"/>
-          <w:szCs w:val="20"/>
-        </w:rPr>
-        <w:t>Vertikal v</w:t>
-      </w:r>
-      <w:r>
-        <w:rPr>
-          <w:rFonts w:ascii="Verdana" w:hAnsi="Verdana" w:cs="Arial"/>
-          <w:sz w:val="20"/>
-          <w:szCs w:val="20"/>
-        </w:rPr>
-        <w:t>in</w:t>
-      </w:r>
-      <w:r>
-        <w:rPr>
-          <w:rFonts w:ascii="Verdana" w:hAnsi="Verdana" w:cs="Arial"/>
-          <w:sz w:val="20"/>
-          <w:szCs w:val="20"/>
-        </w:rPr>
-        <w:t>kel</w:t>
-      </w:r>
-    </w:p>
-    <w:p>
-      <w:pPr>
-        <w:spacing w:after="0" w:line="240" w:lineRule="auto"/>
-        <w:ind w:left="720"/>
-        <w:rPr>
-          <w:rFonts w:ascii="Verdana" w:hAnsi="Verdana" w:cs="Arial"/>
-          <w:sz w:val="20"/>
-          <w:szCs w:val="20"/>
-        </w:rPr>
-      </w:pPr>
-      <w:r>
-        <w:rPr>
-          <w:rFonts w:ascii="Verdana" w:hAnsi="Verdana" w:cs="Arial"/>
-          <w:sz w:val="20"/>
-          <w:szCs w:val="20"/>
-        </w:rPr>
-        <w:t>{{hvk}}</w:t>
-      </w:r>
-      <w:r>
-        <w:rPr>
-          <w:rFonts w:ascii="Verdana" w:hAnsi="Verdana" w:cs="Arial"/>
-          <w:sz w:val="20"/>
-          <w:szCs w:val="20"/>
-        </w:rPr>
-        <w:t xml:space="preserve"> stk. Horisontal vinkel </w:t>
-      </w:r>
-    </w:p>
-    <w:p>
-      <w:pPr>
-        <w:spacing w:after="0" w:line="240" w:lineRule="auto"/>
-        <w:ind w:left="720"/>
-        <w:rPr>
-          <w:rFonts w:ascii="Verdana" w:hAnsi="Verdana" w:cs="Arial"/>
-          <w:sz w:val="20"/>
-          <w:szCs w:val="20"/>
-        </w:rPr>
-      </w:pPr>
-      <w:r>
-        <w:rPr>
-          <w:rFonts w:ascii="Verdana" w:hAnsi="Verdana" w:cs="Arial"/>
-          <w:sz w:val="20"/>
-          <w:szCs w:val="20"/>
-        </w:rPr>
-        <w:t xml:space="preserve">1 </w:t>
-      </w:r>
-      <w:r>
-        <w:rPr>
-          <w:rFonts w:ascii="Verdana" w:hAnsi="Verdana" w:cs="Arial"/>
-          <w:sz w:val="20"/>
-          <w:szCs w:val="20"/>
-        </w:rPr>
-        <w:t xml:space="preserve">stk. </w:t>
-      </w:r>
-      <w:r>
-        <w:rPr>
-          <w:rFonts w:ascii="Verdana" w:hAnsi="Verdana" w:cs="Arial"/>
-          <w:sz w:val="20"/>
-          <w:szCs w:val="20"/>
-        </w:rPr>
-        <w:t>{{ste}}</w:t>
-      </w:r>
-    </w:p>
-    <w:p>
-      <w:pPr>
-        <w:spacing w:after="0" w:line="240" w:lineRule="auto"/>
-        <w:ind w:left="720"/>
-        <w:rPr>
-          <w:rFonts w:ascii="Verdana" w:hAnsi="Verdana" w:cs="Arial"/>
-          <w:sz w:val="20"/>
-          <w:szCs w:val="20"/>
-        </w:rPr>
-      </w:pPr>
-      <w:r>
-        <w:rPr>
-          <w:rFonts w:ascii="Verdana" w:hAnsi="Verdana" w:cs="Arial"/>
-          <w:sz w:val="20"/>
-          <w:szCs w:val="20"/>
-        </w:rPr>
-        <w:t xml:space="preserve">1 </w:t>
-      </w:r>
-      <w:r>
-        <w:rPr>
-          <w:rFonts w:ascii="Verdana" w:hAnsi="Verdana" w:cs="Arial"/>
-          <w:sz w:val="20"/>
-          <w:szCs w:val="20"/>
-        </w:rPr>
-        <w:t xml:space="preserve">stk. </w:t>
-      </w:r>
-      <w:r>
-        <w:rPr>
-          <w:rFonts w:ascii="Verdana" w:hAnsi="Verdana" w:cs="Arial"/>
-          <w:sz w:val="20"/>
-          <w:szCs w:val="20"/>
-        </w:rPr>
-        <w:t>{{sle}}</w:t>
-      </w:r>
-    </w:p>
-    <w:p>
-      <w:pPr>
-        <w:spacing w:after="0" w:line="240" w:lineRule="auto"/>
-        <w:ind w:left="720"/>
-        <w:rPr>
-          <w:rFonts w:ascii="Verdana" w:hAnsi="Verdana" w:cs="Arial"/>
-          <w:sz w:val="20"/>
-          <w:szCs w:val="20"/>
-        </w:rPr>
-      </w:pPr>
-      <w:r>
-        <w:rPr>
-          <w:rFonts w:ascii="Verdana" w:hAnsi="Verdana" w:cs="Arial"/>
-          <w:sz w:val="20"/>
-          <w:szCs w:val="20"/>
-        </w:rPr>
-        <w:t>{{ekspansjonselement}}</w:t>
-      </w:r>
-    </w:p>
-    <w:p>
-      <w:pPr>
-        <w:spacing w:after="0" w:line="240" w:lineRule="auto"/>
-        <w:ind w:left="720"/>
-        <w:rPr>
-          <w:rFonts w:ascii="Verdana" w:hAnsi="Verdana" w:cs="Arial"/>
-          <w:sz w:val="20"/>
-          <w:szCs w:val="20"/>
-        </w:rPr>
-      </w:pPr>
-      <w:r>
-        <w:rPr>
-          <w:rFonts w:ascii="Verdana" w:hAnsi="Verdana" w:cs="Arial"/>
-          <w:sz w:val="20"/>
-          <w:szCs w:val="20"/>
-        </w:rPr>
-        <w:t>{{bre}}</w:t>
-      </w:r>
-    </w:p>
-    <w:p>
-      <w:pPr>
-        <w:spacing w:after="0" w:line="240" w:lineRule="auto"/>
-        <w:ind w:left="720"/>
         <w:rPr>
           <w:rFonts w:ascii="Verdana" w:hAnsi="Verdana" w:cs="Arial"/>
           <w:sz w:val="20"/>
@@ -1195,7 +1744,25 @@
                 <w:sz w:val="20"/>
                 <w:szCs w:val="20"/>
               </w:rPr>
-              <w:t>{{avb_tekst}}</w:t>
+              <w:t>{{</w:t>
+            </w:r>
+            <w:proofErr w:type="spellStart"/>
+            <w:r>
+              <w:rPr>
+                <w:rFonts w:ascii="Verdana" w:hAnsi="Verdana" w:cs="Arial"/>
+                <w:sz w:val="20"/>
+                <w:szCs w:val="20"/>
+              </w:rPr>
+              <w:t>avb_tekst</w:t>
+            </w:r>
+            <w:proofErr w:type="spellEnd"/>
+            <w:r>
+              <w:rPr>
+                <w:rFonts w:ascii="Verdana" w:hAnsi="Verdana" w:cs="Arial"/>
+                <w:sz w:val="20"/>
+                <w:szCs w:val="20"/>
+              </w:rPr>
+              <w:t>}}</w:t>
             </w:r>
           </w:p>
         </w:tc>
@@ -1221,7 +1788,25 @@
                 <w:sz w:val="20"/>
                 <w:szCs w:val="20"/>
               </w:rPr>
-              <w:t>{{avb_pris}}</w:t>
+              <w:t>{{</w:t>
+            </w:r>
+            <w:proofErr w:type="spellStart"/>
+            <w:r>
+              <w:rPr>
+                <w:rFonts w:ascii="Verdana" w:hAnsi="Verdana" w:cs="Arial"/>
+                <w:sz w:val="20"/>
+                <w:szCs w:val="20"/>
+              </w:rPr>
+              <w:t>avb_pris</w:t>
+            </w:r>
+            <w:proofErr w:type="spellEnd"/>
+            <w:r>
+              <w:rPr>
+                <w:rFonts w:ascii="Verdana" w:hAnsi="Verdana" w:cs="Arial"/>
+                <w:sz w:val="20"/>
+                <w:szCs w:val="20"/>
+              </w:rPr>
+              <w:t>}}</w:t>
             </w:r>
           </w:p>
         </w:tc>
@@ -1280,7 +1865,25 @@
                 <w:sz w:val="20"/>
                 <w:szCs w:val="20"/>
               </w:rPr>
-              <w:t>{{mtl}}</w:t>
+              <w:t>{{</w:t>
+            </w:r>
+            <w:proofErr w:type="spellStart"/>
+            <w:r>
+              <w:rPr>
+                <w:rFonts w:ascii="Verdana" w:hAnsi="Verdana" w:cs="Arial"/>
+                <w:sz w:val="20"/>
+                <w:szCs w:val="20"/>
+              </w:rPr>
+              <w:t>mtl</w:t>
+            </w:r>
+            <w:proofErr w:type="spellEnd"/>
+            <w:r>
+              <w:rPr>
+                <w:rFonts w:ascii="Verdana" w:hAnsi="Verdana" w:cs="Arial"/>
+                <w:sz w:val="20"/>
+                <w:szCs w:val="20"/>
+              </w:rPr>
+              <w:t>}}</w:t>
             </w:r>
           </w:p>
         </w:tc>
@@ -1306,7 +1909,25 @@
                 <w:sz w:val="20"/>
                 <w:szCs w:val="20"/>
               </w:rPr>
-              <w:t>{{mtp}}</w:t>
+              <w:t>{{</w:t>
+            </w:r>
+            <w:proofErr w:type="spellStart"/>
+            <w:r>
+              <w:rPr>
+                <w:rFonts w:ascii="Verdana" w:hAnsi="Verdana" w:cs="Arial"/>
+                <w:sz w:val="20"/>
+                <w:szCs w:val="20"/>
+              </w:rPr>
+              <w:t>mtp</w:t>
+            </w:r>
+            <w:proofErr w:type="spellEnd"/>
+            <w:r>
+              <w:rPr>
+                <w:rFonts w:ascii="Verdana" w:hAnsi="Verdana" w:cs="Arial"/>
+                <w:sz w:val="20"/>
+                <w:szCs w:val="20"/>
+              </w:rPr>
+              <w:t>}}</w:t>
             </w:r>
           </w:p>
         </w:tc>
@@ -1327,7 +1948,25 @@
           <w:sz w:val="20"/>
           <w:szCs w:val="20"/>
         </w:rPr>
-        <w:t>{{ttm}}</w:t>
+        <w:t>{{</w:t>
+      </w:r>
+      <w:proofErr w:type="spellStart"/>
+      <w:r>
+        <w:rPr>
+          <w:rFonts w:ascii="Verdana" w:hAnsi="Verdana" w:cs="Arial"/>
+          <w:sz w:val="20"/>
+          <w:szCs w:val="20"/>
+        </w:rPr>
+        <w:t>ttm</w:t>
+      </w:r>
+      <w:proofErr w:type="spellEnd"/>
+      <w:r>
+        <w:rPr>
+          <w:rFonts w:ascii="Verdana" w:hAnsi="Verdana" w:cs="Arial"/>
+          <w:sz w:val="20"/>
+          <w:szCs w:val="20"/>
+        </w:rPr>
+        <w:t>}}</w:t>
       </w:r>
     </w:p>
     <w:p>
@@ -1375,7 +2014,25 @@
                 <w:sz w:val="20"/>
                 <w:szCs w:val="20"/>
               </w:rPr>
-              <w:t>{{itl}}</w:t>
+              <w:t>{{</w:t>
+            </w:r>
+            <w:proofErr w:type="spellStart"/>
+            <w:r>
+              <w:rPr>
+                <w:rFonts w:ascii="Verdana" w:hAnsi="Verdana" w:cs="Arial"/>
+                <w:sz w:val="20"/>
+                <w:szCs w:val="20"/>
+              </w:rPr>
+              <w:t>itl</w:t>
+            </w:r>
+            <w:proofErr w:type="spellEnd"/>
+            <w:r>
+              <w:rPr>
+                <w:rFonts w:ascii="Verdana" w:hAnsi="Verdana" w:cs="Arial"/>
+                <w:sz w:val="20"/>
+                <w:szCs w:val="20"/>
+              </w:rPr>
+              <w:t>}}</w:t>
             </w:r>
           </w:p>
         </w:tc>
@@ -1401,7 +2058,25 @@
                 <w:sz w:val="20"/>
                 <w:szCs w:val="20"/>
               </w:rPr>
-              <w:t>{{itp}}</w:t>
+              <w:t>{{</w:t>
+            </w:r>
+            <w:proofErr w:type="spellStart"/>
+            <w:r>
+              <w:rPr>
+                <w:rFonts w:ascii="Verdana" w:hAnsi="Verdana" w:cs="Arial"/>
+                <w:sz w:val="20"/>
+                <w:szCs w:val="20"/>
+              </w:rPr>
+              <w:t>itp</w:t>
+            </w:r>
+            <w:proofErr w:type="spellEnd"/>
+            <w:r>
+              <w:rPr>
+                <w:rFonts w:ascii="Verdana" w:hAnsi="Verdana" w:cs="Arial"/>
+                <w:sz w:val="20"/>
+                <w:szCs w:val="20"/>
+              </w:rPr>
+              <w:t>}}</w:t>
             </w:r>
           </w:p>
         </w:tc>
@@ -1422,7 +2097,25 @@
           <w:sz w:val="20"/>
           <w:szCs w:val="20"/>
         </w:rPr>
-        <w:t>{{tti}}</w:t>
+        <w:t>{{</w:t>
+      </w:r>
+      <w:proofErr w:type="spellStart"/>
+      <w:r>
+        <w:rPr>
+          <w:rFonts w:ascii="Verdana" w:hAnsi="Verdana" w:cs="Arial"/>
+          <w:sz w:val="20"/>
+          <w:szCs w:val="20"/>
+        </w:rPr>
+        <w:t>tti</w:t>
+      </w:r>
+      <w:proofErr w:type="spellEnd"/>
+      <w:r>
+        <w:rPr>
+          <w:rFonts w:ascii="Verdana" w:hAnsi="Verdana" w:cs="Arial"/>
+          <w:sz w:val="20"/>
+          <w:szCs w:val="20"/>
+        </w:rPr>
+        <w:t>}}</w:t>
       </w:r>
     </w:p>
     <w:p>
@@ -1469,7 +2162,25 @@
                 <w:sz w:val="20"/>
                 <w:szCs w:val="20"/>
               </w:rPr>
-              <w:t>{{tol}}</w:t>
+              <w:t>{{</w:t>
+            </w:r>
+            <w:proofErr w:type="spellStart"/>
+            <w:r>
+              <w:rPr>
+                <w:rFonts w:ascii="Verdana" w:hAnsi="Verdana" w:cs="Arial"/>
+                <w:sz w:val="20"/>
+                <w:szCs w:val="20"/>
+              </w:rPr>
+              <w:t>tol</w:t>
+            </w:r>
+            <w:proofErr w:type="spellEnd"/>
+            <w:r>
+              <w:rPr>
+                <w:rFonts w:ascii="Verdana" w:hAnsi="Verdana" w:cs="Arial"/>
+                <w:sz w:val="20"/>
+                <w:szCs w:val="20"/>
+              </w:rPr>
+              <w:t>}}</w:t>
             </w:r>
           </w:p>
         </w:tc>
@@ -1495,7 +2206,25 @@
                 <w:sz w:val="20"/>
                 <w:szCs w:val="20"/>
               </w:rPr>
-              <w:t>{{top}}</w:t>
+              <w:t>{{</w:t>
+            </w:r>
+            <w:proofErr w:type="spellStart"/>
+            <w:r>
+              <w:rPr>
+                <w:rFonts w:ascii="Verdana" w:hAnsi="Verdana" w:cs="Arial"/>
+                <w:sz w:val="20"/>
+                <w:szCs w:val="20"/>
+              </w:rPr>
+              <w:t>top</w:t>
+            </w:r>
+            <w:proofErr w:type="spellEnd"/>
+            <w:r>
+              <w:rPr>
+                <w:rFonts w:ascii="Verdana" w:hAnsi="Verdana" w:cs="Arial"/>
+                <w:sz w:val="20"/>
+                <w:szCs w:val="20"/>
+              </w:rPr>
+              <w:t>}}</w:t>
             </w:r>
           </w:p>
         </w:tc>
@@ -1516,7 +2245,25 @@
           <w:sz w:val="20"/>
           <w:szCs w:val="20"/>
         </w:rPr>
-        <w:t>{{tod}}</w:t>
+        <w:t>{{</w:t>
+      </w:r>
+      <w:proofErr w:type="spellStart"/>
+      <w:r>
+        <w:rPr>
+          <w:rFonts w:ascii="Verdana" w:hAnsi="Verdana" w:cs="Arial"/>
+          <w:sz w:val="20"/>
+          <w:szCs w:val="20"/>
+        </w:rPr>
+        <w:t>tod</w:t>
+      </w:r>
+      <w:proofErr w:type="spellEnd"/>
+      <w:r>
+        <w:rPr>
+          <w:rFonts w:ascii="Verdana" w:hAnsi="Verdana" w:cs="Arial"/>
+          <w:sz w:val="20"/>
+          <w:szCs w:val="20"/>
+        </w:rPr>
+        <w:t>}}</w:t>
       </w:r>
     </w:p>
     <w:tbl>
@@ -1568,7 +2315,27 @@
           <w:sz w:val="20"/>
           <w:szCs w:val="20"/>
         </w:rPr>
-        <w:t>{{lse}}</w:t>
+        <w:t>{{</w:t>
+      </w:r>
+      <w:proofErr w:type="spellStart"/>
+      <w:r>
+        <w:rPr>
+          <w:rFonts w:ascii="Verdana" w:hAnsi="Verdana" w:cs="Arial"/>
+          <w:bCs/>
+          <w:sz w:val="20"/>
+          <w:szCs w:val="20"/>
+        </w:rPr>
+        <w:t>lse</w:t>
+      </w:r>
+      <w:proofErr w:type="spellEnd"/>
+      <w:r>
+        <w:rPr>
+          <w:rFonts w:ascii="Verdana" w:hAnsi="Verdana" w:cs="Arial"/>
+          <w:bCs/>
+          <w:sz w:val="20"/>
+          <w:szCs w:val="20"/>
+        </w:rPr>
+        <w:t>}}</w:t>
       </w:r>
       <w:r>
         <w:rPr>
@@ -1638,8 +2405,9 @@
                 <w:sz w:val="20"/>
                 <w:szCs w:val="20"/>
               </w:rPr>
-              <w:t>Brannelement er pris pr.st</w:t>
-            </w:r>
+              <w:t xml:space="preserve">Brannelement er pris </w:t>
+            </w:r>
+            <w:proofErr w:type="spellStart"/>
             <w:r>
               <w:rPr>
                 <w:rFonts w:ascii="Verdana" w:hAnsi="Verdana" w:cs="Arial"/>
@@ -1650,7 +2418,7 @@
                 <w:sz w:val="20"/>
                 <w:szCs w:val="20"/>
               </w:rPr>
-              <w:t>k -</w:t>
+              <w:t>pr.st</w:t>
             </w:r>
             <w:r>
               <w:rPr>
@@ -1662,8 +2430,49 @@
                 <w:sz w:val="20"/>
                 <w:szCs w:val="20"/>
               </w:rPr>
-              <w:t xml:space="preserve"> pr.strømskinne</w:t>
-            </w:r>
+              <w:t>k</w:t>
+            </w:r>
+            <w:proofErr w:type="spellEnd"/>
+            <w:r>
+              <w:rPr>
+                <w:rFonts w:ascii="Verdana" w:hAnsi="Verdana" w:cs="Arial"/>
+                <w:b w:val="0"/>
+                <w:bCs w:val="0"/>
+                <w:i/>
+                <w:iCs/>
+                <w:sz w:val="20"/>
+                <w:szCs w:val="20"/>
+              </w:rPr>
+              <w:t xml:space="preserve"> -</w:t>
+            </w:r>
+            <w:r>
+              <w:rPr>
+                <w:rFonts w:ascii="Verdana" w:hAnsi="Verdana" w:cs="Arial"/>
+                <w:b w:val="0"/>
+                <w:bCs w:val="0"/>
+                <w:i/>
+                <w:iCs/>
+                <w:sz w:val="20"/>
+                <w:szCs w:val="20"/>
+              </w:rPr>
+              <w:t xml:space="preserve"> </w:t>
+            </w:r>
+            <w:proofErr w:type="spellStart"/>
+            <w:proofErr w:type="gramStart"/>
+            <w:r>
+              <w:rPr>
+                <w:rFonts w:ascii="Verdana" w:hAnsi="Verdana" w:cs="Arial"/>
+                <w:b w:val="0"/>
+                <w:bCs w:val="0"/>
+                <w:i/>
+                <w:iCs/>
+                <w:sz w:val="20"/>
+                <w:szCs w:val="20"/>
+              </w:rPr>
+              <w:t>pr.strømskinne</w:t>
+            </w:r>
+            <w:proofErr w:type="spellEnd"/>
+            <w:proofErr w:type="gramEnd"/>
           </w:p>
         </w:tc>
         <w:tc>
@@ -1690,7 +2499,21 @@
         <w:rPr>
           <w:rFonts w:ascii="Verdana" w:hAnsi="Verdana" w:cs="Arial"/>
         </w:rPr>
-        <w:t>{{bss}}</w:t>
+        <w:t>{{</w:t>
+      </w:r>
+      <w:proofErr w:type="spellStart"/>
+      <w:r>
+        <w:rPr>
+          <w:rFonts w:ascii="Verdana" w:hAnsi="Verdana" w:cs="Arial"/>
+        </w:rPr>
+        <w:t>bss</w:t>
+      </w:r>
+      <w:proofErr w:type="spellEnd"/>
+      <w:r>
+        <w:rPr>
+          <w:rFonts w:ascii="Verdana" w:hAnsi="Verdana" w:cs="Arial"/>
+        </w:rPr>
+        <w:t>}}</w:t>
       </w:r>
     </w:p>
     <w:tbl>
@@ -1744,18 +2567,10 @@
                 <w:i/>
                 <w:iCs/>
               </w:rPr>
-              <w:t xml:space="preserve"> {{lnr}}: {{brt}}</w:t>
-            </w:r>
-          </w:p>
-        </w:tc>
-        <w:tc>
-          <w:tcPr>
-            <w:tcW w:w="1726" w:type="dxa"/>
-          </w:tcPr>
-          <w:p>
-            <w:pPr>
-              <w:jc w:val="right"/>
-              <w:cnfStyle w:val="100000000000" w:firstRow="1" w:lastRow="0" w:firstColumn="0" w:lastColumn="0" w:oddVBand="0" w:evenVBand="0" w:oddHBand="0" w:evenHBand="0" w:firstRowFirstColumn="0" w:firstRowLastColumn="0" w:lastRowFirstColumn="0" w:lastRowLastColumn="0"/>
+              <w:t xml:space="preserve"> {{</w:t>
+            </w:r>
+            <w:proofErr w:type="spellStart"/>
+            <w:r>
               <w:rPr>
                 <w:rFonts w:ascii="Verdana" w:hAnsi="Verdana" w:cs="Arial"/>
                 <w:b w:val="0"/>
@@ -1763,7 +2578,9 @@
                 <w:i/>
                 <w:iCs/>
               </w:rPr>
-            </w:pPr>
+              <w:t>lnr</w:t>
+            </w:r>
+            <w:proofErr w:type="spellEnd"/>
             <w:r>
               <w:rPr>
                 <w:rFonts w:ascii="Verdana" w:hAnsi="Verdana" w:cs="Arial"/>
@@ -1772,7 +2589,79 @@
                 <w:i/>
                 <w:iCs/>
               </w:rPr>
-              <w:t>kr. {{brp}}</w:t>
+              <w:t>}}: {{</w:t>
+            </w:r>
+            <w:proofErr w:type="spellStart"/>
+            <w:r>
+              <w:rPr>
+                <w:rFonts w:ascii="Verdana" w:hAnsi="Verdana" w:cs="Arial"/>
+                <w:b w:val="0"/>
+                <w:bCs w:val="0"/>
+                <w:i/>
+                <w:iCs/>
+              </w:rPr>
+              <w:t>brt</w:t>
+            </w:r>
+            <w:proofErr w:type="spellEnd"/>
+            <w:r>
+              <w:rPr>
+                <w:rFonts w:ascii="Verdana" w:hAnsi="Verdana" w:cs="Arial"/>
+                <w:b w:val="0"/>
+                <w:bCs w:val="0"/>
+                <w:i/>
+                <w:iCs/>
+              </w:rPr>
+              <w:t>}}</w:t>
+            </w:r>
+          </w:p>
+        </w:tc>
+        <w:tc>
+          <w:tcPr>
+            <w:tcW w:w="1726" w:type="dxa"/>
+          </w:tcPr>
+          <w:p>
+            <w:pPr>
+              <w:jc w:val="right"/>
+              <w:cnfStyle w:val="100000000000" w:firstRow="1" w:lastRow="0" w:firstColumn="0" w:lastColumn="0" w:oddVBand="0" w:evenVBand="0" w:oddHBand="0" w:evenHBand="0" w:firstRowFirstColumn="0" w:firstRowLastColumn="0" w:lastRowFirstColumn="0" w:lastRowLastColumn="0"/>
+              <w:rPr>
+                <w:rFonts w:ascii="Verdana" w:hAnsi="Verdana" w:cs="Arial"/>
+                <w:b w:val="0"/>
+                <w:bCs w:val="0"/>
+                <w:i/>
+                <w:iCs/>
+              </w:rPr>
+            </w:pPr>
+            <w:r>
+              <w:rPr>
+                <w:rFonts w:ascii="Verdana" w:hAnsi="Verdana" w:cs="Arial"/>
+                <w:b w:val="0"/>
+                <w:bCs w:val="0"/>
+                <w:i/>
+                <w:iCs/>
+              </w:rPr>
+              <w:t>kr. {{</w:t>
+            </w:r>
+            <w:proofErr w:type="spellStart"/>
+            <w:r>
+              <w:rPr>
+                <w:rFonts w:ascii="Verdana" w:hAnsi="Verdana" w:cs="Arial"/>
+                <w:b w:val="0"/>
+                <w:bCs w:val="0"/>
+                <w:i/>
+                <w:iCs/>
+              </w:rPr>
+              <w:t>brp</w:t>
+            </w:r>
+            <w:proofErr w:type="spellEnd"/>
+            <w:r>
+              <w:rPr>
+                <w:rFonts w:ascii="Verdana" w:hAnsi="Verdana" w:cs="Arial"/>
+                <w:b w:val="0"/>
+                <w:bCs w:val="0"/>
+                <w:i/>
+                <w:iCs/>
+              </w:rPr>
+              <w:t>}}</w:t>
             </w:r>
           </w:p>
         </w:tc>
@@ -1789,7 +2678,21 @@
         <w:rPr>
           <w:rFonts w:ascii="Verdana" w:hAnsi="Verdana" w:cs="Arial"/>
         </w:rPr>
-        <w:t>{{bse}}</w:t>
+        <w:t>{{</w:t>
+      </w:r>
+      <w:proofErr w:type="spellStart"/>
+      <w:r>
+        <w:rPr>
+          <w:rFonts w:ascii="Verdana" w:hAnsi="Verdana" w:cs="Arial"/>
+        </w:rPr>
+        <w:t>bse</w:t>
+      </w:r>
+      <w:proofErr w:type="spellEnd"/>
+      <w:r>
+        <w:rPr>
+          <w:rFonts w:ascii="Verdana" w:hAnsi="Verdana" w:cs="Arial"/>
+        </w:rPr>
+        <w:t>}}</w:t>
       </w:r>
     </w:p>
     <w:p>
@@ -1855,18 +2758,10 @@
                 <w:i/>
                 <w:iCs/>
               </w:rPr>
-              <w:t>{{lnr}}: {{tol}}</w:t>
-            </w:r>
-          </w:p>
-        </w:tc>
-        <w:tc>
-          <w:tcPr>
-            <w:tcW w:w="1726" w:type="dxa"/>
-          </w:tcPr>
-          <w:p>
-            <w:pPr>
-              <w:jc w:val="right"/>
-              <w:cnfStyle w:val="100000000000" w:firstRow="1" w:lastRow="0" w:firstColumn="0" w:lastColumn="0" w:oddVBand="0" w:evenVBand="0" w:oddHBand="0" w:evenHBand="0" w:firstRowFirstColumn="0" w:firstRowLastColumn="0" w:lastRowFirstColumn="0" w:lastRowLastColumn="0"/>
+              <w:t>{{</w:t>
+            </w:r>
+            <w:proofErr w:type="spellStart"/>
+            <w:r>
               <w:rPr>
                 <w:rFonts w:ascii="Verdana" w:hAnsi="Verdana" w:cs="Arial"/>
                 <w:b w:val="0"/>
@@ -1874,7 +2769,9 @@
                 <w:i/>
                 <w:iCs/>
               </w:rPr>
-            </w:pPr>
+              <w:t>lnr</w:t>
+            </w:r>
+            <w:proofErr w:type="spellEnd"/>
             <w:r>
               <w:rPr>
                 <w:rFonts w:ascii="Verdana" w:hAnsi="Verdana" w:cs="Arial"/>
@@ -1883,7 +2780,79 @@
                 <w:i/>
                 <w:iCs/>
               </w:rPr>
-              <w:t>{{top}}</w:t>
+              <w:t>}}: {{</w:t>
+            </w:r>
+            <w:proofErr w:type="spellStart"/>
+            <w:r>
+              <w:rPr>
+                <w:rFonts w:ascii="Verdana" w:hAnsi="Verdana" w:cs="Arial"/>
+                <w:b w:val="0"/>
+                <w:bCs w:val="0"/>
+                <w:i/>
+                <w:iCs/>
+              </w:rPr>
+              <w:t>tol</w:t>
+            </w:r>
+            <w:proofErr w:type="spellEnd"/>
+            <w:r>
+              <w:rPr>
+                <w:rFonts w:ascii="Verdana" w:hAnsi="Verdana" w:cs="Arial"/>
+                <w:b w:val="0"/>
+                <w:bCs w:val="0"/>
+                <w:i/>
+                <w:iCs/>
+              </w:rPr>
+              <w:t>}}</w:t>
+            </w:r>
+          </w:p>
+        </w:tc>
+        <w:tc>
+          <w:tcPr>
+            <w:tcW w:w="1726" w:type="dxa"/>
+          </w:tcPr>
+          <w:p>
+            <w:pPr>
+              <w:jc w:val="right"/>
+              <w:cnfStyle w:val="100000000000" w:firstRow="1" w:lastRow="0" w:firstColumn="0" w:lastColumn="0" w:oddVBand="0" w:evenVBand="0" w:oddHBand="0" w:evenHBand="0" w:firstRowFirstColumn="0" w:firstRowLastColumn="0" w:lastRowFirstColumn="0" w:lastRowLastColumn="0"/>
+              <w:rPr>
+                <w:rFonts w:ascii="Verdana" w:hAnsi="Verdana" w:cs="Arial"/>
+                <w:b w:val="0"/>
+                <w:bCs w:val="0"/>
+                <w:i/>
+                <w:iCs/>
+              </w:rPr>
+            </w:pPr>
+            <w:r>
+              <w:rPr>
+                <w:rFonts w:ascii="Verdana" w:hAnsi="Verdana" w:cs="Arial"/>
+                <w:b w:val="0"/>
+                <w:bCs w:val="0"/>
+                <w:i/>
+                <w:iCs/>
+              </w:rPr>
+              <w:t>{{</w:t>
+            </w:r>
+            <w:proofErr w:type="spellStart"/>
+            <w:r>
+              <w:rPr>
+                <w:rFonts w:ascii="Verdana" w:hAnsi="Verdana" w:cs="Arial"/>
+                <w:b w:val="0"/>
+                <w:bCs w:val="0"/>
+                <w:i/>
+                <w:iCs/>
+              </w:rPr>
+              <w:t>top</w:t>
+            </w:r>
+            <w:proofErr w:type="spellEnd"/>
+            <w:r>
+              <w:rPr>
+                <w:rFonts w:ascii="Verdana" w:hAnsi="Verdana" w:cs="Arial"/>
+                <w:b w:val="0"/>
+                <w:bCs w:val="0"/>
+                <w:i/>
+                <w:iCs/>
+              </w:rPr>
+              <w:t>}}</w:t>
             </w:r>
           </w:p>
         </w:tc>
@@ -1916,7 +2885,29 @@
                 <w:i/>
                 <w:iCs/>
               </w:rPr>
-              <w:t>{{tod}}</w:t>
+              <w:t>{{</w:t>
+            </w:r>
+            <w:proofErr w:type="spellStart"/>
+            <w:r>
+              <w:rPr>
+                <w:rFonts w:ascii="Verdana" w:hAnsi="Verdana" w:cs="Arial"/>
+                <w:b w:val="0"/>
+                <w:bCs w:val="0"/>
+                <w:i/>
+                <w:iCs/>
+              </w:rPr>
+              <w:t>tod</w:t>
+            </w:r>
+            <w:proofErr w:type="spellEnd"/>
+            <w:r>
+              <w:rPr>
+                <w:rFonts w:ascii="Verdana" w:hAnsi="Verdana" w:cs="Arial"/>
+                <w:b w:val="0"/>
+                <w:bCs w:val="0"/>
+                <w:i/>
+                <w:iCs/>
+              </w:rPr>
+              <w:t>}}</w:t>
             </w:r>
           </w:p>
         </w:tc>
@@ -2110,13 +3101,21 @@
           <w:color w:val="ED7D31" w:themeColor="accent2"/>
         </w:rPr>
         <w:tab/>
-        <w:t xml:space="preserve">à kr </w:t>
-      </w:r>
+        <w:t xml:space="preserve">à </w:t>
+      </w:r>
+      <w:proofErr w:type="gramStart"/>
       <w:r>
         <w:rPr>
           <w:rFonts w:ascii="Verdana" w:hAnsi="Verdana" w:cs="Arial"/>
           <w:color w:val="ED7D31" w:themeColor="accent2"/>
         </w:rPr>
+        <w:t xml:space="preserve">kr </w:t>
+      </w:r>
+      <w:r>
+        <w:rPr>
+          <w:rFonts w:ascii="Verdana" w:hAnsi="Verdana" w:cs="Arial"/>
+          <w:color w:val="ED7D31" w:themeColor="accent2"/>
+        </w:rPr>
         <w:t xml:space="preserve"> </w:t>
       </w:r>
       <w:r>
@@ -2126,6 +3125,7 @@
         </w:rPr>
         <w:t>15</w:t>
       </w:r>
+      <w:proofErr w:type="gramEnd"/>
       <w:r>
         <w:rPr>
           <w:rFonts w:ascii="Verdana" w:hAnsi="Verdana" w:cs="Arial"/>
@@ -2582,7 +3582,27 @@
           <w:szCs w:val="18"/>
           <w:lang w:eastAsia="en-US"/>
         </w:rPr>
-        <w:t xml:space="preserve">Pris på montasjen er basert på kontinuerlig arbeidsprosess uten opphold innenfor normal arbeidstid (07:00-19:00), fri adkomst der skinne skal monteres, tilgang til minimum 16A byggstrøm og tilstrekkelig lys. </w:t>
+        <w:t xml:space="preserve">Pris på montasjen er basert på kontinuerlig arbeidsprosess uten opphold innenfor normal arbeidstid (07:00-19:00), fri adkomst der skinne skal monteres, tilgang til minimum 16A </w:t>
+      </w:r>
+      <w:proofErr w:type="spellStart"/>
+      <w:r>
+        <w:rPr>
+          <w:rFonts w:ascii="Verdana" w:hAnsi="Verdana" w:cs="Arial"/>
+          <w:sz w:val="18"/>
+          <w:szCs w:val="18"/>
+          <w:lang w:eastAsia="en-US"/>
+        </w:rPr>
+        <w:t>byggstrøm</w:t>
+      </w:r>
+      <w:proofErr w:type="spellEnd"/>
+      <w:r>
+        <w:rPr>
+          <w:rFonts w:ascii="Verdana" w:hAnsi="Verdana" w:cs="Arial"/>
+          <w:sz w:val="18"/>
+          <w:szCs w:val="18"/>
+          <w:lang w:eastAsia="en-US"/>
+        </w:rPr>
+        <w:t xml:space="preserve"> og tilstrekkelig lys. </w:t>
       </w:r>
     </w:p>
     <w:p>
@@ -2834,7 +3854,25 @@
           <w:sz w:val="18"/>
           <w:szCs w:val="18"/>
         </w:rPr>
-        <w:t>Ved feil og/eller mangler i mottatt underlag, eller endring av opprinnelig spesifikasjon/underlag, må en priskonsekvens påregnes.</w:t>
+        <w:t xml:space="preserve">Ved feil og/eller mangler i mottatt underlag, eller endring av opprinnelig spesifikasjon/underlag, må en priskonsekvens </w:t>
+      </w:r>
+      <w:proofErr w:type="gramStart"/>
+      <w:r>
+        <w:rPr>
+          <w:rFonts w:ascii="Verdana" w:hAnsi="Verdana" w:cs="Arial"/>
+          <w:sz w:val="18"/>
+          <w:szCs w:val="18"/>
+        </w:rPr>
+        <w:t>påregnes</w:t>
+      </w:r>
+      <w:proofErr w:type="gramEnd"/>
+      <w:r>
+        <w:rPr>
+          <w:rFonts w:ascii="Verdana" w:hAnsi="Verdana" w:cs="Arial"/>
+          <w:sz w:val="18"/>
+          <w:szCs w:val="18"/>
+        </w:rPr>
+        <w:t>.</w:t>
       </w:r>
     </w:p>
     <w:p>
@@ -2851,7 +3889,25 @@
           <w:sz w:val="18"/>
           <w:szCs w:val="18"/>
         </w:rPr>
-        <w:t>Prisgrunnlag (stykklister, skisser og beskrivelser m.m.) skal kontrolleres og godkjennes før en eventuell bestilling plasseres.</w:t>
+        <w:t>Prisgrunnlag (</w:t>
+      </w:r>
+      <w:proofErr w:type="spellStart"/>
+      <w:r>
+        <w:rPr>
+          <w:rFonts w:ascii="Verdana" w:hAnsi="Verdana" w:cs="Arial"/>
+          <w:sz w:val="18"/>
+          <w:szCs w:val="18"/>
+        </w:rPr>
+        <w:t>stykklister</w:t>
+      </w:r>
+      <w:proofErr w:type="spellEnd"/>
+      <w:r>
+        <w:rPr>
+          <w:rFonts w:ascii="Verdana" w:hAnsi="Verdana" w:cs="Arial"/>
+          <w:sz w:val="18"/>
+          <w:szCs w:val="18"/>
+        </w:rPr>
+        <w:t>, skisser og beskrivelser m.m.) skal kontrolleres og godkjennes før en eventuell bestilling plasseres.</w:t>
       </w:r>
     </w:p>
     <w:p>
@@ -2877,7 +3933,25 @@
           <w:sz w:val="18"/>
           <w:szCs w:val="18"/>
         </w:rPr>
-        <w:t xml:space="preserve"> sine leveringsbetingelser er iht. siste utgave av Incoterm sine betingelser.</w:t>
+        <w:t xml:space="preserve"> sine leveringsbetingelser er iht. siste utgave av </w:t>
+      </w:r>
+      <w:proofErr w:type="spellStart"/>
+      <w:r>
+        <w:rPr>
+          <w:rFonts w:ascii="Verdana" w:hAnsi="Verdana" w:cs="Arial"/>
+          <w:sz w:val="18"/>
+          <w:szCs w:val="18"/>
+        </w:rPr>
+        <w:t>Incoterm</w:t>
+      </w:r>
+      <w:proofErr w:type="spellEnd"/>
+      <w:r>
+        <w:rPr>
+          <w:rFonts w:ascii="Verdana" w:hAnsi="Verdana" w:cs="Arial"/>
+          <w:sz w:val="18"/>
+          <w:szCs w:val="18"/>
+        </w:rPr>
+        <w:t xml:space="preserve"> sine betingelser.</w:t>
       </w:r>
       <w:r>
         <w:rPr>
@@ -3273,7 +4347,25 @@
           <w:sz w:val="18"/>
           <w:szCs w:val="18"/>
         </w:rPr>
-        <w:t>{{bruker_navn}}</w:t>
+        <w:t>{{</w:t>
+      </w:r>
+      <w:proofErr w:type="spellStart"/>
+      <w:r>
+        <w:rPr>
+          <w:rFonts w:ascii="Verdana" w:hAnsi="Verdana" w:cs="Arial"/>
+          <w:sz w:val="18"/>
+          <w:szCs w:val="18"/>
+        </w:rPr>
+        <w:t>bruker_navn</w:t>
+      </w:r>
+      <w:proofErr w:type="spellEnd"/>
+      <w:r>
+        <w:rPr>
+          <w:rFonts w:ascii="Verdana" w:hAnsi="Verdana" w:cs="Arial"/>
+          <w:sz w:val="18"/>
+          <w:szCs w:val="18"/>
+        </w:rPr>
+        <w:t>}}</w:t>
       </w:r>
     </w:p>
     <w:p>
@@ -3290,7 +4382,25 @@
           <w:sz w:val="18"/>
           <w:szCs w:val="18"/>
         </w:rPr>
-        <w:t>{{bruker_stilling}}</w:t>
+        <w:t>{{</w:t>
+      </w:r>
+      <w:proofErr w:type="spellStart"/>
+      <w:r>
+        <w:rPr>
+          <w:rFonts w:ascii="Verdana" w:hAnsi="Verdana" w:cs="Arial"/>
+          <w:sz w:val="18"/>
+          <w:szCs w:val="18"/>
+        </w:rPr>
+        <w:t>bruker_stilling</w:t>
+      </w:r>
+      <w:proofErr w:type="spellEnd"/>
+      <w:r>
+        <w:rPr>
+          <w:rFonts w:ascii="Verdana" w:hAnsi="Verdana" w:cs="Arial"/>
+          <w:sz w:val="18"/>
+          <w:szCs w:val="18"/>
+        </w:rPr>
+        <w:t>}}</w:t>
       </w:r>
       <w:r>
         <w:rPr>
@@ -3397,15 +4507,99 @@
           <w:sz w:val="18"/>
           <w:szCs w:val="18"/>
         </w:rPr>
-        <w:t xml:space="preserve">OPPDRAGSGIVER har ansvaret for å Ernström Electro AS alle nødvendige og relevanteopplysninger som er nødvendig for å kunne gi et komplett tilbud på forespørselen. Herunder grensesnittet til andre sidestilte entreprenører.Det forutsettes at oppdraget har en klar funksjonsbeskrivelse. Merkostnader som følge av mangelfulle eller uriktige opplysninger kan kreves dekket som tillegg. </w:t>
-      </w:r>
-      <w:r>
-        <w:rPr>
-          <w:rFonts w:ascii="Verdana" w:hAnsi="Verdana" w:cs="Arial"/>
-          <w:sz w:val="18"/>
-          <w:szCs w:val="18"/>
-        </w:rPr>
-        <w:t>Ernström Electro AS</w:t>
+        <w:t xml:space="preserve">OPPDRAGSGIVER har ansvaret for å </w:t>
+      </w:r>
+      <w:proofErr w:type="spellStart"/>
+      <w:r>
+        <w:rPr>
+          <w:rFonts w:ascii="Verdana" w:hAnsi="Verdana" w:cs="Arial"/>
+          <w:sz w:val="18"/>
+          <w:szCs w:val="18"/>
+        </w:rPr>
+        <w:t>Ernström</w:t>
+      </w:r>
+      <w:proofErr w:type="spellEnd"/>
+      <w:r>
+        <w:rPr>
+          <w:rFonts w:ascii="Verdana" w:hAnsi="Verdana" w:cs="Arial"/>
+          <w:sz w:val="18"/>
+          <w:szCs w:val="18"/>
+        </w:rPr>
+        <w:t xml:space="preserve"> </w:t>
+      </w:r>
+      <w:proofErr w:type="spellStart"/>
+      <w:r>
+        <w:rPr>
+          <w:rFonts w:ascii="Verdana" w:hAnsi="Verdana" w:cs="Arial"/>
+          <w:sz w:val="18"/>
+          <w:szCs w:val="18"/>
+        </w:rPr>
+        <w:t>Electro</w:t>
+      </w:r>
+      <w:proofErr w:type="spellEnd"/>
+      <w:r>
+        <w:rPr>
+          <w:rFonts w:ascii="Verdana" w:hAnsi="Verdana" w:cs="Arial"/>
+          <w:sz w:val="18"/>
+          <w:szCs w:val="18"/>
+        </w:rPr>
+        <w:t xml:space="preserve"> AS alle nødvendige og relevanteopplysninger som er nødvendig for å kunne gi et komplett tilbud på forespørselen. Herunder grensesnittet til andre sidestilte </w:t>
+      </w:r>
+      <w:proofErr w:type="spellStart"/>
+      <w:proofErr w:type="gramStart"/>
+      <w:r>
+        <w:rPr>
+          <w:rFonts w:ascii="Verdana" w:hAnsi="Verdana" w:cs="Arial"/>
+          <w:sz w:val="18"/>
+          <w:szCs w:val="18"/>
+        </w:rPr>
+        <w:t>entreprenører.Det</w:t>
+      </w:r>
+      <w:proofErr w:type="spellEnd"/>
+      <w:proofErr w:type="gramEnd"/>
+      <w:r>
+        <w:rPr>
+          <w:rFonts w:ascii="Verdana" w:hAnsi="Verdana" w:cs="Arial"/>
+          <w:sz w:val="18"/>
+          <w:szCs w:val="18"/>
+        </w:rPr>
+        <w:t xml:space="preserve"> forutsettes at oppdraget har en klar funksjonsbeskrivelse. Merkostnader som følge av mangelfulle eller uriktige opplysninger kan kreves dekket som tillegg. </w:t>
+      </w:r>
+      <w:proofErr w:type="spellStart"/>
+      <w:r>
+        <w:rPr>
+          <w:rFonts w:ascii="Verdana" w:hAnsi="Verdana" w:cs="Arial"/>
+          <w:sz w:val="18"/>
+          <w:szCs w:val="18"/>
+        </w:rPr>
+        <w:t>Ernström</w:t>
+      </w:r>
+      <w:proofErr w:type="spellEnd"/>
+      <w:r>
+        <w:rPr>
+          <w:rFonts w:ascii="Verdana" w:hAnsi="Verdana" w:cs="Arial"/>
+          <w:sz w:val="18"/>
+          <w:szCs w:val="18"/>
+        </w:rPr>
+        <w:t xml:space="preserve"> </w:t>
+      </w:r>
+      <w:proofErr w:type="spellStart"/>
+      <w:r>
+        <w:rPr>
+          <w:rFonts w:ascii="Verdana" w:hAnsi="Verdana" w:cs="Arial"/>
+          <w:sz w:val="18"/>
+          <w:szCs w:val="18"/>
+        </w:rPr>
+        <w:t>Electro</w:t>
+      </w:r>
+      <w:proofErr w:type="spellEnd"/>
+      <w:r>
+        <w:rPr>
+          <w:rFonts w:ascii="Verdana" w:hAnsi="Verdana" w:cs="Arial"/>
+          <w:sz w:val="18"/>
+          <w:szCs w:val="18"/>
+        </w:rPr>
+        <w:t xml:space="preserve"> AS</w:t>
       </w:r>
       <w:r>
         <w:rPr>
@@ -3523,13 +4717,41 @@
           <w:szCs w:val="18"/>
         </w:rPr>
       </w:pPr>
-      <w:r>
-        <w:rPr>
-          <w:rFonts w:ascii="Verdana" w:hAnsi="Verdana" w:cs="Arial"/>
-          <w:sz w:val="18"/>
-          <w:szCs w:val="18"/>
-        </w:rPr>
-        <w:t xml:space="preserve">Ernström Electro AS forholder seg til den fremdriftsplan som er lagt ved kontrakten eller som er utarbeidet iht. NS 8417 pkt. 21.2 (4 uker etter kontraktsignatur) og kan kreve tillegg for endringer fra denne. Eventuell forsering fra avtalt fremdrift forutsetter skriftlig endringsordre. </w:t>
+      <w:proofErr w:type="spellStart"/>
+      <w:r>
+        <w:rPr>
+          <w:rFonts w:ascii="Verdana" w:hAnsi="Verdana" w:cs="Arial"/>
+          <w:sz w:val="18"/>
+          <w:szCs w:val="18"/>
+        </w:rPr>
+        <w:t>Ernström</w:t>
+      </w:r>
+      <w:proofErr w:type="spellEnd"/>
+      <w:r>
+        <w:rPr>
+          <w:rFonts w:ascii="Verdana" w:hAnsi="Verdana" w:cs="Arial"/>
+          <w:sz w:val="18"/>
+          <w:szCs w:val="18"/>
+        </w:rPr>
+        <w:t xml:space="preserve"> </w:t>
+      </w:r>
+      <w:proofErr w:type="spellStart"/>
+      <w:r>
+        <w:rPr>
+          <w:rFonts w:ascii="Verdana" w:hAnsi="Verdana" w:cs="Arial"/>
+          <w:sz w:val="18"/>
+          <w:szCs w:val="18"/>
+        </w:rPr>
+        <w:t>Electro</w:t>
+      </w:r>
+      <w:proofErr w:type="spellEnd"/>
+      <w:r>
+        <w:rPr>
+          <w:rFonts w:ascii="Verdana" w:hAnsi="Verdana" w:cs="Arial"/>
+          <w:sz w:val="18"/>
+          <w:szCs w:val="18"/>
+        </w:rPr>
+        <w:t xml:space="preserve"> AS forholder seg til den fremdriftsplan som er lagt ved kontrakten eller som er utarbeidet iht. NS 8417 pkt. 21.2 (4 uker etter kontraktsignatur) og kan kreve tillegg for endringer fra denne. Eventuell forsering fra avtalt fremdrift forutsetter skriftlig endringsordre. </w:t>
       </w:r>
     </w:p>
     <w:p>
@@ -3548,13 +4770,41 @@
           <w:szCs w:val="18"/>
         </w:rPr>
       </w:pPr>
-      <w:r>
-        <w:rPr>
-          <w:rFonts w:ascii="Verdana" w:hAnsi="Verdana" w:cs="Arial"/>
-          <w:sz w:val="18"/>
-          <w:szCs w:val="18"/>
-        </w:rPr>
-        <w:t>Ernström Electro AS plikter å varsle endringer og tillegg iht. NS 8417 pkt. 31.1. Krav om forsering av fremdrift forutsettes fremmet som endringsordre, jf. 31.3.</w:t>
+      <w:proofErr w:type="spellStart"/>
+      <w:r>
+        <w:rPr>
+          <w:rFonts w:ascii="Verdana" w:hAnsi="Verdana" w:cs="Arial"/>
+          <w:sz w:val="18"/>
+          <w:szCs w:val="18"/>
+        </w:rPr>
+        <w:t>Ernström</w:t>
+      </w:r>
+      <w:proofErr w:type="spellEnd"/>
+      <w:r>
+        <w:rPr>
+          <w:rFonts w:ascii="Verdana" w:hAnsi="Verdana" w:cs="Arial"/>
+          <w:sz w:val="18"/>
+          <w:szCs w:val="18"/>
+        </w:rPr>
+        <w:t xml:space="preserve"> </w:t>
+      </w:r>
+      <w:proofErr w:type="spellStart"/>
+      <w:r>
+        <w:rPr>
+          <w:rFonts w:ascii="Verdana" w:hAnsi="Verdana" w:cs="Arial"/>
+          <w:sz w:val="18"/>
+          <w:szCs w:val="18"/>
+        </w:rPr>
+        <w:t>Electro</w:t>
+      </w:r>
+      <w:proofErr w:type="spellEnd"/>
+      <w:r>
+        <w:rPr>
+          <w:rFonts w:ascii="Verdana" w:hAnsi="Verdana" w:cs="Arial"/>
+          <w:sz w:val="18"/>
+          <w:szCs w:val="18"/>
+        </w:rPr>
+        <w:t xml:space="preserve"> AS plikter å varsle endringer og tillegg iht. NS 8417 pkt. 31.1. Krav om forsering av fremdrift forutsettes fremmet som endringsordre, jf. 31.3.</w:t>
       </w:r>
       <w:r>
         <w:rPr>
@@ -3586,7 +4836,43 @@
           <w:sz w:val="18"/>
           <w:szCs w:val="18"/>
         </w:rPr>
-        <w:t>Når Ernström Electro AS har fremmet et krav om endring i tid eller vederlag, anses endringen som akseptert i den grad svar ikke er mottatt innen den svarfrist som er satt. Er det ikke gitt en frist for innsigelser forutsettes eventuelle innsigelser å være mottatt innen 14 kalenderdager.</w:t>
+        <w:t xml:space="preserve">Når </w:t>
+      </w:r>
+      <w:proofErr w:type="spellStart"/>
+      <w:r>
+        <w:rPr>
+          <w:rFonts w:ascii="Verdana" w:hAnsi="Verdana" w:cs="Arial"/>
+          <w:sz w:val="18"/>
+          <w:szCs w:val="18"/>
+        </w:rPr>
+        <w:t>Ernström</w:t>
+      </w:r>
+      <w:proofErr w:type="spellEnd"/>
+      <w:r>
+        <w:rPr>
+          <w:rFonts w:ascii="Verdana" w:hAnsi="Verdana" w:cs="Arial"/>
+          <w:sz w:val="18"/>
+          <w:szCs w:val="18"/>
+        </w:rPr>
+        <w:t xml:space="preserve"> </w:t>
+      </w:r>
+      <w:proofErr w:type="spellStart"/>
+      <w:r>
+        <w:rPr>
+          <w:rFonts w:ascii="Verdana" w:hAnsi="Verdana" w:cs="Arial"/>
+          <w:sz w:val="18"/>
+          <w:szCs w:val="18"/>
+        </w:rPr>
+        <w:t>Electro</w:t>
+      </w:r>
+      <w:proofErr w:type="spellEnd"/>
+      <w:r>
+        <w:rPr>
+          <w:rFonts w:ascii="Verdana" w:hAnsi="Verdana" w:cs="Arial"/>
+          <w:sz w:val="18"/>
+          <w:szCs w:val="18"/>
+        </w:rPr>
+        <w:t xml:space="preserve"> AS har fremmet et krav om endring i tid eller vederlag, anses endringen som akseptert i den grad svar ikke er mottatt innen den svarfrist som er satt. Er det ikke gitt en frist for innsigelser forutsettes eventuelle innsigelser å være mottatt innen 14 kalenderdager.</w:t>
       </w:r>
       <w:r>
         <w:rPr>
@@ -3643,15 +4929,79 @@
           <w:sz w:val="18"/>
           <w:szCs w:val="18"/>
         </w:rPr>
-        <w:t xml:space="preserve">mindre det er avtalt en betalingsplan. Ernström Electro AS forbeholder seg rett til å a konto-fakturere 50% ved bestilling. Ved betalingsmislighold har MCS Elektrotavler Øst AS rett til å stanse arbeidene og har ikke ansvar for eventuelle merkostnader som følge av en berettiget stans. Ved betalingsmislighold utover 14 dager har </w:t>
-      </w:r>
-      <w:r>
-        <w:rPr>
-          <w:rFonts w:ascii="Verdana" w:hAnsi="Verdana" w:cs="Arial"/>
-          <w:sz w:val="18"/>
-          <w:szCs w:val="18"/>
-        </w:rPr>
-        <w:t xml:space="preserve">Ernström Electro AS </w:t>
+        <w:t xml:space="preserve">mindre det er avtalt en betalingsplan. </w:t>
+      </w:r>
+      <w:proofErr w:type="spellStart"/>
+      <w:r>
+        <w:rPr>
+          <w:rFonts w:ascii="Verdana" w:hAnsi="Verdana" w:cs="Arial"/>
+          <w:sz w:val="18"/>
+          <w:szCs w:val="18"/>
+        </w:rPr>
+        <w:t>Ernström</w:t>
+      </w:r>
+      <w:proofErr w:type="spellEnd"/>
+      <w:r>
+        <w:rPr>
+          <w:rFonts w:ascii="Verdana" w:hAnsi="Verdana" w:cs="Arial"/>
+          <w:sz w:val="18"/>
+          <w:szCs w:val="18"/>
+        </w:rPr>
+        <w:t xml:space="preserve"> </w:t>
+      </w:r>
+      <w:proofErr w:type="spellStart"/>
+      <w:r>
+        <w:rPr>
+          <w:rFonts w:ascii="Verdana" w:hAnsi="Verdana" w:cs="Arial"/>
+          <w:sz w:val="18"/>
+          <w:szCs w:val="18"/>
+        </w:rPr>
+        <w:t>Electro</w:t>
+      </w:r>
+      <w:proofErr w:type="spellEnd"/>
+      <w:r>
+        <w:rPr>
+          <w:rFonts w:ascii="Verdana" w:hAnsi="Verdana" w:cs="Arial"/>
+          <w:sz w:val="18"/>
+          <w:szCs w:val="18"/>
+        </w:rPr>
+        <w:t xml:space="preserve"> AS forbeholder seg rett til å a konto-fakturere 50% ved bestilling. Ved betalingsmislighold har MCS Elektrotavler Øst AS rett til å stanse arbeidene og har ikke ansvar for eventuelle merkostnader som følge av en berettiget stans. Ved betalingsmislighold utover 14 dager har </w:t>
+      </w:r>
+      <w:proofErr w:type="spellStart"/>
+      <w:r>
+        <w:rPr>
+          <w:rFonts w:ascii="Verdana" w:hAnsi="Verdana" w:cs="Arial"/>
+          <w:sz w:val="18"/>
+          <w:szCs w:val="18"/>
+        </w:rPr>
+        <w:t>Ernström</w:t>
+      </w:r>
+      <w:proofErr w:type="spellEnd"/>
+      <w:r>
+        <w:rPr>
+          <w:rFonts w:ascii="Verdana" w:hAnsi="Verdana" w:cs="Arial"/>
+          <w:sz w:val="18"/>
+          <w:szCs w:val="18"/>
+        </w:rPr>
+        <w:t xml:space="preserve"> </w:t>
+      </w:r>
+      <w:proofErr w:type="spellStart"/>
+      <w:r>
+        <w:rPr>
+          <w:rFonts w:ascii="Verdana" w:hAnsi="Verdana" w:cs="Arial"/>
+          <w:sz w:val="18"/>
+          <w:szCs w:val="18"/>
+        </w:rPr>
+        <w:t>Electro</w:t>
+      </w:r>
+      <w:proofErr w:type="spellEnd"/>
+      <w:r>
+        <w:rPr>
+          <w:rFonts w:ascii="Verdana" w:hAnsi="Verdana" w:cs="Arial"/>
+          <w:sz w:val="18"/>
+          <w:szCs w:val="18"/>
+        </w:rPr>
+        <w:t xml:space="preserve"> AS </w:t>
       </w:r>
       <w:r>
         <w:rPr>
@@ -3716,7 +5066,43 @@
           <w:sz w:val="18"/>
           <w:szCs w:val="18"/>
         </w:rPr>
-        <w:t>ved at Ernström Electro AS avtaler med OPPDRAGSGIVER et omforent tidspunkt som ikke er lengre enn 5 arbeidsdager frem i tid.</w:t>
+        <w:t xml:space="preserve">ved at </w:t>
+      </w:r>
+      <w:proofErr w:type="spellStart"/>
+      <w:r>
+        <w:rPr>
+          <w:rFonts w:ascii="Verdana" w:hAnsi="Verdana" w:cs="Arial"/>
+          <w:sz w:val="18"/>
+          <w:szCs w:val="18"/>
+        </w:rPr>
+        <w:t>Ernström</w:t>
+      </w:r>
+      <w:proofErr w:type="spellEnd"/>
+      <w:r>
+        <w:rPr>
+          <w:rFonts w:ascii="Verdana" w:hAnsi="Verdana" w:cs="Arial"/>
+          <w:sz w:val="18"/>
+          <w:szCs w:val="18"/>
+        </w:rPr>
+        <w:t xml:space="preserve"> </w:t>
+      </w:r>
+      <w:proofErr w:type="spellStart"/>
+      <w:r>
+        <w:rPr>
+          <w:rFonts w:ascii="Verdana" w:hAnsi="Verdana" w:cs="Arial"/>
+          <w:sz w:val="18"/>
+          <w:szCs w:val="18"/>
+        </w:rPr>
+        <w:t>Electro</w:t>
+      </w:r>
+      <w:proofErr w:type="spellEnd"/>
+      <w:r>
+        <w:rPr>
+          <w:rFonts w:ascii="Verdana" w:hAnsi="Verdana" w:cs="Arial"/>
+          <w:sz w:val="18"/>
+          <w:szCs w:val="18"/>
+        </w:rPr>
+        <w:t xml:space="preserve"> AS avtaler med OPPDRAGSGIVER et omforent tidspunkt som ikke er lengre enn 5 arbeidsdager frem i tid.</w:t>
       </w:r>
       <w:r>
         <w:rPr>
@@ -3726,13 +5112,41 @@
         </w:rPr>
         <w:br/>
       </w:r>
-      <w:r>
-        <w:rPr>
-          <w:rFonts w:ascii="Verdana" w:hAnsi="Verdana" w:cs="Arial"/>
-          <w:sz w:val="18"/>
-          <w:szCs w:val="18"/>
-        </w:rPr>
-        <w:t xml:space="preserve">Ernström Electro AS fremlegger FDV-dokumentasjon senest ved registreringsforretningen. </w:t>
+      <w:proofErr w:type="spellStart"/>
+      <w:r>
+        <w:rPr>
+          <w:rFonts w:ascii="Verdana" w:hAnsi="Verdana" w:cs="Arial"/>
+          <w:sz w:val="18"/>
+          <w:szCs w:val="18"/>
+        </w:rPr>
+        <w:t>Ernström</w:t>
+      </w:r>
+      <w:proofErr w:type="spellEnd"/>
+      <w:r>
+        <w:rPr>
+          <w:rFonts w:ascii="Verdana" w:hAnsi="Verdana" w:cs="Arial"/>
+          <w:sz w:val="18"/>
+          <w:szCs w:val="18"/>
+        </w:rPr>
+        <w:t xml:space="preserve"> </w:t>
+      </w:r>
+      <w:proofErr w:type="spellStart"/>
+      <w:r>
+        <w:rPr>
+          <w:rFonts w:ascii="Verdana" w:hAnsi="Verdana" w:cs="Arial"/>
+          <w:sz w:val="18"/>
+          <w:szCs w:val="18"/>
+        </w:rPr>
+        <w:t>Electro</w:t>
+      </w:r>
+      <w:proofErr w:type="spellEnd"/>
+      <w:r>
+        <w:rPr>
+          <w:rFonts w:ascii="Verdana" w:hAnsi="Verdana" w:cs="Arial"/>
+          <w:sz w:val="18"/>
+          <w:szCs w:val="18"/>
+        </w:rPr>
+        <w:t xml:space="preserve"> AS fremlegger FDV-dokumentasjon senest ved registreringsforretningen. </w:t>
       </w:r>
     </w:p>
     <w:p>
@@ -3783,13 +5197,41 @@
         </w:rPr>
         <w:br/>
       </w:r>
-      <w:r>
-        <w:rPr>
-          <w:rFonts w:ascii="Verdana" w:hAnsi="Verdana" w:cs="Arial"/>
-          <w:sz w:val="18"/>
-          <w:szCs w:val="18"/>
-        </w:rPr>
-        <w:t>Ernström Electro AS har rett til å utbedre eventuelle berettigede reklamasjoner. Slik utbedring skal skje innen rimelig tid etter at mangelen er reklamert og ansvarsforholdet er klarlagt.</w:t>
+      <w:proofErr w:type="spellStart"/>
+      <w:r>
+        <w:rPr>
+          <w:rFonts w:ascii="Verdana" w:hAnsi="Verdana" w:cs="Arial"/>
+          <w:sz w:val="18"/>
+          <w:szCs w:val="18"/>
+        </w:rPr>
+        <w:t>Ernström</w:t>
+      </w:r>
+      <w:proofErr w:type="spellEnd"/>
+      <w:r>
+        <w:rPr>
+          <w:rFonts w:ascii="Verdana" w:hAnsi="Verdana" w:cs="Arial"/>
+          <w:sz w:val="18"/>
+          <w:szCs w:val="18"/>
+        </w:rPr>
+        <w:t xml:space="preserve"> </w:t>
+      </w:r>
+      <w:proofErr w:type="spellStart"/>
+      <w:r>
+        <w:rPr>
+          <w:rFonts w:ascii="Verdana" w:hAnsi="Verdana" w:cs="Arial"/>
+          <w:sz w:val="18"/>
+          <w:szCs w:val="18"/>
+        </w:rPr>
+        <w:t>Electro</w:t>
+      </w:r>
+      <w:proofErr w:type="spellEnd"/>
+      <w:r>
+        <w:rPr>
+          <w:rFonts w:ascii="Verdana" w:hAnsi="Verdana" w:cs="Arial"/>
+          <w:sz w:val="18"/>
+          <w:szCs w:val="18"/>
+        </w:rPr>
+        <w:t xml:space="preserve"> AS har rett til å utbedre eventuelle berettigede reklamasjoner. Slik utbedring skal skje innen rimelig tid etter at mangelen er reklamert og ansvarsforholdet er klarlagt.</w:t>
       </w:r>
     </w:p>
     <w:p>
@@ -3808,13 +5250,77 @@
           <w:szCs w:val="18"/>
         </w:rPr>
       </w:pPr>
-      <w:r>
-        <w:rPr>
-          <w:rFonts w:ascii="Verdana" w:hAnsi="Verdana" w:cs="Arial"/>
-          <w:sz w:val="18"/>
-          <w:szCs w:val="18"/>
-        </w:rPr>
-        <w:t>Ernström Electro AS har ikke ansvar for skader utover å utbedre med mindre OPPDRAGSGIVER kan påvise at skaden skyldes utvist uaktsomhet fra Ernström Electro AS.</w:t>
+      <w:proofErr w:type="spellStart"/>
+      <w:r>
+        <w:rPr>
+          <w:rFonts w:ascii="Verdana" w:hAnsi="Verdana" w:cs="Arial"/>
+          <w:sz w:val="18"/>
+          <w:szCs w:val="18"/>
+        </w:rPr>
+        <w:t>Ernström</w:t>
+      </w:r>
+      <w:proofErr w:type="spellEnd"/>
+      <w:r>
+        <w:rPr>
+          <w:rFonts w:ascii="Verdana" w:hAnsi="Verdana" w:cs="Arial"/>
+          <w:sz w:val="18"/>
+          <w:szCs w:val="18"/>
+        </w:rPr>
+        <w:t xml:space="preserve"> </w:t>
+      </w:r>
+      <w:proofErr w:type="spellStart"/>
+      <w:r>
+        <w:rPr>
+          <w:rFonts w:ascii="Verdana" w:hAnsi="Verdana" w:cs="Arial"/>
+          <w:sz w:val="18"/>
+          <w:szCs w:val="18"/>
+        </w:rPr>
+        <w:t>Electro</w:t>
+      </w:r>
+      <w:proofErr w:type="spellEnd"/>
+      <w:r>
+        <w:rPr>
+          <w:rFonts w:ascii="Verdana" w:hAnsi="Verdana" w:cs="Arial"/>
+          <w:sz w:val="18"/>
+          <w:szCs w:val="18"/>
+        </w:rPr>
+        <w:t xml:space="preserve"> AS har ikke ansvar for skader utover å utbedre med mindre OPPDRAGSGIVER kan påvise at skaden skyldes utvist uaktsomhet fra </w:t>
+      </w:r>
+      <w:proofErr w:type="spellStart"/>
+      <w:r>
+        <w:rPr>
+          <w:rFonts w:ascii="Verdana" w:hAnsi="Verdana" w:cs="Arial"/>
+          <w:sz w:val="18"/>
+          <w:szCs w:val="18"/>
+        </w:rPr>
+        <w:t>Ernström</w:t>
+      </w:r>
+      <w:proofErr w:type="spellEnd"/>
+      <w:r>
+        <w:rPr>
+          <w:rFonts w:ascii="Verdana" w:hAnsi="Verdana" w:cs="Arial"/>
+          <w:sz w:val="18"/>
+          <w:szCs w:val="18"/>
+        </w:rPr>
+        <w:t xml:space="preserve"> </w:t>
+      </w:r>
+      <w:proofErr w:type="spellStart"/>
+      <w:r>
+        <w:rPr>
+          <w:rFonts w:ascii="Verdana" w:hAnsi="Verdana" w:cs="Arial"/>
+          <w:sz w:val="18"/>
+          <w:szCs w:val="18"/>
+        </w:rPr>
+        <w:t>Electro</w:t>
+      </w:r>
+      <w:proofErr w:type="spellEnd"/>
+      <w:r>
+        <w:rPr>
+          <w:rFonts w:ascii="Verdana" w:hAnsi="Verdana" w:cs="Arial"/>
+          <w:sz w:val="18"/>
+          <w:szCs w:val="18"/>
+        </w:rPr>
+        <w:t xml:space="preserve"> AS.</w:t>
       </w:r>
       <w:r>
         <w:rPr>
@@ -3830,7 +5336,43 @@
           <w:sz w:val="18"/>
           <w:szCs w:val="18"/>
         </w:rPr>
-        <w:t>Under enhver omstendighet begrenses det erstatningsansvaret Ernström Electro AS måtte ha oppad til kontraktsummen med mindre erstatningskravet er oppstått som følge av grov uaktsomhet.</w:t>
+        <w:t xml:space="preserve">Under enhver omstendighet begrenses det erstatningsansvaret </w:t>
+      </w:r>
+      <w:proofErr w:type="spellStart"/>
+      <w:r>
+        <w:rPr>
+          <w:rFonts w:ascii="Verdana" w:hAnsi="Verdana" w:cs="Arial"/>
+          <w:sz w:val="18"/>
+          <w:szCs w:val="18"/>
+        </w:rPr>
+        <w:t>Ernström</w:t>
+      </w:r>
+      <w:proofErr w:type="spellEnd"/>
+      <w:r>
+        <w:rPr>
+          <w:rFonts w:ascii="Verdana" w:hAnsi="Verdana" w:cs="Arial"/>
+          <w:sz w:val="18"/>
+          <w:szCs w:val="18"/>
+        </w:rPr>
+        <w:t xml:space="preserve"> </w:t>
+      </w:r>
+      <w:proofErr w:type="spellStart"/>
+      <w:r>
+        <w:rPr>
+          <w:rFonts w:ascii="Verdana" w:hAnsi="Verdana" w:cs="Arial"/>
+          <w:sz w:val="18"/>
+          <w:szCs w:val="18"/>
+        </w:rPr>
+        <w:t>Electro</w:t>
+      </w:r>
+      <w:proofErr w:type="spellEnd"/>
+      <w:r>
+        <w:rPr>
+          <w:rFonts w:ascii="Verdana" w:hAnsi="Verdana" w:cs="Arial"/>
+          <w:sz w:val="18"/>
+          <w:szCs w:val="18"/>
+        </w:rPr>
+        <w:t xml:space="preserve"> AS måtte ha oppad til kontraktsummen med mindre erstatningskravet er oppstått som følge av grov uaktsomhet.</w:t>
       </w:r>
     </w:p>
     <w:p>
@@ -9752,7 +11294,7 @@
   <w:style w:type="paragraph" w:default="1" w:styleId="Normal">
     <w:name w:val="Normal"/>
     <w:qFormat/>
-    <w:rsid w:val="005F1824"/>
+    <w:rsid w:val="00432205"/>
   </w:style>
   <w:style w:type="paragraph" w:styleId="Overskrift2">
     <w:name w:val="heading 2"/>

</xml_diff>

<commit_message>
modified:   server/mail.js 	modified:   server/templates/tilbud/tilbud-stromskinner-template.docx
</commit_message>
<xml_diff>
--- a/server/templates/tilbud/tilbud-stromskinner-template.docx
+++ b/server/templates/tilbud/tilbud-stromskinner-template.docx
@@ -1010,7 +1010,6 @@
               <w:t>amp</w:t>
             </w:r>
             <w:proofErr w:type="spellEnd"/>
-            <w:proofErr w:type="gramStart"/>
             <w:r>
               <w:rPr>
                 <w:rFonts w:ascii="Verdana" w:hAnsi="Verdana" w:cs="Arial"/>
@@ -1027,7 +1026,6 @@
               </w:rPr>
               <w:t>A</w:t>
             </w:r>
-            <w:proofErr w:type="gramEnd"/>
             <w:r>
               <w:rPr>
                 <w:rFonts w:ascii="Verdana" w:hAnsi="Verdana" w:cs="Arial"/>
@@ -1159,13 +1157,13 @@
         <w:tblLook w:val="04A0" w:firstRow="1" w:lastRow="0" w:firstColumn="1" w:lastColumn="0" w:noHBand="0" w:noVBand="1"/>
       </w:tblPr>
       <w:tblGrid>
-        <w:gridCol w:w="4859"/>
-        <w:gridCol w:w="4887"/>
+        <w:gridCol w:w="6930"/>
+        <w:gridCol w:w="2816"/>
       </w:tblGrid>
       <w:tr>
         <w:tc>
           <w:tcPr>
-            <w:tcW w:w="5228" w:type="dxa"/>
+            <w:tcW w:w="6930" w:type="dxa"/>
           </w:tcPr>
           <w:p>
             <w:pPr>
@@ -1206,7 +1204,7 @@
         </w:tc>
         <w:tc>
           <w:tcPr>
-            <w:tcW w:w="5228" w:type="dxa"/>
+            <w:tcW w:w="2816" w:type="dxa"/>
           </w:tcPr>
           <w:p>
             <w:pPr>
@@ -1248,7 +1246,7 @@
       <w:tr>
         <w:tc>
           <w:tcPr>
-            <w:tcW w:w="5228" w:type="dxa"/>
+            <w:tcW w:w="6930" w:type="dxa"/>
           </w:tcPr>
           <w:p>
             <w:pPr>
@@ -1289,7 +1287,7 @@
         </w:tc>
         <w:tc>
           <w:tcPr>
-            <w:tcW w:w="5228" w:type="dxa"/>
+            <w:tcW w:w="2816" w:type="dxa"/>
           </w:tcPr>
           <w:p>
             <w:pPr>
@@ -1331,7 +1329,7 @@
       <w:tr>
         <w:tc>
           <w:tcPr>
-            <w:tcW w:w="5228" w:type="dxa"/>
+            <w:tcW w:w="6930" w:type="dxa"/>
           </w:tcPr>
           <w:p>
             <w:pPr>
@@ -1372,7 +1370,7 @@
         </w:tc>
         <w:tc>
           <w:tcPr>
-            <w:tcW w:w="5228" w:type="dxa"/>
+            <w:tcW w:w="2816" w:type="dxa"/>
           </w:tcPr>
           <w:p>
             <w:pPr>
@@ -1414,7 +1412,7 @@
       <w:tr>
         <w:tc>
           <w:tcPr>
-            <w:tcW w:w="5228" w:type="dxa"/>
+            <w:tcW w:w="6930" w:type="dxa"/>
           </w:tcPr>
           <w:p>
             <w:pPr>
@@ -1437,7 +1435,7 @@
         </w:tc>
         <w:tc>
           <w:tcPr>
-            <w:tcW w:w="5228" w:type="dxa"/>
+            <w:tcW w:w="2816" w:type="dxa"/>
           </w:tcPr>
           <w:p>
             <w:pPr>
@@ -1479,7 +1477,7 @@
       <w:tr>
         <w:tc>
           <w:tcPr>
-            <w:tcW w:w="5228" w:type="dxa"/>
+            <w:tcW w:w="6930" w:type="dxa"/>
           </w:tcPr>
           <w:p>
             <w:pPr>
@@ -1520,7 +1518,7 @@
         </w:tc>
         <w:tc>
           <w:tcPr>
-            <w:tcW w:w="5228" w:type="dxa"/>
+            <w:tcW w:w="2816" w:type="dxa"/>
           </w:tcPr>
           <w:p>
             <w:pPr>
@@ -1562,7 +1560,7 @@
       <w:tr>
         <w:tc>
           <w:tcPr>
-            <w:tcW w:w="5228" w:type="dxa"/>
+            <w:tcW w:w="6930" w:type="dxa"/>
           </w:tcPr>
           <w:p>
             <w:pPr>
@@ -1585,11 +1583,10 @@
         </w:tc>
         <w:tc>
           <w:tcPr>
-            <w:tcW w:w="5228" w:type="dxa"/>
-          </w:tcPr>
-          <w:p>
-            <w:pPr>
-              <w:ind w:firstLine="708"/>
+            <w:tcW w:w="2816" w:type="dxa"/>
+          </w:tcPr>
+          <w:p>
+            <w:pPr>
               <w:rPr>
                 <w:rFonts w:ascii="Verdana" w:hAnsi="Verdana" w:cs="Arial"/>
                 <w:sz w:val="20"/>
@@ -1628,7 +1625,7 @@
       <w:tr>
         <w:tc>
           <w:tcPr>
-            <w:tcW w:w="5228" w:type="dxa"/>
+            <w:tcW w:w="6930" w:type="dxa"/>
           </w:tcPr>
           <w:p>
             <w:pPr>
@@ -1651,7 +1648,7 @@
         </w:tc>
         <w:tc>
           <w:tcPr>
-            <w:tcW w:w="5228" w:type="dxa"/>
+            <w:tcW w:w="2816" w:type="dxa"/>
           </w:tcPr>
           <w:p>
             <w:pPr>
@@ -2136,8 +2133,8 @@
         <w:tblLook w:val="04A0" w:firstRow="1" w:lastRow="0" w:firstColumn="1" w:lastColumn="0" w:noHBand="0" w:noVBand="1"/>
       </w:tblPr>
       <w:tblGrid>
-        <w:gridCol w:w="7711"/>
-        <w:gridCol w:w="2755"/>
+        <w:gridCol w:w="7651"/>
+        <w:gridCol w:w="2815"/>
       </w:tblGrid>
       <w:tr>
         <w:trPr>
@@ -2146,7 +2143,7 @@
         <w:tc>
           <w:tcPr>
             <w:cnfStyle w:val="001000000000" w:firstRow="0" w:lastRow="0" w:firstColumn="1" w:lastColumn="0" w:oddVBand="0" w:evenVBand="0" w:oddHBand="0" w:evenHBand="0" w:firstRowFirstColumn="0" w:firstRowLastColumn="0" w:lastRowFirstColumn="0" w:lastRowLastColumn="0"/>
-            <w:tcW w:w="3684" w:type="pct"/>
+            <w:tcW w:w="3655" w:type="pct"/>
           </w:tcPr>
           <w:p>
             <w:pPr>
@@ -2186,7 +2183,7 @@
         </w:tc>
         <w:tc>
           <w:tcPr>
-            <w:tcW w:w="1316" w:type="pct"/>
+            <w:tcW w:w="1345" w:type="pct"/>
           </w:tcPr>
           <w:p>
             <w:pPr>
@@ -2458,7 +2455,6 @@
               <w:t xml:space="preserve"> </w:t>
             </w:r>
             <w:proofErr w:type="spellStart"/>
-            <w:proofErr w:type="gramStart"/>
             <w:r>
               <w:rPr>
                 <w:rFonts w:ascii="Verdana" w:hAnsi="Verdana" w:cs="Arial"/>
@@ -2472,7 +2468,6 @@
               <w:t>pr.strømskinne</w:t>
             </w:r>
             <w:proofErr w:type="spellEnd"/>
-            <w:proofErr w:type="gramEnd"/>
           </w:p>
         </w:tc>
         <w:tc>
@@ -3101,31 +3096,22 @@
           <w:color w:val="ED7D31" w:themeColor="accent2"/>
         </w:rPr>
         <w:tab/>
-        <w:t xml:space="preserve">à </w:t>
-      </w:r>
-      <w:proofErr w:type="gramStart"/>
+        <w:t xml:space="preserve">à kr </w:t>
+      </w:r>
       <w:r>
         <w:rPr>
           <w:rFonts w:ascii="Verdana" w:hAnsi="Verdana" w:cs="Arial"/>
           <w:color w:val="ED7D31" w:themeColor="accent2"/>
         </w:rPr>
-        <w:t xml:space="preserve">kr </w:t>
+        <w:t xml:space="preserve"> </w:t>
       </w:r>
       <w:r>
         <w:rPr>
           <w:rFonts w:ascii="Verdana" w:hAnsi="Verdana" w:cs="Arial"/>
           <w:color w:val="ED7D31" w:themeColor="accent2"/>
         </w:rPr>
-        <w:t xml:space="preserve"> </w:t>
-      </w:r>
-      <w:r>
-        <w:rPr>
-          <w:rFonts w:ascii="Verdana" w:hAnsi="Verdana" w:cs="Arial"/>
-          <w:color w:val="ED7D31" w:themeColor="accent2"/>
-        </w:rPr>
         <w:t>15</w:t>
       </w:r>
-      <w:proofErr w:type="gramEnd"/>
       <w:r>
         <w:rPr>
           <w:rFonts w:ascii="Verdana" w:hAnsi="Verdana" w:cs="Arial"/>
@@ -3854,25 +3840,7 @@
           <w:sz w:val="18"/>
           <w:szCs w:val="18"/>
         </w:rPr>
-        <w:t xml:space="preserve">Ved feil og/eller mangler i mottatt underlag, eller endring av opprinnelig spesifikasjon/underlag, må en priskonsekvens </w:t>
-      </w:r>
-      <w:proofErr w:type="gramStart"/>
-      <w:r>
-        <w:rPr>
-          <w:rFonts w:ascii="Verdana" w:hAnsi="Verdana" w:cs="Arial"/>
-          <w:sz w:val="18"/>
-          <w:szCs w:val="18"/>
-        </w:rPr>
-        <w:t>påregnes</w:t>
-      </w:r>
-      <w:proofErr w:type="gramEnd"/>
-      <w:r>
-        <w:rPr>
-          <w:rFonts w:ascii="Verdana" w:hAnsi="Verdana" w:cs="Arial"/>
-          <w:sz w:val="18"/>
-          <w:szCs w:val="18"/>
-        </w:rPr>
-        <w:t>.</w:t>
+        <w:t>Ved feil og/eller mangler i mottatt underlag, eller endring av opprinnelig spesifikasjon/underlag, må en priskonsekvens påregnes.</w:t>
       </w:r>
     </w:p>
     <w:p>
@@ -4546,7 +4514,6 @@
         <w:t xml:space="preserve"> AS alle nødvendige og relevanteopplysninger som er nødvendig for å kunne gi et komplett tilbud på forespørselen. Herunder grensesnittet til andre sidestilte </w:t>
       </w:r>
       <w:proofErr w:type="spellStart"/>
-      <w:proofErr w:type="gramStart"/>
       <w:r>
         <w:rPr>
           <w:rFonts w:ascii="Verdana" w:hAnsi="Verdana" w:cs="Arial"/>
@@ -4556,7 +4523,6 @@
         <w:t>entreprenører.Det</w:t>
       </w:r>
       <w:proofErr w:type="spellEnd"/>
-      <w:proofErr w:type="gramEnd"/>
       <w:r>
         <w:rPr>
           <w:rFonts w:ascii="Verdana" w:hAnsi="Verdana" w:cs="Arial"/>

</xml_diff>

<commit_message>
modified:   app.js 	modified:   server/mail.js 	modified:   server/templates/tilbud/tilbud-stromskinner-template.docx
</commit_message>
<xml_diff>
--- a/server/templates/tilbud/tilbud-stromskinner-template.docx
+++ b/server/templates/tilbud/tilbud-stromskinner-template.docx
@@ -1010,6 +1010,7 @@
               <w:t>amp</w:t>
             </w:r>
             <w:proofErr w:type="spellEnd"/>
+            <w:proofErr w:type="gramStart"/>
             <w:r>
               <w:rPr>
                 <w:rFonts w:ascii="Verdana" w:hAnsi="Verdana" w:cs="Arial"/>
@@ -1026,6 +1027,7 @@
               </w:rPr>
               <w:t>A</w:t>
             </w:r>
+            <w:proofErr w:type="gramEnd"/>
             <w:r>
               <w:rPr>
                 <w:rFonts w:ascii="Verdana" w:hAnsi="Verdana" w:cs="Arial"/>
@@ -1192,13 +1194,39 @@
               <w:t>mtr</w:t>
             </w:r>
             <w:proofErr w:type="spellEnd"/>
-            <w:r>
-              <w:rPr>
-                <w:rFonts w:ascii="Verdana" w:hAnsi="Verdana" w:cs="Arial"/>
-                <w:sz w:val="20"/>
-                <w:szCs w:val="20"/>
-              </w:rPr>
-              <w:t>}} meter total lengde</w:t>
+            <w:proofErr w:type="gramStart"/>
+            <w:r>
+              <w:rPr>
+                <w:rFonts w:ascii="Verdana" w:hAnsi="Verdana" w:cs="Arial"/>
+                <w:sz w:val="20"/>
+                <w:szCs w:val="20"/>
+              </w:rPr>
+              <w:t xml:space="preserve">}} </w:t>
+            </w:r>
+            <w:r>
+              <w:rPr>
+                <w:rFonts w:ascii="Verdana" w:hAnsi="Verdana" w:cs="Arial"/>
+                <w:sz w:val="20"/>
+                <w:szCs w:val="20"/>
+              </w:rPr>
+              <w:t xml:space="preserve"> </w:t>
+            </w:r>
+            <w:r>
+              <w:rPr>
+                <w:rFonts w:ascii="Verdana" w:hAnsi="Verdana" w:cs="Arial"/>
+                <w:sz w:val="20"/>
+                <w:szCs w:val="20"/>
+              </w:rPr>
+              <w:t>meter</w:t>
+            </w:r>
+            <w:proofErr w:type="gramEnd"/>
+            <w:r>
+              <w:rPr>
+                <w:rFonts w:ascii="Verdana" w:hAnsi="Verdana" w:cs="Arial"/>
+                <w:sz w:val="20"/>
+                <w:szCs w:val="20"/>
+              </w:rPr>
+              <w:t xml:space="preserve"> total lengde</w:t>
             </w:r>
           </w:p>
         </w:tc>
@@ -1210,13 +1238,17 @@
             <w:pPr>
               <w:rPr>
                 <w:rFonts w:ascii="Verdana" w:hAnsi="Verdana" w:cs="Arial"/>
-                <w:sz w:val="20"/>
-                <w:szCs w:val="20"/>
-              </w:rPr>
-            </w:pPr>
-            <w:r>
-              <w:rPr>
-                <w:rFonts w:ascii="Verdana" w:hAnsi="Verdana" w:cs="Arial"/>
+                <w:i/>
+                <w:iCs/>
+                <w:sz w:val="20"/>
+                <w:szCs w:val="20"/>
+              </w:rPr>
+            </w:pPr>
+            <w:r>
+              <w:rPr>
+                <w:rFonts w:ascii="Verdana" w:hAnsi="Verdana" w:cs="Arial"/>
+                <w:i/>
+                <w:iCs/>
                 <w:sz w:val="20"/>
                 <w:szCs w:val="20"/>
               </w:rPr>
@@ -1226,6 +1258,8 @@
             <w:r>
               <w:rPr>
                 <w:rFonts w:ascii="Verdana" w:hAnsi="Verdana" w:cs="Arial"/>
+                <w:i/>
+                <w:iCs/>
                 <w:sz w:val="20"/>
                 <w:szCs w:val="20"/>
               </w:rPr>
@@ -1235,6 +1269,8 @@
             <w:r>
               <w:rPr>
                 <w:rFonts w:ascii="Verdana" w:hAnsi="Verdana" w:cs="Arial"/>
+                <w:i/>
+                <w:iCs/>
                 <w:sz w:val="20"/>
                 <w:szCs w:val="20"/>
               </w:rPr>
@@ -1275,13 +1311,39 @@
               <w:t>vvk</w:t>
             </w:r>
             <w:proofErr w:type="spellEnd"/>
-            <w:r>
-              <w:rPr>
-                <w:rFonts w:ascii="Verdana" w:hAnsi="Verdana" w:cs="Arial"/>
-                <w:sz w:val="20"/>
-                <w:szCs w:val="20"/>
-              </w:rPr>
-              <w:t>}} stk. Vertikal vinkel</w:t>
+            <w:proofErr w:type="gramStart"/>
+            <w:r>
+              <w:rPr>
+                <w:rFonts w:ascii="Verdana" w:hAnsi="Verdana" w:cs="Arial"/>
+                <w:sz w:val="20"/>
+                <w:szCs w:val="20"/>
+              </w:rPr>
+              <w:t xml:space="preserve">}} </w:t>
+            </w:r>
+            <w:r>
+              <w:rPr>
+                <w:rFonts w:ascii="Verdana" w:hAnsi="Verdana" w:cs="Arial"/>
+                <w:sz w:val="20"/>
+                <w:szCs w:val="20"/>
+              </w:rPr>
+              <w:t xml:space="preserve"> </w:t>
+            </w:r>
+            <w:r>
+              <w:rPr>
+                <w:rFonts w:ascii="Verdana" w:hAnsi="Verdana" w:cs="Arial"/>
+                <w:sz w:val="20"/>
+                <w:szCs w:val="20"/>
+              </w:rPr>
+              <w:t>stk.</w:t>
+            </w:r>
+            <w:proofErr w:type="gramEnd"/>
+            <w:r>
+              <w:rPr>
+                <w:rFonts w:ascii="Verdana" w:hAnsi="Verdana" w:cs="Arial"/>
+                <w:sz w:val="20"/>
+                <w:szCs w:val="20"/>
+              </w:rPr>
+              <w:t xml:space="preserve"> Vertikal vinkel</w:t>
             </w:r>
           </w:p>
         </w:tc>
@@ -1293,13 +1355,17 @@
             <w:pPr>
               <w:rPr>
                 <w:rFonts w:ascii="Verdana" w:hAnsi="Verdana" w:cs="Arial"/>
-                <w:sz w:val="20"/>
-                <w:szCs w:val="20"/>
-              </w:rPr>
-            </w:pPr>
-            <w:r>
-              <w:rPr>
-                <w:rFonts w:ascii="Verdana" w:hAnsi="Verdana" w:cs="Arial"/>
+                <w:i/>
+                <w:iCs/>
+                <w:sz w:val="20"/>
+                <w:szCs w:val="20"/>
+              </w:rPr>
+            </w:pPr>
+            <w:r>
+              <w:rPr>
+                <w:rFonts w:ascii="Verdana" w:hAnsi="Verdana" w:cs="Arial"/>
+                <w:i/>
+                <w:iCs/>
                 <w:sz w:val="20"/>
                 <w:szCs w:val="20"/>
               </w:rPr>
@@ -1309,6 +1375,8 @@
             <w:r>
               <w:rPr>
                 <w:rFonts w:ascii="Verdana" w:hAnsi="Verdana" w:cs="Arial"/>
+                <w:i/>
+                <w:iCs/>
                 <w:sz w:val="20"/>
                 <w:szCs w:val="20"/>
               </w:rPr>
@@ -1318,6 +1386,8 @@
             <w:r>
               <w:rPr>
                 <w:rFonts w:ascii="Verdana" w:hAnsi="Verdana" w:cs="Arial"/>
+                <w:i/>
+                <w:iCs/>
                 <w:sz w:val="20"/>
                 <w:szCs w:val="20"/>
               </w:rPr>
@@ -1376,13 +1446,17 @@
             <w:pPr>
               <w:rPr>
                 <w:rFonts w:ascii="Verdana" w:hAnsi="Verdana" w:cs="Arial"/>
-                <w:sz w:val="20"/>
-                <w:szCs w:val="20"/>
-              </w:rPr>
-            </w:pPr>
-            <w:r>
-              <w:rPr>
-                <w:rFonts w:ascii="Verdana" w:hAnsi="Verdana" w:cs="Arial"/>
+                <w:i/>
+                <w:iCs/>
+                <w:sz w:val="20"/>
+                <w:szCs w:val="20"/>
+              </w:rPr>
+            </w:pPr>
+            <w:r>
+              <w:rPr>
+                <w:rFonts w:ascii="Verdana" w:hAnsi="Verdana" w:cs="Arial"/>
+                <w:i/>
+                <w:iCs/>
                 <w:sz w:val="20"/>
                 <w:szCs w:val="20"/>
               </w:rPr>
@@ -1392,6 +1466,8 @@
             <w:r>
               <w:rPr>
                 <w:rFonts w:ascii="Verdana" w:hAnsi="Verdana" w:cs="Arial"/>
+                <w:i/>
+                <w:iCs/>
                 <w:sz w:val="20"/>
                 <w:szCs w:val="20"/>
               </w:rPr>
@@ -1401,6 +1477,8 @@
             <w:r>
               <w:rPr>
                 <w:rFonts w:ascii="Verdana" w:hAnsi="Verdana" w:cs="Arial"/>
+                <w:i/>
+                <w:iCs/>
                 <w:sz w:val="20"/>
                 <w:szCs w:val="20"/>
               </w:rPr>
@@ -1441,13 +1519,17 @@
             <w:pPr>
               <w:rPr>
                 <w:rFonts w:ascii="Verdana" w:hAnsi="Verdana" w:cs="Arial"/>
-                <w:sz w:val="20"/>
-                <w:szCs w:val="20"/>
-              </w:rPr>
-            </w:pPr>
-            <w:r>
-              <w:rPr>
-                <w:rFonts w:ascii="Verdana" w:hAnsi="Verdana" w:cs="Arial"/>
+                <w:i/>
+                <w:iCs/>
+                <w:sz w:val="20"/>
+                <w:szCs w:val="20"/>
+              </w:rPr>
+            </w:pPr>
+            <w:r>
+              <w:rPr>
+                <w:rFonts w:ascii="Verdana" w:hAnsi="Verdana" w:cs="Arial"/>
+                <w:i/>
+                <w:iCs/>
                 <w:sz w:val="20"/>
                 <w:szCs w:val="20"/>
               </w:rPr>
@@ -1457,6 +1539,8 @@
             <w:r>
               <w:rPr>
                 <w:rFonts w:ascii="Verdana" w:hAnsi="Verdana" w:cs="Arial"/>
+                <w:i/>
+                <w:iCs/>
                 <w:sz w:val="20"/>
                 <w:szCs w:val="20"/>
               </w:rPr>
@@ -1466,6 +1550,8 @@
             <w:r>
               <w:rPr>
                 <w:rFonts w:ascii="Verdana" w:hAnsi="Verdana" w:cs="Arial"/>
+                <w:i/>
+                <w:iCs/>
                 <w:sz w:val="20"/>
                 <w:szCs w:val="20"/>
               </w:rPr>
@@ -1524,13 +1610,17 @@
             <w:pPr>
               <w:rPr>
                 <w:rFonts w:ascii="Verdana" w:hAnsi="Verdana" w:cs="Arial"/>
-                <w:sz w:val="20"/>
-                <w:szCs w:val="20"/>
-              </w:rPr>
-            </w:pPr>
-            <w:r>
-              <w:rPr>
-                <w:rFonts w:ascii="Verdana" w:hAnsi="Verdana" w:cs="Arial"/>
+                <w:i/>
+                <w:iCs/>
+                <w:sz w:val="20"/>
+                <w:szCs w:val="20"/>
+              </w:rPr>
+            </w:pPr>
+            <w:r>
+              <w:rPr>
+                <w:rFonts w:ascii="Verdana" w:hAnsi="Verdana" w:cs="Arial"/>
+                <w:i/>
+                <w:iCs/>
                 <w:sz w:val="20"/>
                 <w:szCs w:val="20"/>
               </w:rPr>
@@ -1540,6 +1630,8 @@
             <w:r>
               <w:rPr>
                 <w:rFonts w:ascii="Verdana" w:hAnsi="Verdana" w:cs="Arial"/>
+                <w:i/>
+                <w:iCs/>
                 <w:sz w:val="20"/>
                 <w:szCs w:val="20"/>
               </w:rPr>
@@ -1549,6 +1641,8 @@
             <w:r>
               <w:rPr>
                 <w:rFonts w:ascii="Verdana" w:hAnsi="Verdana" w:cs="Arial"/>
+                <w:i/>
+                <w:iCs/>
                 <w:sz w:val="20"/>
                 <w:szCs w:val="20"/>
               </w:rPr>
@@ -1589,13 +1683,17 @@
             <w:pPr>
               <w:rPr>
                 <w:rFonts w:ascii="Verdana" w:hAnsi="Verdana" w:cs="Arial"/>
-                <w:sz w:val="20"/>
-                <w:szCs w:val="20"/>
-              </w:rPr>
-            </w:pPr>
-            <w:r>
-              <w:rPr>
-                <w:rFonts w:ascii="Verdana" w:hAnsi="Verdana" w:cs="Arial"/>
+                <w:i/>
+                <w:iCs/>
+                <w:sz w:val="20"/>
+                <w:szCs w:val="20"/>
+              </w:rPr>
+            </w:pPr>
+            <w:r>
+              <w:rPr>
+                <w:rFonts w:ascii="Verdana" w:hAnsi="Verdana" w:cs="Arial"/>
+                <w:i/>
+                <w:iCs/>
                 <w:sz w:val="20"/>
                 <w:szCs w:val="20"/>
               </w:rPr>
@@ -1605,6 +1703,8 @@
             <w:r>
               <w:rPr>
                 <w:rFonts w:ascii="Verdana" w:hAnsi="Verdana" w:cs="Arial"/>
+                <w:i/>
+                <w:iCs/>
                 <w:sz w:val="20"/>
                 <w:szCs w:val="20"/>
               </w:rPr>
@@ -1614,6 +1714,8 @@
             <w:r>
               <w:rPr>
                 <w:rFonts w:ascii="Verdana" w:hAnsi="Verdana" w:cs="Arial"/>
+                <w:i/>
+                <w:iCs/>
                 <w:sz w:val="20"/>
                 <w:szCs w:val="20"/>
               </w:rPr>
@@ -1654,13 +1756,17 @@
             <w:pPr>
               <w:rPr>
                 <w:rFonts w:ascii="Verdana" w:hAnsi="Verdana" w:cs="Arial"/>
-                <w:sz w:val="20"/>
-                <w:szCs w:val="20"/>
-              </w:rPr>
-            </w:pPr>
-            <w:r>
-              <w:rPr>
-                <w:rFonts w:ascii="Verdana" w:hAnsi="Verdana" w:cs="Arial"/>
+                <w:i/>
+                <w:iCs/>
+                <w:sz w:val="20"/>
+                <w:szCs w:val="20"/>
+              </w:rPr>
+            </w:pPr>
+            <w:r>
+              <w:rPr>
+                <w:rFonts w:ascii="Verdana" w:hAnsi="Verdana" w:cs="Arial"/>
+                <w:i/>
+                <w:iCs/>
                 <w:sz w:val="20"/>
                 <w:szCs w:val="20"/>
               </w:rPr>
@@ -1670,6 +1776,8 @@
             <w:r>
               <w:rPr>
                 <w:rFonts w:ascii="Verdana" w:hAnsi="Verdana" w:cs="Arial"/>
+                <w:i/>
+                <w:iCs/>
                 <w:sz w:val="20"/>
                 <w:szCs w:val="20"/>
               </w:rPr>
@@ -1679,6 +1787,8 @@
             <w:r>
               <w:rPr>
                 <w:rFonts w:ascii="Verdana" w:hAnsi="Verdana" w:cs="Arial"/>
+                <w:i/>
+                <w:iCs/>
                 <w:sz w:val="20"/>
                 <w:szCs w:val="20"/>
               </w:rPr>
@@ -2455,6 +2565,7 @@
               <w:t xml:space="preserve"> </w:t>
             </w:r>
             <w:proofErr w:type="spellStart"/>
+            <w:proofErr w:type="gramStart"/>
             <w:r>
               <w:rPr>
                 <w:rFonts w:ascii="Verdana" w:hAnsi="Verdana" w:cs="Arial"/>
@@ -2468,6 +2579,7 @@
               <w:t>pr.strømskinne</w:t>
             </w:r>
             <w:proofErr w:type="spellEnd"/>
+            <w:proofErr w:type="gramEnd"/>
           </w:p>
         </w:tc>
         <w:tc>
@@ -3096,13 +3208,21 @@
           <w:color w:val="ED7D31" w:themeColor="accent2"/>
         </w:rPr>
         <w:tab/>
-        <w:t xml:space="preserve">à kr </w:t>
-      </w:r>
+        <w:t xml:space="preserve">à </w:t>
+      </w:r>
+      <w:proofErr w:type="gramStart"/>
       <w:r>
         <w:rPr>
           <w:rFonts w:ascii="Verdana" w:hAnsi="Verdana" w:cs="Arial"/>
           <w:color w:val="ED7D31" w:themeColor="accent2"/>
         </w:rPr>
+        <w:t xml:space="preserve">kr </w:t>
+      </w:r>
+      <w:r>
+        <w:rPr>
+          <w:rFonts w:ascii="Verdana" w:hAnsi="Verdana" w:cs="Arial"/>
+          <w:color w:val="ED7D31" w:themeColor="accent2"/>
+        </w:rPr>
         <w:t xml:space="preserve"> </w:t>
       </w:r>
       <w:r>
@@ -3112,6 +3232,7 @@
         </w:rPr>
         <w:t>15</w:t>
       </w:r>
+      <w:proofErr w:type="gramEnd"/>
       <w:r>
         <w:rPr>
           <w:rFonts w:ascii="Verdana" w:hAnsi="Verdana" w:cs="Arial"/>
@@ -3840,7 +3961,25 @@
           <w:sz w:val="18"/>
           <w:szCs w:val="18"/>
         </w:rPr>
-        <w:t>Ved feil og/eller mangler i mottatt underlag, eller endring av opprinnelig spesifikasjon/underlag, må en priskonsekvens påregnes.</w:t>
+        <w:t xml:space="preserve">Ved feil og/eller mangler i mottatt underlag, eller endring av opprinnelig spesifikasjon/underlag, må en priskonsekvens </w:t>
+      </w:r>
+      <w:proofErr w:type="gramStart"/>
+      <w:r>
+        <w:rPr>
+          <w:rFonts w:ascii="Verdana" w:hAnsi="Verdana" w:cs="Arial"/>
+          <w:sz w:val="18"/>
+          <w:szCs w:val="18"/>
+        </w:rPr>
+        <w:t>påregnes</w:t>
+      </w:r>
+      <w:proofErr w:type="gramEnd"/>
+      <w:r>
+        <w:rPr>
+          <w:rFonts w:ascii="Verdana" w:hAnsi="Verdana" w:cs="Arial"/>
+          <w:sz w:val="18"/>
+          <w:szCs w:val="18"/>
+        </w:rPr>
+        <w:t>.</w:t>
       </w:r>
     </w:p>
     <w:p>
@@ -4514,6 +4653,7 @@
         <w:t xml:space="preserve"> AS alle nødvendige og relevanteopplysninger som er nødvendig for å kunne gi et komplett tilbud på forespørselen. Herunder grensesnittet til andre sidestilte </w:t>
       </w:r>
       <w:proofErr w:type="spellStart"/>
+      <w:proofErr w:type="gramStart"/>
       <w:r>
         <w:rPr>
           <w:rFonts w:ascii="Verdana" w:hAnsi="Verdana" w:cs="Arial"/>
@@ -4523,6 +4663,7 @@
         <w:t>entreprenører.Det</w:t>
       </w:r>
       <w:proofErr w:type="spellEnd"/>
+      <w:proofErr w:type="gramEnd"/>
       <w:r>
         <w:rPr>
           <w:rFonts w:ascii="Verdana" w:hAnsi="Verdana" w:cs="Arial"/>

</xml_diff>

<commit_message>
Update offer generation and project workflow
</commit_message>
<xml_diff>
--- a/server/templates/tilbud/tilbud-stromskinner-template.docx
+++ b/server/templates/tilbud/tilbud-stromskinner-template.docx
@@ -3428,7 +3428,9 @@
           <w:lang w:eastAsia="en-US"/>
         </w:rPr>
       </w:pPr>
-      <w:r>
+    </w:p>
+    <w:p>
+      <w:pPr>
         <w:rPr>
           <w:rFonts w:ascii="Verdana" w:eastAsia="Times New Roman" w:hAnsi="Verdana" w:cs="Arial"/>
           <w:color w:val="FF0000"/>
@@ -3436,8 +3438,84 @@
           <w:szCs w:val="18"/>
           <w:lang w:eastAsia="en-US"/>
         </w:rPr>
-        <w:t>Hva gjør vi med betingelser råvarer?</w:t>
-      </w:r>
+      </w:pPr>
+    </w:p>
+    <w:p>
+      <w:pPr>
+        <w:rPr>
+          <w:rFonts w:ascii="Verdana" w:eastAsia="Times New Roman" w:hAnsi="Verdana" w:cs="Arial"/>
+          <w:color w:val="FF0000"/>
+          <w:sz w:val="18"/>
+          <w:szCs w:val="18"/>
+          <w:lang w:eastAsia="en-US"/>
+        </w:rPr>
+      </w:pPr>
+    </w:p>
+    <w:p>
+      <w:pPr>
+        <w:rPr>
+          <w:rFonts w:ascii="Verdana" w:eastAsia="Times New Roman" w:hAnsi="Verdana" w:cs="Arial"/>
+          <w:color w:val="FF0000"/>
+          <w:sz w:val="18"/>
+          <w:szCs w:val="18"/>
+          <w:lang w:eastAsia="en-US"/>
+        </w:rPr>
+      </w:pPr>
+    </w:p>
+    <w:p>
+      <w:pPr>
+        <w:rPr>
+          <w:rFonts w:ascii="Verdana" w:eastAsia="Times New Roman" w:hAnsi="Verdana" w:cs="Arial"/>
+          <w:color w:val="FF0000"/>
+          <w:sz w:val="18"/>
+          <w:szCs w:val="18"/>
+          <w:lang w:eastAsia="en-US"/>
+        </w:rPr>
+      </w:pPr>
+    </w:p>
+    <w:p>
+      <w:pPr>
+        <w:rPr>
+          <w:rFonts w:ascii="Verdana" w:eastAsia="Times New Roman" w:hAnsi="Verdana" w:cs="Arial"/>
+          <w:color w:val="FF0000"/>
+          <w:sz w:val="18"/>
+          <w:szCs w:val="18"/>
+          <w:lang w:eastAsia="en-US"/>
+        </w:rPr>
+      </w:pPr>
+    </w:p>
+    <w:p>
+      <w:pPr>
+        <w:rPr>
+          <w:rFonts w:ascii="Verdana" w:eastAsia="Times New Roman" w:hAnsi="Verdana" w:cs="Arial"/>
+          <w:color w:val="FF0000"/>
+          <w:sz w:val="18"/>
+          <w:szCs w:val="18"/>
+          <w:lang w:eastAsia="en-US"/>
+        </w:rPr>
+      </w:pPr>
+    </w:p>
+    <w:p>
+      <w:pPr>
+        <w:rPr>
+          <w:rFonts w:ascii="Verdana" w:eastAsia="Times New Roman" w:hAnsi="Verdana" w:cs="Arial"/>
+          <w:color w:val="FF0000"/>
+          <w:sz w:val="18"/>
+          <w:szCs w:val="18"/>
+          <w:lang w:eastAsia="en-US"/>
+        </w:rPr>
+      </w:pPr>
+    </w:p>
+    <w:p>
+      <w:pPr>
+        <w:rPr>
+          <w:rFonts w:ascii="Verdana" w:eastAsia="Times New Roman" w:hAnsi="Verdana" w:cs="Arial"/>
+          <w:color w:val="FF0000"/>
+          <w:sz w:val="18"/>
+          <w:szCs w:val="18"/>
+          <w:lang w:eastAsia="en-US"/>
+        </w:rPr>
+      </w:pPr>
     </w:p>
     <w:p>
       <w:pPr>
@@ -3637,7 +3715,23 @@
           <w:szCs w:val="18"/>
         </w:rPr>
         <w:tab/>
-        <w:t>Tilkoblinger mellom skinne og trafo / effektbryter</w:t>
+        <w:t>Tilkobling</w:t>
+      </w:r>
+      <w:r>
+        <w:rPr>
+          <w:rFonts w:ascii="Verdana" w:hAnsi="Verdana" w:cs="Arial"/>
+          <w:sz w:val="18"/>
+          <w:szCs w:val="18"/>
+        </w:rPr>
+        <w:t xml:space="preserve"> av fleksibler/lasker</w:t>
+      </w:r>
+      <w:r>
+        <w:rPr>
+          <w:rFonts w:ascii="Verdana" w:hAnsi="Verdana" w:cs="Arial"/>
+          <w:sz w:val="18"/>
+          <w:szCs w:val="18"/>
+        </w:rPr>
+        <w:t xml:space="preserve"> mellom skinne og trafo/effektbryter</w:t>
       </w:r>
     </w:p>
     <w:p>
@@ -3716,58 +3810,224 @@
           <w:lang w:eastAsia="en-US"/>
         </w:rPr>
         <w:lastRenderedPageBreak/>
-        <w:t xml:space="preserve">FORBEHOLD VED MONTASJE AV STRØMSKINNER FRA </w:t>
-      </w:r>
-      <w:r>
+        <w:t>FORBEHOLD VED MONTASJE AV STRØMSKINNER FRA BUSBAR</w:t>
+      </w:r>
+    </w:p>
+    <w:p>
+      <w:pPr>
+        <w:spacing w:after="0" w:line="240" w:lineRule="auto"/>
         <w:rPr>
           <w:rFonts w:ascii="Verdana" w:eastAsia="Times New Roman" w:hAnsi="Verdana" w:cs="Arial"/>
+          <w:b/>
+          <w:bCs/>
           <w:sz w:val="18"/>
           <w:szCs w:val="18"/>
           <w:lang w:eastAsia="en-US"/>
         </w:rPr>
-        <w:t xml:space="preserve">BUSBAR / </w:t>
-      </w:r>
-      <w:r>
+      </w:pPr>
+    </w:p>
+    <w:p>
+      <w:pPr>
+        <w:spacing w:after="0" w:line="240" w:lineRule="auto"/>
         <w:rPr>
           <w:rFonts w:ascii="Verdana" w:eastAsia="Times New Roman" w:hAnsi="Verdana" w:cs="Arial"/>
           <w:sz w:val="18"/>
           <w:szCs w:val="18"/>
           <w:lang w:eastAsia="en-US"/>
         </w:rPr>
-        <w:t>MCS</w:t>
-      </w:r>
+      </w:pPr>
       <w:r>
         <w:rPr>
           <w:rFonts w:ascii="Verdana" w:eastAsia="Times New Roman" w:hAnsi="Verdana" w:cs="Arial"/>
-          <w:bCs/>
           <w:sz w:val="18"/>
           <w:szCs w:val="18"/>
           <w:lang w:eastAsia="en-US"/>
         </w:rPr>
+        <w:t>Ansvar for montasje</w:t>
+      </w:r>
+      <w:r>
+        <w:rPr>
+          <w:rFonts w:ascii="Verdana" w:eastAsia="Times New Roman" w:hAnsi="Verdana" w:cs="Arial"/>
+          <w:sz w:val="18"/>
+          <w:szCs w:val="18"/>
+          <w:lang w:eastAsia="en-US"/>
+        </w:rPr>
+        <w:br/>
+        <w:t>Busbar er ikke ansvarlig installatør og forbeholder seg retten til å benytte ekstern montasjepartner for utførelse av arbeidet.</w:t>
+      </w:r>
+      <w:r>
+        <w:rPr>
+          <w:rFonts w:ascii="Verdana" w:eastAsia="Times New Roman" w:hAnsi="Verdana" w:cs="Arial"/>
+          <w:sz w:val="18"/>
+          <w:szCs w:val="18"/>
+          <w:lang w:eastAsia="en-US"/>
+        </w:rPr>
+        <w:t xml:space="preserve"> </w:t>
+      </w:r>
+      <w:r>
+        <w:rPr>
+          <w:rFonts w:ascii="Verdana" w:eastAsia="Times New Roman" w:hAnsi="Verdana" w:cs="Arial"/>
+          <w:sz w:val="18"/>
+          <w:szCs w:val="18"/>
+          <w:lang w:eastAsia="en-US"/>
+        </w:rPr>
+        <w:t>Generell garantitid er 12 måneder fra overlevering til oppdragsgiver. Ansvar er begrenset til utbedring av feil eller mangler.</w:t>
+      </w:r>
+    </w:p>
+    <w:p>
+      <w:pPr>
+        <w:spacing w:after="0" w:line="240" w:lineRule="auto"/>
+        <w:rPr>
+          <w:rFonts w:ascii="Verdana" w:eastAsia="Times New Roman" w:hAnsi="Verdana" w:cs="Arial"/>
+          <w:sz w:val="18"/>
+          <w:szCs w:val="18"/>
+          <w:lang w:eastAsia="en-US"/>
+        </w:rPr>
+      </w:pPr>
+    </w:p>
+    <w:p>
+      <w:pPr>
+        <w:spacing w:after="0" w:line="240" w:lineRule="auto"/>
+        <w:rPr>
+          <w:rFonts w:ascii="Verdana" w:eastAsia="Times New Roman" w:hAnsi="Verdana" w:cs="Arial"/>
+          <w:sz w:val="18"/>
+          <w:szCs w:val="18"/>
+          <w:lang w:eastAsia="en-US"/>
+        </w:rPr>
+      </w:pPr>
+      <w:r>
+        <w:rPr>
+          <w:rFonts w:ascii="Verdana" w:eastAsia="Times New Roman" w:hAnsi="Verdana" w:cs="Arial"/>
+          <w:sz w:val="18"/>
+          <w:szCs w:val="18"/>
+          <w:lang w:eastAsia="en-US"/>
+        </w:rPr>
+        <w:t>Forutsetninger for pris</w:t>
+      </w:r>
+      <w:r>
+        <w:rPr>
+          <w:rFonts w:ascii="Verdana" w:eastAsia="Times New Roman" w:hAnsi="Verdana" w:cs="Arial"/>
+          <w:sz w:val="18"/>
+          <w:szCs w:val="18"/>
+          <w:lang w:eastAsia="en-US"/>
+        </w:rPr>
+        <w:br/>
+        <w:t xml:space="preserve">Tilbudt pris for montasje er basert på en sammenhengende og uavbrutt arbeidsprosess innenfor ordinær arbeidstid kl. 07:00–19:00. Prisen forutsetter videre: </w:t>
+      </w:r>
+    </w:p>
+    <w:p>
+      <w:pPr>
+        <w:numPr>
+          <w:ilvl w:val="1"/>
+          <w:numId w:val="15"/>
+        </w:numPr>
+        <w:spacing w:after="0" w:line="240" w:lineRule="auto"/>
+        <w:rPr>
+          <w:rFonts w:ascii="Verdana" w:eastAsia="Times New Roman" w:hAnsi="Verdana" w:cs="Arial"/>
+          <w:sz w:val="18"/>
+          <w:szCs w:val="18"/>
+          <w:lang w:eastAsia="en-US"/>
+        </w:rPr>
+      </w:pPr>
+      <w:r>
+        <w:rPr>
+          <w:rFonts w:ascii="Verdana" w:eastAsia="Times New Roman" w:hAnsi="Verdana" w:cs="Arial"/>
+          <w:sz w:val="18"/>
+          <w:szCs w:val="18"/>
+          <w:lang w:eastAsia="en-US"/>
+        </w:rPr>
+        <w:t>F</w:t>
+      </w:r>
+      <w:r>
+        <w:rPr>
+          <w:rFonts w:ascii="Verdana" w:eastAsia="Times New Roman" w:hAnsi="Verdana" w:cs="Arial"/>
+          <w:sz w:val="18"/>
+          <w:szCs w:val="18"/>
+          <w:lang w:eastAsia="en-US"/>
+        </w:rPr>
+        <w:t>ri og uhindret adkomst til montasjeområdet</w:t>
+      </w:r>
+      <w:r>
+        <w:rPr>
+          <w:rFonts w:ascii="Verdana" w:eastAsia="Times New Roman" w:hAnsi="Verdana" w:cs="Arial"/>
+          <w:sz w:val="18"/>
+          <w:szCs w:val="18"/>
+          <w:lang w:eastAsia="en-US"/>
+        </w:rPr>
         <w:t>.</w:t>
       </w:r>
     </w:p>
     <w:p>
       <w:pPr>
+        <w:numPr>
+          <w:ilvl w:val="1"/>
+          <w:numId w:val="15"/>
+        </w:numPr>
         <w:spacing w:after="0" w:line="240" w:lineRule="auto"/>
         <w:rPr>
           <w:rFonts w:ascii="Verdana" w:eastAsia="Times New Roman" w:hAnsi="Verdana" w:cs="Arial"/>
-          <w:bCs/>
           <w:sz w:val="18"/>
           <w:szCs w:val="18"/>
           <w:lang w:eastAsia="en-US"/>
         </w:rPr>
       </w:pPr>
-    </w:p>
-    <w:p>
-      <w:pPr>
-        <w:pStyle w:val="Listeavsnitt"/>
+      <w:r>
+        <w:rPr>
+          <w:rFonts w:ascii="Verdana" w:eastAsia="Times New Roman" w:hAnsi="Verdana" w:cs="Arial"/>
+          <w:sz w:val="18"/>
+          <w:szCs w:val="18"/>
+          <w:lang w:eastAsia="en-US"/>
+        </w:rPr>
+        <w:t>T</w:t>
+      </w:r>
+      <w:r>
+        <w:rPr>
+          <w:rFonts w:ascii="Verdana" w:eastAsia="Times New Roman" w:hAnsi="Verdana" w:cs="Arial"/>
+          <w:sz w:val="18"/>
+          <w:szCs w:val="18"/>
+          <w:lang w:eastAsia="en-US"/>
+        </w:rPr>
+        <w:t xml:space="preserve">ilgjengelig </w:t>
+      </w:r>
+      <w:proofErr w:type="spellStart"/>
+      <w:r>
+        <w:rPr>
+          <w:rFonts w:ascii="Verdana" w:eastAsia="Times New Roman" w:hAnsi="Verdana" w:cs="Arial"/>
+          <w:sz w:val="18"/>
+          <w:szCs w:val="18"/>
+          <w:lang w:eastAsia="en-US"/>
+        </w:rPr>
+        <w:t>byggstrøm</w:t>
+      </w:r>
+      <w:proofErr w:type="spellEnd"/>
+      <w:r>
+        <w:rPr>
+          <w:rFonts w:ascii="Verdana" w:eastAsia="Times New Roman" w:hAnsi="Verdana" w:cs="Arial"/>
+          <w:sz w:val="18"/>
+          <w:szCs w:val="18"/>
+          <w:lang w:eastAsia="en-US"/>
+        </w:rPr>
+        <w:t xml:space="preserve"> på minimum 16A</w:t>
+      </w:r>
+      <w:r>
+        <w:rPr>
+          <w:rFonts w:ascii="Verdana" w:eastAsia="Times New Roman" w:hAnsi="Verdana" w:cs="Arial"/>
+          <w:sz w:val="18"/>
+          <w:szCs w:val="18"/>
+          <w:lang w:eastAsia="en-US"/>
+        </w:rPr>
+        <w:t>.</w:t>
+      </w:r>
+    </w:p>
+    <w:p>
+      <w:pPr>
         <w:numPr>
-          <w:ilvl w:val="0"/>
-          <w:numId w:val="11"/>
+          <w:ilvl w:val="1"/>
+          <w:numId w:val="15"/>
         </w:numPr>
-        <w:rPr>
-          <w:rFonts w:ascii="Verdana" w:hAnsi="Verdana" w:cs="Arial"/>
+        <w:spacing w:after="0" w:line="240" w:lineRule="auto"/>
+        <w:rPr>
+          <w:rFonts w:ascii="Verdana" w:eastAsia="Times New Roman" w:hAnsi="Verdana" w:cs="Arial"/>
           <w:sz w:val="18"/>
           <w:szCs w:val="18"/>
           <w:lang w:eastAsia="en-US"/>
@@ -3775,12 +4035,560 @@
       </w:pPr>
       <w:r>
         <w:rPr>
-          <w:rFonts w:ascii="Verdana" w:hAnsi="Verdana" w:cs="Arial"/>
+          <w:rFonts w:ascii="Verdana" w:eastAsia="Times New Roman" w:hAnsi="Verdana" w:cs="Arial"/>
           <w:sz w:val="18"/>
           <w:szCs w:val="18"/>
           <w:lang w:eastAsia="en-US"/>
         </w:rPr>
-        <w:t xml:space="preserve">Pris på montasjen er basert på kontinuerlig arbeidsprosess uten opphold innenfor normal arbeidstid (07:00-19:00), fri adkomst der skinne skal monteres, tilgang til minimum 16A </w:t>
+        <w:t>T</w:t>
+      </w:r>
+      <w:r>
+        <w:rPr>
+          <w:rFonts w:ascii="Verdana" w:eastAsia="Times New Roman" w:hAnsi="Verdana" w:cs="Arial"/>
+          <w:sz w:val="18"/>
+          <w:szCs w:val="18"/>
+          <w:lang w:eastAsia="en-US"/>
+        </w:rPr>
+        <w:t>ilfredsstillende belysning på arbeidsstedet.</w:t>
+      </w:r>
+    </w:p>
+    <w:p>
+      <w:pPr>
+        <w:spacing w:after="0" w:line="240" w:lineRule="auto"/>
+        <w:rPr>
+          <w:rFonts w:ascii="Verdana" w:eastAsia="Times New Roman" w:hAnsi="Verdana" w:cs="Arial"/>
+          <w:sz w:val="18"/>
+          <w:szCs w:val="18"/>
+          <w:lang w:eastAsia="en-US"/>
+        </w:rPr>
+      </w:pPr>
+    </w:p>
+    <w:p>
+      <w:pPr>
+        <w:spacing w:after="0" w:line="240" w:lineRule="auto"/>
+        <w:rPr>
+          <w:rFonts w:ascii="Verdana" w:eastAsia="Times New Roman" w:hAnsi="Verdana" w:cs="Arial"/>
+          <w:sz w:val="18"/>
+          <w:szCs w:val="18"/>
+          <w:lang w:eastAsia="en-US"/>
+        </w:rPr>
+      </w:pPr>
+      <w:r>
+        <w:rPr>
+          <w:rFonts w:ascii="Verdana" w:eastAsia="Times New Roman" w:hAnsi="Verdana" w:cs="Arial"/>
+          <w:sz w:val="18"/>
+          <w:szCs w:val="18"/>
+          <w:lang w:eastAsia="en-US"/>
+        </w:rPr>
+        <w:t>Arbeid i høyden</w:t>
+      </w:r>
+      <w:r>
+        <w:rPr>
+          <w:rFonts w:ascii="Verdana" w:eastAsia="Times New Roman" w:hAnsi="Verdana" w:cs="Arial"/>
+          <w:sz w:val="18"/>
+          <w:szCs w:val="18"/>
+          <w:lang w:eastAsia="en-US"/>
+        </w:rPr>
+        <w:br/>
+        <w:t xml:space="preserve">Ved montasje i høyder over 3,0 meter er oppdragsgiver ansvarlig for å </w:t>
+      </w:r>
+      <w:proofErr w:type="gramStart"/>
+      <w:r>
+        <w:rPr>
+          <w:rFonts w:ascii="Verdana" w:eastAsia="Times New Roman" w:hAnsi="Verdana" w:cs="Arial"/>
+          <w:sz w:val="18"/>
+          <w:szCs w:val="18"/>
+          <w:lang w:eastAsia="en-US"/>
+        </w:rPr>
+        <w:t>besørge</w:t>
+      </w:r>
+      <w:proofErr w:type="gramEnd"/>
+      <w:r>
+        <w:rPr>
+          <w:rFonts w:ascii="Verdana" w:eastAsia="Times New Roman" w:hAnsi="Verdana" w:cs="Arial"/>
+          <w:sz w:val="18"/>
+          <w:szCs w:val="18"/>
+          <w:lang w:eastAsia="en-US"/>
+        </w:rPr>
+        <w:t xml:space="preserve"> og bekoste nødvendig stillas, lift eller annet godkjent arbeidsutstyr.</w:t>
+      </w:r>
+    </w:p>
+    <w:p>
+      <w:pPr>
+        <w:spacing w:after="0" w:line="240" w:lineRule="auto"/>
+        <w:rPr>
+          <w:rFonts w:ascii="Verdana" w:eastAsia="Times New Roman" w:hAnsi="Verdana" w:cs="Arial"/>
+          <w:sz w:val="18"/>
+          <w:szCs w:val="18"/>
+          <w:lang w:eastAsia="en-US"/>
+        </w:rPr>
+      </w:pPr>
+    </w:p>
+    <w:p>
+      <w:pPr>
+        <w:spacing w:after="0" w:line="240" w:lineRule="auto"/>
+        <w:rPr>
+          <w:rFonts w:ascii="Verdana" w:eastAsia="Times New Roman" w:hAnsi="Verdana" w:cs="Arial"/>
+          <w:sz w:val="18"/>
+          <w:szCs w:val="18"/>
+          <w:lang w:eastAsia="en-US"/>
+        </w:rPr>
+      </w:pPr>
+      <w:r>
+        <w:rPr>
+          <w:rFonts w:ascii="Verdana" w:eastAsia="Times New Roman" w:hAnsi="Verdana" w:cs="Arial"/>
+          <w:sz w:val="18"/>
+          <w:szCs w:val="18"/>
+          <w:lang w:eastAsia="en-US"/>
+        </w:rPr>
+        <w:t>Arbeider som ikke inngår i tilbudet</w:t>
+      </w:r>
+      <w:r>
+        <w:rPr>
+          <w:rFonts w:ascii="Verdana" w:eastAsia="Times New Roman" w:hAnsi="Verdana" w:cs="Arial"/>
+          <w:sz w:val="18"/>
+          <w:szCs w:val="18"/>
+          <w:lang w:eastAsia="en-US"/>
+        </w:rPr>
+        <w:br/>
+        <w:t xml:space="preserve">Følgende arbeider er ikke inkludert i tilbudt pris med mindre annet er skriftlig avtalt: </w:t>
+      </w:r>
+    </w:p>
+    <w:p>
+      <w:pPr>
+        <w:numPr>
+          <w:ilvl w:val="1"/>
+          <w:numId w:val="15"/>
+        </w:numPr>
+        <w:spacing w:after="0" w:line="240" w:lineRule="auto"/>
+        <w:rPr>
+          <w:rFonts w:ascii="Verdana" w:eastAsia="Times New Roman" w:hAnsi="Verdana" w:cs="Arial"/>
+          <w:sz w:val="18"/>
+          <w:szCs w:val="18"/>
+          <w:lang w:eastAsia="en-US"/>
+        </w:rPr>
+      </w:pPr>
+      <w:r>
+        <w:rPr>
+          <w:rFonts w:ascii="Verdana" w:eastAsia="Times New Roman" w:hAnsi="Verdana" w:cs="Arial"/>
+          <w:sz w:val="18"/>
+          <w:szCs w:val="18"/>
+          <w:lang w:eastAsia="en-US"/>
+        </w:rPr>
+        <w:t>D</w:t>
+      </w:r>
+      <w:r>
+        <w:rPr>
+          <w:rFonts w:ascii="Verdana" w:eastAsia="Times New Roman" w:hAnsi="Verdana" w:cs="Arial"/>
+          <w:sz w:val="18"/>
+          <w:szCs w:val="18"/>
+          <w:lang w:eastAsia="en-US"/>
+        </w:rPr>
+        <w:t>emontering av eksisterende strømskinner eller anleg</w:t>
+      </w:r>
+      <w:r>
+        <w:rPr>
+          <w:rFonts w:ascii="Verdana" w:eastAsia="Times New Roman" w:hAnsi="Verdana" w:cs="Arial"/>
+          <w:sz w:val="18"/>
+          <w:szCs w:val="18"/>
+          <w:lang w:eastAsia="en-US"/>
+        </w:rPr>
+        <w:t>g.</w:t>
+      </w:r>
+    </w:p>
+    <w:p>
+      <w:pPr>
+        <w:numPr>
+          <w:ilvl w:val="1"/>
+          <w:numId w:val="15"/>
+        </w:numPr>
+        <w:spacing w:after="0" w:line="240" w:lineRule="auto"/>
+        <w:rPr>
+          <w:rFonts w:ascii="Verdana" w:eastAsia="Times New Roman" w:hAnsi="Verdana" w:cs="Arial"/>
+          <w:sz w:val="18"/>
+          <w:szCs w:val="18"/>
+          <w:lang w:eastAsia="en-US"/>
+        </w:rPr>
+      </w:pPr>
+      <w:r>
+        <w:rPr>
+          <w:rFonts w:ascii="Verdana" w:eastAsia="Times New Roman" w:hAnsi="Verdana" w:cs="Arial"/>
+          <w:sz w:val="18"/>
+          <w:szCs w:val="18"/>
+          <w:lang w:eastAsia="en-US"/>
+        </w:rPr>
+        <w:t>H</w:t>
+      </w:r>
+      <w:r>
+        <w:rPr>
+          <w:rFonts w:ascii="Verdana" w:eastAsia="Times New Roman" w:hAnsi="Verdana" w:cs="Arial"/>
+          <w:sz w:val="18"/>
+          <w:szCs w:val="18"/>
+          <w:lang w:eastAsia="en-US"/>
+        </w:rPr>
+        <w:t xml:space="preserve">ulltaking i sikringsskap, </w:t>
+      </w:r>
+      <w:r>
+        <w:rPr>
+          <w:rFonts w:ascii="Verdana" w:eastAsia="Times New Roman" w:hAnsi="Verdana" w:cs="Arial"/>
+          <w:sz w:val="18"/>
+          <w:szCs w:val="18"/>
+          <w:lang w:eastAsia="en-US"/>
+        </w:rPr>
+        <w:t>vegg/tak/gulv</w:t>
+      </w:r>
+      <w:r>
+        <w:rPr>
+          <w:rFonts w:ascii="Verdana" w:eastAsia="Times New Roman" w:hAnsi="Verdana" w:cs="Arial"/>
+          <w:sz w:val="18"/>
+          <w:szCs w:val="18"/>
+          <w:lang w:eastAsia="en-US"/>
+        </w:rPr>
+        <w:t>.</w:t>
+      </w:r>
+    </w:p>
+    <w:p>
+      <w:pPr>
+        <w:numPr>
+          <w:ilvl w:val="1"/>
+          <w:numId w:val="15"/>
+        </w:numPr>
+        <w:spacing w:after="0" w:line="240" w:lineRule="auto"/>
+        <w:rPr>
+          <w:rFonts w:ascii="Verdana" w:eastAsia="Times New Roman" w:hAnsi="Verdana" w:cs="Arial"/>
+          <w:sz w:val="18"/>
+          <w:szCs w:val="18"/>
+          <w:lang w:eastAsia="en-US"/>
+        </w:rPr>
+      </w:pPr>
+      <w:r>
+        <w:rPr>
+          <w:rFonts w:ascii="Verdana" w:eastAsia="Times New Roman" w:hAnsi="Verdana" w:cs="Arial"/>
+          <w:sz w:val="18"/>
+          <w:szCs w:val="18"/>
+          <w:lang w:eastAsia="en-US"/>
+        </w:rPr>
+        <w:t>M</w:t>
+      </w:r>
+      <w:r>
+        <w:rPr>
+          <w:rFonts w:ascii="Verdana" w:eastAsia="Times New Roman" w:hAnsi="Verdana" w:cs="Arial"/>
+          <w:sz w:val="18"/>
+          <w:szCs w:val="18"/>
+          <w:lang w:eastAsia="en-US"/>
+        </w:rPr>
+        <w:t>ontering og tilkobling av trafo – tavle- element</w:t>
+      </w:r>
+      <w:r>
+        <w:rPr>
+          <w:rFonts w:ascii="Verdana" w:eastAsia="Times New Roman" w:hAnsi="Verdana" w:cs="Arial"/>
+          <w:sz w:val="18"/>
+          <w:szCs w:val="18"/>
+          <w:lang w:eastAsia="en-US"/>
+        </w:rPr>
+        <w:t>.</w:t>
+      </w:r>
+    </w:p>
+    <w:p>
+      <w:pPr>
+        <w:numPr>
+          <w:ilvl w:val="1"/>
+          <w:numId w:val="15"/>
+        </w:numPr>
+        <w:spacing w:after="0" w:line="240" w:lineRule="auto"/>
+        <w:rPr>
+          <w:rFonts w:ascii="Verdana" w:eastAsia="Times New Roman" w:hAnsi="Verdana" w:cs="Arial"/>
+          <w:sz w:val="18"/>
+          <w:szCs w:val="18"/>
+          <w:lang w:eastAsia="en-US"/>
+        </w:rPr>
+      </w:pPr>
+      <w:r>
+        <w:rPr>
+          <w:rFonts w:ascii="Verdana" w:eastAsia="Times New Roman" w:hAnsi="Verdana" w:cs="Arial"/>
+          <w:sz w:val="18"/>
+          <w:szCs w:val="18"/>
+          <w:lang w:eastAsia="en-US"/>
+        </w:rPr>
+        <w:t>J</w:t>
+      </w:r>
+      <w:r>
+        <w:rPr>
+          <w:rFonts w:ascii="Verdana" w:eastAsia="Times New Roman" w:hAnsi="Verdana" w:cs="Arial"/>
+          <w:sz w:val="18"/>
+          <w:szCs w:val="18"/>
+          <w:lang w:eastAsia="en-US"/>
+        </w:rPr>
+        <w:t>ording av utsatte ledende deler</w:t>
+      </w:r>
+      <w:r>
+        <w:rPr>
+          <w:rFonts w:ascii="Verdana" w:eastAsia="Times New Roman" w:hAnsi="Verdana" w:cs="Arial"/>
+          <w:sz w:val="18"/>
+          <w:szCs w:val="18"/>
+          <w:lang w:eastAsia="en-US"/>
+        </w:rPr>
+        <w:t>.</w:t>
+      </w:r>
+    </w:p>
+    <w:p>
+      <w:pPr>
+        <w:numPr>
+          <w:ilvl w:val="1"/>
+          <w:numId w:val="15"/>
+        </w:numPr>
+        <w:spacing w:after="0" w:line="240" w:lineRule="auto"/>
+        <w:rPr>
+          <w:rFonts w:ascii="Verdana" w:eastAsia="Times New Roman" w:hAnsi="Verdana" w:cs="Arial"/>
+          <w:sz w:val="18"/>
+          <w:szCs w:val="18"/>
+          <w:lang w:eastAsia="en-US"/>
+        </w:rPr>
+      </w:pPr>
+      <w:r>
+        <w:rPr>
+          <w:rFonts w:ascii="Verdana" w:eastAsia="Times New Roman" w:hAnsi="Verdana" w:cs="Arial"/>
+          <w:sz w:val="18"/>
+          <w:szCs w:val="18"/>
+          <w:lang w:eastAsia="en-US"/>
+        </w:rPr>
+        <w:t>B</w:t>
+      </w:r>
+      <w:r>
+        <w:rPr>
+          <w:rFonts w:ascii="Verdana" w:eastAsia="Times New Roman" w:hAnsi="Verdana" w:cs="Arial"/>
+          <w:sz w:val="18"/>
+          <w:szCs w:val="18"/>
+          <w:lang w:eastAsia="en-US"/>
+        </w:rPr>
+        <w:t>ranntetting</w:t>
+      </w:r>
+      <w:r>
+        <w:rPr>
+          <w:rFonts w:ascii="Verdana" w:eastAsia="Times New Roman" w:hAnsi="Verdana" w:cs="Arial"/>
+          <w:sz w:val="18"/>
+          <w:szCs w:val="18"/>
+          <w:lang w:eastAsia="en-US"/>
+        </w:rPr>
+        <w:t xml:space="preserve"> mellom brannelement og vegg/tak/gulv.</w:t>
+      </w:r>
+    </w:p>
+    <w:p>
+      <w:pPr>
+        <w:numPr>
+          <w:ilvl w:val="1"/>
+          <w:numId w:val="15"/>
+        </w:numPr>
+        <w:spacing w:after="0" w:line="240" w:lineRule="auto"/>
+        <w:rPr>
+          <w:rFonts w:ascii="Verdana" w:eastAsia="Times New Roman" w:hAnsi="Verdana" w:cs="Arial"/>
+          <w:sz w:val="18"/>
+          <w:szCs w:val="18"/>
+          <w:lang w:eastAsia="en-US"/>
+        </w:rPr>
+      </w:pPr>
+      <w:r>
+        <w:rPr>
+          <w:rFonts w:ascii="Verdana" w:eastAsia="Times New Roman" w:hAnsi="Verdana" w:cs="Arial"/>
+          <w:sz w:val="18"/>
+          <w:szCs w:val="18"/>
+          <w:lang w:eastAsia="en-US"/>
+        </w:rPr>
+        <w:t>L</w:t>
+      </w:r>
+      <w:r>
+        <w:rPr>
+          <w:rFonts w:ascii="Verdana" w:eastAsia="Times New Roman" w:hAnsi="Verdana" w:cs="Arial"/>
+          <w:sz w:val="18"/>
+          <w:szCs w:val="18"/>
+          <w:lang w:eastAsia="en-US"/>
+        </w:rPr>
+        <w:t>everanse eller etablering av kulvert</w:t>
+      </w:r>
+      <w:r>
+        <w:rPr>
+          <w:rFonts w:ascii="Verdana" w:eastAsia="Times New Roman" w:hAnsi="Verdana" w:cs="Arial"/>
+          <w:sz w:val="18"/>
+          <w:szCs w:val="18"/>
+          <w:lang w:eastAsia="en-US"/>
+        </w:rPr>
+        <w:t>.</w:t>
+      </w:r>
+    </w:p>
+    <w:p>
+      <w:pPr>
+        <w:spacing w:after="0" w:line="240" w:lineRule="auto"/>
+        <w:rPr>
+          <w:rFonts w:ascii="Verdana" w:eastAsia="Times New Roman" w:hAnsi="Verdana" w:cs="Arial"/>
+          <w:sz w:val="18"/>
+          <w:szCs w:val="18"/>
+          <w:lang w:eastAsia="en-US"/>
+        </w:rPr>
+      </w:pPr>
+    </w:p>
+    <w:p>
+      <w:pPr>
+        <w:spacing w:after="0" w:line="240" w:lineRule="auto"/>
+        <w:rPr>
+          <w:rFonts w:ascii="Verdana" w:eastAsia="Times New Roman" w:hAnsi="Verdana" w:cs="Arial"/>
+          <w:sz w:val="18"/>
+          <w:szCs w:val="18"/>
+          <w:lang w:eastAsia="en-US"/>
+        </w:rPr>
+      </w:pPr>
+      <w:r>
+        <w:rPr>
+          <w:rFonts w:ascii="Verdana" w:eastAsia="Times New Roman" w:hAnsi="Verdana" w:cs="Arial"/>
+          <w:sz w:val="18"/>
+          <w:szCs w:val="18"/>
+          <w:lang w:eastAsia="en-US"/>
+        </w:rPr>
+        <w:t>Lossing og kraning</w:t>
+      </w:r>
+      <w:r>
+        <w:rPr>
+          <w:rFonts w:ascii="Verdana" w:eastAsia="Times New Roman" w:hAnsi="Verdana" w:cs="Arial"/>
+          <w:sz w:val="18"/>
+          <w:szCs w:val="18"/>
+          <w:lang w:eastAsia="en-US"/>
+        </w:rPr>
+        <w:br/>
+        <w:t>Oppdragsgiver er ansvarlig for lossing og eventuell kraning av strømskinner på byggeplass.</w:t>
+      </w:r>
+    </w:p>
+    <w:p>
+      <w:pPr>
+        <w:spacing w:after="0" w:line="240" w:lineRule="auto"/>
+        <w:rPr>
+          <w:rFonts w:ascii="Verdana" w:eastAsia="Times New Roman" w:hAnsi="Verdana" w:cs="Arial"/>
+          <w:sz w:val="18"/>
+          <w:szCs w:val="18"/>
+          <w:lang w:eastAsia="en-US"/>
+        </w:rPr>
+      </w:pPr>
+    </w:p>
+    <w:p>
+      <w:pPr>
+        <w:spacing w:after="0" w:line="240" w:lineRule="auto"/>
+        <w:rPr>
+          <w:rFonts w:ascii="Verdana" w:eastAsia="Times New Roman" w:hAnsi="Verdana" w:cs="Arial"/>
+          <w:sz w:val="18"/>
+          <w:szCs w:val="18"/>
+          <w:lang w:eastAsia="en-US"/>
+        </w:rPr>
+      </w:pPr>
+      <w:r>
+        <w:rPr>
+          <w:rFonts w:ascii="Verdana" w:eastAsia="Times New Roman" w:hAnsi="Verdana" w:cs="Arial"/>
+          <w:sz w:val="18"/>
+          <w:szCs w:val="18"/>
+          <w:lang w:eastAsia="en-US"/>
+        </w:rPr>
+        <w:t>Temperatur og oppvarming</w:t>
+      </w:r>
+      <w:r>
+        <w:rPr>
+          <w:rFonts w:ascii="Verdana" w:eastAsia="Times New Roman" w:hAnsi="Verdana" w:cs="Arial"/>
+          <w:sz w:val="18"/>
+          <w:szCs w:val="18"/>
+          <w:lang w:eastAsia="en-US"/>
+        </w:rPr>
+        <w:br/>
+        <w:t>Ved temperaturer under 5 °C er oppdragsgiver ansvarlig for at arbeidsområdet holdes tilstrekkelig oppvarmet</w:t>
+      </w:r>
+    </w:p>
+    <w:p>
+      <w:pPr>
+        <w:rPr>
+          <w:rFonts w:ascii="Verdana" w:hAnsi="Verdana" w:cs="Arial"/>
+          <w:sz w:val="18"/>
+          <w:szCs w:val="18"/>
+        </w:rPr>
+      </w:pPr>
+    </w:p>
+    <w:p>
+      <w:pPr>
+        <w:rPr>
+          <w:rFonts w:ascii="Verdana" w:hAnsi="Verdana" w:cs="Arial"/>
+          <w:sz w:val="18"/>
+          <w:szCs w:val="18"/>
+        </w:rPr>
+      </w:pPr>
+      <w:r>
+        <w:rPr>
+          <w:rFonts w:ascii="Verdana" w:hAnsi="Verdana" w:cs="Arial"/>
+          <w:sz w:val="18"/>
+          <w:szCs w:val="18"/>
+        </w:rPr>
+        <w:t>Vi gjør oppmerksom på, at hvis kortslutningsnivå ikke er kjent, kan dette ha påvirkning på valg av vern</w:t>
+      </w:r>
+      <w:r>
+        <w:rPr>
+          <w:rFonts w:ascii="Verdana" w:hAnsi="Verdana" w:cs="Arial"/>
+          <w:sz w:val="18"/>
+          <w:szCs w:val="18"/>
+        </w:rPr>
+        <w:t>/strømskinne</w:t>
+      </w:r>
+      <w:r>
+        <w:rPr>
+          <w:rFonts w:ascii="Verdana" w:hAnsi="Verdana" w:cs="Arial"/>
+          <w:sz w:val="18"/>
+          <w:szCs w:val="18"/>
+        </w:rPr>
+        <w:t xml:space="preserve"> og dertil pris.</w:t>
+      </w:r>
+    </w:p>
+    <w:p>
+      <w:pPr>
+        <w:rPr>
+          <w:rFonts w:ascii="Verdana" w:hAnsi="Verdana" w:cs="Arial"/>
+          <w:sz w:val="18"/>
+          <w:szCs w:val="18"/>
+        </w:rPr>
+      </w:pPr>
+      <w:r>
+        <w:rPr>
+          <w:rFonts w:ascii="Verdana" w:hAnsi="Verdana" w:cs="Arial"/>
+          <w:sz w:val="18"/>
+          <w:szCs w:val="18"/>
+        </w:rPr>
+        <w:t xml:space="preserve">Ved feil og/eller mangler i mottatt underlag, eller endring av opprinnelig spesifikasjon/underlag, må en priskonsekvens </w:t>
+      </w:r>
+      <w:proofErr w:type="gramStart"/>
+      <w:r>
+        <w:rPr>
+          <w:rFonts w:ascii="Verdana" w:hAnsi="Verdana" w:cs="Arial"/>
+          <w:sz w:val="18"/>
+          <w:szCs w:val="18"/>
+        </w:rPr>
+        <w:t>påregnes</w:t>
+      </w:r>
+      <w:proofErr w:type="gramEnd"/>
+      <w:r>
+        <w:rPr>
+          <w:rFonts w:ascii="Verdana" w:hAnsi="Verdana" w:cs="Arial"/>
+          <w:sz w:val="18"/>
+          <w:szCs w:val="18"/>
+        </w:rPr>
+        <w:t>.</w:t>
+      </w:r>
+    </w:p>
+    <w:p>
+      <w:pPr>
+        <w:rPr>
+          <w:rFonts w:ascii="Verdana" w:hAnsi="Verdana" w:cs="Arial"/>
+          <w:sz w:val="18"/>
+          <w:szCs w:val="18"/>
+        </w:rPr>
+      </w:pPr>
+      <w:r>
+        <w:rPr>
+          <w:rFonts w:ascii="Verdana" w:hAnsi="Verdana" w:cs="Arial"/>
+          <w:sz w:val="18"/>
+          <w:szCs w:val="18"/>
+        </w:rPr>
+        <w:t>Prisgrunnlag (</w:t>
       </w:r>
       <w:proofErr w:type="spellStart"/>
       <w:r>
@@ -3788,9 +4596,52 @@
           <w:rFonts w:ascii="Verdana" w:hAnsi="Verdana" w:cs="Arial"/>
           <w:sz w:val="18"/>
           <w:szCs w:val="18"/>
+        </w:rPr>
+        <w:t>stykklister</w:t>
+      </w:r>
+      <w:proofErr w:type="spellEnd"/>
+      <w:r>
+        <w:rPr>
+          <w:rFonts w:ascii="Verdana" w:hAnsi="Verdana" w:cs="Arial"/>
+          <w:sz w:val="18"/>
+          <w:szCs w:val="18"/>
+        </w:rPr>
+        <w:t>, skisser og beskrivelser m.m.) skal kontrolleres og godkjennes før en eventuell bestilling plasseres.</w:t>
+      </w:r>
+    </w:p>
+    <w:p>
+      <w:pPr>
+        <w:rPr>
+          <w:rFonts w:ascii="Verdana" w:hAnsi="Verdana" w:cs="Arial"/>
+          <w:sz w:val="18"/>
+          <w:szCs w:val="18"/>
+        </w:rPr>
+      </w:pPr>
+      <w:r>
+        <w:rPr>
+          <w:rFonts w:ascii="Verdana" w:eastAsia="Times New Roman" w:hAnsi="Verdana" w:cs="Arial"/>
+          <w:sz w:val="18"/>
+          <w:szCs w:val="18"/>
           <w:lang w:eastAsia="en-US"/>
         </w:rPr>
-        <w:t>byggstrøm</w:t>
+        <w:t>BUSBAR / MCS</w:t>
+      </w:r>
+      <w:r>
+        <w:rPr>
+          <w:rFonts w:ascii="Verdana" w:hAnsi="Verdana" w:cs="Arial"/>
+          <w:sz w:val="18"/>
+          <w:szCs w:val="18"/>
+        </w:rPr>
+        <w:t xml:space="preserve"> sine leveringsbetingelser er iht. siste utgave av </w:t>
+      </w:r>
+      <w:proofErr w:type="spellStart"/>
+      <w:r>
+        <w:rPr>
+          <w:rFonts w:ascii="Verdana" w:hAnsi="Verdana" w:cs="Arial"/>
+          <w:sz w:val="18"/>
+          <w:szCs w:val="18"/>
+        </w:rPr>
+        <w:t>Incoterm</w:t>
       </w:r>
       <w:proofErr w:type="spellEnd"/>
       <w:r>
@@ -3798,358 +4649,107 @@
           <w:rFonts w:ascii="Verdana" w:hAnsi="Verdana" w:cs="Arial"/>
           <w:sz w:val="18"/>
           <w:szCs w:val="18"/>
+        </w:rPr>
+        <w:t xml:space="preserve"> sine betingelser.</w:t>
+      </w:r>
+      <w:r>
+        <w:rPr>
+          <w:rFonts w:ascii="Verdana" w:hAnsi="Verdana" w:cs="Arial"/>
+          <w:sz w:val="18"/>
+          <w:szCs w:val="18"/>
+        </w:rPr>
+        <w:br/>
+      </w:r>
+      <w:r>
+        <w:rPr>
+          <w:rFonts w:ascii="Verdana" w:eastAsia="Times New Roman" w:hAnsi="Verdana" w:cs="Arial"/>
+          <w:sz w:val="18"/>
+          <w:szCs w:val="18"/>
           <w:lang w:eastAsia="en-US"/>
         </w:rPr>
-        <w:t xml:space="preserve"> og tilstrekkelig lys. </w:t>
-      </w:r>
-    </w:p>
-    <w:p>
-      <w:pPr>
-        <w:pStyle w:val="Listeavsnitt"/>
-        <w:numPr>
-          <w:ilvl w:val="0"/>
-          <w:numId w:val="11"/>
-        </w:numPr>
-        <w:rPr>
-          <w:rFonts w:ascii="Verdana" w:hAnsi="Verdana" w:cs="Arial"/>
-          <w:sz w:val="18"/>
-          <w:szCs w:val="18"/>
-          <w:lang w:eastAsia="en-US"/>
-        </w:rPr>
-      </w:pPr>
-      <w:r>
-        <w:rPr>
-          <w:rFonts w:ascii="Verdana" w:hAnsi="Verdana" w:cs="Arial"/>
-          <w:sz w:val="18"/>
-          <w:szCs w:val="18"/>
-          <w:lang w:eastAsia="en-US"/>
-        </w:rPr>
-        <w:t xml:space="preserve">Over 3,0 meter høyde må oppdragsgiver beregne leie av stillas / lift. </w:t>
-      </w:r>
-    </w:p>
-    <w:p>
-      <w:pPr>
-        <w:pStyle w:val="Listeavsnitt"/>
-        <w:numPr>
-          <w:ilvl w:val="0"/>
-          <w:numId w:val="11"/>
-        </w:numPr>
-        <w:rPr>
-          <w:rFonts w:ascii="Verdana" w:hAnsi="Verdana" w:cs="Arial"/>
-          <w:sz w:val="18"/>
-          <w:szCs w:val="18"/>
-          <w:lang w:eastAsia="en-US"/>
-        </w:rPr>
-      </w:pPr>
-      <w:r>
-        <w:rPr>
-          <w:rFonts w:ascii="Verdana" w:hAnsi="Verdana" w:cs="Arial"/>
-          <w:sz w:val="18"/>
-          <w:szCs w:val="18"/>
-          <w:lang w:eastAsia="en-US"/>
-        </w:rPr>
-        <w:t xml:space="preserve">Demontering av eksisterende skinne er ikke inkludert i prisen. </w:t>
-      </w:r>
-    </w:p>
-    <w:p>
-      <w:pPr>
-        <w:pStyle w:val="Listeavsnitt"/>
-        <w:numPr>
-          <w:ilvl w:val="0"/>
-          <w:numId w:val="11"/>
-        </w:numPr>
-        <w:rPr>
-          <w:rFonts w:ascii="Verdana" w:hAnsi="Verdana" w:cs="Arial"/>
-          <w:sz w:val="18"/>
-          <w:szCs w:val="18"/>
-          <w:lang w:eastAsia="en-US"/>
-        </w:rPr>
-      </w:pPr>
-      <w:r>
-        <w:rPr>
-          <w:rFonts w:ascii="Verdana" w:hAnsi="Verdana" w:cs="Arial"/>
-          <w:sz w:val="18"/>
-          <w:szCs w:val="18"/>
-          <w:lang w:eastAsia="en-US"/>
-        </w:rPr>
-        <w:t xml:space="preserve">Hulltaking i sikringsskap, vegger og tak er ikke inkludert i prisen. </w:t>
-      </w:r>
-    </w:p>
-    <w:p>
-      <w:pPr>
-        <w:pStyle w:val="Listeavsnitt"/>
-        <w:numPr>
-          <w:ilvl w:val="0"/>
-          <w:numId w:val="11"/>
-        </w:numPr>
-        <w:rPr>
-          <w:rFonts w:ascii="Verdana" w:hAnsi="Verdana" w:cs="Arial"/>
-          <w:sz w:val="18"/>
-          <w:szCs w:val="18"/>
-          <w:lang w:eastAsia="en-US"/>
-        </w:rPr>
-      </w:pPr>
-      <w:r>
-        <w:rPr>
-          <w:rFonts w:ascii="Verdana" w:hAnsi="Verdana" w:cs="Arial"/>
-          <w:sz w:val="18"/>
-          <w:szCs w:val="18"/>
-          <w:lang w:eastAsia="en-US"/>
-        </w:rPr>
-        <w:t>Jording av utsatte deler og branntetting er ikke inkludert i prisen.</w:t>
-      </w:r>
-    </w:p>
-    <w:p>
-      <w:pPr>
-        <w:spacing w:after="0" w:line="240" w:lineRule="auto"/>
-        <w:rPr>
-          <w:rFonts w:ascii="Verdana" w:eastAsia="Times New Roman" w:hAnsi="Verdana" w:cs="Arial"/>
-          <w:sz w:val="18"/>
-          <w:szCs w:val="18"/>
-          <w:lang w:eastAsia="en-US"/>
-        </w:rPr>
-      </w:pPr>
-      <w:r>
-        <w:rPr>
-          <w:rFonts w:ascii="Verdana" w:eastAsia="Times New Roman" w:hAnsi="Verdana" w:cs="Arial"/>
-          <w:sz w:val="18"/>
-          <w:szCs w:val="18"/>
-          <w:lang w:eastAsia="en-US"/>
-        </w:rPr>
-        <w:tab/>
-      </w:r>
-    </w:p>
-    <w:p>
-      <w:pPr>
-        <w:spacing w:after="0" w:line="240" w:lineRule="auto"/>
-        <w:rPr>
-          <w:rFonts w:ascii="Verdana" w:eastAsia="Times New Roman" w:hAnsi="Verdana" w:cs="Arial"/>
-          <w:sz w:val="18"/>
-          <w:szCs w:val="18"/>
-          <w:lang w:eastAsia="en-US"/>
-        </w:rPr>
-      </w:pPr>
-      <w:r>
-        <w:rPr>
-          <w:rFonts w:ascii="Verdana" w:eastAsia="Times New Roman" w:hAnsi="Verdana" w:cs="Arial"/>
-          <w:sz w:val="18"/>
-          <w:szCs w:val="18"/>
-          <w:lang w:eastAsia="en-US"/>
-        </w:rPr>
-        <w:t xml:space="preserve">Oppdragsgiver er ansvarlig for at strømskinnene blir losset og lagret under tak i nærheten av montasje stedet. Hvis det oppstår forsinkelser på byggeplassen utenfor </w:t>
-      </w:r>
-      <w:r>
-        <w:rPr>
-          <w:rFonts w:ascii="Verdana" w:eastAsia="Times New Roman" w:hAnsi="Verdana" w:cs="Arial"/>
-          <w:sz w:val="18"/>
-          <w:szCs w:val="18"/>
-          <w:lang w:eastAsia="en-US"/>
-        </w:rPr>
         <w:t>BUSBAR / MCS</w:t>
       </w:r>
       <w:r>
         <w:rPr>
-          <w:rFonts w:ascii="Verdana" w:eastAsia="Times New Roman" w:hAnsi="Verdana" w:cs="Arial"/>
-          <w:sz w:val="18"/>
-          <w:szCs w:val="18"/>
-          <w:lang w:eastAsia="en-US"/>
-        </w:rPr>
-        <w:t xml:space="preserve"> sin kontroll under montasjeprosessen eller endringer av opprinnelig strømskinne løsning faktureres dette fortløpende i henhold til </w:t>
-      </w:r>
-      <w:r>
-        <w:rPr>
-          <w:rFonts w:ascii="Verdana" w:eastAsia="Times New Roman" w:hAnsi="Verdana" w:cs="Arial"/>
-          <w:sz w:val="18"/>
-          <w:szCs w:val="18"/>
-          <w:lang w:eastAsia="en-US"/>
-        </w:rPr>
-        <w:t>BUSBAR / MCS</w:t>
-      </w:r>
-      <w:r>
-        <w:rPr>
-          <w:rFonts w:ascii="Verdana" w:eastAsia="Times New Roman" w:hAnsi="Verdana" w:cs="Arial"/>
-          <w:sz w:val="18"/>
-          <w:szCs w:val="18"/>
-          <w:lang w:eastAsia="en-US"/>
-        </w:rPr>
-        <w:t xml:space="preserve"> sine generelle salgsbetingelser og prisliste.</w:t>
-      </w:r>
-      <w:r>
+          <w:rFonts w:ascii="Verdana" w:hAnsi="Verdana" w:cs="Arial"/>
+          <w:sz w:val="18"/>
+          <w:szCs w:val="18"/>
+        </w:rPr>
         <w:t xml:space="preserve"> </w:t>
       </w:r>
       <w:r>
         <w:rPr>
-          <w:rFonts w:ascii="Verdana" w:eastAsia="Times New Roman" w:hAnsi="Verdana" w:cs="Arial"/>
-          <w:sz w:val="18"/>
-          <w:szCs w:val="18"/>
-          <w:lang w:eastAsia="en-US"/>
-        </w:rPr>
-        <w:t>Generell garantitid er 12 måneder fra overlevering til oppdragsgiver. Ansvar er begrenset til utbedring av feil eller mangler.</w:t>
-      </w:r>
-      <w:r>
-        <w:rPr>
-          <w:rFonts w:ascii="Verdana" w:eastAsia="Times New Roman" w:hAnsi="Verdana" w:cs="Arial"/>
-          <w:sz w:val="18"/>
-          <w:szCs w:val="18"/>
-          <w:lang w:eastAsia="en-US"/>
-        </w:rPr>
-        <w:t xml:space="preserve"> </w:t>
-      </w:r>
-    </w:p>
-    <w:p>
-      <w:pPr>
-        <w:rPr>
-          <w:rFonts w:ascii="Verdana" w:hAnsi="Verdana" w:cs="Arial"/>
-          <w:sz w:val="18"/>
-          <w:szCs w:val="18"/>
-        </w:rPr>
-      </w:pPr>
-    </w:p>
-    <w:p>
-      <w:pPr>
-        <w:rPr>
-          <w:rFonts w:ascii="Verdana" w:hAnsi="Verdana" w:cs="Arial"/>
-          <w:sz w:val="18"/>
-          <w:szCs w:val="18"/>
-        </w:rPr>
-      </w:pPr>
-      <w:r>
-        <w:rPr>
-          <w:rFonts w:ascii="Verdana" w:hAnsi="Verdana" w:cs="Arial"/>
-          <w:sz w:val="18"/>
-          <w:szCs w:val="18"/>
-        </w:rPr>
-        <w:t>Vi gjør oppmerksom på, at hvis kortslutningsnivå ikke er kjent, kan dette ha påvirkning på valg av vern</w:t>
-      </w:r>
-      <w:r>
-        <w:rPr>
-          <w:rFonts w:ascii="Verdana" w:hAnsi="Verdana" w:cs="Arial"/>
-          <w:sz w:val="18"/>
-          <w:szCs w:val="18"/>
-        </w:rPr>
-        <w:t>/strømskinne</w:t>
-      </w:r>
-      <w:r>
-        <w:rPr>
-          <w:rFonts w:ascii="Verdana" w:hAnsi="Verdana" w:cs="Arial"/>
-          <w:sz w:val="18"/>
-          <w:szCs w:val="18"/>
-        </w:rPr>
-        <w:t xml:space="preserve"> og dertil pris.</w:t>
-      </w:r>
-    </w:p>
-    <w:p>
-      <w:pPr>
-        <w:rPr>
-          <w:rFonts w:ascii="Verdana" w:hAnsi="Verdana" w:cs="Arial"/>
-          <w:sz w:val="18"/>
-          <w:szCs w:val="18"/>
-        </w:rPr>
-      </w:pPr>
-      <w:r>
-        <w:rPr>
-          <w:rFonts w:ascii="Verdana" w:hAnsi="Verdana" w:cs="Arial"/>
-          <w:sz w:val="18"/>
-          <w:szCs w:val="18"/>
-        </w:rPr>
-        <w:t xml:space="preserve">Ved feil og/eller mangler i mottatt underlag, eller endring av opprinnelig spesifikasjon/underlag, må en priskonsekvens </w:t>
-      </w:r>
-      <w:proofErr w:type="gramStart"/>
-      <w:r>
-        <w:rPr>
-          <w:rFonts w:ascii="Verdana" w:hAnsi="Verdana" w:cs="Arial"/>
-          <w:sz w:val="18"/>
-          <w:szCs w:val="18"/>
-        </w:rPr>
-        <w:t>påregnes</w:t>
-      </w:r>
-      <w:proofErr w:type="gramEnd"/>
-      <w:r>
-        <w:rPr>
-          <w:rFonts w:ascii="Verdana" w:hAnsi="Verdana" w:cs="Arial"/>
-          <w:sz w:val="18"/>
-          <w:szCs w:val="18"/>
-        </w:rPr>
-        <w:t>.</w:t>
-      </w:r>
-    </w:p>
-    <w:p>
-      <w:pPr>
-        <w:rPr>
-          <w:rFonts w:ascii="Verdana" w:hAnsi="Verdana" w:cs="Arial"/>
-          <w:sz w:val="18"/>
-          <w:szCs w:val="18"/>
-        </w:rPr>
-      </w:pPr>
-      <w:r>
-        <w:rPr>
-          <w:rFonts w:ascii="Verdana" w:hAnsi="Verdana" w:cs="Arial"/>
-          <w:sz w:val="18"/>
-          <w:szCs w:val="18"/>
-        </w:rPr>
-        <w:t>Prisgrunnlag (</w:t>
-      </w:r>
-      <w:proofErr w:type="spellStart"/>
-      <w:r>
-        <w:rPr>
-          <w:rFonts w:ascii="Verdana" w:hAnsi="Verdana" w:cs="Arial"/>
-          <w:sz w:val="18"/>
-          <w:szCs w:val="18"/>
-        </w:rPr>
-        <w:t>stykklister</w:t>
-      </w:r>
-      <w:proofErr w:type="spellEnd"/>
-      <w:r>
-        <w:rPr>
-          <w:rFonts w:ascii="Verdana" w:hAnsi="Verdana" w:cs="Arial"/>
-          <w:sz w:val="18"/>
-          <w:szCs w:val="18"/>
-        </w:rPr>
-        <w:t>, skisser og beskrivelser m.m.) skal kontrolleres og godkjennes før en eventuell bestilling plasseres.</w:t>
-      </w:r>
-    </w:p>
-    <w:p>
-      <w:pPr>
-        <w:rPr>
-          <w:rFonts w:ascii="Verdana" w:hAnsi="Verdana" w:cs="Arial"/>
-          <w:sz w:val="18"/>
-          <w:szCs w:val="18"/>
-        </w:rPr>
-      </w:pPr>
-      <w:r>
-        <w:rPr>
-          <w:rFonts w:ascii="Verdana" w:eastAsia="Times New Roman" w:hAnsi="Verdana" w:cs="Arial"/>
-          <w:sz w:val="18"/>
-          <w:szCs w:val="18"/>
-          <w:lang w:eastAsia="en-US"/>
-        </w:rPr>
-        <w:t>BUSBAR / MCS</w:t>
-      </w:r>
-      <w:r>
-        <w:rPr>
-          <w:rFonts w:ascii="Verdana" w:hAnsi="Verdana" w:cs="Arial"/>
-          <w:sz w:val="18"/>
-          <w:szCs w:val="18"/>
-        </w:rPr>
-        <w:t xml:space="preserve"> sine leveringsbetingelser er iht. siste utgave av </w:t>
-      </w:r>
-      <w:proofErr w:type="spellStart"/>
-      <w:r>
-        <w:rPr>
-          <w:rFonts w:ascii="Verdana" w:hAnsi="Verdana" w:cs="Arial"/>
-          <w:sz w:val="18"/>
-          <w:szCs w:val="18"/>
-        </w:rPr>
-        <w:t>Incoterm</w:t>
-      </w:r>
-      <w:proofErr w:type="spellEnd"/>
-      <w:r>
-        <w:rPr>
-          <w:rFonts w:ascii="Verdana" w:hAnsi="Verdana" w:cs="Arial"/>
-          <w:sz w:val="18"/>
-          <w:szCs w:val="18"/>
-        </w:rPr>
-        <w:t xml:space="preserve"> sine betingelser.</w:t>
+          <w:rFonts w:ascii="Verdana" w:hAnsi="Verdana" w:cs="Arial"/>
+          <w:sz w:val="18"/>
+          <w:szCs w:val="18"/>
+        </w:rPr>
+        <w:t>leverer normalt EXW – Ex Works.</w:t>
+      </w:r>
+    </w:p>
+    <w:p>
+      <w:pPr>
+        <w:rPr>
+          <w:rFonts w:ascii="Verdana" w:hAnsi="Verdana" w:cs="Arial"/>
+          <w:sz w:val="18"/>
+          <w:szCs w:val="18"/>
+        </w:rPr>
+      </w:pPr>
+      <w:r>
+        <w:rPr>
+          <w:rFonts w:ascii="Verdana" w:hAnsi="Verdana" w:cs="Arial"/>
+          <w:sz w:val="18"/>
+          <w:szCs w:val="18"/>
+        </w:rPr>
+        <w:t xml:space="preserve">I de tilfeller fraktkostnader </w:t>
+      </w:r>
+      <w:r>
+        <w:rPr>
+          <w:rFonts w:ascii="Verdana" w:hAnsi="Verdana" w:cs="Arial"/>
+          <w:sz w:val="18"/>
+          <w:szCs w:val="18"/>
+        </w:rPr>
+        <w:t>er</w:t>
+      </w:r>
+      <w:r>
+        <w:rPr>
+          <w:rFonts w:ascii="Verdana" w:hAnsi="Verdana" w:cs="Arial"/>
+          <w:sz w:val="18"/>
+          <w:szCs w:val="18"/>
+        </w:rPr>
+        <w:t xml:space="preserve"> inkludert i tilbudet, benyttes rimeligste fraktalternativ. Ved eventuelle tilleggskrav (f.eks. klimanøytral leveranse, kran, kundespesifiserte krav o.l. som ikke kommer tydelig fram i forespørsel) faktureres dette etterskuddsvis.</w:t>
+      </w:r>
+    </w:p>
+    <w:p>
+      <w:pPr>
+        <w:rPr>
+          <w:rFonts w:ascii="Verdana" w:hAnsi="Verdana" w:cs="Arial"/>
+          <w:sz w:val="18"/>
+          <w:szCs w:val="18"/>
+        </w:rPr>
+      </w:pPr>
+      <w:r>
+        <w:rPr>
+          <w:rFonts w:ascii="Verdana" w:hAnsi="Verdana" w:cs="Arial"/>
+          <w:sz w:val="18"/>
+          <w:szCs w:val="18"/>
+        </w:rPr>
+        <w:t xml:space="preserve">Standard betalingsbetingelser: </w:t>
+      </w:r>
+      <w:r>
+        <w:rPr>
+          <w:rFonts w:ascii="Verdana" w:hAnsi="Verdana" w:cs="Arial"/>
+          <w:sz w:val="18"/>
+          <w:szCs w:val="18"/>
+        </w:rPr>
+        <w:t>3</w:t>
+      </w:r>
+      <w:r>
+        <w:rPr>
+          <w:rFonts w:ascii="Verdana" w:hAnsi="Verdana" w:cs="Arial"/>
+          <w:sz w:val="18"/>
+          <w:szCs w:val="18"/>
+        </w:rPr>
+        <w:t>0 dager</w:t>
       </w:r>
       <w:r>
         <w:rPr>
@@ -4158,130 +4758,24 @@
           <w:szCs w:val="18"/>
         </w:rPr>
         <w:br/>
-      </w:r>
-      <w:r>
-        <w:rPr>
-          <w:rFonts w:ascii="Verdana" w:eastAsia="Times New Roman" w:hAnsi="Verdana" w:cs="Arial"/>
-          <w:sz w:val="18"/>
-          <w:szCs w:val="18"/>
-          <w:lang w:eastAsia="en-US"/>
-        </w:rPr>
-        <w:t>BUSBAR / MCS</w:t>
-      </w:r>
-      <w:r>
-        <w:rPr>
-          <w:rFonts w:ascii="Verdana" w:hAnsi="Verdana" w:cs="Arial"/>
-          <w:sz w:val="18"/>
-          <w:szCs w:val="18"/>
-        </w:rPr>
-        <w:t xml:space="preserve"> </w:t>
-      </w:r>
-      <w:r>
-        <w:rPr>
-          <w:rFonts w:ascii="Verdana" w:hAnsi="Verdana" w:cs="Arial"/>
-          <w:sz w:val="18"/>
-          <w:szCs w:val="18"/>
-        </w:rPr>
-        <w:t>leverer normalt EXW – Ex Works.</w:t>
-      </w:r>
-    </w:p>
-    <w:p>
-      <w:pPr>
-        <w:rPr>
-          <w:rFonts w:ascii="Verdana" w:hAnsi="Verdana" w:cs="Arial"/>
-          <w:sz w:val="18"/>
-          <w:szCs w:val="18"/>
-        </w:rPr>
-      </w:pPr>
-      <w:r>
-        <w:rPr>
-          <w:rFonts w:ascii="Verdana" w:hAnsi="Verdana" w:cs="Arial"/>
-          <w:sz w:val="18"/>
-          <w:szCs w:val="18"/>
-        </w:rPr>
-        <w:t xml:space="preserve">I de tilfeller fraktkostnader </w:t>
-      </w:r>
-      <w:r>
-        <w:rPr>
-          <w:rFonts w:ascii="Verdana" w:hAnsi="Verdana" w:cs="Arial"/>
-          <w:sz w:val="18"/>
-          <w:szCs w:val="18"/>
-        </w:rPr>
-        <w:t>er</w:t>
-      </w:r>
-      <w:r>
-        <w:rPr>
-          <w:rFonts w:ascii="Verdana" w:hAnsi="Verdana" w:cs="Arial"/>
-          <w:sz w:val="18"/>
-          <w:szCs w:val="18"/>
-        </w:rPr>
-        <w:t xml:space="preserve"> inkludert i tilbudet, benyttes rimeligste fraktalternativ. Ved eventuelle tilleggskrav (f.eks. klimanøytral leveranse, kran, kundespesifiserte krav o.l. som ikke kommer tydelig fram i forespørsel) faktureres dette etterskuddsvis.</w:t>
-      </w:r>
-    </w:p>
-    <w:p>
-      <w:pPr>
-        <w:rPr>
-          <w:rFonts w:ascii="Verdana" w:hAnsi="Verdana" w:cs="Arial"/>
-          <w:sz w:val="18"/>
-          <w:szCs w:val="18"/>
-        </w:rPr>
-      </w:pPr>
-      <w:r>
-        <w:rPr>
-          <w:rFonts w:ascii="Verdana" w:hAnsi="Verdana" w:cs="Arial"/>
-          <w:sz w:val="18"/>
-          <w:szCs w:val="18"/>
-        </w:rPr>
-        <w:t xml:space="preserve">Standard betalingsbetingelser: </w:t>
-      </w:r>
-      <w:r>
-        <w:rPr>
-          <w:rFonts w:ascii="Verdana" w:hAnsi="Verdana" w:cs="Arial"/>
-          <w:sz w:val="18"/>
-          <w:szCs w:val="18"/>
-        </w:rPr>
-        <w:t>3</w:t>
-      </w:r>
-      <w:r>
-        <w:rPr>
-          <w:rFonts w:ascii="Verdana" w:hAnsi="Verdana" w:cs="Arial"/>
-          <w:sz w:val="18"/>
-          <w:szCs w:val="18"/>
-        </w:rPr>
-        <w:t>0 dager</w:t>
-      </w:r>
-    </w:p>
-    <w:p>
-      <w:pPr>
-        <w:rPr>
-          <w:rFonts w:ascii="Verdana" w:hAnsi="Verdana" w:cs="Arial"/>
-          <w:sz w:val="18"/>
-          <w:szCs w:val="18"/>
-        </w:rPr>
-      </w:pPr>
-      <w:r>
-        <w:rPr>
-          <w:rFonts w:ascii="Verdana" w:hAnsi="Verdana" w:cs="Arial"/>
-          <w:sz w:val="18"/>
-          <w:szCs w:val="18"/>
-        </w:rPr>
-        <w:t xml:space="preserve">Prisene er basert på dagens valuta / EUR, USD ut </w:t>
-      </w:r>
-      <w:r>
-        <w:rPr>
-          <w:rFonts w:ascii="Verdana" w:hAnsi="Verdana" w:cs="Arial"/>
-          <w:sz w:val="18"/>
-          <w:szCs w:val="18"/>
-        </w:rPr>
-        <w:t>ifra</w:t>
-      </w:r>
-      <w:r>
-        <w:rPr>
-          <w:rFonts w:ascii="Verdana" w:hAnsi="Verdana" w:cs="Arial"/>
-          <w:sz w:val="18"/>
-          <w:szCs w:val="18"/>
-        </w:rPr>
-        <w:t xml:space="preserve"> hvilket produkt som leveres.</w:t>
+        <w:t>Tilbudet er gyldig i 30 dager</w:t>
+      </w:r>
+    </w:p>
+    <w:p>
+      <w:pPr>
+        <w:rPr>
+          <w:rFonts w:ascii="Verdana" w:hAnsi="Verdana" w:cs="Arial"/>
+          <w:sz w:val="18"/>
+          <w:szCs w:val="18"/>
+        </w:rPr>
+      </w:pPr>
+      <w:r>
+        <w:rPr>
+          <w:rFonts w:ascii="Verdana" w:hAnsi="Verdana" w:cs="Arial"/>
+          <w:sz w:val="18"/>
+          <w:szCs w:val="18"/>
+        </w:rPr>
+        <w:t>Prisene er basert på dagens leverandørpriser, tollsatser, råvarepriser og valutakurser. Ved endringer i disse forutsetninger forbeholder vi oss retten til å justere våre priser tilsvarende. Valutakurs beregnes ved fakturering.</w:t>
       </w:r>
     </w:p>
     <w:p>
@@ -4411,6 +4905,7 @@
           <w:sz w:val="18"/>
           <w:szCs w:val="18"/>
         </w:rPr>
+        <w:lastRenderedPageBreak/>
         <w:t xml:space="preserve">Underlag fra kunde </w:t>
       </w:r>
     </w:p>
@@ -10761,6 +11256,123 @@
     </w:lvl>
   </w:abstractNum>
   <w:abstractNum w:abstractNumId="10" w15:restartNumberingAfterBreak="0">
+    <w:nsid w:val="5BCA1D34"/>
+    <w:multiLevelType w:val="multilevel"/>
+    <w:tmpl w:val="2AC88F20"/>
+    <w:lvl w:ilvl="0">
+      <w:start w:val="1"/>
+      <w:numFmt w:val="decimal"/>
+      <w:lvlText w:val="%1."/>
+      <w:lvlJc w:val="left"/>
+      <w:pPr>
+        <w:tabs>
+          <w:tab w:val="num" w:pos="720"/>
+        </w:tabs>
+        <w:ind w:left="720" w:hanging="360"/>
+      </w:pPr>
+    </w:lvl>
+    <w:lvl w:ilvl="1">
+      <w:start w:val="1"/>
+      <w:numFmt w:val="bullet"/>
+      <w:lvlText w:val="o"/>
+      <w:lvlJc w:val="left"/>
+      <w:pPr>
+        <w:tabs>
+          <w:tab w:val="num" w:pos="1440"/>
+        </w:tabs>
+        <w:ind w:left="1440" w:hanging="360"/>
+      </w:pPr>
+      <w:rPr>
+        <w:rFonts w:ascii="Courier New" w:hAnsi="Courier New" w:cs="Times New Roman" w:hint="default"/>
+        <w:sz w:val="20"/>
+      </w:rPr>
+    </w:lvl>
+    <w:lvl w:ilvl="2">
+      <w:start w:val="1"/>
+      <w:numFmt w:val="decimal"/>
+      <w:lvlText w:val="%3."/>
+      <w:lvlJc w:val="left"/>
+      <w:pPr>
+        <w:tabs>
+          <w:tab w:val="num" w:pos="2160"/>
+        </w:tabs>
+        <w:ind w:left="2160" w:hanging="360"/>
+      </w:pPr>
+    </w:lvl>
+    <w:lvl w:ilvl="3">
+      <w:start w:val="1"/>
+      <w:numFmt w:val="decimal"/>
+      <w:lvlText w:val="%4."/>
+      <w:lvlJc w:val="left"/>
+      <w:pPr>
+        <w:tabs>
+          <w:tab w:val="num" w:pos="2880"/>
+        </w:tabs>
+        <w:ind w:left="2880" w:hanging="360"/>
+      </w:pPr>
+    </w:lvl>
+    <w:lvl w:ilvl="4">
+      <w:start w:val="1"/>
+      <w:numFmt w:val="decimal"/>
+      <w:lvlText w:val="%5."/>
+      <w:lvlJc w:val="left"/>
+      <w:pPr>
+        <w:tabs>
+          <w:tab w:val="num" w:pos="3600"/>
+        </w:tabs>
+        <w:ind w:left="3600" w:hanging="360"/>
+      </w:pPr>
+    </w:lvl>
+    <w:lvl w:ilvl="5">
+      <w:start w:val="1"/>
+      <w:numFmt w:val="decimal"/>
+      <w:lvlText w:val="%6."/>
+      <w:lvlJc w:val="left"/>
+      <w:pPr>
+        <w:tabs>
+          <w:tab w:val="num" w:pos="4320"/>
+        </w:tabs>
+        <w:ind w:left="4320" w:hanging="360"/>
+      </w:pPr>
+    </w:lvl>
+    <w:lvl w:ilvl="6">
+      <w:start w:val="1"/>
+      <w:numFmt w:val="decimal"/>
+      <w:lvlText w:val="%7."/>
+      <w:lvlJc w:val="left"/>
+      <w:pPr>
+        <w:tabs>
+          <w:tab w:val="num" w:pos="5040"/>
+        </w:tabs>
+        <w:ind w:left="5040" w:hanging="360"/>
+      </w:pPr>
+    </w:lvl>
+    <w:lvl w:ilvl="7">
+      <w:start w:val="1"/>
+      <w:numFmt w:val="decimal"/>
+      <w:lvlText w:val="%8."/>
+      <w:lvlJc w:val="left"/>
+      <w:pPr>
+        <w:tabs>
+          <w:tab w:val="num" w:pos="5760"/>
+        </w:tabs>
+        <w:ind w:left="5760" w:hanging="360"/>
+      </w:pPr>
+    </w:lvl>
+    <w:lvl w:ilvl="8">
+      <w:start w:val="1"/>
+      <w:numFmt w:val="decimal"/>
+      <w:lvlText w:val="%9."/>
+      <w:lvlJc w:val="left"/>
+      <w:pPr>
+        <w:tabs>
+          <w:tab w:val="num" w:pos="6480"/>
+        </w:tabs>
+        <w:ind w:left="6480" w:hanging="360"/>
+      </w:pPr>
+    </w:lvl>
+  </w:abstractNum>
+  <w:abstractNum w:abstractNumId="11" w15:restartNumberingAfterBreak="0">
     <w:nsid w:val="74066C03"/>
     <w:multiLevelType w:val="multilevel"/>
     <w:tmpl w:val="FE36E5C8"/>
@@ -10909,7 +11521,7 @@
       </w:rPr>
     </w:lvl>
   </w:abstractNum>
-  <w:abstractNum w:abstractNumId="11" w15:restartNumberingAfterBreak="0">
+  <w:abstractNum w:abstractNumId="12" w15:restartNumberingAfterBreak="0">
     <w:nsid w:val="76C23F2D"/>
     <w:multiLevelType w:val="hybridMultilevel"/>
     <w:tmpl w:val="DBD295A0"/>
@@ -11083,13 +11695,41 @@
     <w:abstractNumId w:val="6"/>
   </w:num>
   <w:num w:numId="12" w16cid:durableId="874074787">
-    <w:abstractNumId w:val="11"/>
+    <w:abstractNumId w:val="12"/>
   </w:num>
   <w:num w:numId="13" w16cid:durableId="1444575619">
-    <w:abstractNumId w:val="10"/>
+    <w:abstractNumId w:val="11"/>
   </w:num>
   <w:num w:numId="14" w16cid:durableId="1979870743">
     <w:abstractNumId w:val="9"/>
+  </w:num>
+  <w:num w:numId="15" w16cid:durableId="483471689">
+    <w:abstractNumId w:val="10"/>
+    <w:lvlOverride w:ilvl="0">
+      <w:startOverride w:val="1"/>
+    </w:lvlOverride>
+    <w:lvlOverride w:ilvl="1"/>
+    <w:lvlOverride w:ilvl="2">
+      <w:startOverride w:val="1"/>
+    </w:lvlOverride>
+    <w:lvlOverride w:ilvl="3">
+      <w:startOverride w:val="1"/>
+    </w:lvlOverride>
+    <w:lvlOverride w:ilvl="4">
+      <w:startOverride w:val="1"/>
+    </w:lvlOverride>
+    <w:lvlOverride w:ilvl="5">
+      <w:startOverride w:val="1"/>
+    </w:lvlOverride>
+    <w:lvlOverride w:ilvl="6">
+      <w:startOverride w:val="1"/>
+    </w:lvlOverride>
+    <w:lvlOverride w:ilvl="7">
+      <w:startOverride w:val="1"/>
+    </w:lvlOverride>
+    <w:lvlOverride w:ilvl="8">
+      <w:startOverride w:val="1"/>
+    </w:lvlOverride>
   </w:num>
 </w:numbering>
 </file>
@@ -11553,7 +12193,6 @@
   <w:style w:type="character" w:default="1" w:styleId="Standardskriftforavsnitt">
     <w:name w:val="Default Paragraph Font"/>
     <w:uiPriority w:val="1"/>
-    <w:semiHidden/>
     <w:unhideWhenUsed/>
   </w:style>
   <w:style w:type="table" w:default="1" w:styleId="Vanligtabell">

</xml_diff>

<commit_message>
Add project archive status workflow
</commit_message>
<xml_diff>
--- a/server/templates/tilbud/tilbud-stromskinner-template.docx
+++ b/server/templates/tilbud/tilbud-stromskinner-template.docx
@@ -3853,25 +3853,7 @@
           <w:lang w:eastAsia="en-US"/>
         </w:rPr>
         <w:br/>
-        <w:t>Busbar er ikke ansvarlig installatør og forbeholder seg retten til å benytte ekstern montasjepartner for utførelse av arbeidet.</w:t>
-      </w:r>
-      <w:r>
-        <w:rPr>
-          <w:rFonts w:ascii="Verdana" w:eastAsia="Times New Roman" w:hAnsi="Verdana" w:cs="Arial"/>
-          <w:sz w:val="18"/>
-          <w:szCs w:val="18"/>
-          <w:lang w:eastAsia="en-US"/>
-        </w:rPr>
-        <w:t xml:space="preserve"> </w:t>
-      </w:r>
-      <w:r>
-        <w:rPr>
-          <w:rFonts w:ascii="Verdana" w:eastAsia="Times New Roman" w:hAnsi="Verdana" w:cs="Arial"/>
-          <w:sz w:val="18"/>
-          <w:szCs w:val="18"/>
-          <w:lang w:eastAsia="en-US"/>
-        </w:rPr>
-        <w:t>Generell garantitid er 12 måneder fra overlevering til oppdragsgiver. Ansvar er begrenset til utbedring av feil eller mangler.</w:t>
+        <w:t>Busbar er ikke ansvarlig installatør og forbeholder seg retten til å benytte ekstern montasjepartner for utførelse av arbeidet. Generell garantitid er 12 måneder fra overlevering til oppdragsgiver. Ansvar er begrenset til utbedring av feil eller mangler.</w:t>
       </w:r>
     </w:p>
     <w:p>
@@ -3936,25 +3918,7 @@
           <w:szCs w:val="18"/>
           <w:lang w:eastAsia="en-US"/>
         </w:rPr>
-        <w:t>F</w:t>
-      </w:r>
-      <w:r>
-        <w:rPr>
-          <w:rFonts w:ascii="Verdana" w:eastAsia="Times New Roman" w:hAnsi="Verdana" w:cs="Arial"/>
-          <w:sz w:val="18"/>
-          <w:szCs w:val="18"/>
-          <w:lang w:eastAsia="en-US"/>
-        </w:rPr>
-        <w:t>ri og uhindret adkomst til montasjeområdet</w:t>
-      </w:r>
-      <w:r>
-        <w:rPr>
-          <w:rFonts w:ascii="Verdana" w:eastAsia="Times New Roman" w:hAnsi="Verdana" w:cs="Arial"/>
-          <w:sz w:val="18"/>
-          <w:szCs w:val="18"/>
-          <w:lang w:eastAsia="en-US"/>
-        </w:rPr>
-        <w:t>.</w:t>
+        <w:t>Fri og uhindret adkomst til montasjeområdet.</w:t>
       </w:r>
     </w:p>
     <w:p>
@@ -3978,8 +3942,9 @@
           <w:szCs w:val="18"/>
           <w:lang w:eastAsia="en-US"/>
         </w:rPr>
-        <w:t>T</w:t>
-      </w:r>
+        <w:t xml:space="preserve">Tilgjengelig </w:t>
+      </w:r>
+      <w:proofErr w:type="spellStart"/>
       <w:r>
         <w:rPr>
           <w:rFonts w:ascii="Verdana" w:eastAsia="Times New Roman" w:hAnsi="Verdana" w:cs="Arial"/>
@@ -3987,9 +3952,9 @@
           <w:szCs w:val="18"/>
           <w:lang w:eastAsia="en-US"/>
         </w:rPr>
-        <w:t xml:space="preserve">ilgjengelig </w:t>
-      </w:r>
-      <w:proofErr w:type="spellStart"/>
+        <w:t>byggstrøm</w:t>
+      </w:r>
+      <w:proofErr w:type="spellEnd"/>
       <w:r>
         <w:rPr>
           <w:rFonts w:ascii="Verdana" w:eastAsia="Times New Roman" w:hAnsi="Verdana" w:cs="Arial"/>
@@ -3997,26 +3962,7 @@
           <w:szCs w:val="18"/>
           <w:lang w:eastAsia="en-US"/>
         </w:rPr>
-        <w:t>byggstrøm</w:t>
-      </w:r>
-      <w:proofErr w:type="spellEnd"/>
-      <w:r>
-        <w:rPr>
-          <w:rFonts w:ascii="Verdana" w:eastAsia="Times New Roman" w:hAnsi="Verdana" w:cs="Arial"/>
-          <w:sz w:val="18"/>
-          <w:szCs w:val="18"/>
-          <w:lang w:eastAsia="en-US"/>
-        </w:rPr>
-        <w:t xml:space="preserve"> på minimum 16A</w:t>
-      </w:r>
-      <w:r>
-        <w:rPr>
-          <w:rFonts w:ascii="Verdana" w:eastAsia="Times New Roman" w:hAnsi="Verdana" w:cs="Arial"/>
-          <w:sz w:val="18"/>
-          <w:szCs w:val="18"/>
-          <w:lang w:eastAsia="en-US"/>
-        </w:rPr>
-        <w:t>.</w:t>
+        <w:t xml:space="preserve"> på minimum 16A.</w:t>
       </w:r>
     </w:p>
     <w:p>
@@ -4040,16 +3986,7 @@
           <w:szCs w:val="18"/>
           <w:lang w:eastAsia="en-US"/>
         </w:rPr>
-        <w:t>T</w:t>
-      </w:r>
-      <w:r>
-        <w:rPr>
-          <w:rFonts w:ascii="Verdana" w:eastAsia="Times New Roman" w:hAnsi="Verdana" w:cs="Arial"/>
-          <w:sz w:val="18"/>
-          <w:szCs w:val="18"/>
-          <w:lang w:eastAsia="en-US"/>
-        </w:rPr>
-        <w:t>ilfredsstillende belysning på arbeidsstedet.</w:t>
+        <w:t>Tilfredsstillende belysning på arbeidsstedet.</w:t>
       </w:r>
     </w:p>
     <w:p>
@@ -4175,25 +4112,7 @@
           <w:szCs w:val="18"/>
           <w:lang w:eastAsia="en-US"/>
         </w:rPr>
-        <w:t>D</w:t>
-      </w:r>
-      <w:r>
-        <w:rPr>
-          <w:rFonts w:ascii="Verdana" w:eastAsia="Times New Roman" w:hAnsi="Verdana" w:cs="Arial"/>
-          <w:sz w:val="18"/>
-          <w:szCs w:val="18"/>
-          <w:lang w:eastAsia="en-US"/>
-        </w:rPr>
-        <w:t>emontering av eksisterende strømskinner eller anleg</w:t>
-      </w:r>
-      <w:r>
-        <w:rPr>
-          <w:rFonts w:ascii="Verdana" w:eastAsia="Times New Roman" w:hAnsi="Verdana" w:cs="Arial"/>
-          <w:sz w:val="18"/>
-          <w:szCs w:val="18"/>
-          <w:lang w:eastAsia="en-US"/>
-        </w:rPr>
-        <w:t>g.</w:t>
+        <w:t>Demontering av eksisterende strømskinner eller anlegg.</w:t>
       </w:r>
     </w:p>
     <w:p>
@@ -4217,16 +4136,7 @@
           <w:szCs w:val="18"/>
           <w:lang w:eastAsia="en-US"/>
         </w:rPr>
-        <w:t>H</w:t>
-      </w:r>
-      <w:r>
-        <w:rPr>
-          <w:rFonts w:ascii="Verdana" w:eastAsia="Times New Roman" w:hAnsi="Verdana" w:cs="Arial"/>
-          <w:sz w:val="18"/>
-          <w:szCs w:val="18"/>
-          <w:lang w:eastAsia="en-US"/>
-        </w:rPr>
-        <w:t xml:space="preserve">ulltaking i sikringsskap, </w:t>
+        <w:t xml:space="preserve">Hulltaking i sikringsskap, </w:t>
       </w:r>
       <w:r>
         <w:rPr>
@@ -4268,25 +4178,7 @@
           <w:szCs w:val="18"/>
           <w:lang w:eastAsia="en-US"/>
         </w:rPr>
-        <w:t>M</w:t>
-      </w:r>
-      <w:r>
-        <w:rPr>
-          <w:rFonts w:ascii="Verdana" w:eastAsia="Times New Roman" w:hAnsi="Verdana" w:cs="Arial"/>
-          <w:sz w:val="18"/>
-          <w:szCs w:val="18"/>
-          <w:lang w:eastAsia="en-US"/>
-        </w:rPr>
-        <w:t>ontering og tilkobling av trafo – tavle- element</w:t>
-      </w:r>
-      <w:r>
-        <w:rPr>
-          <w:rFonts w:ascii="Verdana" w:eastAsia="Times New Roman" w:hAnsi="Verdana" w:cs="Arial"/>
-          <w:sz w:val="18"/>
-          <w:szCs w:val="18"/>
-          <w:lang w:eastAsia="en-US"/>
-        </w:rPr>
-        <w:t>.</w:t>
+        <w:t>Montering og tilkobling av trafo – tavle- element.</w:t>
       </w:r>
     </w:p>
     <w:p>
@@ -4310,25 +4202,7 @@
           <w:szCs w:val="18"/>
           <w:lang w:eastAsia="en-US"/>
         </w:rPr>
-        <w:t>J</w:t>
-      </w:r>
-      <w:r>
-        <w:rPr>
-          <w:rFonts w:ascii="Verdana" w:eastAsia="Times New Roman" w:hAnsi="Verdana" w:cs="Arial"/>
-          <w:sz w:val="18"/>
-          <w:szCs w:val="18"/>
-          <w:lang w:eastAsia="en-US"/>
-        </w:rPr>
-        <w:t>ording av utsatte ledende deler</w:t>
-      </w:r>
-      <w:r>
-        <w:rPr>
-          <w:rFonts w:ascii="Verdana" w:eastAsia="Times New Roman" w:hAnsi="Verdana" w:cs="Arial"/>
-          <w:sz w:val="18"/>
-          <w:szCs w:val="18"/>
-          <w:lang w:eastAsia="en-US"/>
-        </w:rPr>
-        <w:t>.</w:t>
+        <w:t>Jording av utsatte ledende deler.</w:t>
       </w:r>
     </w:p>
     <w:p>
@@ -4352,25 +4226,7 @@
           <w:szCs w:val="18"/>
           <w:lang w:eastAsia="en-US"/>
         </w:rPr>
-        <w:t>B</w:t>
-      </w:r>
-      <w:r>
-        <w:rPr>
-          <w:rFonts w:ascii="Verdana" w:eastAsia="Times New Roman" w:hAnsi="Verdana" w:cs="Arial"/>
-          <w:sz w:val="18"/>
-          <w:szCs w:val="18"/>
-          <w:lang w:eastAsia="en-US"/>
-        </w:rPr>
-        <w:t>ranntetting</w:t>
-      </w:r>
-      <w:r>
-        <w:rPr>
-          <w:rFonts w:ascii="Verdana" w:eastAsia="Times New Roman" w:hAnsi="Verdana" w:cs="Arial"/>
-          <w:sz w:val="18"/>
-          <w:szCs w:val="18"/>
-          <w:lang w:eastAsia="en-US"/>
-        </w:rPr>
-        <w:t xml:space="preserve"> mellom brannelement og vegg/tak/gulv.</w:t>
+        <w:t>Branntetting mellom brannelement og vegg/tak/gulv.</w:t>
       </w:r>
     </w:p>
     <w:p>
@@ -4394,25 +4250,7 @@
           <w:szCs w:val="18"/>
           <w:lang w:eastAsia="en-US"/>
         </w:rPr>
-        <w:t>L</w:t>
-      </w:r>
-      <w:r>
-        <w:rPr>
-          <w:rFonts w:ascii="Verdana" w:eastAsia="Times New Roman" w:hAnsi="Verdana" w:cs="Arial"/>
-          <w:sz w:val="18"/>
-          <w:szCs w:val="18"/>
-          <w:lang w:eastAsia="en-US"/>
-        </w:rPr>
-        <w:t>everanse eller etablering av kulvert</w:t>
-      </w:r>
-      <w:r>
-        <w:rPr>
-          <w:rFonts w:ascii="Verdana" w:eastAsia="Times New Roman" w:hAnsi="Verdana" w:cs="Arial"/>
-          <w:sz w:val="18"/>
-          <w:szCs w:val="18"/>
-          <w:lang w:eastAsia="en-US"/>
-        </w:rPr>
-        <w:t>.</w:t>
+        <w:t>Leveranse eller etablering av kulvert.</w:t>
       </w:r>
     </w:p>
     <w:p>
@@ -12193,6 +12031,7 @@
   <w:style w:type="character" w:default="1" w:styleId="Standardskriftforavsnitt">
     <w:name w:val="Default Paragraph Font"/>
     <w:uiPriority w:val="1"/>
+    <w:semiHidden/>
     <w:unhideWhenUsed/>
   </w:style>
   <w:style w:type="table" w:default="1" w:styleId="Vanligtabell">

</xml_diff>

<commit_message>
Oppdater tilbudsberegning og visning
</commit_message>
<xml_diff>
--- a/server/templates/tilbud/tilbud-stromskinner-template.docx
+++ b/server/templates/tilbud/tilbud-stromskinner-template.docx
@@ -1,6 +1,6 @@
 
 <file path=word/document.xml><?xml version="1.0" encoding="utf-8"?>
-<w:document xmlns:wpc="http://schemas.microsoft.com/office/word/2010/wordprocessingCanvas" xmlns:cx="http://schemas.microsoft.com/office/drawing/2014/chartex" xmlns:cx1="http://schemas.microsoft.com/office/drawing/2015/9/8/chartex" xmlns:cx2="http://schemas.microsoft.com/office/drawing/2015/10/21/chartex" xmlns:cx3="http://schemas.microsoft.com/office/drawing/2016/5/9/chartex" xmlns:cx4="http://schemas.microsoft.com/office/drawing/2016/5/10/chartex" xmlns:cx5="http://schemas.microsoft.com/office/drawing/2016/5/11/chartex" xmlns:cx6="http://schemas.microsoft.com/office/drawing/2016/5/12/chartex" xmlns:cx7="http://schemas.microsoft.com/office/drawing/2016/5/13/chartex" xmlns:cx8="http://schemas.microsoft.com/office/drawing/2016/5/14/chartex" xmlns:mc="http://schemas.openxmlformats.org/markup-compatibility/2006" xmlns:aink="http://schemas.microsoft.com/office/drawing/2016/ink" xmlns:am3d="http://schemas.microsoft.com/office/drawing/2017/model3d" xmlns:o="urn:schemas-microsoft-com:office:office" xmlns:oel="http://schemas.microsoft.com/office/2019/extlst" xmlns:r="http://schemas.openxmlformats.org/officeDocument/2006/relationships" xmlns:m="http://schemas.openxmlformats.org/officeDocument/2006/math" xmlns:v="urn:schemas-microsoft-com:vml" xmlns:wp14="http://schemas.microsoft.com/office/word/2010/wordprocessingDrawing" xmlns:wp="http://schemas.openxmlformats.org/drawingml/2006/wordprocessingDrawing" xmlns:w10="urn:schemas-microsoft-com:office:word" xmlns:w="http://schemas.openxmlformats.org/wordprocessingml/2006/main" xmlns:w14="http://schemas.microsoft.com/office/word/2010/wordml" xmlns:w15="http://schemas.microsoft.com/office/word/2012/wordml" xmlns:w16cex="http://schemas.microsoft.com/office/word/2018/wordml/cex" xmlns:w16cid="http://schemas.microsoft.com/office/word/2016/wordml/cid" xmlns:w16="http://schemas.microsoft.com/office/word/2018/wordml" xmlns:w16du="http://schemas.microsoft.com/office/word/2023/wordml/word16du" xmlns:w16sdtdh="http://schemas.microsoft.com/office/word/2020/wordml/sdtdatahash" xmlns:w16sdtfl="http://schemas.microsoft.com/office/word/2024/wordml/sdtformatlock" xmlns:w16se="http://schemas.microsoft.com/office/word/2015/wordml/symex" xmlns:wpg="http://schemas.microsoft.com/office/word/2010/wordprocessingGroup" xmlns:wpi="http://schemas.microsoft.com/office/word/2010/wordprocessingInk" xmlns:wne="http://schemas.microsoft.com/office/word/2006/wordml" xmlns:wps="http://schemas.microsoft.com/office/word/2010/wordprocessingShape" mc:Ignorable="w14 w15 w16se w16cid w16 w16cex w16sdtdh w16sdtfl w16du wp14">
+<w:document xmlns:wpc="http://schemas.microsoft.com/office/word/2010/wordprocessingCanvas" xmlns:cx="http://schemas.microsoft.com/office/drawing/2014/chartex" xmlns:cx1="http://schemas.microsoft.com/office/drawing/2015/9/8/chartex" xmlns:cx2="http://schemas.microsoft.com/office/drawing/2015/10/21/chartex" xmlns:cx3="http://schemas.microsoft.com/office/drawing/2016/5/9/chartex" xmlns:cx4="http://schemas.microsoft.com/office/drawing/2016/5/10/chartex" xmlns:cx5="http://schemas.microsoft.com/office/drawing/2016/5/11/chartex" xmlns:cx6="http://schemas.microsoft.com/office/drawing/2016/5/12/chartex" xmlns:cx7="http://schemas.microsoft.com/office/drawing/2016/5/13/chartex" xmlns:cx8="http://schemas.microsoft.com/office/drawing/2016/5/14/chartex" xmlns:mc="http://schemas.openxmlformats.org/markup-compatibility/2006" xmlns:aink="http://schemas.microsoft.com/office/drawing/2016/ink" xmlns:am3d="http://schemas.microsoft.com/office/drawing/2017/model3d" xmlns:o="urn:schemas-microsoft-com:office:office" xmlns:oel="http://schemas.microsoft.com/office/2019/extlst" xmlns:r="http://schemas.openxmlformats.org/officeDocument/2006/relationships" xmlns:m="http://schemas.openxmlformats.org/officeDocument/2006/math" xmlns:v="urn:schemas-microsoft-com:vml" xmlns:wp14="http://schemas.microsoft.com/office/word/2010/wordprocessingDrawing" xmlns:wp="http://schemas.openxmlformats.org/drawingml/2006/wordprocessingDrawing" xmlns:w10="urn:schemas-microsoft-com:office:word" xmlns:w="http://schemas.openxmlformats.org/wordprocessingml/2006/main" xmlns:w14="http://schemas.microsoft.com/office/word/2010/wordml" xmlns:w15="http://schemas.microsoft.com/office/word/2012/wordml" xmlns:w16cei="http://schemas.microsoft.com/office/word/2026/wordml/cei" xmlns:w16cex="http://schemas.microsoft.com/office/word/2018/wordml/cex" xmlns:w16cid="http://schemas.microsoft.com/office/word/2016/wordml/cid" xmlns:w16="http://schemas.microsoft.com/office/word/2018/wordml" xmlns:w16du="http://schemas.microsoft.com/office/word/2023/wordml/word16du" xmlns:w16sdtdh="http://schemas.microsoft.com/office/word/2020/wordml/sdtdatahash" xmlns:w16sdtfl="http://schemas.microsoft.com/office/word/2024/wordml/sdtformatlock" xmlns:w16se="http://schemas.microsoft.com/office/word/2015/wordml/symex" xmlns:wpg="http://schemas.microsoft.com/office/word/2010/wordprocessingGroup" xmlns:wpi="http://schemas.microsoft.com/office/word/2010/wordprocessingInk" xmlns:wne="http://schemas.microsoft.com/office/word/2006/wordml" xmlns:wps="http://schemas.microsoft.com/office/word/2010/wordprocessingShape" mc:Ignorable="w14 w15 w16se w16cid w16 w16cex w16sdtdh w16sdtfl w16du wp14">
   <w:body>
     <w:tbl>
       <w:tblPr>
@@ -180,25 +180,7 @@
                 <w:bCs/>
                 <w:sz w:val="20"/>
               </w:rPr>
-              <w:t>{{</w:t>
-            </w:r>
-            <w:proofErr w:type="spellStart"/>
-            <w:r>
-              <w:rPr>
-                <w:rFonts w:cs="Arial"/>
-                <w:bCs/>
-                <w:sz w:val="20"/>
-              </w:rPr>
-              <w:t>tilbud_nr</w:t>
-            </w:r>
-            <w:proofErr w:type="spellEnd"/>
-            <w:r>
-              <w:rPr>
-                <w:rFonts w:cs="Arial"/>
-                <w:bCs/>
-                <w:sz w:val="20"/>
-              </w:rPr>
-              <w:t>}}</w:t>
+              <w:t>{{tilbud_nr}}</w:t>
             </w:r>
           </w:p>
         </w:tc>
@@ -443,27 +425,7 @@
                 <w:sz w:val="20"/>
                 <w:szCs w:val="20"/>
               </w:rPr>
-              <w:t>{{</w:t>
-            </w:r>
-            <w:proofErr w:type="spellStart"/>
-            <w:r>
-              <w:rPr>
-                <w:rFonts w:ascii="Verdana" w:hAnsi="Verdana" w:cs="Calibri"/>
-                <w:color w:val="000000"/>
-                <w:sz w:val="20"/>
-                <w:szCs w:val="20"/>
-              </w:rPr>
-              <w:t>kunde_adresse</w:t>
-            </w:r>
-            <w:proofErr w:type="spellEnd"/>
-            <w:r>
-              <w:rPr>
-                <w:rFonts w:ascii="Verdana" w:hAnsi="Verdana" w:cs="Calibri"/>
-                <w:color w:val="000000"/>
-                <w:sz w:val="20"/>
-                <w:szCs w:val="20"/>
-              </w:rPr>
-              <w:t>}}</w:t>
+              <w:t>{{kunde_adresse}}</w:t>
             </w:r>
           </w:p>
         </w:tc>
@@ -489,65 +451,29 @@
                 <w:szCs w:val="22"/>
                 <w:lang w:val="nb-NO"/>
               </w:rPr>
-              <w:t>{{</w:t>
-            </w:r>
-            <w:proofErr w:type="spellStart"/>
-            <w:r>
+              <w:t>{{bruker_navn}}</w:t>
+            </w:r>
+          </w:p>
+        </w:tc>
+        <w:tc>
+          <w:tcPr>
+            <w:tcW w:w="3577" w:type="dxa"/>
+            <w:vAlign w:val="center"/>
+          </w:tcPr>
+          <w:p>
+            <w:pPr>
+              <w:pStyle w:val="Fillinginheader"/>
               <w:rPr>
                 <w:rFonts w:cs="Arial"/>
                 <w:sz w:val="20"/>
-                <w:szCs w:val="22"/>
-                <w:lang w:val="nb-NO"/>
-              </w:rPr>
-              <w:t>bruker_navn</w:t>
-            </w:r>
-            <w:proofErr w:type="spellEnd"/>
+              </w:rPr>
+            </w:pPr>
             <w:r>
               <w:rPr>
                 <w:rFonts w:cs="Arial"/>
                 <w:sz w:val="20"/>
-                <w:szCs w:val="22"/>
-                <w:lang w:val="nb-NO"/>
-              </w:rPr>
-              <w:t>}}</w:t>
-            </w:r>
-          </w:p>
-        </w:tc>
-        <w:tc>
-          <w:tcPr>
-            <w:tcW w:w="3577" w:type="dxa"/>
-            <w:vAlign w:val="center"/>
-          </w:tcPr>
-          <w:p>
-            <w:pPr>
-              <w:pStyle w:val="Fillinginheader"/>
-              <w:rPr>
-                <w:rFonts w:cs="Arial"/>
-                <w:sz w:val="20"/>
-              </w:rPr>
-            </w:pPr>
-            <w:r>
-              <w:rPr>
-                <w:rFonts w:cs="Arial"/>
-                <w:sz w:val="20"/>
-              </w:rPr>
-              <w:t>{{</w:t>
-            </w:r>
-            <w:proofErr w:type="spellStart"/>
-            <w:r>
-              <w:rPr>
-                <w:rFonts w:cs="Arial"/>
-                <w:sz w:val="20"/>
-              </w:rPr>
-              <w:t>revisjon</w:t>
-            </w:r>
-            <w:proofErr w:type="spellEnd"/>
-            <w:r>
-              <w:rPr>
-                <w:rFonts w:cs="Arial"/>
-                <w:sz w:val="20"/>
-              </w:rPr>
-              <w:t>}}</w:t>
+              </w:rPr>
+              <w:t>{{revisjon}}</w:t>
             </w:r>
           </w:p>
         </w:tc>
@@ -579,27 +505,7 @@
                 <w:sz w:val="20"/>
                 <w:szCs w:val="20"/>
               </w:rPr>
-              <w:t>{{</w:t>
-            </w:r>
-            <w:proofErr w:type="spellStart"/>
-            <w:r>
-              <w:rPr>
-                <w:rFonts w:ascii="Verdana" w:hAnsi="Verdana" w:cs="Calibri"/>
-                <w:color w:val="000000"/>
-                <w:sz w:val="20"/>
-                <w:szCs w:val="20"/>
-              </w:rPr>
-              <w:t>postnummer_sted</w:t>
-            </w:r>
-            <w:proofErr w:type="spellEnd"/>
-            <w:r>
-              <w:rPr>
-                <w:rFonts w:ascii="Verdana" w:hAnsi="Verdana" w:cs="Calibri"/>
-                <w:color w:val="000000"/>
-                <w:sz w:val="20"/>
-                <w:szCs w:val="20"/>
-              </w:rPr>
-              <w:t>}}</w:t>
+              <w:t>{{postnummer_sted}}</w:t>
             </w:r>
           </w:p>
         </w:tc>
@@ -625,19 +531,25 @@
                 <w:szCs w:val="22"/>
                 <w:lang w:val="nb-NO"/>
               </w:rPr>
-              <w:t>{{</w:t>
-            </w:r>
-            <w:proofErr w:type="spellStart"/>
-            <w:r>
+              <w:t>{{bruker_epost}}</w:t>
+            </w:r>
+          </w:p>
+        </w:tc>
+        <w:tc>
+          <w:tcPr>
+            <w:tcW w:w="3577" w:type="dxa"/>
+            <w:vAlign w:val="center"/>
+          </w:tcPr>
+          <w:p>
+            <w:pPr>
+              <w:pStyle w:val="Fillinginheader"/>
               <w:rPr>
                 <w:rFonts w:cs="Arial"/>
                 <w:sz w:val="20"/>
                 <w:szCs w:val="22"/>
                 <w:lang w:val="nb-NO"/>
               </w:rPr>
-              <w:t>bruker_epost</w:t>
-            </w:r>
-            <w:proofErr w:type="spellEnd"/>
+            </w:pPr>
             <w:r>
               <w:rPr>
                 <w:rFonts w:cs="Arial"/>
@@ -645,62 +557,16 @@
                 <w:szCs w:val="22"/>
                 <w:lang w:val="nb-NO"/>
               </w:rPr>
-              <w:t>}}</w:t>
-            </w:r>
-          </w:p>
-        </w:tc>
-        <w:tc>
-          <w:tcPr>
-            <w:tcW w:w="3577" w:type="dxa"/>
-            <w:vAlign w:val="center"/>
-          </w:tcPr>
-          <w:p>
-            <w:pPr>
-              <w:pStyle w:val="Fillinginheader"/>
+              <w:t xml:space="preserve">Tlf.: </w:t>
+            </w:r>
+            <w:r>
               <w:rPr>
                 <w:rFonts w:cs="Arial"/>
                 <w:sz w:val="20"/>
                 <w:szCs w:val="22"/>
                 <w:lang w:val="nb-NO"/>
               </w:rPr>
-            </w:pPr>
-            <w:r>
-              <w:rPr>
-                <w:rFonts w:cs="Arial"/>
-                <w:sz w:val="20"/>
-                <w:szCs w:val="22"/>
-                <w:lang w:val="nb-NO"/>
-              </w:rPr>
-              <w:t xml:space="preserve">Tlf.: </w:t>
-            </w:r>
-            <w:r>
-              <w:rPr>
-                <w:rFonts w:cs="Arial"/>
-                <w:sz w:val="20"/>
-                <w:szCs w:val="22"/>
-                <w:lang w:val="nb-NO"/>
-              </w:rPr>
-              <w:t>{{</w:t>
-            </w:r>
-            <w:proofErr w:type="spellStart"/>
-            <w:r>
-              <w:rPr>
-                <w:rFonts w:cs="Arial"/>
-                <w:sz w:val="20"/>
-                <w:szCs w:val="22"/>
-                <w:lang w:val="nb-NO"/>
-              </w:rPr>
-              <w:t>bruker_telefon</w:t>
-            </w:r>
-            <w:proofErr w:type="spellEnd"/>
-            <w:r>
-              <w:rPr>
-                <w:rFonts w:cs="Arial"/>
-                <w:sz w:val="20"/>
-                <w:szCs w:val="22"/>
-                <w:lang w:val="nb-NO"/>
-              </w:rPr>
-              <w:t>}}</w:t>
+              <w:t>{{bruker_telefon}}</w:t>
             </w:r>
           </w:p>
         </w:tc>
@@ -907,36 +773,18 @@
           <w:sz w:val="20"/>
           <w:szCs w:val="20"/>
         </w:rPr>
-        <w:t>{{</w:t>
-      </w:r>
-      <w:proofErr w:type="spellStart"/>
-      <w:r>
-        <w:rPr>
-          <w:rFonts w:ascii="Verdana" w:hAnsi="Verdana" w:cs="Arial"/>
-          <w:sz w:val="20"/>
-          <w:szCs w:val="20"/>
-        </w:rPr>
-        <w:t>lss</w:t>
-      </w:r>
-      <w:proofErr w:type="spellEnd"/>
-      <w:r>
-        <w:rPr>
-          <w:rFonts w:ascii="Verdana" w:hAnsi="Verdana" w:cs="Arial"/>
-          <w:sz w:val="20"/>
-          <w:szCs w:val="20"/>
-        </w:rPr>
-        <w:t>}}</w:t>
+        <w:t>{{lss}}</w:t>
       </w:r>
     </w:p>
     <w:tbl>
       <w:tblPr>
         <w:tblStyle w:val="Vanligtabell4"/>
-        <w:tblW w:w="0" w:type="auto"/>
+        <w:tblW w:w="10469" w:type="dxa"/>
         <w:tblLook w:val="04A0" w:firstRow="1" w:lastRow="0" w:firstColumn="1" w:lastColumn="0" w:noHBand="0" w:noVBand="1"/>
       </w:tblPr>
       <w:tblGrid>
-        <w:gridCol w:w="6570"/>
-        <w:gridCol w:w="3896"/>
+        <w:gridCol w:w="7661"/>
+        <w:gridCol w:w="2808"/>
       </w:tblGrid>
       <w:tr>
         <w:trPr>
@@ -945,7 +793,7 @@
         <w:tc>
           <w:tcPr>
             <w:cnfStyle w:val="001000000000" w:firstRow="0" w:lastRow="0" w:firstColumn="1" w:lastColumn="0" w:oddVBand="0" w:evenVBand="0" w:oddHBand="0" w:evenHBand="0" w:firstRowFirstColumn="0" w:firstRowLastColumn="0" w:lastRowFirstColumn="0" w:lastRowLastColumn="0"/>
-            <w:tcW w:w="6570" w:type="dxa"/>
+            <w:tcW w:w="7661" w:type="dxa"/>
           </w:tcPr>
           <w:p>
             <w:pPr>
@@ -962,25 +810,7 @@
                 <w:sz w:val="20"/>
                 <w:szCs w:val="20"/>
               </w:rPr>
-              <w:t>Strømskinne – {{</w:t>
-            </w:r>
-            <w:proofErr w:type="spellStart"/>
-            <w:r>
-              <w:rPr>
-                <w:rFonts w:ascii="Verdana" w:hAnsi="Verdana" w:cs="Arial"/>
-                <w:sz w:val="20"/>
-                <w:szCs w:val="20"/>
-              </w:rPr>
-              <w:t>lnr</w:t>
-            </w:r>
-            <w:proofErr w:type="spellEnd"/>
-            <w:r>
-              <w:rPr>
-                <w:rFonts w:ascii="Verdana" w:hAnsi="Verdana" w:cs="Arial"/>
-                <w:sz w:val="20"/>
-                <w:szCs w:val="20"/>
-              </w:rPr>
-              <w:t>}}</w:t>
+              <w:t>Strømskinne – {{lnr}}</w:t>
             </w:r>
           </w:p>
           <w:p>
@@ -1000,7 +830,6 @@
               </w:rPr>
               <w:t>{{</w:t>
             </w:r>
-            <w:proofErr w:type="spellStart"/>
             <w:r>
               <w:rPr>
                 <w:rFonts w:ascii="Verdana" w:hAnsi="Verdana" w:cs="Arial"/>
@@ -1009,8 +838,6 @@
               </w:rPr>
               <w:t>amp</w:t>
             </w:r>
-            <w:proofErr w:type="spellEnd"/>
-            <w:proofErr w:type="gramStart"/>
             <w:r>
               <w:rPr>
                 <w:rFonts w:ascii="Verdana" w:hAnsi="Verdana" w:cs="Arial"/>
@@ -1027,7 +854,6 @@
               </w:rPr>
               <w:t>A</w:t>
             </w:r>
-            <w:proofErr w:type="gramEnd"/>
             <w:r>
               <w:rPr>
                 <w:rFonts w:ascii="Verdana" w:hAnsi="Verdana" w:cs="Arial"/>
@@ -1058,32 +884,33 @@
                 <w:sz w:val="20"/>
                 <w:szCs w:val="20"/>
               </w:rPr>
-              <w:t>{{</w:t>
-            </w:r>
-            <w:proofErr w:type="spellStart"/>
-            <w:r>
+              <w:t>{{ip_grad}}</w:t>
+            </w:r>
+          </w:p>
+        </w:tc>
+        <w:tc>
+          <w:tcPr>
+            <w:tcW w:w="2808" w:type="dxa"/>
+          </w:tcPr>
+          <w:p>
+            <w:pPr>
+              <w:jc w:val="right"/>
+              <w:cnfStyle w:val="100000000000" w:firstRow="1" w:lastRow="0" w:firstColumn="0" w:lastColumn="0" w:oddVBand="0" w:evenVBand="0" w:oddHBand="0" w:evenHBand="0" w:firstRowFirstColumn="0" w:firstRowLastColumn="0" w:lastRowFirstColumn="0" w:lastRowLastColumn="0"/>
               <w:rPr>
                 <w:rFonts w:ascii="Verdana" w:hAnsi="Verdana" w:cs="Arial"/>
                 <w:sz w:val="20"/>
                 <w:szCs w:val="20"/>
               </w:rPr>
-              <w:t>ip_grad</w:t>
-            </w:r>
-            <w:proofErr w:type="spellEnd"/>
+            </w:pPr>
             <w:r>
               <w:rPr>
                 <w:rFonts w:ascii="Verdana" w:hAnsi="Verdana" w:cs="Arial"/>
                 <w:sz w:val="20"/>
                 <w:szCs w:val="20"/>
               </w:rPr>
-              <w:t>}}</w:t>
-            </w:r>
-          </w:p>
-        </w:tc>
-        <w:tc>
-          <w:tcPr>
-            <w:tcW w:w="3896" w:type="dxa"/>
-          </w:tcPr>
+              <w:t>{{offer_total_nok}}</w:t>
+            </w:r>
+          </w:p>
           <w:p>
             <w:pPr>
               <w:jc w:val="right"/>
@@ -1095,40 +922,6 @@
                 <w:szCs w:val="20"/>
               </w:rPr>
             </w:pPr>
-            <w:r>
-              <w:rPr>
-                <w:rFonts w:ascii="Verdana" w:hAnsi="Verdana" w:cs="Arial"/>
-                <w:sz w:val="20"/>
-                <w:szCs w:val="20"/>
-              </w:rPr>
-              <w:t xml:space="preserve">kr. </w:t>
-            </w:r>
-            <w:r>
-              <w:rPr>
-                <w:rFonts w:ascii="Verdana" w:hAnsi="Verdana" w:cs="Arial"/>
-                <w:sz w:val="20"/>
-                <w:szCs w:val="20"/>
-              </w:rPr>
-              <w:t>{{</w:t>
-            </w:r>
-            <w:proofErr w:type="spellStart"/>
-            <w:r>
-              <w:rPr>
-                <w:rFonts w:ascii="Verdana" w:hAnsi="Verdana" w:cs="Arial"/>
-                <w:sz w:val="20"/>
-                <w:szCs w:val="20"/>
-              </w:rPr>
-              <w:t>total_ex_montasje_nok</w:t>
-            </w:r>
-            <w:proofErr w:type="spellEnd"/>
-            <w:r>
-              <w:rPr>
-                <w:rFonts w:ascii="Verdana" w:hAnsi="Verdana" w:cs="Arial"/>
-                <w:sz w:val="20"/>
-                <w:szCs w:val="20"/>
-              </w:rPr>
-              <w:t>}}</w:t>
-            </w:r>
           </w:p>
         </w:tc>
       </w:tr>
@@ -1146,8 +939,7 @@
     <w:tbl>
       <w:tblPr>
         <w:tblStyle w:val="Tabellrutenett"/>
-        <w:tblW w:w="0" w:type="auto"/>
-        <w:tblInd w:w="720" w:type="dxa"/>
+        <w:tblW w:w="10469" w:type="dxa"/>
         <w:tblBorders>
           <w:top w:val="none" w:sz="0" w:space="0" w:color="auto"/>
           <w:left w:val="none" w:sz="0" w:space="0" w:color="auto"/>
@@ -1159,17 +951,17 @@
         <w:tblLook w:val="04A0" w:firstRow="1" w:lastRow="0" w:firstColumn="1" w:lastColumn="0" w:noHBand="0" w:noVBand="1"/>
       </w:tblPr>
       <w:tblGrid>
-        <w:gridCol w:w="6827"/>
-        <w:gridCol w:w="2919"/>
+        <w:gridCol w:w="4997"/>
+        <w:gridCol w:w="2664"/>
+        <w:gridCol w:w="2808"/>
       </w:tblGrid>
       <w:tr>
         <w:tc>
           <w:tcPr>
-            <w:tcW w:w="6930" w:type="dxa"/>
-          </w:tcPr>
-          <w:p>
-            <w:pPr>
-              <w:jc w:val="both"/>
+            <w:tcW w:w="4997" w:type="dxa"/>
+          </w:tcPr>
+          <w:p>
+            <w:pPr>
               <w:rPr>
                 <w:rFonts w:ascii="Verdana" w:hAnsi="Verdana" w:cs="Arial"/>
                 <w:sz w:val="20"/>
@@ -1182,60 +974,17 @@
                 <w:sz w:val="20"/>
                 <w:szCs w:val="20"/>
               </w:rPr>
-              <w:t>{{</w:t>
-            </w:r>
-            <w:proofErr w:type="spellStart"/>
-            <w:r>
-              <w:rPr>
-                <w:rFonts w:ascii="Verdana" w:hAnsi="Verdana" w:cs="Arial"/>
-                <w:sz w:val="20"/>
-                <w:szCs w:val="20"/>
-              </w:rPr>
-              <w:t>mtr</w:t>
-            </w:r>
-            <w:proofErr w:type="spellEnd"/>
-            <w:proofErr w:type="gramStart"/>
-            <w:r>
-              <w:rPr>
-                <w:rFonts w:ascii="Verdana" w:hAnsi="Verdana" w:cs="Arial"/>
-                <w:sz w:val="20"/>
-                <w:szCs w:val="20"/>
-              </w:rPr>
-              <w:t xml:space="preserve">}} </w:t>
-            </w:r>
-            <w:r>
-              <w:rPr>
-                <w:rFonts w:ascii="Verdana" w:hAnsi="Verdana" w:cs="Arial"/>
-                <w:sz w:val="20"/>
-                <w:szCs w:val="20"/>
-              </w:rPr>
-              <w:t xml:space="preserve"> </w:t>
-            </w:r>
-            <w:r>
-              <w:rPr>
-                <w:rFonts w:ascii="Verdana" w:hAnsi="Verdana" w:cs="Arial"/>
-                <w:sz w:val="20"/>
-                <w:szCs w:val="20"/>
-              </w:rPr>
-              <w:t>meter</w:t>
-            </w:r>
-            <w:proofErr w:type="gramEnd"/>
-            <w:r>
-              <w:rPr>
-                <w:rFonts w:ascii="Verdana" w:hAnsi="Verdana" w:cs="Arial"/>
-                <w:sz w:val="20"/>
-                <w:szCs w:val="20"/>
-              </w:rPr>
-              <w:t xml:space="preserve"> total lengde</w:t>
-            </w:r>
-          </w:p>
-        </w:tc>
-        <w:tc>
-          <w:tcPr>
-            <w:tcW w:w="2816" w:type="dxa"/>
-          </w:tcPr>
-          <w:p>
-            <w:pPr>
+              <w:t>{{mtr}}meter total lengde</w:t>
+            </w:r>
+          </w:p>
+        </w:tc>
+        <w:tc>
+          <w:tcPr>
+            <w:tcW w:w="2664" w:type="dxa"/>
+          </w:tcPr>
+          <w:p>
+            <w:pPr>
+              <w:jc w:val="right"/>
               <w:rPr>
                 <w:rFonts w:ascii="Verdana" w:hAnsi="Verdana" w:cs="Arial"/>
                 <w:i/>
@@ -1252,10 +1001,16 @@
                 <w:sz w:val="20"/>
                 <w:szCs w:val="20"/>
               </w:rPr>
-              <w:t>{{</w:t>
-            </w:r>
-            <w:proofErr w:type="spellStart"/>
-            <w:r>
+              <w:t>{{mtr_enhetspris}}</w:t>
+            </w:r>
+          </w:p>
+        </w:tc>
+        <w:tc>
+          <w:tcPr>
+            <w:tcW w:w="2808" w:type="dxa"/>
+          </w:tcPr>
+          <w:p>
+            <w:pPr>
               <w:rPr>
                 <w:rFonts w:ascii="Verdana" w:hAnsi="Verdana" w:cs="Arial"/>
                 <w:i/>
@@ -1263,10 +1018,40 @@
                 <w:sz w:val="20"/>
                 <w:szCs w:val="20"/>
               </w:rPr>
-              <w:t>mtr_enhetspris</w:t>
-            </w:r>
-            <w:proofErr w:type="spellEnd"/>
-            <w:r>
+            </w:pPr>
+          </w:p>
+        </w:tc>
+      </w:tr>
+      <w:tr>
+        <w:tc>
+          <w:tcPr>
+            <w:tcW w:w="4997" w:type="dxa"/>
+          </w:tcPr>
+          <w:p>
+            <w:pPr>
+              <w:rPr>
+                <w:rFonts w:ascii="Verdana" w:hAnsi="Verdana" w:cs="Arial"/>
+                <w:sz w:val="20"/>
+                <w:szCs w:val="20"/>
+              </w:rPr>
+            </w:pPr>
+            <w:r>
+              <w:rPr>
+                <w:rFonts w:ascii="Verdana" w:hAnsi="Verdana" w:cs="Arial"/>
+                <w:sz w:val="20"/>
+                <w:szCs w:val="20"/>
+              </w:rPr>
+              <w:t>{{vvk}}stk. Vertikal vinkel</w:t>
+            </w:r>
+          </w:p>
+        </w:tc>
+        <w:tc>
+          <w:tcPr>
+            <w:tcW w:w="2664" w:type="dxa"/>
+          </w:tcPr>
+          <w:p>
+            <w:pPr>
+              <w:jc w:val="right"/>
               <w:rPr>
                 <w:rFonts w:ascii="Verdana" w:hAnsi="Verdana" w:cs="Arial"/>
                 <w:i/>
@@ -1274,85 +1059,8 @@
                 <w:sz w:val="20"/>
                 <w:szCs w:val="20"/>
               </w:rPr>
-              <w:t>}}</w:t>
-            </w:r>
-          </w:p>
-        </w:tc>
-      </w:tr>
-      <w:tr>
-        <w:tc>
-          <w:tcPr>
-            <w:tcW w:w="6930" w:type="dxa"/>
-          </w:tcPr>
-          <w:p>
-            <w:pPr>
-              <w:jc w:val="both"/>
-              <w:rPr>
-                <w:rFonts w:ascii="Verdana" w:hAnsi="Verdana" w:cs="Arial"/>
-                <w:sz w:val="20"/>
-                <w:szCs w:val="20"/>
-              </w:rPr>
-            </w:pPr>
-            <w:r>
-              <w:rPr>
-                <w:rFonts w:ascii="Verdana" w:hAnsi="Verdana" w:cs="Arial"/>
-                <w:sz w:val="20"/>
-                <w:szCs w:val="20"/>
-              </w:rPr>
-              <w:t>{{</w:t>
-            </w:r>
-            <w:proofErr w:type="spellStart"/>
-            <w:r>
-              <w:rPr>
-                <w:rFonts w:ascii="Verdana" w:hAnsi="Verdana" w:cs="Arial"/>
-                <w:sz w:val="20"/>
-                <w:szCs w:val="20"/>
-              </w:rPr>
-              <w:t>vvk</w:t>
-            </w:r>
-            <w:proofErr w:type="spellEnd"/>
-            <w:proofErr w:type="gramStart"/>
-            <w:r>
-              <w:rPr>
-                <w:rFonts w:ascii="Verdana" w:hAnsi="Verdana" w:cs="Arial"/>
-                <w:sz w:val="20"/>
-                <w:szCs w:val="20"/>
-              </w:rPr>
-              <w:t xml:space="preserve">}} </w:t>
-            </w:r>
-            <w:r>
-              <w:rPr>
-                <w:rFonts w:ascii="Verdana" w:hAnsi="Verdana" w:cs="Arial"/>
-                <w:sz w:val="20"/>
-                <w:szCs w:val="20"/>
-              </w:rPr>
-              <w:t xml:space="preserve"> </w:t>
-            </w:r>
-            <w:r>
-              <w:rPr>
-                <w:rFonts w:ascii="Verdana" w:hAnsi="Verdana" w:cs="Arial"/>
-                <w:sz w:val="20"/>
-                <w:szCs w:val="20"/>
-              </w:rPr>
-              <w:t>stk.</w:t>
-            </w:r>
-            <w:proofErr w:type="gramEnd"/>
-            <w:r>
-              <w:rPr>
-                <w:rFonts w:ascii="Verdana" w:hAnsi="Verdana" w:cs="Arial"/>
-                <w:sz w:val="20"/>
-                <w:szCs w:val="20"/>
-              </w:rPr>
-              <w:t xml:space="preserve"> Vertikal vinkel</w:t>
-            </w:r>
-          </w:p>
-        </w:tc>
-        <w:tc>
-          <w:tcPr>
-            <w:tcW w:w="2816" w:type="dxa"/>
-          </w:tcPr>
-          <w:p>
-            <w:pPr>
+            </w:pPr>
+            <w:r>
               <w:rPr>
                 <w:rFonts w:ascii="Verdana" w:hAnsi="Verdana" w:cs="Arial"/>
                 <w:i/>
@@ -1360,8 +1068,16 @@
                 <w:sz w:val="20"/>
                 <w:szCs w:val="20"/>
               </w:rPr>
-            </w:pPr>
-            <w:r>
+              <w:t>{{vvk_enhetspris}}</w:t>
+            </w:r>
+          </w:p>
+        </w:tc>
+        <w:tc>
+          <w:tcPr>
+            <w:tcW w:w="2808" w:type="dxa"/>
+          </w:tcPr>
+          <w:p>
+            <w:pPr>
               <w:rPr>
                 <w:rFonts w:ascii="Verdana" w:hAnsi="Verdana" w:cs="Arial"/>
                 <w:i/>
@@ -1369,10 +1085,40 @@
                 <w:sz w:val="20"/>
                 <w:szCs w:val="20"/>
               </w:rPr>
-              <w:t>{{</w:t>
-            </w:r>
-            <w:proofErr w:type="spellStart"/>
-            <w:r>
+            </w:pPr>
+          </w:p>
+        </w:tc>
+      </w:tr>
+      <w:tr>
+        <w:tc>
+          <w:tcPr>
+            <w:tcW w:w="4997" w:type="dxa"/>
+          </w:tcPr>
+          <w:p>
+            <w:pPr>
+              <w:rPr>
+                <w:rFonts w:ascii="Verdana" w:hAnsi="Verdana" w:cs="Arial"/>
+                <w:sz w:val="20"/>
+                <w:szCs w:val="20"/>
+              </w:rPr>
+            </w:pPr>
+            <w:r>
+              <w:rPr>
+                <w:rFonts w:ascii="Verdana" w:hAnsi="Verdana" w:cs="Arial"/>
+                <w:sz w:val="20"/>
+                <w:szCs w:val="20"/>
+              </w:rPr>
+              <w:t xml:space="preserve">{{hvk}} stk. Horisontal vinkel </w:t>
+            </w:r>
+          </w:p>
+        </w:tc>
+        <w:tc>
+          <w:tcPr>
+            <w:tcW w:w="2664" w:type="dxa"/>
+          </w:tcPr>
+          <w:p>
+            <w:pPr>
+              <w:jc w:val="right"/>
               <w:rPr>
                 <w:rFonts w:ascii="Verdana" w:hAnsi="Verdana" w:cs="Arial"/>
                 <w:i/>
@@ -1380,9 +1126,7 @@
                 <w:sz w:val="20"/>
                 <w:szCs w:val="20"/>
               </w:rPr>
-              <w:t>vvk_enhetspris</w:t>
-            </w:r>
-            <w:proofErr w:type="spellEnd"/>
+            </w:pPr>
             <w:r>
               <w:rPr>
                 <w:rFonts w:ascii="Verdana" w:hAnsi="Verdana" w:cs="Arial"/>
@@ -1391,56 +1135,13 @@
                 <w:sz w:val="20"/>
                 <w:szCs w:val="20"/>
               </w:rPr>
-              <w:t>}}</w:t>
-            </w:r>
-          </w:p>
-        </w:tc>
-      </w:tr>
-      <w:tr>
-        <w:tc>
-          <w:tcPr>
-            <w:tcW w:w="6930" w:type="dxa"/>
-          </w:tcPr>
-          <w:p>
-            <w:pPr>
-              <w:jc w:val="both"/>
-              <w:rPr>
-                <w:rFonts w:ascii="Verdana" w:hAnsi="Verdana" w:cs="Arial"/>
-                <w:sz w:val="20"/>
-                <w:szCs w:val="20"/>
-              </w:rPr>
-            </w:pPr>
-            <w:r>
-              <w:rPr>
-                <w:rFonts w:ascii="Verdana" w:hAnsi="Verdana" w:cs="Arial"/>
-                <w:sz w:val="20"/>
-                <w:szCs w:val="20"/>
-              </w:rPr>
-              <w:t>{{</w:t>
-            </w:r>
-            <w:proofErr w:type="spellStart"/>
-            <w:r>
-              <w:rPr>
-                <w:rFonts w:ascii="Verdana" w:hAnsi="Verdana" w:cs="Arial"/>
-                <w:sz w:val="20"/>
-                <w:szCs w:val="20"/>
-              </w:rPr>
-              <w:t>hvk</w:t>
-            </w:r>
-            <w:proofErr w:type="spellEnd"/>
-            <w:r>
-              <w:rPr>
-                <w:rFonts w:ascii="Verdana" w:hAnsi="Verdana" w:cs="Arial"/>
-                <w:sz w:val="20"/>
-                <w:szCs w:val="20"/>
-              </w:rPr>
-              <w:t xml:space="preserve">}} stk. Horisontal vinkel </w:t>
-            </w:r>
-          </w:p>
-        </w:tc>
-        <w:tc>
-          <w:tcPr>
-            <w:tcW w:w="2816" w:type="dxa"/>
+              <w:t>{{hvk_enhetspris}}</w:t>
+            </w:r>
+          </w:p>
+        </w:tc>
+        <w:tc>
+          <w:tcPr>
+            <w:tcW w:w="2808" w:type="dxa"/>
           </w:tcPr>
           <w:p>
             <w:pPr>
@@ -1452,7 +1153,39 @@
                 <w:szCs w:val="20"/>
               </w:rPr>
             </w:pPr>
-            <w:r>
+          </w:p>
+        </w:tc>
+      </w:tr>
+      <w:tr>
+        <w:tc>
+          <w:tcPr>
+            <w:tcW w:w="4997" w:type="dxa"/>
+          </w:tcPr>
+          <w:p>
+            <w:pPr>
+              <w:rPr>
+                <w:rFonts w:ascii="Verdana" w:hAnsi="Verdana" w:cs="Arial"/>
+                <w:sz w:val="20"/>
+                <w:szCs w:val="20"/>
+              </w:rPr>
+            </w:pPr>
+            <w:r>
+              <w:rPr>
+                <w:rFonts w:ascii="Verdana" w:hAnsi="Verdana" w:cs="Arial"/>
+                <w:sz w:val="20"/>
+                <w:szCs w:val="20"/>
+              </w:rPr>
+              <w:t>1 stk. {{ste}}</w:t>
+            </w:r>
+          </w:p>
+        </w:tc>
+        <w:tc>
+          <w:tcPr>
+            <w:tcW w:w="2664" w:type="dxa"/>
+          </w:tcPr>
+          <w:p>
+            <w:pPr>
+              <w:jc w:val="right"/>
               <w:rPr>
                 <w:rFonts w:ascii="Verdana" w:hAnsi="Verdana" w:cs="Arial"/>
                 <w:i/>
@@ -1460,9 +1193,7 @@
                 <w:sz w:val="20"/>
                 <w:szCs w:val="20"/>
               </w:rPr>
-              <w:t>{{</w:t>
-            </w:r>
-            <w:proofErr w:type="spellStart"/>
+            </w:pPr>
             <w:r>
               <w:rPr>
                 <w:rFonts w:ascii="Verdana" w:hAnsi="Verdana" w:cs="Arial"/>
@@ -1471,10 +1202,16 @@
                 <w:sz w:val="20"/>
                 <w:szCs w:val="20"/>
               </w:rPr>
-              <w:t>hvk_enhetspris</w:t>
-            </w:r>
-            <w:proofErr w:type="spellEnd"/>
-            <w:r>
+              <w:t>{{ste_enhetspris}}</w:t>
+            </w:r>
+          </w:p>
+        </w:tc>
+        <w:tc>
+          <w:tcPr>
+            <w:tcW w:w="2808" w:type="dxa"/>
+          </w:tcPr>
+          <w:p>
+            <w:pPr>
               <w:rPr>
                 <w:rFonts w:ascii="Verdana" w:hAnsi="Verdana" w:cs="Arial"/>
                 <w:i/>
@@ -1482,19 +1219,17 @@
                 <w:sz w:val="20"/>
                 <w:szCs w:val="20"/>
               </w:rPr>
-              <w:t>}}</w:t>
-            </w:r>
+            </w:pPr>
           </w:p>
         </w:tc>
       </w:tr>
       <w:tr>
         <w:tc>
           <w:tcPr>
-            <w:tcW w:w="6930" w:type="dxa"/>
-          </w:tcPr>
-          <w:p>
-            <w:pPr>
-              <w:jc w:val="both"/>
+            <w:tcW w:w="4997" w:type="dxa"/>
+          </w:tcPr>
+          <w:p>
+            <w:pPr>
               <w:rPr>
                 <w:rFonts w:ascii="Verdana" w:hAnsi="Verdana" w:cs="Arial"/>
                 <w:sz w:val="20"/>
@@ -1507,16 +1242,17 @@
                 <w:sz w:val="20"/>
                 <w:szCs w:val="20"/>
               </w:rPr>
-              <w:t>1 stk. {{ste}}</w:t>
-            </w:r>
-          </w:p>
-        </w:tc>
-        <w:tc>
-          <w:tcPr>
-            <w:tcW w:w="2816" w:type="dxa"/>
-          </w:tcPr>
-          <w:p>
-            <w:pPr>
+              <w:t>1 stk. {{sle}}</w:t>
+            </w:r>
+          </w:p>
+        </w:tc>
+        <w:tc>
+          <w:tcPr>
+            <w:tcW w:w="2664" w:type="dxa"/>
+          </w:tcPr>
+          <w:p>
+            <w:pPr>
+              <w:jc w:val="right"/>
               <w:rPr>
                 <w:rFonts w:ascii="Verdana" w:hAnsi="Verdana" w:cs="Arial"/>
                 <w:i/>
@@ -1533,10 +1269,16 @@
                 <w:sz w:val="20"/>
                 <w:szCs w:val="20"/>
               </w:rPr>
-              <w:t>{{</w:t>
-            </w:r>
-            <w:proofErr w:type="spellStart"/>
-            <w:r>
+              <w:t>{{sle_enhetspris}}</w:t>
+            </w:r>
+          </w:p>
+        </w:tc>
+        <w:tc>
+          <w:tcPr>
+            <w:tcW w:w="2808" w:type="dxa"/>
+          </w:tcPr>
+          <w:p>
+            <w:pPr>
               <w:rPr>
                 <w:rFonts w:ascii="Verdana" w:hAnsi="Verdana" w:cs="Arial"/>
                 <w:i/>
@@ -1544,10 +1286,40 @@
                 <w:sz w:val="20"/>
                 <w:szCs w:val="20"/>
               </w:rPr>
-              <w:t>ste_enhetspris</w:t>
-            </w:r>
-            <w:proofErr w:type="spellEnd"/>
-            <w:r>
+            </w:pPr>
+          </w:p>
+        </w:tc>
+      </w:tr>
+      <w:tr>
+        <w:tc>
+          <w:tcPr>
+            <w:tcW w:w="4997" w:type="dxa"/>
+          </w:tcPr>
+          <w:p>
+            <w:pPr>
+              <w:rPr>
+                <w:rFonts w:ascii="Verdana" w:hAnsi="Verdana" w:cs="Arial"/>
+                <w:sz w:val="20"/>
+                <w:szCs w:val="20"/>
+              </w:rPr>
+            </w:pPr>
+            <w:r>
+              <w:rPr>
+                <w:rFonts w:ascii="Verdana" w:hAnsi="Verdana" w:cs="Arial"/>
+                <w:sz w:val="20"/>
+                <w:szCs w:val="20"/>
+              </w:rPr>
+              <w:t>{{ekspansjonselement}}</w:t>
+            </w:r>
+          </w:p>
+        </w:tc>
+        <w:tc>
+          <w:tcPr>
+            <w:tcW w:w="2664" w:type="dxa"/>
+          </w:tcPr>
+          <w:p>
+            <w:pPr>
+              <w:jc w:val="right"/>
               <w:rPr>
                 <w:rFonts w:ascii="Verdana" w:hAnsi="Verdana" w:cs="Arial"/>
                 <w:i/>
@@ -1555,59 +1327,8 @@
                 <w:sz w:val="20"/>
                 <w:szCs w:val="20"/>
               </w:rPr>
-              <w:t>}}</w:t>
-            </w:r>
-          </w:p>
-        </w:tc>
-      </w:tr>
-      <w:tr>
-        <w:tc>
-          <w:tcPr>
-            <w:tcW w:w="6930" w:type="dxa"/>
-          </w:tcPr>
-          <w:p>
-            <w:pPr>
-              <w:jc w:val="both"/>
-              <w:rPr>
-                <w:rFonts w:ascii="Verdana" w:hAnsi="Verdana" w:cs="Arial"/>
-                <w:sz w:val="20"/>
-                <w:szCs w:val="20"/>
-              </w:rPr>
-            </w:pPr>
-            <w:r>
-              <w:rPr>
-                <w:rFonts w:ascii="Verdana" w:hAnsi="Verdana" w:cs="Arial"/>
-                <w:sz w:val="20"/>
-                <w:szCs w:val="20"/>
-              </w:rPr>
-              <w:t>1 stk. {{</w:t>
-            </w:r>
-            <w:proofErr w:type="spellStart"/>
-            <w:r>
-              <w:rPr>
-                <w:rFonts w:ascii="Verdana" w:hAnsi="Verdana" w:cs="Arial"/>
-                <w:sz w:val="20"/>
-                <w:szCs w:val="20"/>
-              </w:rPr>
-              <w:t>sle</w:t>
-            </w:r>
-            <w:proofErr w:type="spellEnd"/>
-            <w:r>
-              <w:rPr>
-                <w:rFonts w:ascii="Verdana" w:hAnsi="Verdana" w:cs="Arial"/>
-                <w:sz w:val="20"/>
-                <w:szCs w:val="20"/>
-              </w:rPr>
-              <w:t>}}</w:t>
-            </w:r>
-          </w:p>
-        </w:tc>
-        <w:tc>
-          <w:tcPr>
-            <w:tcW w:w="2816" w:type="dxa"/>
-          </w:tcPr>
-          <w:p>
-            <w:pPr>
+            </w:pPr>
+            <w:r>
               <w:rPr>
                 <w:rFonts w:ascii="Verdana" w:hAnsi="Verdana" w:cs="Arial"/>
                 <w:i/>
@@ -1615,8 +1336,16 @@
                 <w:sz w:val="20"/>
                 <w:szCs w:val="20"/>
               </w:rPr>
-            </w:pPr>
-            <w:r>
+              <w:t>{{exp_enhetspris}}</w:t>
+            </w:r>
+          </w:p>
+        </w:tc>
+        <w:tc>
+          <w:tcPr>
+            <w:tcW w:w="2808" w:type="dxa"/>
+          </w:tcPr>
+          <w:p>
+            <w:pPr>
               <w:rPr>
                 <w:rFonts w:ascii="Verdana" w:hAnsi="Verdana" w:cs="Arial"/>
                 <w:i/>
@@ -1624,10 +1353,40 @@
                 <w:sz w:val="20"/>
                 <w:szCs w:val="20"/>
               </w:rPr>
-              <w:t>{{</w:t>
-            </w:r>
-            <w:proofErr w:type="spellStart"/>
-            <w:r>
+            </w:pPr>
+          </w:p>
+        </w:tc>
+      </w:tr>
+      <w:tr>
+        <w:tc>
+          <w:tcPr>
+            <w:tcW w:w="4997" w:type="dxa"/>
+          </w:tcPr>
+          <w:p>
+            <w:pPr>
+              <w:rPr>
+                <w:rFonts w:ascii="Verdana" w:hAnsi="Verdana" w:cs="Arial"/>
+                <w:sz w:val="20"/>
+                <w:szCs w:val="20"/>
+              </w:rPr>
+            </w:pPr>
+            <w:r>
+              <w:rPr>
+                <w:rFonts w:ascii="Verdana" w:hAnsi="Verdana" w:cs="Arial"/>
+                <w:sz w:val="20"/>
+                <w:szCs w:val="20"/>
+              </w:rPr>
+              <w:t>{{bre}}</w:t>
+            </w:r>
+          </w:p>
+        </w:tc>
+        <w:tc>
+          <w:tcPr>
+            <w:tcW w:w="2664" w:type="dxa"/>
+          </w:tcPr>
+          <w:p>
+            <w:pPr>
+              <w:jc w:val="right"/>
               <w:rPr>
                 <w:rFonts w:ascii="Verdana" w:hAnsi="Verdana" w:cs="Arial"/>
                 <w:i/>
@@ -1635,9 +1394,7 @@
                 <w:sz w:val="20"/>
                 <w:szCs w:val="20"/>
               </w:rPr>
-              <w:t>sle_enhetspris</w:t>
-            </w:r>
-            <w:proofErr w:type="spellEnd"/>
+            </w:pPr>
             <w:r>
               <w:rPr>
                 <w:rFonts w:ascii="Verdana" w:hAnsi="Verdana" w:cs="Arial"/>
@@ -1646,38 +1403,13 @@
                 <w:sz w:val="20"/>
                 <w:szCs w:val="20"/>
               </w:rPr>
-              <w:t>}}</w:t>
-            </w:r>
-          </w:p>
-        </w:tc>
-      </w:tr>
-      <w:tr>
-        <w:tc>
-          <w:tcPr>
-            <w:tcW w:w="6930" w:type="dxa"/>
-          </w:tcPr>
-          <w:p>
-            <w:pPr>
-              <w:jc w:val="both"/>
-              <w:rPr>
-                <w:rFonts w:ascii="Verdana" w:hAnsi="Verdana" w:cs="Arial"/>
-                <w:sz w:val="20"/>
-                <w:szCs w:val="20"/>
-              </w:rPr>
-            </w:pPr>
-            <w:r>
-              <w:rPr>
-                <w:rFonts w:ascii="Verdana" w:hAnsi="Verdana" w:cs="Arial"/>
-                <w:sz w:val="20"/>
-                <w:szCs w:val="20"/>
-              </w:rPr>
-              <w:t>{{ekspansjonselement}}</w:t>
-            </w:r>
-          </w:p>
-        </w:tc>
-        <w:tc>
-          <w:tcPr>
-            <w:tcW w:w="2816" w:type="dxa"/>
+              <w:t>{{bre_enhetspris}}</w:t>
+            </w:r>
+          </w:p>
+        </w:tc>
+        <w:tc>
+          <w:tcPr>
+            <w:tcW w:w="2808" w:type="dxa"/>
           </w:tcPr>
           <w:p>
             <w:pPr>
@@ -1689,7 +1421,39 @@
                 <w:szCs w:val="20"/>
               </w:rPr>
             </w:pPr>
-            <w:r>
+          </w:p>
+        </w:tc>
+      </w:tr>
+      <w:tr>
+        <w:tc>
+          <w:tcPr>
+            <w:tcW w:w="4997" w:type="dxa"/>
+          </w:tcPr>
+          <w:p>
+            <w:pPr>
+              <w:rPr>
+                <w:rFonts w:ascii="Verdana" w:hAnsi="Verdana" w:cs="Arial"/>
+                <w:sz w:val="20"/>
+                <w:szCs w:val="20"/>
+              </w:rPr>
+            </w:pPr>
+            <w:r>
+              <w:rPr>
+                <w:rFonts w:ascii="Verdana" w:hAnsi="Verdana" w:cs="Arial"/>
+                <w:sz w:val="20"/>
+                <w:szCs w:val="20"/>
+              </w:rPr>
+              <w:t>{{spesialelementer_tekst}}</w:t>
+            </w:r>
+          </w:p>
+        </w:tc>
+        <w:tc>
+          <w:tcPr>
+            <w:tcW w:w="2664" w:type="dxa"/>
+          </w:tcPr>
+          <w:p>
+            <w:pPr>
+              <w:jc w:val="right"/>
               <w:rPr>
                 <w:rFonts w:ascii="Verdana" w:hAnsi="Verdana" w:cs="Arial"/>
                 <w:i/>
@@ -1697,9 +1461,7 @@
                 <w:sz w:val="20"/>
                 <w:szCs w:val="20"/>
               </w:rPr>
-              <w:t>{{</w:t>
-            </w:r>
-            <w:proofErr w:type="spellStart"/>
+            </w:pPr>
             <w:r>
               <w:rPr>
                 <w:rFonts w:ascii="Verdana" w:hAnsi="Verdana" w:cs="Arial"/>
@@ -1708,10 +1470,16 @@
                 <w:sz w:val="20"/>
                 <w:szCs w:val="20"/>
               </w:rPr>
-              <w:t>exp_enhetspris</w:t>
-            </w:r>
-            <w:proofErr w:type="spellEnd"/>
-            <w:r>
+              <w:t>{{spe_pris}}</w:t>
+            </w:r>
+          </w:p>
+        </w:tc>
+        <w:tc>
+          <w:tcPr>
+            <w:tcW w:w="2808" w:type="dxa"/>
+          </w:tcPr>
+          <w:p>
+            <w:pPr>
               <w:rPr>
                 <w:rFonts w:ascii="Verdana" w:hAnsi="Verdana" w:cs="Arial"/>
                 <w:i/>
@@ -1719,172 +1487,7 @@
                 <w:sz w:val="20"/>
                 <w:szCs w:val="20"/>
               </w:rPr>
-              <w:t>}}</w:t>
-            </w:r>
-          </w:p>
-        </w:tc>
-      </w:tr>
-      <w:tr>
-        <w:tc>
-          <w:tcPr>
-            <w:tcW w:w="6930" w:type="dxa"/>
-          </w:tcPr>
-          <w:p>
-            <w:pPr>
-              <w:jc w:val="both"/>
-              <w:rPr>
-                <w:rFonts w:ascii="Verdana" w:hAnsi="Verdana" w:cs="Arial"/>
-                <w:sz w:val="20"/>
-                <w:szCs w:val="20"/>
-              </w:rPr>
-            </w:pPr>
-            <w:r>
-              <w:rPr>
-                <w:rFonts w:ascii="Verdana" w:hAnsi="Verdana" w:cs="Arial"/>
-                <w:sz w:val="20"/>
-                <w:szCs w:val="20"/>
-              </w:rPr>
-              <w:t>{{bre}}</w:t>
-            </w:r>
-          </w:p>
-        </w:tc>
-        <w:tc>
-          <w:tcPr>
-            <w:tcW w:w="2816" w:type="dxa"/>
-          </w:tcPr>
-          <w:p>
-            <w:pPr>
-              <w:rPr>
-                <w:rFonts w:ascii="Verdana" w:hAnsi="Verdana" w:cs="Arial"/>
-                <w:i/>
-                <w:iCs/>
-                <w:sz w:val="20"/>
-                <w:szCs w:val="20"/>
-              </w:rPr>
-            </w:pPr>
-            <w:r>
-              <w:rPr>
-                <w:rFonts w:ascii="Verdana" w:hAnsi="Verdana" w:cs="Arial"/>
-                <w:i/>
-                <w:iCs/>
-                <w:sz w:val="20"/>
-                <w:szCs w:val="20"/>
-              </w:rPr>
-              <w:t>{{</w:t>
-            </w:r>
-            <w:proofErr w:type="spellStart"/>
-            <w:r>
-              <w:rPr>
-                <w:rFonts w:ascii="Verdana" w:hAnsi="Verdana" w:cs="Arial"/>
-                <w:i/>
-                <w:iCs/>
-                <w:sz w:val="20"/>
-                <w:szCs w:val="20"/>
-              </w:rPr>
-              <w:t>bre_enhetspris</w:t>
-            </w:r>
-            <w:proofErr w:type="spellEnd"/>
-            <w:r>
-              <w:rPr>
-                <w:rFonts w:ascii="Verdana" w:hAnsi="Verdana" w:cs="Arial"/>
-                <w:i/>
-                <w:iCs/>
-                <w:sz w:val="20"/>
-                <w:szCs w:val="20"/>
-              </w:rPr>
-              <w:t>}}</w:t>
-            </w:r>
-          </w:p>
-        </w:tc>
-      </w:tr>
-      <w:tr>
-        <w:tc>
-          <w:tcPr>
-            <w:tcW w:w="6930" w:type="dxa"/>
-          </w:tcPr>
-          <w:p>
-            <w:pPr>
-              <w:jc w:val="both"/>
-              <w:rPr>
-                <w:rFonts w:ascii="Verdana" w:hAnsi="Verdana" w:cs="Arial"/>
-                <w:sz w:val="20"/>
-                <w:szCs w:val="20"/>
-              </w:rPr>
-            </w:pPr>
-            <w:r>
-              <w:rPr>
-                <w:rFonts w:ascii="Verdana" w:hAnsi="Verdana" w:cs="Arial"/>
-                <w:sz w:val="20"/>
-                <w:szCs w:val="20"/>
-              </w:rPr>
-              <w:t>{{</w:t>
-            </w:r>
-            <w:proofErr w:type="spellStart"/>
-            <w:r>
-              <w:rPr>
-                <w:rFonts w:ascii="Verdana" w:hAnsi="Verdana" w:cs="Arial"/>
-                <w:sz w:val="20"/>
-                <w:szCs w:val="20"/>
-              </w:rPr>
-              <w:t>spesialelementer_tekst</w:t>
-            </w:r>
-            <w:proofErr w:type="spellEnd"/>
-            <w:r>
-              <w:rPr>
-                <w:rFonts w:ascii="Verdana" w:hAnsi="Verdana" w:cs="Arial"/>
-                <w:sz w:val="20"/>
-                <w:szCs w:val="20"/>
-              </w:rPr>
-              <w:t>}}</w:t>
-            </w:r>
-          </w:p>
-        </w:tc>
-        <w:tc>
-          <w:tcPr>
-            <w:tcW w:w="2816" w:type="dxa"/>
-          </w:tcPr>
-          <w:p>
-            <w:pPr>
-              <w:rPr>
-                <w:rFonts w:ascii="Verdana" w:hAnsi="Verdana" w:cs="Arial"/>
-                <w:i/>
-                <w:iCs/>
-                <w:sz w:val="20"/>
-                <w:szCs w:val="20"/>
-              </w:rPr>
-            </w:pPr>
-            <w:r>
-              <w:rPr>
-                <w:rFonts w:ascii="Verdana" w:hAnsi="Verdana" w:cs="Arial"/>
-                <w:i/>
-                <w:iCs/>
-                <w:sz w:val="20"/>
-                <w:szCs w:val="20"/>
-              </w:rPr>
-              <w:t>{{</w:t>
-            </w:r>
-            <w:proofErr w:type="spellStart"/>
-            <w:r>
-              <w:rPr>
-                <w:rFonts w:ascii="Verdana" w:hAnsi="Verdana" w:cs="Arial"/>
-                <w:i/>
-                <w:iCs/>
-                <w:sz w:val="20"/>
-                <w:szCs w:val="20"/>
-              </w:rPr>
-              <w:t>spesialelementer_pris</w:t>
-            </w:r>
-            <w:proofErr w:type="spellEnd"/>
-            <w:r>
-              <w:rPr>
-                <w:rFonts w:ascii="Verdana" w:hAnsi="Verdana" w:cs="Arial"/>
-                <w:i/>
-                <w:iCs/>
-                <w:sz w:val="20"/>
-                <w:szCs w:val="20"/>
-              </w:rPr>
-              <w:t>}}</w:t>
-            </w:r>
+            </w:pPr>
           </w:p>
         </w:tc>
       </w:tr>
@@ -1942,25 +1545,7 @@
                 <w:sz w:val="20"/>
                 <w:szCs w:val="20"/>
               </w:rPr>
-              <w:t>{{</w:t>
-            </w:r>
-            <w:proofErr w:type="spellStart"/>
-            <w:r>
-              <w:rPr>
-                <w:rFonts w:ascii="Verdana" w:hAnsi="Verdana" w:cs="Arial"/>
-                <w:sz w:val="20"/>
-                <w:szCs w:val="20"/>
-              </w:rPr>
-              <w:t>avb_tekst</w:t>
-            </w:r>
-            <w:proofErr w:type="spellEnd"/>
-            <w:r>
-              <w:rPr>
-                <w:rFonts w:ascii="Verdana" w:hAnsi="Verdana" w:cs="Arial"/>
-                <w:sz w:val="20"/>
-                <w:szCs w:val="20"/>
-              </w:rPr>
-              <w:t>}}</w:t>
+              <w:t>{{avb_tekst}}</w:t>
             </w:r>
           </w:p>
         </w:tc>
@@ -1986,25 +1571,7 @@
                 <w:sz w:val="20"/>
                 <w:szCs w:val="20"/>
               </w:rPr>
-              <w:t>{{</w:t>
-            </w:r>
-            <w:proofErr w:type="spellStart"/>
-            <w:r>
-              <w:rPr>
-                <w:rFonts w:ascii="Verdana" w:hAnsi="Verdana" w:cs="Arial"/>
-                <w:sz w:val="20"/>
-                <w:szCs w:val="20"/>
-              </w:rPr>
-              <w:t>avb_pris</w:t>
-            </w:r>
-            <w:proofErr w:type="spellEnd"/>
-            <w:r>
-              <w:rPr>
-                <w:rFonts w:ascii="Verdana" w:hAnsi="Verdana" w:cs="Arial"/>
-                <w:sz w:val="20"/>
-                <w:szCs w:val="20"/>
-              </w:rPr>
-              <w:t>}}</w:t>
+              <w:t>{{avb_pris}}</w:t>
             </w:r>
           </w:p>
         </w:tc>
@@ -2063,25 +1630,7 @@
                 <w:sz w:val="20"/>
                 <w:szCs w:val="20"/>
               </w:rPr>
-              <w:t>{{</w:t>
-            </w:r>
-            <w:proofErr w:type="spellStart"/>
-            <w:r>
-              <w:rPr>
-                <w:rFonts w:ascii="Verdana" w:hAnsi="Verdana" w:cs="Arial"/>
-                <w:sz w:val="20"/>
-                <w:szCs w:val="20"/>
-              </w:rPr>
-              <w:t>mtl</w:t>
-            </w:r>
-            <w:proofErr w:type="spellEnd"/>
-            <w:r>
-              <w:rPr>
-                <w:rFonts w:ascii="Verdana" w:hAnsi="Verdana" w:cs="Arial"/>
-                <w:sz w:val="20"/>
-                <w:szCs w:val="20"/>
-              </w:rPr>
-              <w:t>}}</w:t>
+              <w:t>{{mtl}}</w:t>
             </w:r>
           </w:p>
         </w:tc>
@@ -2107,25 +1656,7 @@
                 <w:sz w:val="20"/>
                 <w:szCs w:val="20"/>
               </w:rPr>
-              <w:t>{{</w:t>
-            </w:r>
-            <w:proofErr w:type="spellStart"/>
-            <w:r>
-              <w:rPr>
-                <w:rFonts w:ascii="Verdana" w:hAnsi="Verdana" w:cs="Arial"/>
-                <w:sz w:val="20"/>
-                <w:szCs w:val="20"/>
-              </w:rPr>
-              <w:t>mtp</w:t>
-            </w:r>
-            <w:proofErr w:type="spellEnd"/>
-            <w:r>
-              <w:rPr>
-                <w:rFonts w:ascii="Verdana" w:hAnsi="Verdana" w:cs="Arial"/>
-                <w:sz w:val="20"/>
-                <w:szCs w:val="20"/>
-              </w:rPr>
-              <w:t>}}</w:t>
+              <w:t>{{mtp}}</w:t>
             </w:r>
           </w:p>
         </w:tc>
@@ -2146,25 +1677,7 @@
           <w:sz w:val="20"/>
           <w:szCs w:val="20"/>
         </w:rPr>
-        <w:t>{{</w:t>
-      </w:r>
-      <w:proofErr w:type="spellStart"/>
-      <w:r>
-        <w:rPr>
-          <w:rFonts w:ascii="Verdana" w:hAnsi="Verdana" w:cs="Arial"/>
-          <w:sz w:val="20"/>
-          <w:szCs w:val="20"/>
-        </w:rPr>
-        <w:t>ttm</w:t>
-      </w:r>
-      <w:proofErr w:type="spellEnd"/>
-      <w:r>
-        <w:rPr>
-          <w:rFonts w:ascii="Verdana" w:hAnsi="Verdana" w:cs="Arial"/>
-          <w:sz w:val="20"/>
-          <w:szCs w:val="20"/>
-        </w:rPr>
-        <w:t>}}</w:t>
+        <w:t>{{ttm}}</w:t>
       </w:r>
     </w:p>
     <w:p>
@@ -2212,25 +1725,7 @@
                 <w:sz w:val="20"/>
                 <w:szCs w:val="20"/>
               </w:rPr>
-              <w:t>{{</w:t>
-            </w:r>
-            <w:proofErr w:type="spellStart"/>
-            <w:r>
-              <w:rPr>
-                <w:rFonts w:ascii="Verdana" w:hAnsi="Verdana" w:cs="Arial"/>
-                <w:sz w:val="20"/>
-                <w:szCs w:val="20"/>
-              </w:rPr>
-              <w:t>itl</w:t>
-            </w:r>
-            <w:proofErr w:type="spellEnd"/>
-            <w:r>
-              <w:rPr>
-                <w:rFonts w:ascii="Verdana" w:hAnsi="Verdana" w:cs="Arial"/>
-                <w:sz w:val="20"/>
-                <w:szCs w:val="20"/>
-              </w:rPr>
-              <w:t>}}</w:t>
+              <w:t>{{itl}}</w:t>
             </w:r>
           </w:p>
         </w:tc>
@@ -2256,25 +1751,7 @@
                 <w:sz w:val="20"/>
                 <w:szCs w:val="20"/>
               </w:rPr>
-              <w:t>{{</w:t>
-            </w:r>
-            <w:proofErr w:type="spellStart"/>
-            <w:r>
-              <w:rPr>
-                <w:rFonts w:ascii="Verdana" w:hAnsi="Verdana" w:cs="Arial"/>
-                <w:sz w:val="20"/>
-                <w:szCs w:val="20"/>
-              </w:rPr>
-              <w:t>itp</w:t>
-            </w:r>
-            <w:proofErr w:type="spellEnd"/>
-            <w:r>
-              <w:rPr>
-                <w:rFonts w:ascii="Verdana" w:hAnsi="Verdana" w:cs="Arial"/>
-                <w:sz w:val="20"/>
-                <w:szCs w:val="20"/>
-              </w:rPr>
-              <w:t>}}</w:t>
+              <w:t>{{itp}}</w:t>
             </w:r>
           </w:p>
         </w:tc>
@@ -2295,25 +1772,7 @@
           <w:sz w:val="20"/>
           <w:szCs w:val="20"/>
         </w:rPr>
-        <w:t>{{</w:t>
-      </w:r>
-      <w:proofErr w:type="spellStart"/>
-      <w:r>
-        <w:rPr>
-          <w:rFonts w:ascii="Verdana" w:hAnsi="Verdana" w:cs="Arial"/>
-          <w:sz w:val="20"/>
-          <w:szCs w:val="20"/>
-        </w:rPr>
-        <w:t>tti</w:t>
-      </w:r>
-      <w:proofErr w:type="spellEnd"/>
-      <w:r>
-        <w:rPr>
-          <w:rFonts w:ascii="Verdana" w:hAnsi="Verdana" w:cs="Arial"/>
-          <w:sz w:val="20"/>
-          <w:szCs w:val="20"/>
-        </w:rPr>
-        <w:t>}}</w:t>
+        <w:t>{{tti}}</w:t>
       </w:r>
     </w:p>
     <w:p>
@@ -2360,25 +1819,7 @@
                 <w:sz w:val="20"/>
                 <w:szCs w:val="20"/>
               </w:rPr>
-              <w:t>{{</w:t>
-            </w:r>
-            <w:proofErr w:type="spellStart"/>
-            <w:r>
-              <w:rPr>
-                <w:rFonts w:ascii="Verdana" w:hAnsi="Verdana" w:cs="Arial"/>
-                <w:sz w:val="20"/>
-                <w:szCs w:val="20"/>
-              </w:rPr>
-              <w:t>tol</w:t>
-            </w:r>
-            <w:proofErr w:type="spellEnd"/>
-            <w:r>
-              <w:rPr>
-                <w:rFonts w:ascii="Verdana" w:hAnsi="Verdana" w:cs="Arial"/>
-                <w:sz w:val="20"/>
-                <w:szCs w:val="20"/>
-              </w:rPr>
-              <w:t>}}</w:t>
+              <w:t>{{tol}}</w:t>
             </w:r>
           </w:p>
         </w:tc>
@@ -2404,25 +1845,7 @@
                 <w:sz w:val="20"/>
                 <w:szCs w:val="20"/>
               </w:rPr>
-              <w:t>{{</w:t>
-            </w:r>
-            <w:proofErr w:type="spellStart"/>
-            <w:r>
-              <w:rPr>
-                <w:rFonts w:ascii="Verdana" w:hAnsi="Verdana" w:cs="Arial"/>
-                <w:sz w:val="20"/>
-                <w:szCs w:val="20"/>
-              </w:rPr>
-              <w:t>top</w:t>
-            </w:r>
-            <w:proofErr w:type="spellEnd"/>
-            <w:r>
-              <w:rPr>
-                <w:rFonts w:ascii="Verdana" w:hAnsi="Verdana" w:cs="Arial"/>
-                <w:sz w:val="20"/>
-                <w:szCs w:val="20"/>
-              </w:rPr>
-              <w:t>}}</w:t>
+              <w:t>{{top}}</w:t>
             </w:r>
           </w:p>
         </w:tc>
@@ -2443,25 +1866,7 @@
           <w:sz w:val="20"/>
           <w:szCs w:val="20"/>
         </w:rPr>
-        <w:t>{{</w:t>
-      </w:r>
-      <w:proofErr w:type="spellStart"/>
-      <w:r>
-        <w:rPr>
-          <w:rFonts w:ascii="Verdana" w:hAnsi="Verdana" w:cs="Arial"/>
-          <w:sz w:val="20"/>
-          <w:szCs w:val="20"/>
-        </w:rPr>
-        <w:t>tod</w:t>
-      </w:r>
-      <w:proofErr w:type="spellEnd"/>
-      <w:r>
-        <w:rPr>
-          <w:rFonts w:ascii="Verdana" w:hAnsi="Verdana" w:cs="Arial"/>
-          <w:sz w:val="20"/>
-          <w:szCs w:val="20"/>
-        </w:rPr>
-        <w:t>}}</w:t>
+        <w:t>{{tod}}</w:t>
       </w:r>
     </w:p>
     <w:tbl>
@@ -2513,27 +1918,7 @@
           <w:sz w:val="20"/>
           <w:szCs w:val="20"/>
         </w:rPr>
-        <w:t>{{</w:t>
-      </w:r>
-      <w:proofErr w:type="spellStart"/>
-      <w:r>
-        <w:rPr>
-          <w:rFonts w:ascii="Verdana" w:hAnsi="Verdana" w:cs="Arial"/>
-          <w:bCs/>
-          <w:sz w:val="20"/>
-          <w:szCs w:val="20"/>
-        </w:rPr>
-        <w:t>lse</w:t>
-      </w:r>
-      <w:proofErr w:type="spellEnd"/>
-      <w:r>
-        <w:rPr>
-          <w:rFonts w:ascii="Verdana" w:hAnsi="Verdana" w:cs="Arial"/>
-          <w:bCs/>
-          <w:sz w:val="20"/>
-          <w:szCs w:val="20"/>
-        </w:rPr>
-        <w:t>}}</w:t>
+        <w:t>{{lse}}</w:t>
       </w:r>
       <w:r>
         <w:rPr>
@@ -2603,9 +1988,8 @@
                 <w:sz w:val="20"/>
                 <w:szCs w:val="20"/>
               </w:rPr>
-              <w:t xml:space="preserve">Brannelement er pris </w:t>
-            </w:r>
-            <w:proofErr w:type="spellStart"/>
+              <w:t>Brannelement er pris pr.st</w:t>
+            </w:r>
             <w:r>
               <w:rPr>
                 <w:rFonts w:ascii="Verdana" w:hAnsi="Verdana" w:cs="Arial"/>
@@ -2616,7 +2000,7 @@
                 <w:sz w:val="20"/>
                 <w:szCs w:val="20"/>
               </w:rPr>
-              <w:t>pr.st</w:t>
+              <w:t>k -</w:t>
             </w:r>
             <w:r>
               <w:rPr>
@@ -2628,49 +2012,8 @@
                 <w:sz w:val="20"/>
                 <w:szCs w:val="20"/>
               </w:rPr>
-              <w:t>k</w:t>
-            </w:r>
-            <w:proofErr w:type="spellEnd"/>
-            <w:r>
-              <w:rPr>
-                <w:rFonts w:ascii="Verdana" w:hAnsi="Verdana" w:cs="Arial"/>
-                <w:b w:val="0"/>
-                <w:bCs w:val="0"/>
-                <w:i/>
-                <w:iCs/>
-                <w:sz w:val="20"/>
-                <w:szCs w:val="20"/>
-              </w:rPr>
-              <w:t xml:space="preserve"> -</w:t>
-            </w:r>
-            <w:r>
-              <w:rPr>
-                <w:rFonts w:ascii="Verdana" w:hAnsi="Verdana" w:cs="Arial"/>
-                <w:b w:val="0"/>
-                <w:bCs w:val="0"/>
-                <w:i/>
-                <w:iCs/>
-                <w:sz w:val="20"/>
-                <w:szCs w:val="20"/>
-              </w:rPr>
-              <w:t xml:space="preserve"> </w:t>
-            </w:r>
-            <w:proofErr w:type="spellStart"/>
-            <w:proofErr w:type="gramStart"/>
-            <w:r>
-              <w:rPr>
-                <w:rFonts w:ascii="Verdana" w:hAnsi="Verdana" w:cs="Arial"/>
-                <w:b w:val="0"/>
-                <w:bCs w:val="0"/>
-                <w:i/>
-                <w:iCs/>
-                <w:sz w:val="20"/>
-                <w:szCs w:val="20"/>
-              </w:rPr>
-              <w:t>pr.strømskinne</w:t>
-            </w:r>
-            <w:proofErr w:type="spellEnd"/>
-            <w:proofErr w:type="gramEnd"/>
+              <w:t xml:space="preserve"> pr.strømskinne</w:t>
+            </w:r>
           </w:p>
         </w:tc>
         <w:tc>
@@ -2697,21 +2040,7 @@
         <w:rPr>
           <w:rFonts w:ascii="Verdana" w:hAnsi="Verdana" w:cs="Arial"/>
         </w:rPr>
-        <w:t>{{</w:t>
-      </w:r>
-      <w:proofErr w:type="spellStart"/>
-      <w:r>
-        <w:rPr>
-          <w:rFonts w:ascii="Verdana" w:hAnsi="Verdana" w:cs="Arial"/>
-        </w:rPr>
-        <w:t>bss</w:t>
-      </w:r>
-      <w:proofErr w:type="spellEnd"/>
-      <w:r>
-        <w:rPr>
-          <w:rFonts w:ascii="Verdana" w:hAnsi="Verdana" w:cs="Arial"/>
-        </w:rPr>
-        <w:t>}}</w:t>
+        <w:t>{{bss}}</w:t>
       </w:r>
     </w:p>
     <w:tbl>
@@ -2765,10 +2094,18 @@
                 <w:i/>
                 <w:iCs/>
               </w:rPr>
-              <w:t xml:space="preserve"> {{</w:t>
-            </w:r>
-            <w:proofErr w:type="spellStart"/>
-            <w:r>
+              <w:t xml:space="preserve"> {{lnr}}: {{brt}}</w:t>
+            </w:r>
+          </w:p>
+        </w:tc>
+        <w:tc>
+          <w:tcPr>
+            <w:tcW w:w="1726" w:type="dxa"/>
+          </w:tcPr>
+          <w:p>
+            <w:pPr>
+              <w:jc w:val="right"/>
+              <w:cnfStyle w:val="100000000000" w:firstRow="1" w:lastRow="0" w:firstColumn="0" w:lastColumn="0" w:oddVBand="0" w:evenVBand="0" w:oddHBand="0" w:evenHBand="0" w:firstRowFirstColumn="0" w:firstRowLastColumn="0" w:lastRowFirstColumn="0" w:lastRowLastColumn="0"/>
               <w:rPr>
                 <w:rFonts w:ascii="Verdana" w:hAnsi="Verdana" w:cs="Arial"/>
                 <w:b w:val="0"/>
@@ -2776,9 +2113,7 @@
                 <w:i/>
                 <w:iCs/>
               </w:rPr>
-              <w:t>lnr</w:t>
-            </w:r>
-            <w:proofErr w:type="spellEnd"/>
+            </w:pPr>
             <w:r>
               <w:rPr>
                 <w:rFonts w:ascii="Verdana" w:hAnsi="Verdana" w:cs="Arial"/>
@@ -2787,79 +2122,7 @@
                 <w:i/>
                 <w:iCs/>
               </w:rPr>
-              <w:t>}}: {{</w:t>
-            </w:r>
-            <w:proofErr w:type="spellStart"/>
-            <w:r>
-              <w:rPr>
-                <w:rFonts w:ascii="Verdana" w:hAnsi="Verdana" w:cs="Arial"/>
-                <w:b w:val="0"/>
-                <w:bCs w:val="0"/>
-                <w:i/>
-                <w:iCs/>
-              </w:rPr>
-              <w:t>brt</w:t>
-            </w:r>
-            <w:proofErr w:type="spellEnd"/>
-            <w:r>
-              <w:rPr>
-                <w:rFonts w:ascii="Verdana" w:hAnsi="Verdana" w:cs="Arial"/>
-                <w:b w:val="0"/>
-                <w:bCs w:val="0"/>
-                <w:i/>
-                <w:iCs/>
-              </w:rPr>
-              <w:t>}}</w:t>
-            </w:r>
-          </w:p>
-        </w:tc>
-        <w:tc>
-          <w:tcPr>
-            <w:tcW w:w="1726" w:type="dxa"/>
-          </w:tcPr>
-          <w:p>
-            <w:pPr>
-              <w:jc w:val="right"/>
-              <w:cnfStyle w:val="100000000000" w:firstRow="1" w:lastRow="0" w:firstColumn="0" w:lastColumn="0" w:oddVBand="0" w:evenVBand="0" w:oddHBand="0" w:evenHBand="0" w:firstRowFirstColumn="0" w:firstRowLastColumn="0" w:lastRowFirstColumn="0" w:lastRowLastColumn="0"/>
-              <w:rPr>
-                <w:rFonts w:ascii="Verdana" w:hAnsi="Verdana" w:cs="Arial"/>
-                <w:b w:val="0"/>
-                <w:bCs w:val="0"/>
-                <w:i/>
-                <w:iCs/>
-              </w:rPr>
-            </w:pPr>
-            <w:r>
-              <w:rPr>
-                <w:rFonts w:ascii="Verdana" w:hAnsi="Verdana" w:cs="Arial"/>
-                <w:b w:val="0"/>
-                <w:bCs w:val="0"/>
-                <w:i/>
-                <w:iCs/>
-              </w:rPr>
-              <w:t>kr. {{</w:t>
-            </w:r>
-            <w:proofErr w:type="spellStart"/>
-            <w:r>
-              <w:rPr>
-                <w:rFonts w:ascii="Verdana" w:hAnsi="Verdana" w:cs="Arial"/>
-                <w:b w:val="0"/>
-                <w:bCs w:val="0"/>
-                <w:i/>
-                <w:iCs/>
-              </w:rPr>
-              <w:t>brp</w:t>
-            </w:r>
-            <w:proofErr w:type="spellEnd"/>
-            <w:r>
-              <w:rPr>
-                <w:rFonts w:ascii="Verdana" w:hAnsi="Verdana" w:cs="Arial"/>
-                <w:b w:val="0"/>
-                <w:bCs w:val="0"/>
-                <w:i/>
-                <w:iCs/>
-              </w:rPr>
-              <w:t>}}</w:t>
+              <w:t>kr. {{brp}}</w:t>
             </w:r>
           </w:p>
         </w:tc>
@@ -2876,21 +2139,7 @@
         <w:rPr>
           <w:rFonts w:ascii="Verdana" w:hAnsi="Verdana" w:cs="Arial"/>
         </w:rPr>
-        <w:t>{{</w:t>
-      </w:r>
-      <w:proofErr w:type="spellStart"/>
-      <w:r>
-        <w:rPr>
-          <w:rFonts w:ascii="Verdana" w:hAnsi="Verdana" w:cs="Arial"/>
-        </w:rPr>
-        <w:t>bse</w:t>
-      </w:r>
-      <w:proofErr w:type="spellEnd"/>
-      <w:r>
-        <w:rPr>
-          <w:rFonts w:ascii="Verdana" w:hAnsi="Verdana" w:cs="Arial"/>
-        </w:rPr>
-        <w:t>}}</w:t>
+        <w:t>{{bse}}</w:t>
       </w:r>
     </w:p>
     <w:p>
@@ -2956,10 +2205,18 @@
                 <w:i/>
                 <w:iCs/>
               </w:rPr>
-              <w:t>{{</w:t>
-            </w:r>
-            <w:proofErr w:type="spellStart"/>
-            <w:r>
+              <w:t>{{lnr}}: {{tol}}</w:t>
+            </w:r>
+          </w:p>
+        </w:tc>
+        <w:tc>
+          <w:tcPr>
+            <w:tcW w:w="1726" w:type="dxa"/>
+          </w:tcPr>
+          <w:p>
+            <w:pPr>
+              <w:jc w:val="right"/>
+              <w:cnfStyle w:val="100000000000" w:firstRow="1" w:lastRow="0" w:firstColumn="0" w:lastColumn="0" w:oddVBand="0" w:evenVBand="0" w:oddHBand="0" w:evenHBand="0" w:firstRowFirstColumn="0" w:firstRowLastColumn="0" w:lastRowFirstColumn="0" w:lastRowLastColumn="0"/>
               <w:rPr>
                 <w:rFonts w:ascii="Verdana" w:hAnsi="Verdana" w:cs="Arial"/>
                 <w:b w:val="0"/>
@@ -2967,9 +2224,7 @@
                 <w:i/>
                 <w:iCs/>
               </w:rPr>
-              <w:t>lnr</w:t>
-            </w:r>
-            <w:proofErr w:type="spellEnd"/>
+            </w:pPr>
             <w:r>
               <w:rPr>
                 <w:rFonts w:ascii="Verdana" w:hAnsi="Verdana" w:cs="Arial"/>
@@ -2978,10 +2233,23 @@
                 <w:i/>
                 <w:iCs/>
               </w:rPr>
-              <w:t>}}: {{</w:t>
-            </w:r>
-            <w:proofErr w:type="spellStart"/>
-            <w:r>
+              <w:t>{{top}}</w:t>
+            </w:r>
+          </w:p>
+        </w:tc>
+      </w:tr>
+      <w:tr>
+        <w:trPr>
+          <w:cnfStyle w:val="000000100000" w:firstRow="0" w:lastRow="0" w:firstColumn="0" w:lastColumn="0" w:oddVBand="0" w:evenVBand="0" w:oddHBand="1" w:evenHBand="0" w:firstRowFirstColumn="0" w:firstRowLastColumn="0" w:lastRowFirstColumn="0" w:lastRowLastColumn="0"/>
+        </w:trPr>
+        <w:tc>
+          <w:tcPr>
+            <w:cnfStyle w:val="001000000000" w:firstRow="0" w:lastRow="0" w:firstColumn="1" w:lastColumn="0" w:oddVBand="0" w:evenVBand="0" w:oddHBand="0" w:evenHBand="0" w:firstRowFirstColumn="0" w:firstRowLastColumn="0" w:lastRowFirstColumn="0" w:lastRowLastColumn="0"/>
+            <w:tcW w:w="5228" w:type="dxa"/>
+            <w:shd w:val="clear" w:color="auto" w:fill="auto"/>
+          </w:tcPr>
+          <w:p>
+            <w:pPr>
               <w:rPr>
                 <w:rFonts w:ascii="Verdana" w:hAnsi="Verdana" w:cs="Arial"/>
                 <w:b w:val="0"/>
@@ -2989,9 +2257,7 @@
                 <w:i/>
                 <w:iCs/>
               </w:rPr>
-              <w:t>tol</w:t>
-            </w:r>
-            <w:proofErr w:type="spellEnd"/>
+            </w:pPr>
             <w:r>
               <w:rPr>
                 <w:rFonts w:ascii="Verdana" w:hAnsi="Verdana" w:cs="Arial"/>
@@ -3000,112 +2266,7 @@
                 <w:i/>
                 <w:iCs/>
               </w:rPr>
-              <w:t>}}</w:t>
-            </w:r>
-          </w:p>
-        </w:tc>
-        <w:tc>
-          <w:tcPr>
-            <w:tcW w:w="1726" w:type="dxa"/>
-          </w:tcPr>
-          <w:p>
-            <w:pPr>
-              <w:jc w:val="right"/>
-              <w:cnfStyle w:val="100000000000" w:firstRow="1" w:lastRow="0" w:firstColumn="0" w:lastColumn="0" w:oddVBand="0" w:evenVBand="0" w:oddHBand="0" w:evenHBand="0" w:firstRowFirstColumn="0" w:firstRowLastColumn="0" w:lastRowFirstColumn="0" w:lastRowLastColumn="0"/>
-              <w:rPr>
-                <w:rFonts w:ascii="Verdana" w:hAnsi="Verdana" w:cs="Arial"/>
-                <w:b w:val="0"/>
-                <w:bCs w:val="0"/>
-                <w:i/>
-                <w:iCs/>
-              </w:rPr>
-            </w:pPr>
-            <w:r>
-              <w:rPr>
-                <w:rFonts w:ascii="Verdana" w:hAnsi="Verdana" w:cs="Arial"/>
-                <w:b w:val="0"/>
-                <w:bCs w:val="0"/>
-                <w:i/>
-                <w:iCs/>
-              </w:rPr>
-              <w:t>{{</w:t>
-            </w:r>
-            <w:proofErr w:type="spellStart"/>
-            <w:r>
-              <w:rPr>
-                <w:rFonts w:ascii="Verdana" w:hAnsi="Verdana" w:cs="Arial"/>
-                <w:b w:val="0"/>
-                <w:bCs w:val="0"/>
-                <w:i/>
-                <w:iCs/>
-              </w:rPr>
-              <w:t>top</w:t>
-            </w:r>
-            <w:proofErr w:type="spellEnd"/>
-            <w:r>
-              <w:rPr>
-                <w:rFonts w:ascii="Verdana" w:hAnsi="Verdana" w:cs="Arial"/>
-                <w:b w:val="0"/>
-                <w:bCs w:val="0"/>
-                <w:i/>
-                <w:iCs/>
-              </w:rPr>
-              <w:t>}}</w:t>
-            </w:r>
-          </w:p>
-        </w:tc>
-      </w:tr>
-      <w:tr>
-        <w:trPr>
-          <w:cnfStyle w:val="000000100000" w:firstRow="0" w:lastRow="0" w:firstColumn="0" w:lastColumn="0" w:oddVBand="0" w:evenVBand="0" w:oddHBand="1" w:evenHBand="0" w:firstRowFirstColumn="0" w:firstRowLastColumn="0" w:lastRowFirstColumn="0" w:lastRowLastColumn="0"/>
-        </w:trPr>
-        <w:tc>
-          <w:tcPr>
-            <w:cnfStyle w:val="001000000000" w:firstRow="0" w:lastRow="0" w:firstColumn="1" w:lastColumn="0" w:oddVBand="0" w:evenVBand="0" w:oddHBand="0" w:evenHBand="0" w:firstRowFirstColumn="0" w:firstRowLastColumn="0" w:lastRowFirstColumn="0" w:lastRowLastColumn="0"/>
-            <w:tcW w:w="5228" w:type="dxa"/>
-            <w:shd w:val="clear" w:color="auto" w:fill="auto"/>
-          </w:tcPr>
-          <w:p>
-            <w:pPr>
-              <w:rPr>
-                <w:rFonts w:ascii="Verdana" w:hAnsi="Verdana" w:cs="Arial"/>
-                <w:b w:val="0"/>
-                <w:bCs w:val="0"/>
-                <w:i/>
-                <w:iCs/>
-              </w:rPr>
-            </w:pPr>
-            <w:r>
-              <w:rPr>
-                <w:rFonts w:ascii="Verdana" w:hAnsi="Verdana" w:cs="Arial"/>
-                <w:b w:val="0"/>
-                <w:bCs w:val="0"/>
-                <w:i/>
-                <w:iCs/>
-              </w:rPr>
-              <w:t>{{</w:t>
-            </w:r>
-            <w:proofErr w:type="spellStart"/>
-            <w:r>
-              <w:rPr>
-                <w:rFonts w:ascii="Verdana" w:hAnsi="Verdana" w:cs="Arial"/>
-                <w:b w:val="0"/>
-                <w:bCs w:val="0"/>
-                <w:i/>
-                <w:iCs/>
-              </w:rPr>
-              <w:t>tod</w:t>
-            </w:r>
-            <w:proofErr w:type="spellEnd"/>
-            <w:r>
-              <w:rPr>
-                <w:rFonts w:ascii="Verdana" w:hAnsi="Verdana" w:cs="Arial"/>
-                <w:b w:val="0"/>
-                <w:bCs w:val="0"/>
-                <w:i/>
-                <w:iCs/>
-              </w:rPr>
-              <w:t>}}</w:t>
+              <w:t>{{tod}}</w:t>
             </w:r>
           </w:p>
         </w:tc>
@@ -3299,31 +2460,22 @@
           <w:color w:val="ED7D31" w:themeColor="accent2"/>
         </w:rPr>
         <w:tab/>
-        <w:t xml:space="preserve">à </w:t>
-      </w:r>
-      <w:proofErr w:type="gramStart"/>
+        <w:t xml:space="preserve">à kr </w:t>
+      </w:r>
       <w:r>
         <w:rPr>
           <w:rFonts w:ascii="Verdana" w:hAnsi="Verdana" w:cs="Arial"/>
           <w:color w:val="ED7D31" w:themeColor="accent2"/>
         </w:rPr>
-        <w:t xml:space="preserve">kr </w:t>
+        <w:t xml:space="preserve"> </w:t>
       </w:r>
       <w:r>
         <w:rPr>
           <w:rFonts w:ascii="Verdana" w:hAnsi="Verdana" w:cs="Arial"/>
           <w:color w:val="ED7D31" w:themeColor="accent2"/>
         </w:rPr>
-        <w:t xml:space="preserve"> </w:t>
-      </w:r>
-      <w:r>
-        <w:rPr>
-          <w:rFonts w:ascii="Verdana" w:hAnsi="Verdana" w:cs="Arial"/>
-          <w:color w:val="ED7D31" w:themeColor="accent2"/>
-        </w:rPr>
         <w:t>15</w:t>
       </w:r>
-      <w:proofErr w:type="gramEnd"/>
       <w:r>
         <w:rPr>
           <w:rFonts w:ascii="Verdana" w:hAnsi="Verdana" w:cs="Arial"/>
@@ -3942,27 +3094,7 @@
           <w:szCs w:val="18"/>
           <w:lang w:eastAsia="en-US"/>
         </w:rPr>
-        <w:t xml:space="preserve">Tilgjengelig </w:t>
-      </w:r>
-      <w:proofErr w:type="spellStart"/>
-      <w:r>
-        <w:rPr>
-          <w:rFonts w:ascii="Verdana" w:eastAsia="Times New Roman" w:hAnsi="Verdana" w:cs="Arial"/>
-          <w:sz w:val="18"/>
-          <w:szCs w:val="18"/>
-          <w:lang w:eastAsia="en-US"/>
-        </w:rPr>
-        <w:t>byggstrøm</w:t>
-      </w:r>
-      <w:proofErr w:type="spellEnd"/>
-      <w:r>
-        <w:rPr>
-          <w:rFonts w:ascii="Verdana" w:eastAsia="Times New Roman" w:hAnsi="Verdana" w:cs="Arial"/>
-          <w:sz w:val="18"/>
-          <w:szCs w:val="18"/>
-          <w:lang w:eastAsia="en-US"/>
-        </w:rPr>
-        <w:t xml:space="preserve"> på minimum 16A.</w:t>
+        <w:t>Tilgjengelig byggstrøm på minimum 16A.</w:t>
       </w:r>
     </w:p>
     <w:p>
@@ -4027,27 +3159,7 @@
           <w:lang w:eastAsia="en-US"/>
         </w:rPr>
         <w:br/>
-        <w:t xml:space="preserve">Ved montasje i høyder over 3,0 meter er oppdragsgiver ansvarlig for å </w:t>
-      </w:r>
-      <w:proofErr w:type="gramStart"/>
-      <w:r>
-        <w:rPr>
-          <w:rFonts w:ascii="Verdana" w:eastAsia="Times New Roman" w:hAnsi="Verdana" w:cs="Arial"/>
-          <w:sz w:val="18"/>
-          <w:szCs w:val="18"/>
-          <w:lang w:eastAsia="en-US"/>
-        </w:rPr>
-        <w:t>besørge</w:t>
-      </w:r>
-      <w:proofErr w:type="gramEnd"/>
-      <w:r>
-        <w:rPr>
-          <w:rFonts w:ascii="Verdana" w:eastAsia="Times New Roman" w:hAnsi="Verdana" w:cs="Arial"/>
-          <w:sz w:val="18"/>
-          <w:szCs w:val="18"/>
-          <w:lang w:eastAsia="en-US"/>
-        </w:rPr>
-        <w:t xml:space="preserve"> og bekoste nødvendig stillas, lift eller annet godkjent arbeidsutstyr.</w:t>
+        <w:t>Ved montasje i høyder over 3,0 meter er oppdragsgiver ansvarlig for å besørge og bekoste nødvendig stillas, lift eller annet godkjent arbeidsutstyr.</w:t>
       </w:r>
     </w:p>
     <w:p>
@@ -4391,60 +3503,24 @@
           <w:sz w:val="18"/>
           <w:szCs w:val="18"/>
         </w:rPr>
-        <w:t xml:space="preserve">Ved feil og/eller mangler i mottatt underlag, eller endring av opprinnelig spesifikasjon/underlag, må en priskonsekvens </w:t>
-      </w:r>
-      <w:proofErr w:type="gramStart"/>
-      <w:r>
-        <w:rPr>
-          <w:rFonts w:ascii="Verdana" w:hAnsi="Verdana" w:cs="Arial"/>
-          <w:sz w:val="18"/>
-          <w:szCs w:val="18"/>
-        </w:rPr>
-        <w:t>påregnes</w:t>
-      </w:r>
-      <w:proofErr w:type="gramEnd"/>
-      <w:r>
-        <w:rPr>
-          <w:rFonts w:ascii="Verdana" w:hAnsi="Verdana" w:cs="Arial"/>
-          <w:sz w:val="18"/>
-          <w:szCs w:val="18"/>
-        </w:rPr>
-        <w:t>.</w:t>
-      </w:r>
-    </w:p>
-    <w:p>
-      <w:pPr>
-        <w:rPr>
-          <w:rFonts w:ascii="Verdana" w:hAnsi="Verdana" w:cs="Arial"/>
-          <w:sz w:val="18"/>
-          <w:szCs w:val="18"/>
-        </w:rPr>
-      </w:pPr>
-      <w:r>
-        <w:rPr>
-          <w:rFonts w:ascii="Verdana" w:hAnsi="Verdana" w:cs="Arial"/>
-          <w:sz w:val="18"/>
-          <w:szCs w:val="18"/>
-        </w:rPr>
-        <w:t>Prisgrunnlag (</w:t>
-      </w:r>
-      <w:proofErr w:type="spellStart"/>
-      <w:r>
-        <w:rPr>
-          <w:rFonts w:ascii="Verdana" w:hAnsi="Verdana" w:cs="Arial"/>
-          <w:sz w:val="18"/>
-          <w:szCs w:val="18"/>
-        </w:rPr>
-        <w:t>stykklister</w:t>
-      </w:r>
-      <w:proofErr w:type="spellEnd"/>
-      <w:r>
-        <w:rPr>
-          <w:rFonts w:ascii="Verdana" w:hAnsi="Verdana" w:cs="Arial"/>
-          <w:sz w:val="18"/>
-          <w:szCs w:val="18"/>
-        </w:rPr>
-        <w:t>, skisser og beskrivelser m.m.) skal kontrolleres og godkjennes før en eventuell bestilling plasseres.</w:t>
+        <w:t>Ved feil og/eller mangler i mottatt underlag, eller endring av opprinnelig spesifikasjon/underlag, må en priskonsekvens påregnes.</w:t>
+      </w:r>
+    </w:p>
+    <w:p>
+      <w:pPr>
+        <w:rPr>
+          <w:rFonts w:ascii="Verdana" w:hAnsi="Verdana" w:cs="Arial"/>
+          <w:sz w:val="18"/>
+          <w:szCs w:val="18"/>
+        </w:rPr>
+      </w:pPr>
+      <w:r>
+        <w:rPr>
+          <w:rFonts w:ascii="Verdana" w:hAnsi="Verdana" w:cs="Arial"/>
+          <w:sz w:val="18"/>
+          <w:szCs w:val="18"/>
+        </w:rPr>
+        <w:t>Prisgrunnlag (stykklister, skisser og beskrivelser m.m.) skal kontrolleres og godkjennes før en eventuell bestilling plasseres.</w:t>
       </w:r>
     </w:p>
     <w:p>
@@ -4470,25 +3546,7 @@
           <w:sz w:val="18"/>
           <w:szCs w:val="18"/>
         </w:rPr>
-        <w:t xml:space="preserve"> sine leveringsbetingelser er iht. siste utgave av </w:t>
-      </w:r>
-      <w:proofErr w:type="spellStart"/>
-      <w:r>
-        <w:rPr>
-          <w:rFonts w:ascii="Verdana" w:hAnsi="Verdana" w:cs="Arial"/>
-          <w:sz w:val="18"/>
-          <w:szCs w:val="18"/>
-        </w:rPr>
-        <w:t>Incoterm</w:t>
-      </w:r>
-      <w:proofErr w:type="spellEnd"/>
-      <w:r>
-        <w:rPr>
-          <w:rFonts w:ascii="Verdana" w:hAnsi="Verdana" w:cs="Arial"/>
-          <w:sz w:val="18"/>
-          <w:szCs w:val="18"/>
-        </w:rPr>
-        <w:t xml:space="preserve"> sine betingelser.</w:t>
+        <w:t xml:space="preserve"> sine leveringsbetingelser er iht. siste utgave av Incoterm sine betingelser.</w:t>
       </w:r>
       <w:r>
         <w:rPr>
@@ -4878,60 +3936,24 @@
           <w:sz w:val="18"/>
           <w:szCs w:val="18"/>
         </w:rPr>
-        <w:t>{{</w:t>
-      </w:r>
-      <w:proofErr w:type="spellStart"/>
-      <w:r>
-        <w:rPr>
-          <w:rFonts w:ascii="Verdana" w:hAnsi="Verdana" w:cs="Arial"/>
-          <w:sz w:val="18"/>
-          <w:szCs w:val="18"/>
-        </w:rPr>
-        <w:t>bruker_navn</w:t>
-      </w:r>
-      <w:proofErr w:type="spellEnd"/>
-      <w:r>
-        <w:rPr>
-          <w:rFonts w:ascii="Verdana" w:hAnsi="Verdana" w:cs="Arial"/>
-          <w:sz w:val="18"/>
-          <w:szCs w:val="18"/>
-        </w:rPr>
-        <w:t>}}</w:t>
-      </w:r>
-    </w:p>
-    <w:p>
-      <w:pPr>
-        <w:rPr>
-          <w:rFonts w:ascii="Verdana" w:hAnsi="Verdana" w:cs="Arial"/>
-          <w:sz w:val="18"/>
-          <w:szCs w:val="18"/>
-        </w:rPr>
-      </w:pPr>
-      <w:r>
-        <w:rPr>
-          <w:rFonts w:ascii="Verdana" w:hAnsi="Verdana" w:cs="Arial"/>
-          <w:sz w:val="18"/>
-          <w:szCs w:val="18"/>
-        </w:rPr>
-        <w:t>{{</w:t>
-      </w:r>
-      <w:proofErr w:type="spellStart"/>
-      <w:r>
-        <w:rPr>
-          <w:rFonts w:ascii="Verdana" w:hAnsi="Verdana" w:cs="Arial"/>
-          <w:sz w:val="18"/>
-          <w:szCs w:val="18"/>
-        </w:rPr>
-        <w:t>bruker_stilling</w:t>
-      </w:r>
-      <w:proofErr w:type="spellEnd"/>
-      <w:r>
-        <w:rPr>
-          <w:rFonts w:ascii="Verdana" w:hAnsi="Verdana" w:cs="Arial"/>
-          <w:sz w:val="18"/>
-          <w:szCs w:val="18"/>
-        </w:rPr>
-        <w:t>}}</w:t>
+        <w:t>{{bruker_navn}}</w:t>
+      </w:r>
+    </w:p>
+    <w:p>
+      <w:pPr>
+        <w:rPr>
+          <w:rFonts w:ascii="Verdana" w:hAnsi="Verdana" w:cs="Arial"/>
+          <w:sz w:val="18"/>
+          <w:szCs w:val="18"/>
+        </w:rPr>
+      </w:pPr>
+      <w:r>
+        <w:rPr>
+          <w:rFonts w:ascii="Verdana" w:hAnsi="Verdana" w:cs="Arial"/>
+          <w:sz w:val="18"/>
+          <w:szCs w:val="18"/>
+        </w:rPr>
+        <w:t>{{bruker_stilling}}</w:t>
       </w:r>
       <w:r>
         <w:rPr>
@@ -5038,99 +4060,15 @@
           <w:sz w:val="18"/>
           <w:szCs w:val="18"/>
         </w:rPr>
-        <w:t xml:space="preserve">OPPDRAGSGIVER har ansvaret for å </w:t>
-      </w:r>
-      <w:proofErr w:type="spellStart"/>
-      <w:r>
-        <w:rPr>
-          <w:rFonts w:ascii="Verdana" w:hAnsi="Verdana" w:cs="Arial"/>
-          <w:sz w:val="18"/>
-          <w:szCs w:val="18"/>
-        </w:rPr>
-        <w:t>Ernström</w:t>
-      </w:r>
-      <w:proofErr w:type="spellEnd"/>
-      <w:r>
-        <w:rPr>
-          <w:rFonts w:ascii="Verdana" w:hAnsi="Verdana" w:cs="Arial"/>
-          <w:sz w:val="18"/>
-          <w:szCs w:val="18"/>
-        </w:rPr>
-        <w:t xml:space="preserve"> </w:t>
-      </w:r>
-      <w:proofErr w:type="spellStart"/>
-      <w:r>
-        <w:rPr>
-          <w:rFonts w:ascii="Verdana" w:hAnsi="Verdana" w:cs="Arial"/>
-          <w:sz w:val="18"/>
-          <w:szCs w:val="18"/>
-        </w:rPr>
-        <w:t>Electro</w:t>
-      </w:r>
-      <w:proofErr w:type="spellEnd"/>
-      <w:r>
-        <w:rPr>
-          <w:rFonts w:ascii="Verdana" w:hAnsi="Verdana" w:cs="Arial"/>
-          <w:sz w:val="18"/>
-          <w:szCs w:val="18"/>
-        </w:rPr>
-        <w:t xml:space="preserve"> AS alle nødvendige og relevanteopplysninger som er nødvendig for å kunne gi et komplett tilbud på forespørselen. Herunder grensesnittet til andre sidestilte </w:t>
-      </w:r>
-      <w:proofErr w:type="spellStart"/>
-      <w:proofErr w:type="gramStart"/>
-      <w:r>
-        <w:rPr>
-          <w:rFonts w:ascii="Verdana" w:hAnsi="Verdana" w:cs="Arial"/>
-          <w:sz w:val="18"/>
-          <w:szCs w:val="18"/>
-        </w:rPr>
-        <w:t>entreprenører.Det</w:t>
-      </w:r>
-      <w:proofErr w:type="spellEnd"/>
-      <w:proofErr w:type="gramEnd"/>
-      <w:r>
-        <w:rPr>
-          <w:rFonts w:ascii="Verdana" w:hAnsi="Verdana" w:cs="Arial"/>
-          <w:sz w:val="18"/>
-          <w:szCs w:val="18"/>
-        </w:rPr>
-        <w:t xml:space="preserve"> forutsettes at oppdraget har en klar funksjonsbeskrivelse. Merkostnader som følge av mangelfulle eller uriktige opplysninger kan kreves dekket som tillegg. </w:t>
-      </w:r>
-      <w:proofErr w:type="spellStart"/>
-      <w:r>
-        <w:rPr>
-          <w:rFonts w:ascii="Verdana" w:hAnsi="Verdana" w:cs="Arial"/>
-          <w:sz w:val="18"/>
-          <w:szCs w:val="18"/>
-        </w:rPr>
-        <w:t>Ernström</w:t>
-      </w:r>
-      <w:proofErr w:type="spellEnd"/>
-      <w:r>
-        <w:rPr>
-          <w:rFonts w:ascii="Verdana" w:hAnsi="Verdana" w:cs="Arial"/>
-          <w:sz w:val="18"/>
-          <w:szCs w:val="18"/>
-        </w:rPr>
-        <w:t xml:space="preserve"> </w:t>
-      </w:r>
-      <w:proofErr w:type="spellStart"/>
-      <w:r>
-        <w:rPr>
-          <w:rFonts w:ascii="Verdana" w:hAnsi="Verdana" w:cs="Arial"/>
-          <w:sz w:val="18"/>
-          <w:szCs w:val="18"/>
-        </w:rPr>
-        <w:t>Electro</w:t>
-      </w:r>
-      <w:proofErr w:type="spellEnd"/>
-      <w:r>
-        <w:rPr>
-          <w:rFonts w:ascii="Verdana" w:hAnsi="Verdana" w:cs="Arial"/>
-          <w:sz w:val="18"/>
-          <w:szCs w:val="18"/>
-        </w:rPr>
-        <w:t xml:space="preserve"> AS</w:t>
+        <w:t xml:space="preserve">OPPDRAGSGIVER har ansvaret for å Ernström Electro AS alle nødvendige og relevanteopplysninger som er nødvendig for å kunne gi et komplett tilbud på forespørselen. Herunder grensesnittet til andre sidestilte entreprenører.Det forutsettes at oppdraget har en klar funksjonsbeskrivelse. Merkostnader som følge av mangelfulle eller uriktige opplysninger kan kreves dekket som tillegg. </w:t>
+      </w:r>
+      <w:r>
+        <w:rPr>
+          <w:rFonts w:ascii="Verdana" w:hAnsi="Verdana" w:cs="Arial"/>
+          <w:sz w:val="18"/>
+          <w:szCs w:val="18"/>
+        </w:rPr>
+        <w:t>Ernström Electro AS</w:t>
       </w:r>
       <w:r>
         <w:rPr>
@@ -5248,16 +4186,71 @@
           <w:szCs w:val="18"/>
         </w:rPr>
       </w:pPr>
-      <w:proofErr w:type="spellStart"/>
-      <w:r>
-        <w:rPr>
-          <w:rFonts w:ascii="Verdana" w:hAnsi="Verdana" w:cs="Arial"/>
-          <w:sz w:val="18"/>
-          <w:szCs w:val="18"/>
-        </w:rPr>
-        <w:t>Ernström</w:t>
-      </w:r>
-      <w:proofErr w:type="spellEnd"/>
+      <w:r>
+        <w:rPr>
+          <w:rFonts w:ascii="Verdana" w:hAnsi="Verdana" w:cs="Arial"/>
+          <w:sz w:val="18"/>
+          <w:szCs w:val="18"/>
+        </w:rPr>
+        <w:t xml:space="preserve">Ernström Electro AS forholder seg til den fremdriftsplan som er lagt ved kontrakten eller som er utarbeidet iht. NS 8417 pkt. 21.2 (4 uker etter kontraktsignatur) og kan kreve tillegg for endringer fra denne. Eventuell forsering fra avtalt fremdrift forutsetter skriftlig endringsordre. </w:t>
+      </w:r>
+    </w:p>
+    <w:p>
+      <w:pPr>
+        <w:pStyle w:val="Overskrift2"/>
+      </w:pPr>
+      <w:r>
+        <w:t>5. TILLEGG OG ENDRINGER</w:t>
+      </w:r>
+    </w:p>
+    <w:p>
+      <w:pPr>
+        <w:rPr>
+          <w:rFonts w:ascii="Verdana" w:hAnsi="Verdana" w:cs="Arial"/>
+          <w:sz w:val="18"/>
+          <w:szCs w:val="18"/>
+        </w:rPr>
+      </w:pPr>
+      <w:r>
+        <w:rPr>
+          <w:rFonts w:ascii="Verdana" w:hAnsi="Verdana" w:cs="Arial"/>
+          <w:sz w:val="18"/>
+          <w:szCs w:val="18"/>
+        </w:rPr>
+        <w:t>Ernström Electro AS plikter å varsle endringer og tillegg iht. NS 8417 pkt. 31.1. Krav om forsering av fremdrift forutsettes fremmet som endringsordre, jf. 31.3.</w:t>
+      </w:r>
+      <w:r>
+        <w:rPr>
+          <w:rFonts w:ascii="Verdana" w:hAnsi="Verdana" w:cs="Arial"/>
+          <w:sz w:val="18"/>
+          <w:szCs w:val="18"/>
+        </w:rPr>
+        <w:br/>
+      </w:r>
+      <w:r>
+        <w:rPr>
+          <w:rFonts w:ascii="Verdana" w:hAnsi="Verdana" w:cs="Arial"/>
+          <w:sz w:val="18"/>
+          <w:szCs w:val="18"/>
+        </w:rPr>
+        <w:t>I den grad det er begrensninger i henhold til NS 8417 pkt. 32.1 om hvem som kan bestille endringer på vegne av OPPDRAGSGIVER, må det være nedfelt i protokoll eller lignende.</w:t>
+      </w:r>
+      <w:r>
+        <w:rPr>
+          <w:rFonts w:ascii="Verdana" w:hAnsi="Verdana" w:cs="Arial"/>
+          <w:sz w:val="18"/>
+          <w:szCs w:val="18"/>
+        </w:rPr>
+        <w:br/>
+      </w:r>
+      <w:r>
+        <w:rPr>
+          <w:rFonts w:ascii="Verdana" w:hAnsi="Verdana" w:cs="Arial"/>
+          <w:sz w:val="18"/>
+          <w:szCs w:val="18"/>
+        </w:rPr>
+        <w:t>Når Ernström Electro AS har fremmet et krav om endring i tid eller vederlag, anses endringen som akseptert i den grad svar ikke er mottatt innen den svarfrist som er satt. Er det ikke gitt en frist for innsigelser forutsettes eventuelle innsigelser å være mottatt innen 14 kalenderdager.</w:t>
+      </w:r>
       <w:r>
         <w:rPr>
           <w:rFonts w:ascii="Verdana" w:hAnsi="Verdana" w:cs="Arial"/>
@@ -5266,23 +4259,13 @@
         </w:rPr>
         <w:t xml:space="preserve"> </w:t>
       </w:r>
-      <w:proofErr w:type="spellStart"/>
-      <w:r>
-        <w:rPr>
-          <w:rFonts w:ascii="Verdana" w:hAnsi="Verdana" w:cs="Arial"/>
-          <w:sz w:val="18"/>
-          <w:szCs w:val="18"/>
-        </w:rPr>
-        <w:t>Electro</w:t>
-      </w:r>
-      <w:proofErr w:type="spellEnd"/>
-      <w:r>
-        <w:rPr>
-          <w:rFonts w:ascii="Verdana" w:hAnsi="Verdana" w:cs="Arial"/>
-          <w:sz w:val="18"/>
-          <w:szCs w:val="18"/>
-        </w:rPr>
-        <w:t xml:space="preserve"> AS forholder seg til den fremdriftsplan som er lagt ved kontrakten eller som er utarbeidet iht. NS 8417 pkt. 21.2 (4 uker etter kontraktsignatur) og kan kreve tillegg for endringer fra denne. Eventuell forsering fra avtalt fremdrift forutsetter skriftlig endringsordre. </w:t>
+      <w:r>
+        <w:rPr>
+          <w:rFonts w:ascii="Verdana" w:hAnsi="Verdana" w:cs="Arial"/>
+          <w:sz w:val="18"/>
+          <w:szCs w:val="18"/>
+        </w:rPr>
+        <w:t xml:space="preserve">Benyttes web-hotell regnes svarfristen fra den dato endringsvarselet er lagt inn på web-hotellet. </w:t>
       </w:r>
     </w:p>
     <w:p>
@@ -5290,27 +4273,25 @@
         <w:pStyle w:val="Overskrift2"/>
       </w:pPr>
       <w:r>
-        <w:t>5. TILLEGG OG ENDRINGER</w:t>
-      </w:r>
-    </w:p>
-    <w:p>
-      <w:pPr>
-        <w:rPr>
-          <w:rFonts w:ascii="Verdana" w:hAnsi="Verdana" w:cs="Arial"/>
-          <w:sz w:val="18"/>
-          <w:szCs w:val="18"/>
-        </w:rPr>
-      </w:pPr>
-      <w:proofErr w:type="spellStart"/>
-      <w:r>
-        <w:rPr>
-          <w:rFonts w:ascii="Verdana" w:hAnsi="Verdana" w:cs="Arial"/>
-          <w:sz w:val="18"/>
-          <w:szCs w:val="18"/>
-        </w:rPr>
-        <w:t>Ernström</w:t>
-      </w:r>
-      <w:proofErr w:type="spellEnd"/>
+        <w:t>6. FAKTURERING OG BETALING</w:t>
+      </w:r>
+    </w:p>
+    <w:p>
+      <w:pPr>
+        <w:rPr>
+          <w:rFonts w:ascii="Verdana" w:hAnsi="Verdana" w:cs="Arial"/>
+          <w:sz w:val="18"/>
+          <w:szCs w:val="18"/>
+        </w:rPr>
+      </w:pPr>
+      <w:r>
+        <w:rPr>
+          <w:rFonts w:ascii="Verdana" w:hAnsi="Verdana" w:cs="Arial"/>
+          <w:sz w:val="18"/>
+          <w:szCs w:val="18"/>
+        </w:rPr>
+        <w:t>Oppdraget faktureres i henhold til fremdrift med</w:t>
+      </w:r>
       <w:r>
         <w:rPr>
           <w:rFonts w:ascii="Verdana" w:hAnsi="Verdana" w:cs="Arial"/>
@@ -5319,23 +4300,29 @@
         </w:rPr>
         <w:t xml:space="preserve"> </w:t>
       </w:r>
-      <w:proofErr w:type="spellStart"/>
-      <w:r>
-        <w:rPr>
-          <w:rFonts w:ascii="Verdana" w:hAnsi="Verdana" w:cs="Arial"/>
-          <w:sz w:val="18"/>
-          <w:szCs w:val="18"/>
-        </w:rPr>
-        <w:t>Electro</w:t>
-      </w:r>
-      <w:proofErr w:type="spellEnd"/>
-      <w:r>
-        <w:rPr>
-          <w:rFonts w:ascii="Verdana" w:hAnsi="Verdana" w:cs="Arial"/>
-          <w:sz w:val="18"/>
-          <w:szCs w:val="18"/>
-        </w:rPr>
-        <w:t xml:space="preserve"> AS plikter å varsle endringer og tillegg iht. NS 8417 pkt. 31.1. Krav om forsering av fremdrift forutsettes fremmet som endringsordre, jf. 31.3.</w:t>
+      <w:r>
+        <w:rPr>
+          <w:rFonts w:ascii="Verdana" w:hAnsi="Verdana" w:cs="Arial"/>
+          <w:sz w:val="18"/>
+          <w:szCs w:val="18"/>
+        </w:rPr>
+        <w:t xml:space="preserve">mindre det er avtalt en betalingsplan. Ernström Electro AS forbeholder seg rett til å a konto-fakturere 50% ved bestilling. Ved betalingsmislighold har MCS Elektrotavler Øst AS rett til å stanse arbeidene og har ikke ansvar for eventuelle merkostnader som følge av en berettiget stans. Ved betalingsmislighold utover 14 dager har </w:t>
+      </w:r>
+      <w:r>
+        <w:rPr>
+          <w:rFonts w:ascii="Verdana" w:hAnsi="Verdana" w:cs="Arial"/>
+          <w:sz w:val="18"/>
+          <w:szCs w:val="18"/>
+        </w:rPr>
+        <w:t xml:space="preserve">Ernström Electro AS </w:t>
+      </w:r>
+      <w:r>
+        <w:rPr>
+          <w:rFonts w:ascii="Verdana" w:hAnsi="Verdana" w:cs="Arial"/>
+          <w:sz w:val="18"/>
+          <w:szCs w:val="18"/>
+        </w:rPr>
+        <w:t>rett til å heve kontrakten og kreveerstatning.</w:t>
       </w:r>
       <w:r>
         <w:rPr>
@@ -5351,7 +4338,32 @@
           <w:sz w:val="18"/>
           <w:szCs w:val="18"/>
         </w:rPr>
-        <w:t>I den grad det er begrensninger i henhold til NS 8417 pkt. 32.1 om hvem som kan bestille endringer på vegne av OPPDRAGSGIVER, må det være nedfelt i protokoll eller lignende.</w:t>
+        <w:t xml:space="preserve">Det tillates ikke motregning mot annet mellomværende med mindre det skriftlig er avtalt. </w:t>
+      </w:r>
+    </w:p>
+    <w:p>
+      <w:pPr>
+        <w:pStyle w:val="Overskrift2"/>
+      </w:pPr>
+      <w:r>
+        <w:t>7. AVSLUTNING AV PROSJEKTET. OVERTAGELSE</w:t>
+      </w:r>
+    </w:p>
+    <w:p>
+      <w:pPr>
+        <w:rPr>
+          <w:rFonts w:ascii="Verdana" w:hAnsi="Verdana" w:cs="Arial"/>
+          <w:sz w:val="18"/>
+          <w:szCs w:val="18"/>
+        </w:rPr>
+      </w:pPr>
+      <w:r>
+        <w:rPr>
+          <w:rFonts w:ascii="Verdana" w:hAnsi="Verdana" w:cs="Arial"/>
+          <w:sz w:val="18"/>
+          <w:szCs w:val="18"/>
+        </w:rPr>
+        <w:t>Registreringsforretning iht. NS 8417 pkt. 36.4 skjer</w:t>
       </w:r>
       <w:r>
         <w:rPr>
@@ -5367,59 +4379,23 @@
           <w:sz w:val="18"/>
           <w:szCs w:val="18"/>
         </w:rPr>
-        <w:t xml:space="preserve">Når </w:t>
-      </w:r>
-      <w:proofErr w:type="spellStart"/>
-      <w:r>
-        <w:rPr>
-          <w:rFonts w:ascii="Verdana" w:hAnsi="Verdana" w:cs="Arial"/>
-          <w:sz w:val="18"/>
-          <w:szCs w:val="18"/>
-        </w:rPr>
-        <w:t>Ernström</w:t>
-      </w:r>
-      <w:proofErr w:type="spellEnd"/>
-      <w:r>
-        <w:rPr>
-          <w:rFonts w:ascii="Verdana" w:hAnsi="Verdana" w:cs="Arial"/>
-          <w:sz w:val="18"/>
-          <w:szCs w:val="18"/>
-        </w:rPr>
-        <w:t xml:space="preserve"> </w:t>
-      </w:r>
-      <w:proofErr w:type="spellStart"/>
-      <w:r>
-        <w:rPr>
-          <w:rFonts w:ascii="Verdana" w:hAnsi="Verdana" w:cs="Arial"/>
-          <w:sz w:val="18"/>
-          <w:szCs w:val="18"/>
-        </w:rPr>
-        <w:t>Electro</w:t>
-      </w:r>
-      <w:proofErr w:type="spellEnd"/>
-      <w:r>
-        <w:rPr>
-          <w:rFonts w:ascii="Verdana" w:hAnsi="Verdana" w:cs="Arial"/>
-          <w:sz w:val="18"/>
-          <w:szCs w:val="18"/>
-        </w:rPr>
-        <w:t xml:space="preserve"> AS har fremmet et krav om endring i tid eller vederlag, anses endringen som akseptert i den grad svar ikke er mottatt innen den svarfrist som er satt. Er det ikke gitt en frist for innsigelser forutsettes eventuelle innsigelser å være mottatt innen 14 kalenderdager.</w:t>
-      </w:r>
-      <w:r>
-        <w:rPr>
-          <w:rFonts w:ascii="Verdana" w:hAnsi="Verdana" w:cs="Arial"/>
-          <w:sz w:val="18"/>
-          <w:szCs w:val="18"/>
-        </w:rPr>
-        <w:t xml:space="preserve"> </w:t>
-      </w:r>
-      <w:r>
-        <w:rPr>
-          <w:rFonts w:ascii="Verdana" w:hAnsi="Verdana" w:cs="Arial"/>
-          <w:sz w:val="18"/>
-          <w:szCs w:val="18"/>
-        </w:rPr>
-        <w:t xml:space="preserve">Benyttes web-hotell regnes svarfristen fra den dato endringsvarselet er lagt inn på web-hotellet. </w:t>
+        <w:t>ved at Ernström Electro AS avtaler med OPPDRAGSGIVER et omforent tidspunkt som ikke er lengre enn 5 arbeidsdager frem i tid.</w:t>
+      </w:r>
+      <w:r>
+        <w:rPr>
+          <w:rFonts w:ascii="Verdana" w:hAnsi="Verdana" w:cs="Arial"/>
+          <w:sz w:val="18"/>
+          <w:szCs w:val="18"/>
+        </w:rPr>
+        <w:br/>
+      </w:r>
+      <w:r>
+        <w:rPr>
+          <w:rFonts w:ascii="Verdana" w:hAnsi="Verdana" w:cs="Arial"/>
+          <w:sz w:val="18"/>
+          <w:szCs w:val="18"/>
+        </w:rPr>
+        <w:t xml:space="preserve">Ernström Electro AS fremlegger FDV-dokumentasjon senest ved registreringsforretningen. </w:t>
       </w:r>
     </w:p>
     <w:p>
@@ -5427,120 +4403,24 @@
         <w:pStyle w:val="Overskrift2"/>
       </w:pPr>
       <w:r>
-        <w:t>6. FAKTURERING OG BETALING</w:t>
-      </w:r>
-    </w:p>
-    <w:p>
-      <w:pPr>
-        <w:rPr>
-          <w:rFonts w:ascii="Verdana" w:hAnsi="Verdana" w:cs="Arial"/>
-          <w:sz w:val="18"/>
-          <w:szCs w:val="18"/>
-        </w:rPr>
-      </w:pPr>
-      <w:r>
-        <w:rPr>
-          <w:rFonts w:ascii="Verdana" w:hAnsi="Verdana" w:cs="Arial"/>
-          <w:sz w:val="18"/>
-          <w:szCs w:val="18"/>
-        </w:rPr>
-        <w:t>Oppdraget faktureres i henhold til fremdrift med</w:t>
-      </w:r>
-      <w:r>
-        <w:rPr>
-          <w:rFonts w:ascii="Verdana" w:hAnsi="Verdana" w:cs="Arial"/>
-          <w:sz w:val="18"/>
-          <w:szCs w:val="18"/>
-        </w:rPr>
-        <w:t xml:space="preserve"> </w:t>
-      </w:r>
-      <w:r>
-        <w:rPr>
-          <w:rFonts w:ascii="Verdana" w:hAnsi="Verdana" w:cs="Arial"/>
-          <w:sz w:val="18"/>
-          <w:szCs w:val="18"/>
-        </w:rPr>
-        <w:t xml:space="preserve">mindre det er avtalt en betalingsplan. </w:t>
-      </w:r>
-      <w:proofErr w:type="spellStart"/>
-      <w:r>
-        <w:rPr>
-          <w:rFonts w:ascii="Verdana" w:hAnsi="Verdana" w:cs="Arial"/>
-          <w:sz w:val="18"/>
-          <w:szCs w:val="18"/>
-        </w:rPr>
-        <w:t>Ernström</w:t>
-      </w:r>
-      <w:proofErr w:type="spellEnd"/>
-      <w:r>
-        <w:rPr>
-          <w:rFonts w:ascii="Verdana" w:hAnsi="Verdana" w:cs="Arial"/>
-          <w:sz w:val="18"/>
-          <w:szCs w:val="18"/>
-        </w:rPr>
-        <w:t xml:space="preserve"> </w:t>
-      </w:r>
-      <w:proofErr w:type="spellStart"/>
-      <w:r>
-        <w:rPr>
-          <w:rFonts w:ascii="Verdana" w:hAnsi="Verdana" w:cs="Arial"/>
-          <w:sz w:val="18"/>
-          <w:szCs w:val="18"/>
-        </w:rPr>
-        <w:t>Electro</w:t>
-      </w:r>
-      <w:proofErr w:type="spellEnd"/>
-      <w:r>
-        <w:rPr>
-          <w:rFonts w:ascii="Verdana" w:hAnsi="Verdana" w:cs="Arial"/>
-          <w:sz w:val="18"/>
-          <w:szCs w:val="18"/>
-        </w:rPr>
-        <w:t xml:space="preserve"> AS forbeholder seg rett til å a konto-fakturere 50% ved bestilling. Ved betalingsmislighold har MCS Elektrotavler Øst AS rett til å stanse arbeidene og har ikke ansvar for eventuelle merkostnader som følge av en berettiget stans. Ved betalingsmislighold utover 14 dager har </w:t>
-      </w:r>
-      <w:proofErr w:type="spellStart"/>
-      <w:r>
-        <w:rPr>
-          <w:rFonts w:ascii="Verdana" w:hAnsi="Verdana" w:cs="Arial"/>
-          <w:sz w:val="18"/>
-          <w:szCs w:val="18"/>
-        </w:rPr>
-        <w:t>Ernström</w:t>
-      </w:r>
-      <w:proofErr w:type="spellEnd"/>
-      <w:r>
-        <w:rPr>
-          <w:rFonts w:ascii="Verdana" w:hAnsi="Verdana" w:cs="Arial"/>
-          <w:sz w:val="18"/>
-          <w:szCs w:val="18"/>
-        </w:rPr>
-        <w:t xml:space="preserve"> </w:t>
-      </w:r>
-      <w:proofErr w:type="spellStart"/>
-      <w:r>
-        <w:rPr>
-          <w:rFonts w:ascii="Verdana" w:hAnsi="Verdana" w:cs="Arial"/>
-          <w:sz w:val="18"/>
-          <w:szCs w:val="18"/>
-        </w:rPr>
-        <w:t>Electro</w:t>
-      </w:r>
-      <w:proofErr w:type="spellEnd"/>
-      <w:r>
-        <w:rPr>
-          <w:rFonts w:ascii="Verdana" w:hAnsi="Verdana" w:cs="Arial"/>
-          <w:sz w:val="18"/>
-          <w:szCs w:val="18"/>
-        </w:rPr>
-        <w:t xml:space="preserve"> AS </w:t>
-      </w:r>
-      <w:r>
-        <w:rPr>
-          <w:rFonts w:ascii="Verdana" w:hAnsi="Verdana" w:cs="Arial"/>
-          <w:sz w:val="18"/>
-          <w:szCs w:val="18"/>
-        </w:rPr>
-        <w:t>rett til å heve kontrakten og kreveerstatning.</w:t>
+        <w:t>8. REKLAMASJON</w:t>
+      </w:r>
+    </w:p>
+    <w:p>
+      <w:pPr>
+        <w:rPr>
+          <w:rFonts w:ascii="Verdana" w:hAnsi="Verdana" w:cs="Arial"/>
+          <w:sz w:val="18"/>
+          <w:szCs w:val="18"/>
+        </w:rPr>
+      </w:pPr>
+      <w:r>
+        <w:rPr>
+          <w:rFonts w:ascii="Verdana" w:hAnsi="Verdana" w:cs="Arial"/>
+          <w:sz w:val="18"/>
+          <w:szCs w:val="18"/>
+        </w:rPr>
+        <w:t>Reklamasjoner etter overtagelse</w:t>
       </w:r>
       <w:r>
         <w:rPr>
@@ -5556,7 +4436,23 @@
           <w:sz w:val="18"/>
           <w:szCs w:val="18"/>
         </w:rPr>
-        <w:t xml:space="preserve">Det tillates ikke motregning mot annet mellomværende med mindre det skriftlig er avtalt. </w:t>
+        <w:t>forutsettes fremsatt senest innen én måned etter at det kunne vært reklamert, jf. NS 8417 pkt. 42.2.2. Senere reklamasjoner kan kreves avvist.</w:t>
+      </w:r>
+      <w:r>
+        <w:rPr>
+          <w:rFonts w:ascii="Verdana" w:hAnsi="Verdana" w:cs="Arial"/>
+          <w:sz w:val="18"/>
+          <w:szCs w:val="18"/>
+        </w:rPr>
+        <w:br/>
+      </w:r>
+      <w:r>
+        <w:rPr>
+          <w:rFonts w:ascii="Verdana" w:hAnsi="Verdana" w:cs="Arial"/>
+          <w:sz w:val="18"/>
+          <w:szCs w:val="18"/>
+        </w:rPr>
+        <w:t>Ernström Electro AS har rett til å utbedre eventuelle berettigede reklamasjoner. Slik utbedring skal skje innen rimelig tid etter at mangelen er reklamert og ansvarsforholdet er klarlagt.</w:t>
       </w:r>
     </w:p>
     <w:p>
@@ -5564,24 +4460,24 @@
         <w:pStyle w:val="Overskrift2"/>
       </w:pPr>
       <w:r>
-        <w:t>7. AVSLUTNING AV PROSJEKTET. OVERTAGELSE</w:t>
-      </w:r>
-    </w:p>
-    <w:p>
-      <w:pPr>
-        <w:rPr>
-          <w:rFonts w:ascii="Verdana" w:hAnsi="Verdana" w:cs="Arial"/>
-          <w:sz w:val="18"/>
-          <w:szCs w:val="18"/>
-        </w:rPr>
-      </w:pPr>
-      <w:r>
-        <w:rPr>
-          <w:rFonts w:ascii="Verdana" w:hAnsi="Verdana" w:cs="Arial"/>
-          <w:sz w:val="18"/>
-          <w:szCs w:val="18"/>
-        </w:rPr>
-        <w:t>Registreringsforretning iht. NS 8417 pkt. 36.4 skjer</w:t>
+        <w:t>9. ERSTATNING</w:t>
+      </w:r>
+    </w:p>
+    <w:p>
+      <w:pPr>
+        <w:rPr>
+          <w:rFonts w:ascii="Verdana" w:hAnsi="Verdana" w:cs="Arial"/>
+          <w:sz w:val="18"/>
+          <w:szCs w:val="18"/>
+        </w:rPr>
+      </w:pPr>
+      <w:r>
+        <w:rPr>
+          <w:rFonts w:ascii="Verdana" w:hAnsi="Verdana" w:cs="Arial"/>
+          <w:sz w:val="18"/>
+          <w:szCs w:val="18"/>
+        </w:rPr>
+        <w:t>Ernström Electro AS har ikke ansvar for skader utover å utbedre med mindre OPPDRAGSGIVER kan påvise at skaden skyldes utvist uaktsomhet fra Ernström Electro AS.</w:t>
       </w:r>
       <w:r>
         <w:rPr>
@@ -5597,313 +4493,7 @@
           <w:sz w:val="18"/>
           <w:szCs w:val="18"/>
         </w:rPr>
-        <w:t xml:space="preserve">ved at </w:t>
-      </w:r>
-      <w:proofErr w:type="spellStart"/>
-      <w:r>
-        <w:rPr>
-          <w:rFonts w:ascii="Verdana" w:hAnsi="Verdana" w:cs="Arial"/>
-          <w:sz w:val="18"/>
-          <w:szCs w:val="18"/>
-        </w:rPr>
-        <w:t>Ernström</w:t>
-      </w:r>
-      <w:proofErr w:type="spellEnd"/>
-      <w:r>
-        <w:rPr>
-          <w:rFonts w:ascii="Verdana" w:hAnsi="Verdana" w:cs="Arial"/>
-          <w:sz w:val="18"/>
-          <w:szCs w:val="18"/>
-        </w:rPr>
-        <w:t xml:space="preserve"> </w:t>
-      </w:r>
-      <w:proofErr w:type="spellStart"/>
-      <w:r>
-        <w:rPr>
-          <w:rFonts w:ascii="Verdana" w:hAnsi="Verdana" w:cs="Arial"/>
-          <w:sz w:val="18"/>
-          <w:szCs w:val="18"/>
-        </w:rPr>
-        <w:t>Electro</w:t>
-      </w:r>
-      <w:proofErr w:type="spellEnd"/>
-      <w:r>
-        <w:rPr>
-          <w:rFonts w:ascii="Verdana" w:hAnsi="Verdana" w:cs="Arial"/>
-          <w:sz w:val="18"/>
-          <w:szCs w:val="18"/>
-        </w:rPr>
-        <w:t xml:space="preserve"> AS avtaler med OPPDRAGSGIVER et omforent tidspunkt som ikke er lengre enn 5 arbeidsdager frem i tid.</w:t>
-      </w:r>
-      <w:r>
-        <w:rPr>
-          <w:rFonts w:ascii="Verdana" w:hAnsi="Verdana" w:cs="Arial"/>
-          <w:sz w:val="18"/>
-          <w:szCs w:val="18"/>
-        </w:rPr>
-        <w:br/>
-      </w:r>
-      <w:proofErr w:type="spellStart"/>
-      <w:r>
-        <w:rPr>
-          <w:rFonts w:ascii="Verdana" w:hAnsi="Verdana" w:cs="Arial"/>
-          <w:sz w:val="18"/>
-          <w:szCs w:val="18"/>
-        </w:rPr>
-        <w:t>Ernström</w:t>
-      </w:r>
-      <w:proofErr w:type="spellEnd"/>
-      <w:r>
-        <w:rPr>
-          <w:rFonts w:ascii="Verdana" w:hAnsi="Verdana" w:cs="Arial"/>
-          <w:sz w:val="18"/>
-          <w:szCs w:val="18"/>
-        </w:rPr>
-        <w:t xml:space="preserve"> </w:t>
-      </w:r>
-      <w:proofErr w:type="spellStart"/>
-      <w:r>
-        <w:rPr>
-          <w:rFonts w:ascii="Verdana" w:hAnsi="Verdana" w:cs="Arial"/>
-          <w:sz w:val="18"/>
-          <w:szCs w:val="18"/>
-        </w:rPr>
-        <w:t>Electro</w:t>
-      </w:r>
-      <w:proofErr w:type="spellEnd"/>
-      <w:r>
-        <w:rPr>
-          <w:rFonts w:ascii="Verdana" w:hAnsi="Verdana" w:cs="Arial"/>
-          <w:sz w:val="18"/>
-          <w:szCs w:val="18"/>
-        </w:rPr>
-        <w:t xml:space="preserve"> AS fremlegger FDV-dokumentasjon senest ved registreringsforretningen. </w:t>
-      </w:r>
-    </w:p>
-    <w:p>
-      <w:pPr>
-        <w:pStyle w:val="Overskrift2"/>
-      </w:pPr>
-      <w:r>
-        <w:t>8. REKLAMASJON</w:t>
-      </w:r>
-    </w:p>
-    <w:p>
-      <w:pPr>
-        <w:rPr>
-          <w:rFonts w:ascii="Verdana" w:hAnsi="Verdana" w:cs="Arial"/>
-          <w:sz w:val="18"/>
-          <w:szCs w:val="18"/>
-        </w:rPr>
-      </w:pPr>
-      <w:r>
-        <w:rPr>
-          <w:rFonts w:ascii="Verdana" w:hAnsi="Verdana" w:cs="Arial"/>
-          <w:sz w:val="18"/>
-          <w:szCs w:val="18"/>
-        </w:rPr>
-        <w:t>Reklamasjoner etter overtagelse</w:t>
-      </w:r>
-      <w:r>
-        <w:rPr>
-          <w:rFonts w:ascii="Verdana" w:hAnsi="Verdana" w:cs="Arial"/>
-          <w:sz w:val="18"/>
-          <w:szCs w:val="18"/>
-        </w:rPr>
-        <w:br/>
-      </w:r>
-      <w:r>
-        <w:rPr>
-          <w:rFonts w:ascii="Verdana" w:hAnsi="Verdana" w:cs="Arial"/>
-          <w:sz w:val="18"/>
-          <w:szCs w:val="18"/>
-        </w:rPr>
-        <w:t>forutsettes fremsatt senest innen én måned etter at det kunne vært reklamert, jf. NS 8417 pkt. 42.2.2. Senere reklamasjoner kan kreves avvist.</w:t>
-      </w:r>
-      <w:r>
-        <w:rPr>
-          <w:rFonts w:ascii="Verdana" w:hAnsi="Verdana" w:cs="Arial"/>
-          <w:sz w:val="18"/>
-          <w:szCs w:val="18"/>
-        </w:rPr>
-        <w:br/>
-      </w:r>
-      <w:proofErr w:type="spellStart"/>
-      <w:r>
-        <w:rPr>
-          <w:rFonts w:ascii="Verdana" w:hAnsi="Verdana" w:cs="Arial"/>
-          <w:sz w:val="18"/>
-          <w:szCs w:val="18"/>
-        </w:rPr>
-        <w:t>Ernström</w:t>
-      </w:r>
-      <w:proofErr w:type="spellEnd"/>
-      <w:r>
-        <w:rPr>
-          <w:rFonts w:ascii="Verdana" w:hAnsi="Verdana" w:cs="Arial"/>
-          <w:sz w:val="18"/>
-          <w:szCs w:val="18"/>
-        </w:rPr>
-        <w:t xml:space="preserve"> </w:t>
-      </w:r>
-      <w:proofErr w:type="spellStart"/>
-      <w:r>
-        <w:rPr>
-          <w:rFonts w:ascii="Verdana" w:hAnsi="Verdana" w:cs="Arial"/>
-          <w:sz w:val="18"/>
-          <w:szCs w:val="18"/>
-        </w:rPr>
-        <w:t>Electro</w:t>
-      </w:r>
-      <w:proofErr w:type="spellEnd"/>
-      <w:r>
-        <w:rPr>
-          <w:rFonts w:ascii="Verdana" w:hAnsi="Verdana" w:cs="Arial"/>
-          <w:sz w:val="18"/>
-          <w:szCs w:val="18"/>
-        </w:rPr>
-        <w:t xml:space="preserve"> AS har rett til å utbedre eventuelle berettigede reklamasjoner. Slik utbedring skal skje innen rimelig tid etter at mangelen er reklamert og ansvarsforholdet er klarlagt.</w:t>
-      </w:r>
-    </w:p>
-    <w:p>
-      <w:pPr>
-        <w:pStyle w:val="Overskrift2"/>
-      </w:pPr>
-      <w:r>
-        <w:t>9. ERSTATNING</w:t>
-      </w:r>
-    </w:p>
-    <w:p>
-      <w:pPr>
-        <w:rPr>
-          <w:rFonts w:ascii="Verdana" w:hAnsi="Verdana" w:cs="Arial"/>
-          <w:sz w:val="18"/>
-          <w:szCs w:val="18"/>
-        </w:rPr>
-      </w:pPr>
-      <w:proofErr w:type="spellStart"/>
-      <w:r>
-        <w:rPr>
-          <w:rFonts w:ascii="Verdana" w:hAnsi="Verdana" w:cs="Arial"/>
-          <w:sz w:val="18"/>
-          <w:szCs w:val="18"/>
-        </w:rPr>
-        <w:t>Ernström</w:t>
-      </w:r>
-      <w:proofErr w:type="spellEnd"/>
-      <w:r>
-        <w:rPr>
-          <w:rFonts w:ascii="Verdana" w:hAnsi="Verdana" w:cs="Arial"/>
-          <w:sz w:val="18"/>
-          <w:szCs w:val="18"/>
-        </w:rPr>
-        <w:t xml:space="preserve"> </w:t>
-      </w:r>
-      <w:proofErr w:type="spellStart"/>
-      <w:r>
-        <w:rPr>
-          <w:rFonts w:ascii="Verdana" w:hAnsi="Verdana" w:cs="Arial"/>
-          <w:sz w:val="18"/>
-          <w:szCs w:val="18"/>
-        </w:rPr>
-        <w:t>Electro</w:t>
-      </w:r>
-      <w:proofErr w:type="spellEnd"/>
-      <w:r>
-        <w:rPr>
-          <w:rFonts w:ascii="Verdana" w:hAnsi="Verdana" w:cs="Arial"/>
-          <w:sz w:val="18"/>
-          <w:szCs w:val="18"/>
-        </w:rPr>
-        <w:t xml:space="preserve"> AS har ikke ansvar for skader utover å utbedre med mindre OPPDRAGSGIVER kan påvise at skaden skyldes utvist uaktsomhet fra </w:t>
-      </w:r>
-      <w:proofErr w:type="spellStart"/>
-      <w:r>
-        <w:rPr>
-          <w:rFonts w:ascii="Verdana" w:hAnsi="Verdana" w:cs="Arial"/>
-          <w:sz w:val="18"/>
-          <w:szCs w:val="18"/>
-        </w:rPr>
-        <w:t>Ernström</w:t>
-      </w:r>
-      <w:proofErr w:type="spellEnd"/>
-      <w:r>
-        <w:rPr>
-          <w:rFonts w:ascii="Verdana" w:hAnsi="Verdana" w:cs="Arial"/>
-          <w:sz w:val="18"/>
-          <w:szCs w:val="18"/>
-        </w:rPr>
-        <w:t xml:space="preserve"> </w:t>
-      </w:r>
-      <w:proofErr w:type="spellStart"/>
-      <w:r>
-        <w:rPr>
-          <w:rFonts w:ascii="Verdana" w:hAnsi="Verdana" w:cs="Arial"/>
-          <w:sz w:val="18"/>
-          <w:szCs w:val="18"/>
-        </w:rPr>
-        <w:t>Electro</w:t>
-      </w:r>
-      <w:proofErr w:type="spellEnd"/>
-      <w:r>
-        <w:rPr>
-          <w:rFonts w:ascii="Verdana" w:hAnsi="Verdana" w:cs="Arial"/>
-          <w:sz w:val="18"/>
-          <w:szCs w:val="18"/>
-        </w:rPr>
-        <w:t xml:space="preserve"> AS.</w:t>
-      </w:r>
-      <w:r>
-        <w:rPr>
-          <w:rFonts w:ascii="Verdana" w:hAnsi="Verdana" w:cs="Arial"/>
-          <w:sz w:val="18"/>
-          <w:szCs w:val="18"/>
-        </w:rPr>
-        <w:br/>
-      </w:r>
-      <w:r>
-        <w:rPr>
-          <w:rFonts w:ascii="Verdana" w:hAnsi="Verdana" w:cs="Arial"/>
-          <w:sz w:val="18"/>
-          <w:szCs w:val="18"/>
-        </w:rPr>
-        <w:t xml:space="preserve">Under enhver omstendighet begrenses det erstatningsansvaret </w:t>
-      </w:r>
-      <w:proofErr w:type="spellStart"/>
-      <w:r>
-        <w:rPr>
-          <w:rFonts w:ascii="Verdana" w:hAnsi="Verdana" w:cs="Arial"/>
-          <w:sz w:val="18"/>
-          <w:szCs w:val="18"/>
-        </w:rPr>
-        <w:t>Ernström</w:t>
-      </w:r>
-      <w:proofErr w:type="spellEnd"/>
-      <w:r>
-        <w:rPr>
-          <w:rFonts w:ascii="Verdana" w:hAnsi="Verdana" w:cs="Arial"/>
-          <w:sz w:val="18"/>
-          <w:szCs w:val="18"/>
-        </w:rPr>
-        <w:t xml:space="preserve"> </w:t>
-      </w:r>
-      <w:proofErr w:type="spellStart"/>
-      <w:r>
-        <w:rPr>
-          <w:rFonts w:ascii="Verdana" w:hAnsi="Verdana" w:cs="Arial"/>
-          <w:sz w:val="18"/>
-          <w:szCs w:val="18"/>
-        </w:rPr>
-        <w:t>Electro</w:t>
-      </w:r>
-      <w:proofErr w:type="spellEnd"/>
-      <w:r>
-        <w:rPr>
-          <w:rFonts w:ascii="Verdana" w:hAnsi="Verdana" w:cs="Arial"/>
-          <w:sz w:val="18"/>
-          <w:szCs w:val="18"/>
-        </w:rPr>
-        <w:t xml:space="preserve"> AS måtte ha oppad til kontraktsummen med mindre erstatningskravet er oppstått som følge av grov uaktsomhet.</w:t>
+        <w:t>Under enhver omstendighet begrenses det erstatningsansvaret Ernström Electro AS måtte ha oppad til kontraktsummen med mindre erstatningskravet er oppstått som følge av grov uaktsomhet.</w:t>
       </w:r>
     </w:p>
     <w:p>
@@ -9408,7 +7998,7 @@
 </file>
 
 <file path=word/endnotes.xml><?xml version="1.0" encoding="utf-8"?>
-<w:endnotes xmlns:wpc="http://schemas.microsoft.com/office/word/2010/wordprocessingCanvas" xmlns:cx="http://schemas.microsoft.com/office/drawing/2014/chartex" xmlns:cx1="http://schemas.microsoft.com/office/drawing/2015/9/8/chartex" xmlns:cx2="http://schemas.microsoft.com/office/drawing/2015/10/21/chartex" xmlns:cx3="http://schemas.microsoft.com/office/drawing/2016/5/9/chartex" xmlns:cx4="http://schemas.microsoft.com/office/drawing/2016/5/10/chartex" xmlns:cx5="http://schemas.microsoft.com/office/drawing/2016/5/11/chartex" xmlns:cx6="http://schemas.microsoft.com/office/drawing/2016/5/12/chartex" xmlns:cx7="http://schemas.microsoft.com/office/drawing/2016/5/13/chartex" xmlns:cx8="http://schemas.microsoft.com/office/drawing/2016/5/14/chartex" xmlns:mc="http://schemas.openxmlformats.org/markup-compatibility/2006" xmlns:aink="http://schemas.microsoft.com/office/drawing/2016/ink" xmlns:am3d="http://schemas.microsoft.com/office/drawing/2017/model3d" xmlns:o="urn:schemas-microsoft-com:office:office" xmlns:oel="http://schemas.microsoft.com/office/2019/extlst" xmlns:r="http://schemas.openxmlformats.org/officeDocument/2006/relationships" xmlns:m="http://schemas.openxmlformats.org/officeDocument/2006/math" xmlns:v="urn:schemas-microsoft-com:vml" xmlns:wp14="http://schemas.microsoft.com/office/word/2010/wordprocessingDrawing" xmlns:wp="http://schemas.openxmlformats.org/drawingml/2006/wordprocessingDrawing" xmlns:w10="urn:schemas-microsoft-com:office:word" xmlns:w="http://schemas.openxmlformats.org/wordprocessingml/2006/main" xmlns:w14="http://schemas.microsoft.com/office/word/2010/wordml" xmlns:w15="http://schemas.microsoft.com/office/word/2012/wordml" xmlns:w16cex="http://schemas.microsoft.com/office/word/2018/wordml/cex" xmlns:w16cid="http://schemas.microsoft.com/office/word/2016/wordml/cid" xmlns:w16="http://schemas.microsoft.com/office/word/2018/wordml" xmlns:w16du="http://schemas.microsoft.com/office/word/2023/wordml/word16du" xmlns:w16sdtdh="http://schemas.microsoft.com/office/word/2020/wordml/sdtdatahash" xmlns:w16sdtfl="http://schemas.microsoft.com/office/word/2024/wordml/sdtformatlock" xmlns:w16se="http://schemas.microsoft.com/office/word/2015/wordml/symex" xmlns:wpg="http://schemas.microsoft.com/office/word/2010/wordprocessingGroup" xmlns:wpi="http://schemas.microsoft.com/office/word/2010/wordprocessingInk" xmlns:wne="http://schemas.microsoft.com/office/word/2006/wordml" xmlns:wps="http://schemas.microsoft.com/office/word/2010/wordprocessingShape" mc:Ignorable="w14 w15 w16se w16cid w16 w16cex w16sdtdh w16sdtfl w16du wp14">
+<w:endnotes xmlns:wpc="http://schemas.microsoft.com/office/word/2010/wordprocessingCanvas" xmlns:cx="http://schemas.microsoft.com/office/drawing/2014/chartex" xmlns:cx1="http://schemas.microsoft.com/office/drawing/2015/9/8/chartex" xmlns:cx2="http://schemas.microsoft.com/office/drawing/2015/10/21/chartex" xmlns:cx3="http://schemas.microsoft.com/office/drawing/2016/5/9/chartex" xmlns:cx4="http://schemas.microsoft.com/office/drawing/2016/5/10/chartex" xmlns:cx5="http://schemas.microsoft.com/office/drawing/2016/5/11/chartex" xmlns:cx6="http://schemas.microsoft.com/office/drawing/2016/5/12/chartex" xmlns:cx7="http://schemas.microsoft.com/office/drawing/2016/5/13/chartex" xmlns:cx8="http://schemas.microsoft.com/office/drawing/2016/5/14/chartex" xmlns:mc="http://schemas.openxmlformats.org/markup-compatibility/2006" xmlns:aink="http://schemas.microsoft.com/office/drawing/2016/ink" xmlns:am3d="http://schemas.microsoft.com/office/drawing/2017/model3d" xmlns:o="urn:schemas-microsoft-com:office:office" xmlns:oel="http://schemas.microsoft.com/office/2019/extlst" xmlns:r="http://schemas.openxmlformats.org/officeDocument/2006/relationships" xmlns:m="http://schemas.openxmlformats.org/officeDocument/2006/math" xmlns:v="urn:schemas-microsoft-com:vml" xmlns:wp14="http://schemas.microsoft.com/office/word/2010/wordprocessingDrawing" xmlns:wp="http://schemas.openxmlformats.org/drawingml/2006/wordprocessingDrawing" xmlns:w10="urn:schemas-microsoft-com:office:word" xmlns:w="http://schemas.openxmlformats.org/wordprocessingml/2006/main" xmlns:w14="http://schemas.microsoft.com/office/word/2010/wordml" xmlns:w15="http://schemas.microsoft.com/office/word/2012/wordml" xmlns:w16cei="http://schemas.microsoft.com/office/word/2026/wordml/cei" xmlns:w16cex="http://schemas.microsoft.com/office/word/2018/wordml/cex" xmlns:w16cid="http://schemas.microsoft.com/office/word/2016/wordml/cid" xmlns:w16="http://schemas.microsoft.com/office/word/2018/wordml" xmlns:w16du="http://schemas.microsoft.com/office/word/2023/wordml/word16du" xmlns:w16sdtdh="http://schemas.microsoft.com/office/word/2020/wordml/sdtdatahash" xmlns:w16sdtfl="http://schemas.microsoft.com/office/word/2024/wordml/sdtformatlock" xmlns:w16se="http://schemas.microsoft.com/office/word/2015/wordml/symex" xmlns:wpg="http://schemas.microsoft.com/office/word/2010/wordprocessingGroup" xmlns:wpi="http://schemas.microsoft.com/office/word/2010/wordprocessingInk" xmlns:wne="http://schemas.microsoft.com/office/word/2006/wordml" xmlns:wps="http://schemas.microsoft.com/office/word/2010/wordprocessingShape" mc:Ignorable="w14 w15 w16se w16cid w16 w16cex w16sdtdh w16sdtfl w16du wp14">
   <w:endnote w:type="separator" w:id="-1">
     <w:p>
       <w:pPr>
@@ -9433,7 +8023,7 @@
 </file>
 
 <file path=word/footer1.xml><?xml version="1.0" encoding="utf-8"?>
-<w:ftr xmlns:wpc="http://schemas.microsoft.com/office/word/2010/wordprocessingCanvas" xmlns:cx="http://schemas.microsoft.com/office/drawing/2014/chartex" xmlns:cx1="http://schemas.microsoft.com/office/drawing/2015/9/8/chartex" xmlns:cx2="http://schemas.microsoft.com/office/drawing/2015/10/21/chartex" xmlns:cx3="http://schemas.microsoft.com/office/drawing/2016/5/9/chartex" xmlns:cx4="http://schemas.microsoft.com/office/drawing/2016/5/10/chartex" xmlns:cx5="http://schemas.microsoft.com/office/drawing/2016/5/11/chartex" xmlns:cx6="http://schemas.microsoft.com/office/drawing/2016/5/12/chartex" xmlns:cx7="http://schemas.microsoft.com/office/drawing/2016/5/13/chartex" xmlns:cx8="http://schemas.microsoft.com/office/drawing/2016/5/14/chartex" xmlns:mc="http://schemas.openxmlformats.org/markup-compatibility/2006" xmlns:aink="http://schemas.microsoft.com/office/drawing/2016/ink" xmlns:am3d="http://schemas.microsoft.com/office/drawing/2017/model3d" xmlns:o="urn:schemas-microsoft-com:office:office" xmlns:oel="http://schemas.microsoft.com/office/2019/extlst" xmlns:r="http://schemas.openxmlformats.org/officeDocument/2006/relationships" xmlns:m="http://schemas.openxmlformats.org/officeDocument/2006/math" xmlns:v="urn:schemas-microsoft-com:vml" xmlns:wp14="http://schemas.microsoft.com/office/word/2010/wordprocessingDrawing" xmlns:wp="http://schemas.openxmlformats.org/drawingml/2006/wordprocessingDrawing" xmlns:w10="urn:schemas-microsoft-com:office:word" xmlns:w="http://schemas.openxmlformats.org/wordprocessingml/2006/main" xmlns:w14="http://schemas.microsoft.com/office/word/2010/wordml" xmlns:w15="http://schemas.microsoft.com/office/word/2012/wordml" xmlns:w16cex="http://schemas.microsoft.com/office/word/2018/wordml/cex" xmlns:w16cid="http://schemas.microsoft.com/office/word/2016/wordml/cid" xmlns:w16="http://schemas.microsoft.com/office/word/2018/wordml" xmlns:w16du="http://schemas.microsoft.com/office/word/2023/wordml/word16du" xmlns:w16sdtdh="http://schemas.microsoft.com/office/word/2020/wordml/sdtdatahash" xmlns:w16sdtfl="http://schemas.microsoft.com/office/word/2024/wordml/sdtformatlock" xmlns:w16se="http://schemas.microsoft.com/office/word/2015/wordml/symex" xmlns:wpg="http://schemas.microsoft.com/office/word/2010/wordprocessingGroup" xmlns:wpi="http://schemas.microsoft.com/office/word/2010/wordprocessingInk" xmlns:wne="http://schemas.microsoft.com/office/word/2006/wordml" xmlns:wps="http://schemas.microsoft.com/office/word/2010/wordprocessingShape" mc:Ignorable="w14 w15 w16se w16cid w16 w16cex w16sdtdh w16sdtfl w16du wp14">
+<w:ftr xmlns:wpc="http://schemas.microsoft.com/office/word/2010/wordprocessingCanvas" xmlns:cx="http://schemas.microsoft.com/office/drawing/2014/chartex" xmlns:cx1="http://schemas.microsoft.com/office/drawing/2015/9/8/chartex" xmlns:cx2="http://schemas.microsoft.com/office/drawing/2015/10/21/chartex" xmlns:cx3="http://schemas.microsoft.com/office/drawing/2016/5/9/chartex" xmlns:cx4="http://schemas.microsoft.com/office/drawing/2016/5/10/chartex" xmlns:cx5="http://schemas.microsoft.com/office/drawing/2016/5/11/chartex" xmlns:cx6="http://schemas.microsoft.com/office/drawing/2016/5/12/chartex" xmlns:cx7="http://schemas.microsoft.com/office/drawing/2016/5/13/chartex" xmlns:cx8="http://schemas.microsoft.com/office/drawing/2016/5/14/chartex" xmlns:mc="http://schemas.openxmlformats.org/markup-compatibility/2006" xmlns:aink="http://schemas.microsoft.com/office/drawing/2016/ink" xmlns:am3d="http://schemas.microsoft.com/office/drawing/2017/model3d" xmlns:o="urn:schemas-microsoft-com:office:office" xmlns:oel="http://schemas.microsoft.com/office/2019/extlst" xmlns:r="http://schemas.openxmlformats.org/officeDocument/2006/relationships" xmlns:m="http://schemas.openxmlformats.org/officeDocument/2006/math" xmlns:v="urn:schemas-microsoft-com:vml" xmlns:wp14="http://schemas.microsoft.com/office/word/2010/wordprocessingDrawing" xmlns:wp="http://schemas.openxmlformats.org/drawingml/2006/wordprocessingDrawing" xmlns:w10="urn:schemas-microsoft-com:office:word" xmlns:w="http://schemas.openxmlformats.org/wordprocessingml/2006/main" xmlns:w14="http://schemas.microsoft.com/office/word/2010/wordml" xmlns:w15="http://schemas.microsoft.com/office/word/2012/wordml" xmlns:w16cei="http://schemas.microsoft.com/office/word/2026/wordml/cei" xmlns:w16cex="http://schemas.microsoft.com/office/word/2018/wordml/cex" xmlns:w16cid="http://schemas.microsoft.com/office/word/2016/wordml/cid" xmlns:w16="http://schemas.microsoft.com/office/word/2018/wordml" xmlns:w16du="http://schemas.microsoft.com/office/word/2023/wordml/word16du" xmlns:w16sdtdh="http://schemas.microsoft.com/office/word/2020/wordml/sdtdatahash" xmlns:w16sdtfl="http://schemas.microsoft.com/office/word/2024/wordml/sdtformatlock" xmlns:w16se="http://schemas.microsoft.com/office/word/2015/wordml/symex" xmlns:wpg="http://schemas.microsoft.com/office/word/2010/wordprocessingGroup" xmlns:wpi="http://schemas.microsoft.com/office/word/2010/wordprocessingInk" xmlns:wne="http://schemas.microsoft.com/office/word/2006/wordml" xmlns:wps="http://schemas.microsoft.com/office/word/2010/wordprocessingShape" mc:Ignorable="w14 w15 w16se w16cid w16 w16cex w16sdtdh w16sdtfl w16du wp14">
   <w:p>
     <w:pPr>
       <w:pStyle w:val="Bunntekst"/>
@@ -9443,7 +8033,7 @@
 </file>
 
 <file path=word/footer2.xml><?xml version="1.0" encoding="utf-8"?>
-<w:ftr xmlns:wpc="http://schemas.microsoft.com/office/word/2010/wordprocessingCanvas" xmlns:cx="http://schemas.microsoft.com/office/drawing/2014/chartex" xmlns:cx1="http://schemas.microsoft.com/office/drawing/2015/9/8/chartex" xmlns:cx2="http://schemas.microsoft.com/office/drawing/2015/10/21/chartex" xmlns:cx3="http://schemas.microsoft.com/office/drawing/2016/5/9/chartex" xmlns:cx4="http://schemas.microsoft.com/office/drawing/2016/5/10/chartex" xmlns:cx5="http://schemas.microsoft.com/office/drawing/2016/5/11/chartex" xmlns:cx6="http://schemas.microsoft.com/office/drawing/2016/5/12/chartex" xmlns:cx7="http://schemas.microsoft.com/office/drawing/2016/5/13/chartex" xmlns:cx8="http://schemas.microsoft.com/office/drawing/2016/5/14/chartex" xmlns:mc="http://schemas.openxmlformats.org/markup-compatibility/2006" xmlns:aink="http://schemas.microsoft.com/office/drawing/2016/ink" xmlns:am3d="http://schemas.microsoft.com/office/drawing/2017/model3d" xmlns:o="urn:schemas-microsoft-com:office:office" xmlns:oel="http://schemas.microsoft.com/office/2019/extlst" xmlns:r="http://schemas.openxmlformats.org/officeDocument/2006/relationships" xmlns:m="http://schemas.openxmlformats.org/officeDocument/2006/math" xmlns:v="urn:schemas-microsoft-com:vml" xmlns:wp14="http://schemas.microsoft.com/office/word/2010/wordprocessingDrawing" xmlns:wp="http://schemas.openxmlformats.org/drawingml/2006/wordprocessingDrawing" xmlns:w10="urn:schemas-microsoft-com:office:word" xmlns:w="http://schemas.openxmlformats.org/wordprocessingml/2006/main" xmlns:w14="http://schemas.microsoft.com/office/word/2010/wordml" xmlns:w15="http://schemas.microsoft.com/office/word/2012/wordml" xmlns:w16cex="http://schemas.microsoft.com/office/word/2018/wordml/cex" xmlns:w16cid="http://schemas.microsoft.com/office/word/2016/wordml/cid" xmlns:w16="http://schemas.microsoft.com/office/word/2018/wordml" xmlns:w16du="http://schemas.microsoft.com/office/word/2023/wordml/word16du" xmlns:w16sdtdh="http://schemas.microsoft.com/office/word/2020/wordml/sdtdatahash" xmlns:w16sdtfl="http://schemas.microsoft.com/office/word/2024/wordml/sdtformatlock" xmlns:w16se="http://schemas.microsoft.com/office/word/2015/wordml/symex" xmlns:wpg="http://schemas.microsoft.com/office/word/2010/wordprocessingGroup" xmlns:wpi="http://schemas.microsoft.com/office/word/2010/wordprocessingInk" xmlns:wne="http://schemas.microsoft.com/office/word/2006/wordml" xmlns:wps="http://schemas.microsoft.com/office/word/2010/wordprocessingShape" mc:Ignorable="w14 w15 w16se w16cid w16 w16cex w16sdtdh w16sdtfl w16du wp14">
+<w:ftr xmlns:wpc="http://schemas.microsoft.com/office/word/2010/wordprocessingCanvas" xmlns:cx="http://schemas.microsoft.com/office/drawing/2014/chartex" xmlns:cx1="http://schemas.microsoft.com/office/drawing/2015/9/8/chartex" xmlns:cx2="http://schemas.microsoft.com/office/drawing/2015/10/21/chartex" xmlns:cx3="http://schemas.microsoft.com/office/drawing/2016/5/9/chartex" xmlns:cx4="http://schemas.microsoft.com/office/drawing/2016/5/10/chartex" xmlns:cx5="http://schemas.microsoft.com/office/drawing/2016/5/11/chartex" xmlns:cx6="http://schemas.microsoft.com/office/drawing/2016/5/12/chartex" xmlns:cx7="http://schemas.microsoft.com/office/drawing/2016/5/13/chartex" xmlns:cx8="http://schemas.microsoft.com/office/drawing/2016/5/14/chartex" xmlns:mc="http://schemas.openxmlformats.org/markup-compatibility/2006" xmlns:aink="http://schemas.microsoft.com/office/drawing/2016/ink" xmlns:am3d="http://schemas.microsoft.com/office/drawing/2017/model3d" xmlns:o="urn:schemas-microsoft-com:office:office" xmlns:oel="http://schemas.microsoft.com/office/2019/extlst" xmlns:r="http://schemas.openxmlformats.org/officeDocument/2006/relationships" xmlns:m="http://schemas.openxmlformats.org/officeDocument/2006/math" xmlns:v="urn:schemas-microsoft-com:vml" xmlns:wp14="http://schemas.microsoft.com/office/word/2010/wordprocessingDrawing" xmlns:wp="http://schemas.openxmlformats.org/drawingml/2006/wordprocessingDrawing" xmlns:w10="urn:schemas-microsoft-com:office:word" xmlns:w="http://schemas.openxmlformats.org/wordprocessingml/2006/main" xmlns:w14="http://schemas.microsoft.com/office/word/2010/wordml" xmlns:w15="http://schemas.microsoft.com/office/word/2012/wordml" xmlns:w16cei="http://schemas.microsoft.com/office/word/2026/wordml/cei" xmlns:w16cex="http://schemas.microsoft.com/office/word/2018/wordml/cex" xmlns:w16cid="http://schemas.microsoft.com/office/word/2016/wordml/cid" xmlns:w16="http://schemas.microsoft.com/office/word/2018/wordml" xmlns:w16du="http://schemas.microsoft.com/office/word/2023/wordml/word16du" xmlns:w16sdtdh="http://schemas.microsoft.com/office/word/2020/wordml/sdtdatahash" xmlns:w16sdtfl="http://schemas.microsoft.com/office/word/2024/wordml/sdtformatlock" xmlns:w16se="http://schemas.microsoft.com/office/word/2015/wordml/symex" xmlns:wpg="http://schemas.microsoft.com/office/word/2010/wordprocessingGroup" xmlns:wpi="http://schemas.microsoft.com/office/word/2010/wordprocessingInk" xmlns:wne="http://schemas.microsoft.com/office/word/2006/wordml" xmlns:wps="http://schemas.microsoft.com/office/word/2010/wordprocessingShape" mc:Ignorable="w14 w15 w16se w16cid w16 w16cex w16sdtdh w16sdtfl w16du wp14">
   <w:sdt>
     <w:sdtPr>
       <w:id w:val="-2031787798"/>
@@ -9542,7 +8132,7 @@
 </file>
 
 <file path=word/footer3.xml><?xml version="1.0" encoding="utf-8"?>
-<w:ftr xmlns:wpc="http://schemas.microsoft.com/office/word/2010/wordprocessingCanvas" xmlns:cx="http://schemas.microsoft.com/office/drawing/2014/chartex" xmlns:cx1="http://schemas.microsoft.com/office/drawing/2015/9/8/chartex" xmlns:cx2="http://schemas.microsoft.com/office/drawing/2015/10/21/chartex" xmlns:cx3="http://schemas.microsoft.com/office/drawing/2016/5/9/chartex" xmlns:cx4="http://schemas.microsoft.com/office/drawing/2016/5/10/chartex" xmlns:cx5="http://schemas.microsoft.com/office/drawing/2016/5/11/chartex" xmlns:cx6="http://schemas.microsoft.com/office/drawing/2016/5/12/chartex" xmlns:cx7="http://schemas.microsoft.com/office/drawing/2016/5/13/chartex" xmlns:cx8="http://schemas.microsoft.com/office/drawing/2016/5/14/chartex" xmlns:mc="http://schemas.openxmlformats.org/markup-compatibility/2006" xmlns:aink="http://schemas.microsoft.com/office/drawing/2016/ink" xmlns:am3d="http://schemas.microsoft.com/office/drawing/2017/model3d" xmlns:o="urn:schemas-microsoft-com:office:office" xmlns:oel="http://schemas.microsoft.com/office/2019/extlst" xmlns:r="http://schemas.openxmlformats.org/officeDocument/2006/relationships" xmlns:m="http://schemas.openxmlformats.org/officeDocument/2006/math" xmlns:v="urn:schemas-microsoft-com:vml" xmlns:wp14="http://schemas.microsoft.com/office/word/2010/wordprocessingDrawing" xmlns:wp="http://schemas.openxmlformats.org/drawingml/2006/wordprocessingDrawing" xmlns:w10="urn:schemas-microsoft-com:office:word" xmlns:w="http://schemas.openxmlformats.org/wordprocessingml/2006/main" xmlns:w14="http://schemas.microsoft.com/office/word/2010/wordml" xmlns:w15="http://schemas.microsoft.com/office/word/2012/wordml" xmlns:w16cex="http://schemas.microsoft.com/office/word/2018/wordml/cex" xmlns:w16cid="http://schemas.microsoft.com/office/word/2016/wordml/cid" xmlns:w16="http://schemas.microsoft.com/office/word/2018/wordml" xmlns:w16du="http://schemas.microsoft.com/office/word/2023/wordml/word16du" xmlns:w16sdtdh="http://schemas.microsoft.com/office/word/2020/wordml/sdtdatahash" xmlns:w16sdtfl="http://schemas.microsoft.com/office/word/2024/wordml/sdtformatlock" xmlns:w16se="http://schemas.microsoft.com/office/word/2015/wordml/symex" xmlns:wpg="http://schemas.microsoft.com/office/word/2010/wordprocessingGroup" xmlns:wpi="http://schemas.microsoft.com/office/word/2010/wordprocessingInk" xmlns:wne="http://schemas.microsoft.com/office/word/2006/wordml" xmlns:wps="http://schemas.microsoft.com/office/word/2010/wordprocessingShape" mc:Ignorable="w14 w15 w16se w16cid w16 w16cex w16sdtdh w16sdtfl w16du wp14">
+<w:ftr xmlns:wpc="http://schemas.microsoft.com/office/word/2010/wordprocessingCanvas" xmlns:cx="http://schemas.microsoft.com/office/drawing/2014/chartex" xmlns:cx1="http://schemas.microsoft.com/office/drawing/2015/9/8/chartex" xmlns:cx2="http://schemas.microsoft.com/office/drawing/2015/10/21/chartex" xmlns:cx3="http://schemas.microsoft.com/office/drawing/2016/5/9/chartex" xmlns:cx4="http://schemas.microsoft.com/office/drawing/2016/5/10/chartex" xmlns:cx5="http://schemas.microsoft.com/office/drawing/2016/5/11/chartex" xmlns:cx6="http://schemas.microsoft.com/office/drawing/2016/5/12/chartex" xmlns:cx7="http://schemas.microsoft.com/office/drawing/2016/5/13/chartex" xmlns:cx8="http://schemas.microsoft.com/office/drawing/2016/5/14/chartex" xmlns:mc="http://schemas.openxmlformats.org/markup-compatibility/2006" xmlns:aink="http://schemas.microsoft.com/office/drawing/2016/ink" xmlns:am3d="http://schemas.microsoft.com/office/drawing/2017/model3d" xmlns:o="urn:schemas-microsoft-com:office:office" xmlns:oel="http://schemas.microsoft.com/office/2019/extlst" xmlns:r="http://schemas.openxmlformats.org/officeDocument/2006/relationships" xmlns:m="http://schemas.openxmlformats.org/officeDocument/2006/math" xmlns:v="urn:schemas-microsoft-com:vml" xmlns:wp14="http://schemas.microsoft.com/office/word/2010/wordprocessingDrawing" xmlns:wp="http://schemas.openxmlformats.org/drawingml/2006/wordprocessingDrawing" xmlns:w10="urn:schemas-microsoft-com:office:word" xmlns:w="http://schemas.openxmlformats.org/wordprocessingml/2006/main" xmlns:w14="http://schemas.microsoft.com/office/word/2010/wordml" xmlns:w15="http://schemas.microsoft.com/office/word/2012/wordml" xmlns:w16cei="http://schemas.microsoft.com/office/word/2026/wordml/cei" xmlns:w16cex="http://schemas.microsoft.com/office/word/2018/wordml/cex" xmlns:w16cid="http://schemas.microsoft.com/office/word/2016/wordml/cid" xmlns:w16="http://schemas.microsoft.com/office/word/2018/wordml" xmlns:w16du="http://schemas.microsoft.com/office/word/2023/wordml/word16du" xmlns:w16sdtdh="http://schemas.microsoft.com/office/word/2020/wordml/sdtdatahash" xmlns:w16sdtfl="http://schemas.microsoft.com/office/word/2024/wordml/sdtformatlock" xmlns:w16se="http://schemas.microsoft.com/office/word/2015/wordml/symex" xmlns:wpg="http://schemas.microsoft.com/office/word/2010/wordprocessingGroup" xmlns:wpi="http://schemas.microsoft.com/office/word/2010/wordprocessingInk" xmlns:wne="http://schemas.microsoft.com/office/word/2006/wordml" xmlns:wps="http://schemas.microsoft.com/office/word/2010/wordprocessingShape" mc:Ignorable="w14 w15 w16se w16cid w16 w16cex w16sdtdh w16sdtfl w16du wp14">
   <w:sdt>
     <w:sdtPr>
       <w:id w:val="-850491248"/>
@@ -9649,7 +8239,7 @@
 </file>
 
 <file path=word/footer4.xml><?xml version="1.0" encoding="utf-8"?>
-<w:ftr xmlns:wpc="http://schemas.microsoft.com/office/word/2010/wordprocessingCanvas" xmlns:cx="http://schemas.microsoft.com/office/drawing/2014/chartex" xmlns:cx1="http://schemas.microsoft.com/office/drawing/2015/9/8/chartex" xmlns:cx2="http://schemas.microsoft.com/office/drawing/2015/10/21/chartex" xmlns:cx3="http://schemas.microsoft.com/office/drawing/2016/5/9/chartex" xmlns:cx4="http://schemas.microsoft.com/office/drawing/2016/5/10/chartex" xmlns:cx5="http://schemas.microsoft.com/office/drawing/2016/5/11/chartex" xmlns:cx6="http://schemas.microsoft.com/office/drawing/2016/5/12/chartex" xmlns:cx7="http://schemas.microsoft.com/office/drawing/2016/5/13/chartex" xmlns:cx8="http://schemas.microsoft.com/office/drawing/2016/5/14/chartex" xmlns:mc="http://schemas.openxmlformats.org/markup-compatibility/2006" xmlns:aink="http://schemas.microsoft.com/office/drawing/2016/ink" xmlns:am3d="http://schemas.microsoft.com/office/drawing/2017/model3d" xmlns:o="urn:schemas-microsoft-com:office:office" xmlns:oel="http://schemas.microsoft.com/office/2019/extlst" xmlns:r="http://schemas.openxmlformats.org/officeDocument/2006/relationships" xmlns:m="http://schemas.openxmlformats.org/officeDocument/2006/math" xmlns:v="urn:schemas-microsoft-com:vml" xmlns:wp14="http://schemas.microsoft.com/office/word/2010/wordprocessingDrawing" xmlns:wp="http://schemas.openxmlformats.org/drawingml/2006/wordprocessingDrawing" xmlns:w10="urn:schemas-microsoft-com:office:word" xmlns:w="http://schemas.openxmlformats.org/wordprocessingml/2006/main" xmlns:w14="http://schemas.microsoft.com/office/word/2010/wordml" xmlns:w15="http://schemas.microsoft.com/office/word/2012/wordml" xmlns:w16cex="http://schemas.microsoft.com/office/word/2018/wordml/cex" xmlns:w16cid="http://schemas.microsoft.com/office/word/2016/wordml/cid" xmlns:w16="http://schemas.microsoft.com/office/word/2018/wordml" xmlns:w16du="http://schemas.microsoft.com/office/word/2023/wordml/word16du" xmlns:w16sdtdh="http://schemas.microsoft.com/office/word/2020/wordml/sdtdatahash" xmlns:w16sdtfl="http://schemas.microsoft.com/office/word/2024/wordml/sdtformatlock" xmlns:w16se="http://schemas.microsoft.com/office/word/2015/wordml/symex" xmlns:wpg="http://schemas.microsoft.com/office/word/2010/wordprocessingGroup" xmlns:wpi="http://schemas.microsoft.com/office/word/2010/wordprocessingInk" xmlns:wne="http://schemas.microsoft.com/office/word/2006/wordml" xmlns:wps="http://schemas.microsoft.com/office/word/2010/wordprocessingShape" mc:Ignorable="w14 w15 w16se w16cid w16 w16cex w16sdtdh w16sdtfl w16du wp14">
+<w:ftr xmlns:wpc="http://schemas.microsoft.com/office/word/2010/wordprocessingCanvas" xmlns:cx="http://schemas.microsoft.com/office/drawing/2014/chartex" xmlns:cx1="http://schemas.microsoft.com/office/drawing/2015/9/8/chartex" xmlns:cx2="http://schemas.microsoft.com/office/drawing/2015/10/21/chartex" xmlns:cx3="http://schemas.microsoft.com/office/drawing/2016/5/9/chartex" xmlns:cx4="http://schemas.microsoft.com/office/drawing/2016/5/10/chartex" xmlns:cx5="http://schemas.microsoft.com/office/drawing/2016/5/11/chartex" xmlns:cx6="http://schemas.microsoft.com/office/drawing/2016/5/12/chartex" xmlns:cx7="http://schemas.microsoft.com/office/drawing/2016/5/13/chartex" xmlns:cx8="http://schemas.microsoft.com/office/drawing/2016/5/14/chartex" xmlns:mc="http://schemas.openxmlformats.org/markup-compatibility/2006" xmlns:aink="http://schemas.microsoft.com/office/drawing/2016/ink" xmlns:am3d="http://schemas.microsoft.com/office/drawing/2017/model3d" xmlns:o="urn:schemas-microsoft-com:office:office" xmlns:oel="http://schemas.microsoft.com/office/2019/extlst" xmlns:r="http://schemas.openxmlformats.org/officeDocument/2006/relationships" xmlns:m="http://schemas.openxmlformats.org/officeDocument/2006/math" xmlns:v="urn:schemas-microsoft-com:vml" xmlns:wp14="http://schemas.microsoft.com/office/word/2010/wordprocessingDrawing" xmlns:wp="http://schemas.openxmlformats.org/drawingml/2006/wordprocessingDrawing" xmlns:w10="urn:schemas-microsoft-com:office:word" xmlns:w="http://schemas.openxmlformats.org/wordprocessingml/2006/main" xmlns:w14="http://schemas.microsoft.com/office/word/2010/wordml" xmlns:w15="http://schemas.microsoft.com/office/word/2012/wordml" xmlns:w16cei="http://schemas.microsoft.com/office/word/2026/wordml/cei" xmlns:w16cex="http://schemas.microsoft.com/office/word/2018/wordml/cex" xmlns:w16cid="http://schemas.microsoft.com/office/word/2016/wordml/cid" xmlns:w16="http://schemas.microsoft.com/office/word/2018/wordml" xmlns:w16du="http://schemas.microsoft.com/office/word/2023/wordml/word16du" xmlns:w16sdtdh="http://schemas.microsoft.com/office/word/2020/wordml/sdtdatahash" xmlns:w16sdtfl="http://schemas.microsoft.com/office/word/2024/wordml/sdtformatlock" xmlns:w16se="http://schemas.microsoft.com/office/word/2015/wordml/symex" xmlns:wpg="http://schemas.microsoft.com/office/word/2010/wordprocessingGroup" xmlns:wpi="http://schemas.microsoft.com/office/word/2010/wordprocessingInk" xmlns:wne="http://schemas.microsoft.com/office/word/2006/wordml" xmlns:wps="http://schemas.microsoft.com/office/word/2010/wordprocessingShape" mc:Ignorable="w14 w15 w16se w16cid w16 w16cex w16sdtdh w16sdtfl w16du wp14">
   <w:sdt>
     <w:sdtPr>
       <w:id w:val="775912906"/>
@@ -9748,7 +8338,7 @@
 </file>
 
 <file path=word/footnotes.xml><?xml version="1.0" encoding="utf-8"?>
-<w:footnotes xmlns:wpc="http://schemas.microsoft.com/office/word/2010/wordprocessingCanvas" xmlns:cx="http://schemas.microsoft.com/office/drawing/2014/chartex" xmlns:cx1="http://schemas.microsoft.com/office/drawing/2015/9/8/chartex" xmlns:cx2="http://schemas.microsoft.com/office/drawing/2015/10/21/chartex" xmlns:cx3="http://schemas.microsoft.com/office/drawing/2016/5/9/chartex" xmlns:cx4="http://schemas.microsoft.com/office/drawing/2016/5/10/chartex" xmlns:cx5="http://schemas.microsoft.com/office/drawing/2016/5/11/chartex" xmlns:cx6="http://schemas.microsoft.com/office/drawing/2016/5/12/chartex" xmlns:cx7="http://schemas.microsoft.com/office/drawing/2016/5/13/chartex" xmlns:cx8="http://schemas.microsoft.com/office/drawing/2016/5/14/chartex" xmlns:mc="http://schemas.openxmlformats.org/markup-compatibility/2006" xmlns:aink="http://schemas.microsoft.com/office/drawing/2016/ink" xmlns:am3d="http://schemas.microsoft.com/office/drawing/2017/model3d" xmlns:o="urn:schemas-microsoft-com:office:office" xmlns:oel="http://schemas.microsoft.com/office/2019/extlst" xmlns:r="http://schemas.openxmlformats.org/officeDocument/2006/relationships" xmlns:m="http://schemas.openxmlformats.org/officeDocument/2006/math" xmlns:v="urn:schemas-microsoft-com:vml" xmlns:wp14="http://schemas.microsoft.com/office/word/2010/wordprocessingDrawing" xmlns:wp="http://schemas.openxmlformats.org/drawingml/2006/wordprocessingDrawing" xmlns:w10="urn:schemas-microsoft-com:office:word" xmlns:w="http://schemas.openxmlformats.org/wordprocessingml/2006/main" xmlns:w14="http://schemas.microsoft.com/office/word/2010/wordml" xmlns:w15="http://schemas.microsoft.com/office/word/2012/wordml" xmlns:w16cex="http://schemas.microsoft.com/office/word/2018/wordml/cex" xmlns:w16cid="http://schemas.microsoft.com/office/word/2016/wordml/cid" xmlns:w16="http://schemas.microsoft.com/office/word/2018/wordml" xmlns:w16du="http://schemas.microsoft.com/office/word/2023/wordml/word16du" xmlns:w16sdtdh="http://schemas.microsoft.com/office/word/2020/wordml/sdtdatahash" xmlns:w16sdtfl="http://schemas.microsoft.com/office/word/2024/wordml/sdtformatlock" xmlns:w16se="http://schemas.microsoft.com/office/word/2015/wordml/symex" xmlns:wpg="http://schemas.microsoft.com/office/word/2010/wordprocessingGroup" xmlns:wpi="http://schemas.microsoft.com/office/word/2010/wordprocessingInk" xmlns:wne="http://schemas.microsoft.com/office/word/2006/wordml" xmlns:wps="http://schemas.microsoft.com/office/word/2010/wordprocessingShape" mc:Ignorable="w14 w15 w16se w16cid w16 w16cex w16sdtdh w16sdtfl w16du wp14">
+<w:footnotes xmlns:wpc="http://schemas.microsoft.com/office/word/2010/wordprocessingCanvas" xmlns:cx="http://schemas.microsoft.com/office/drawing/2014/chartex" xmlns:cx1="http://schemas.microsoft.com/office/drawing/2015/9/8/chartex" xmlns:cx2="http://schemas.microsoft.com/office/drawing/2015/10/21/chartex" xmlns:cx3="http://schemas.microsoft.com/office/drawing/2016/5/9/chartex" xmlns:cx4="http://schemas.microsoft.com/office/drawing/2016/5/10/chartex" xmlns:cx5="http://schemas.microsoft.com/office/drawing/2016/5/11/chartex" xmlns:cx6="http://schemas.microsoft.com/office/drawing/2016/5/12/chartex" xmlns:cx7="http://schemas.microsoft.com/office/drawing/2016/5/13/chartex" xmlns:cx8="http://schemas.microsoft.com/office/drawing/2016/5/14/chartex" xmlns:mc="http://schemas.openxmlformats.org/markup-compatibility/2006" xmlns:aink="http://schemas.microsoft.com/office/drawing/2016/ink" xmlns:am3d="http://schemas.microsoft.com/office/drawing/2017/model3d" xmlns:o="urn:schemas-microsoft-com:office:office" xmlns:oel="http://schemas.microsoft.com/office/2019/extlst" xmlns:r="http://schemas.openxmlformats.org/officeDocument/2006/relationships" xmlns:m="http://schemas.openxmlformats.org/officeDocument/2006/math" xmlns:v="urn:schemas-microsoft-com:vml" xmlns:wp14="http://schemas.microsoft.com/office/word/2010/wordprocessingDrawing" xmlns:wp="http://schemas.openxmlformats.org/drawingml/2006/wordprocessingDrawing" xmlns:w10="urn:schemas-microsoft-com:office:word" xmlns:w="http://schemas.openxmlformats.org/wordprocessingml/2006/main" xmlns:w14="http://schemas.microsoft.com/office/word/2010/wordml" xmlns:w15="http://schemas.microsoft.com/office/word/2012/wordml" xmlns:w16cei="http://schemas.microsoft.com/office/word/2026/wordml/cei" xmlns:w16cex="http://schemas.microsoft.com/office/word/2018/wordml/cex" xmlns:w16cid="http://schemas.microsoft.com/office/word/2016/wordml/cid" xmlns:w16="http://schemas.microsoft.com/office/word/2018/wordml" xmlns:w16du="http://schemas.microsoft.com/office/word/2023/wordml/word16du" xmlns:w16sdtdh="http://schemas.microsoft.com/office/word/2020/wordml/sdtdatahash" xmlns:w16sdtfl="http://schemas.microsoft.com/office/word/2024/wordml/sdtformatlock" xmlns:w16se="http://schemas.microsoft.com/office/word/2015/wordml/symex" xmlns:wpg="http://schemas.microsoft.com/office/word/2010/wordprocessingGroup" xmlns:wpi="http://schemas.microsoft.com/office/word/2010/wordprocessingInk" xmlns:wne="http://schemas.microsoft.com/office/word/2006/wordml" xmlns:wps="http://schemas.microsoft.com/office/word/2010/wordprocessingShape" mc:Ignorable="w14 w15 w16se w16cid w16 w16cex w16sdtdh w16sdtfl w16du wp14">
   <w:footnote w:type="separator" w:id="-1">
     <w:p>
       <w:pPr>
@@ -9773,7 +8363,7 @@
 </file>
 
 <file path=word/header1.xml><?xml version="1.0" encoding="utf-8"?>
-<w:hdr xmlns:wpc="http://schemas.microsoft.com/office/word/2010/wordprocessingCanvas" xmlns:cx="http://schemas.microsoft.com/office/drawing/2014/chartex" xmlns:cx1="http://schemas.microsoft.com/office/drawing/2015/9/8/chartex" xmlns:cx2="http://schemas.microsoft.com/office/drawing/2015/10/21/chartex" xmlns:cx3="http://schemas.microsoft.com/office/drawing/2016/5/9/chartex" xmlns:cx4="http://schemas.microsoft.com/office/drawing/2016/5/10/chartex" xmlns:cx5="http://schemas.microsoft.com/office/drawing/2016/5/11/chartex" xmlns:cx6="http://schemas.microsoft.com/office/drawing/2016/5/12/chartex" xmlns:cx7="http://schemas.microsoft.com/office/drawing/2016/5/13/chartex" xmlns:cx8="http://schemas.microsoft.com/office/drawing/2016/5/14/chartex" xmlns:mc="http://schemas.openxmlformats.org/markup-compatibility/2006" xmlns:aink="http://schemas.microsoft.com/office/drawing/2016/ink" xmlns:am3d="http://schemas.microsoft.com/office/drawing/2017/model3d" xmlns:o="urn:schemas-microsoft-com:office:office" xmlns:oel="http://schemas.microsoft.com/office/2019/extlst" xmlns:r="http://schemas.openxmlformats.org/officeDocument/2006/relationships" xmlns:m="http://schemas.openxmlformats.org/officeDocument/2006/math" xmlns:v="urn:schemas-microsoft-com:vml" xmlns:wp14="http://schemas.microsoft.com/office/word/2010/wordprocessingDrawing" xmlns:wp="http://schemas.openxmlformats.org/drawingml/2006/wordprocessingDrawing" xmlns:w10="urn:schemas-microsoft-com:office:word" xmlns:w="http://schemas.openxmlformats.org/wordprocessingml/2006/main" xmlns:w14="http://schemas.microsoft.com/office/word/2010/wordml" xmlns:w15="http://schemas.microsoft.com/office/word/2012/wordml" xmlns:w16cex="http://schemas.microsoft.com/office/word/2018/wordml/cex" xmlns:w16cid="http://schemas.microsoft.com/office/word/2016/wordml/cid" xmlns:w16="http://schemas.microsoft.com/office/word/2018/wordml" xmlns:w16du="http://schemas.microsoft.com/office/word/2023/wordml/word16du" xmlns:w16sdtdh="http://schemas.microsoft.com/office/word/2020/wordml/sdtdatahash" xmlns:w16sdtfl="http://schemas.microsoft.com/office/word/2024/wordml/sdtformatlock" xmlns:w16se="http://schemas.microsoft.com/office/word/2015/wordml/symex" xmlns:wpg="http://schemas.microsoft.com/office/word/2010/wordprocessingGroup" xmlns:wpi="http://schemas.microsoft.com/office/word/2010/wordprocessingInk" xmlns:wne="http://schemas.microsoft.com/office/word/2006/wordml" xmlns:wps="http://schemas.microsoft.com/office/word/2010/wordprocessingShape" mc:Ignorable="w14 w15 w16se w16cid w16 w16cex w16sdtdh w16sdtfl w16du wp14">
+<w:hdr xmlns:wpc="http://schemas.microsoft.com/office/word/2010/wordprocessingCanvas" xmlns:cx="http://schemas.microsoft.com/office/drawing/2014/chartex" xmlns:cx1="http://schemas.microsoft.com/office/drawing/2015/9/8/chartex" xmlns:cx2="http://schemas.microsoft.com/office/drawing/2015/10/21/chartex" xmlns:cx3="http://schemas.microsoft.com/office/drawing/2016/5/9/chartex" xmlns:cx4="http://schemas.microsoft.com/office/drawing/2016/5/10/chartex" xmlns:cx5="http://schemas.microsoft.com/office/drawing/2016/5/11/chartex" xmlns:cx6="http://schemas.microsoft.com/office/drawing/2016/5/12/chartex" xmlns:cx7="http://schemas.microsoft.com/office/drawing/2016/5/13/chartex" xmlns:cx8="http://schemas.microsoft.com/office/drawing/2016/5/14/chartex" xmlns:mc="http://schemas.openxmlformats.org/markup-compatibility/2006" xmlns:aink="http://schemas.microsoft.com/office/drawing/2016/ink" xmlns:am3d="http://schemas.microsoft.com/office/drawing/2017/model3d" xmlns:o="urn:schemas-microsoft-com:office:office" xmlns:oel="http://schemas.microsoft.com/office/2019/extlst" xmlns:r="http://schemas.openxmlformats.org/officeDocument/2006/relationships" xmlns:m="http://schemas.openxmlformats.org/officeDocument/2006/math" xmlns:v="urn:schemas-microsoft-com:vml" xmlns:wp14="http://schemas.microsoft.com/office/word/2010/wordprocessingDrawing" xmlns:wp="http://schemas.openxmlformats.org/drawingml/2006/wordprocessingDrawing" xmlns:w10="urn:schemas-microsoft-com:office:word" xmlns:w="http://schemas.openxmlformats.org/wordprocessingml/2006/main" xmlns:w14="http://schemas.microsoft.com/office/word/2010/wordml" xmlns:w15="http://schemas.microsoft.com/office/word/2012/wordml" xmlns:w16cei="http://schemas.microsoft.com/office/word/2026/wordml/cei" xmlns:w16cex="http://schemas.microsoft.com/office/word/2018/wordml/cex" xmlns:w16cid="http://schemas.microsoft.com/office/word/2016/wordml/cid" xmlns:w16="http://schemas.microsoft.com/office/word/2018/wordml" xmlns:w16du="http://schemas.microsoft.com/office/word/2023/wordml/word16du" xmlns:w16sdtdh="http://schemas.microsoft.com/office/word/2020/wordml/sdtdatahash" xmlns:w16sdtfl="http://schemas.microsoft.com/office/word/2024/wordml/sdtformatlock" xmlns:w16se="http://schemas.microsoft.com/office/word/2015/wordml/symex" xmlns:wpg="http://schemas.microsoft.com/office/word/2010/wordprocessingGroup" xmlns:wpi="http://schemas.microsoft.com/office/word/2010/wordprocessingInk" xmlns:wne="http://schemas.microsoft.com/office/word/2006/wordml" xmlns:wps="http://schemas.microsoft.com/office/word/2010/wordprocessingShape" mc:Ignorable="w14 w15 w16se w16cid w16 w16cex w16sdtdh w16sdtfl w16du wp14">
   <w:p>
     <w:pPr>
       <w:pStyle w:val="Topptekst"/>
@@ -9783,7 +8373,7 @@
 </file>
 
 <file path=word/header2.xml><?xml version="1.0" encoding="utf-8"?>
-<w:hdr xmlns:wpc="http://schemas.microsoft.com/office/word/2010/wordprocessingCanvas" xmlns:cx="http://schemas.microsoft.com/office/drawing/2014/chartex" xmlns:cx1="http://schemas.microsoft.com/office/drawing/2015/9/8/chartex" xmlns:cx2="http://schemas.microsoft.com/office/drawing/2015/10/21/chartex" xmlns:cx3="http://schemas.microsoft.com/office/drawing/2016/5/9/chartex" xmlns:cx4="http://schemas.microsoft.com/office/drawing/2016/5/10/chartex" xmlns:cx5="http://schemas.microsoft.com/office/drawing/2016/5/11/chartex" xmlns:cx6="http://schemas.microsoft.com/office/drawing/2016/5/12/chartex" xmlns:cx7="http://schemas.microsoft.com/office/drawing/2016/5/13/chartex" xmlns:cx8="http://schemas.microsoft.com/office/drawing/2016/5/14/chartex" xmlns:mc="http://schemas.openxmlformats.org/markup-compatibility/2006" xmlns:aink="http://schemas.microsoft.com/office/drawing/2016/ink" xmlns:am3d="http://schemas.microsoft.com/office/drawing/2017/model3d" xmlns:o="urn:schemas-microsoft-com:office:office" xmlns:oel="http://schemas.microsoft.com/office/2019/extlst" xmlns:r="http://schemas.openxmlformats.org/officeDocument/2006/relationships" xmlns:m="http://schemas.openxmlformats.org/officeDocument/2006/math" xmlns:v="urn:schemas-microsoft-com:vml" xmlns:wp14="http://schemas.microsoft.com/office/word/2010/wordprocessingDrawing" xmlns:wp="http://schemas.openxmlformats.org/drawingml/2006/wordprocessingDrawing" xmlns:w10="urn:schemas-microsoft-com:office:word" xmlns:w="http://schemas.openxmlformats.org/wordprocessingml/2006/main" xmlns:w14="http://schemas.microsoft.com/office/word/2010/wordml" xmlns:w15="http://schemas.microsoft.com/office/word/2012/wordml" xmlns:w16cex="http://schemas.microsoft.com/office/word/2018/wordml/cex" xmlns:w16cid="http://schemas.microsoft.com/office/word/2016/wordml/cid" xmlns:w16="http://schemas.microsoft.com/office/word/2018/wordml" xmlns:w16du="http://schemas.microsoft.com/office/word/2023/wordml/word16du" xmlns:w16sdtdh="http://schemas.microsoft.com/office/word/2020/wordml/sdtdatahash" xmlns:w16sdtfl="http://schemas.microsoft.com/office/word/2024/wordml/sdtformatlock" xmlns:w16se="http://schemas.microsoft.com/office/word/2015/wordml/symex" xmlns:wpg="http://schemas.microsoft.com/office/word/2010/wordprocessingGroup" xmlns:wpi="http://schemas.microsoft.com/office/word/2010/wordprocessingInk" xmlns:wne="http://schemas.microsoft.com/office/word/2006/wordml" xmlns:wps="http://schemas.microsoft.com/office/word/2010/wordprocessingShape" mc:Ignorable="w14 w15 w16se w16cid w16 w16cex w16sdtdh w16sdtfl w16du wp14">
+<w:hdr xmlns:wpc="http://schemas.microsoft.com/office/word/2010/wordprocessingCanvas" xmlns:cx="http://schemas.microsoft.com/office/drawing/2014/chartex" xmlns:cx1="http://schemas.microsoft.com/office/drawing/2015/9/8/chartex" xmlns:cx2="http://schemas.microsoft.com/office/drawing/2015/10/21/chartex" xmlns:cx3="http://schemas.microsoft.com/office/drawing/2016/5/9/chartex" xmlns:cx4="http://schemas.microsoft.com/office/drawing/2016/5/10/chartex" xmlns:cx5="http://schemas.microsoft.com/office/drawing/2016/5/11/chartex" xmlns:cx6="http://schemas.microsoft.com/office/drawing/2016/5/12/chartex" xmlns:cx7="http://schemas.microsoft.com/office/drawing/2016/5/13/chartex" xmlns:cx8="http://schemas.microsoft.com/office/drawing/2016/5/14/chartex" xmlns:mc="http://schemas.openxmlformats.org/markup-compatibility/2006" xmlns:aink="http://schemas.microsoft.com/office/drawing/2016/ink" xmlns:am3d="http://schemas.microsoft.com/office/drawing/2017/model3d" xmlns:o="urn:schemas-microsoft-com:office:office" xmlns:oel="http://schemas.microsoft.com/office/2019/extlst" xmlns:r="http://schemas.openxmlformats.org/officeDocument/2006/relationships" xmlns:m="http://schemas.openxmlformats.org/officeDocument/2006/math" xmlns:v="urn:schemas-microsoft-com:vml" xmlns:wp14="http://schemas.microsoft.com/office/word/2010/wordprocessingDrawing" xmlns:wp="http://schemas.openxmlformats.org/drawingml/2006/wordprocessingDrawing" xmlns:w10="urn:schemas-microsoft-com:office:word" xmlns:w="http://schemas.openxmlformats.org/wordprocessingml/2006/main" xmlns:w14="http://schemas.microsoft.com/office/word/2010/wordml" xmlns:w15="http://schemas.microsoft.com/office/word/2012/wordml" xmlns:w16cei="http://schemas.microsoft.com/office/word/2026/wordml/cei" xmlns:w16cex="http://schemas.microsoft.com/office/word/2018/wordml/cex" xmlns:w16cid="http://schemas.microsoft.com/office/word/2016/wordml/cid" xmlns:w16="http://schemas.microsoft.com/office/word/2018/wordml" xmlns:w16du="http://schemas.microsoft.com/office/word/2023/wordml/word16du" xmlns:w16sdtdh="http://schemas.microsoft.com/office/word/2020/wordml/sdtdatahash" xmlns:w16sdtfl="http://schemas.microsoft.com/office/word/2024/wordml/sdtformatlock" xmlns:w16se="http://schemas.microsoft.com/office/word/2015/wordml/symex" xmlns:wpg="http://schemas.microsoft.com/office/word/2010/wordprocessingGroup" xmlns:wpi="http://schemas.microsoft.com/office/word/2010/wordprocessingInk" xmlns:wne="http://schemas.microsoft.com/office/word/2006/wordml" xmlns:wps="http://schemas.microsoft.com/office/word/2010/wordprocessingShape" mc:Ignorable="w14 w15 w16se w16cid w16 w16cex w16sdtdh w16sdtfl w16du wp14">
   <w:p>
     <w:pPr>
       <w:pStyle w:val="Topptekst"/>
@@ -9809,7 +8399,7 @@
 </file>
 
 <file path=word/header3.xml><?xml version="1.0" encoding="utf-8"?>
-<w:hdr xmlns:wpc="http://schemas.microsoft.com/office/word/2010/wordprocessingCanvas" xmlns:cx="http://schemas.microsoft.com/office/drawing/2014/chartex" xmlns:cx1="http://schemas.microsoft.com/office/drawing/2015/9/8/chartex" xmlns:cx2="http://schemas.microsoft.com/office/drawing/2015/10/21/chartex" xmlns:cx3="http://schemas.microsoft.com/office/drawing/2016/5/9/chartex" xmlns:cx4="http://schemas.microsoft.com/office/drawing/2016/5/10/chartex" xmlns:cx5="http://schemas.microsoft.com/office/drawing/2016/5/11/chartex" xmlns:cx6="http://schemas.microsoft.com/office/drawing/2016/5/12/chartex" xmlns:cx7="http://schemas.microsoft.com/office/drawing/2016/5/13/chartex" xmlns:cx8="http://schemas.microsoft.com/office/drawing/2016/5/14/chartex" xmlns:mc="http://schemas.openxmlformats.org/markup-compatibility/2006" xmlns:aink="http://schemas.microsoft.com/office/drawing/2016/ink" xmlns:am3d="http://schemas.microsoft.com/office/drawing/2017/model3d" xmlns:o="urn:schemas-microsoft-com:office:office" xmlns:oel="http://schemas.microsoft.com/office/2019/extlst" xmlns:r="http://schemas.openxmlformats.org/officeDocument/2006/relationships" xmlns:m="http://schemas.openxmlformats.org/officeDocument/2006/math" xmlns:v="urn:schemas-microsoft-com:vml" xmlns:wp14="http://schemas.microsoft.com/office/word/2010/wordprocessingDrawing" xmlns:wp="http://schemas.openxmlformats.org/drawingml/2006/wordprocessingDrawing" xmlns:w10="urn:schemas-microsoft-com:office:word" xmlns:w="http://schemas.openxmlformats.org/wordprocessingml/2006/main" xmlns:w14="http://schemas.microsoft.com/office/word/2010/wordml" xmlns:w15="http://schemas.microsoft.com/office/word/2012/wordml" xmlns:w16cex="http://schemas.microsoft.com/office/word/2018/wordml/cex" xmlns:w16cid="http://schemas.microsoft.com/office/word/2016/wordml/cid" xmlns:w16="http://schemas.microsoft.com/office/word/2018/wordml" xmlns:w16du="http://schemas.microsoft.com/office/word/2023/wordml/word16du" xmlns:w16sdtdh="http://schemas.microsoft.com/office/word/2020/wordml/sdtdatahash" xmlns:w16sdtfl="http://schemas.microsoft.com/office/word/2024/wordml/sdtformatlock" xmlns:w16se="http://schemas.microsoft.com/office/word/2015/wordml/symex" xmlns:wpg="http://schemas.microsoft.com/office/word/2010/wordprocessingGroup" xmlns:wpi="http://schemas.microsoft.com/office/word/2010/wordprocessingInk" xmlns:wne="http://schemas.microsoft.com/office/word/2006/wordml" xmlns:wps="http://schemas.microsoft.com/office/word/2010/wordprocessingShape" mc:Ignorable="w14 w15 w16se w16cid w16 w16cex w16sdtdh w16sdtfl w16du wp14">
+<w:hdr xmlns:wpc="http://schemas.microsoft.com/office/word/2010/wordprocessingCanvas" xmlns:cx="http://schemas.microsoft.com/office/drawing/2014/chartex" xmlns:cx1="http://schemas.microsoft.com/office/drawing/2015/9/8/chartex" xmlns:cx2="http://schemas.microsoft.com/office/drawing/2015/10/21/chartex" xmlns:cx3="http://schemas.microsoft.com/office/drawing/2016/5/9/chartex" xmlns:cx4="http://schemas.microsoft.com/office/drawing/2016/5/10/chartex" xmlns:cx5="http://schemas.microsoft.com/office/drawing/2016/5/11/chartex" xmlns:cx6="http://schemas.microsoft.com/office/drawing/2016/5/12/chartex" xmlns:cx7="http://schemas.microsoft.com/office/drawing/2016/5/13/chartex" xmlns:cx8="http://schemas.microsoft.com/office/drawing/2016/5/14/chartex" xmlns:mc="http://schemas.openxmlformats.org/markup-compatibility/2006" xmlns:aink="http://schemas.microsoft.com/office/drawing/2016/ink" xmlns:am3d="http://schemas.microsoft.com/office/drawing/2017/model3d" xmlns:o="urn:schemas-microsoft-com:office:office" xmlns:oel="http://schemas.microsoft.com/office/2019/extlst" xmlns:r="http://schemas.openxmlformats.org/officeDocument/2006/relationships" xmlns:m="http://schemas.openxmlformats.org/officeDocument/2006/math" xmlns:v="urn:schemas-microsoft-com:vml" xmlns:wp14="http://schemas.microsoft.com/office/word/2010/wordprocessingDrawing" xmlns:wp="http://schemas.openxmlformats.org/drawingml/2006/wordprocessingDrawing" xmlns:w10="urn:schemas-microsoft-com:office:word" xmlns:w="http://schemas.openxmlformats.org/wordprocessingml/2006/main" xmlns:w14="http://schemas.microsoft.com/office/word/2010/wordml" xmlns:w15="http://schemas.microsoft.com/office/word/2012/wordml" xmlns:w16cei="http://schemas.microsoft.com/office/word/2026/wordml/cei" xmlns:w16cex="http://schemas.microsoft.com/office/word/2018/wordml/cex" xmlns:w16cid="http://schemas.microsoft.com/office/word/2016/wordml/cid" xmlns:w16="http://schemas.microsoft.com/office/word/2018/wordml" xmlns:w16du="http://schemas.microsoft.com/office/word/2023/wordml/word16du" xmlns:w16sdtdh="http://schemas.microsoft.com/office/word/2020/wordml/sdtdatahash" xmlns:w16sdtfl="http://schemas.microsoft.com/office/word/2024/wordml/sdtformatlock" xmlns:w16se="http://schemas.microsoft.com/office/word/2015/wordml/symex" xmlns:wpg="http://schemas.microsoft.com/office/word/2010/wordprocessingGroup" xmlns:wpi="http://schemas.microsoft.com/office/word/2010/wordprocessingInk" xmlns:wne="http://schemas.microsoft.com/office/word/2006/wordml" xmlns:wps="http://schemas.microsoft.com/office/word/2010/wordprocessingShape" mc:Ignorable="w14 w15 w16se w16cid w16 w16cex w16sdtdh w16sdtfl w16du wp14">
   <w:p>
     <w:r>
       <w:rPr>
@@ -9883,7 +8473,7 @@
 </file>
 
 <file path=word/numbering.xml><?xml version="1.0" encoding="utf-8"?>
-<w:numbering xmlns:wpc="http://schemas.microsoft.com/office/word/2010/wordprocessingCanvas" xmlns:cx="http://schemas.microsoft.com/office/drawing/2014/chartex" xmlns:cx1="http://schemas.microsoft.com/office/drawing/2015/9/8/chartex" xmlns:cx2="http://schemas.microsoft.com/office/drawing/2015/10/21/chartex" xmlns:cx3="http://schemas.microsoft.com/office/drawing/2016/5/9/chartex" xmlns:cx4="http://schemas.microsoft.com/office/drawing/2016/5/10/chartex" xmlns:cx5="http://schemas.microsoft.com/office/drawing/2016/5/11/chartex" xmlns:cx6="http://schemas.microsoft.com/office/drawing/2016/5/12/chartex" xmlns:cx7="http://schemas.microsoft.com/office/drawing/2016/5/13/chartex" xmlns:cx8="http://schemas.microsoft.com/office/drawing/2016/5/14/chartex" xmlns:mc="http://schemas.openxmlformats.org/markup-compatibility/2006" xmlns:aink="http://schemas.microsoft.com/office/drawing/2016/ink" xmlns:am3d="http://schemas.microsoft.com/office/drawing/2017/model3d" xmlns:o="urn:schemas-microsoft-com:office:office" xmlns:oel="http://schemas.microsoft.com/office/2019/extlst" xmlns:r="http://schemas.openxmlformats.org/officeDocument/2006/relationships" xmlns:m="http://schemas.openxmlformats.org/officeDocument/2006/math" xmlns:v="urn:schemas-microsoft-com:vml" xmlns:wp14="http://schemas.microsoft.com/office/word/2010/wordprocessingDrawing" xmlns:wp="http://schemas.openxmlformats.org/drawingml/2006/wordprocessingDrawing" xmlns:w10="urn:schemas-microsoft-com:office:word" xmlns:w="http://schemas.openxmlformats.org/wordprocessingml/2006/main" xmlns:w14="http://schemas.microsoft.com/office/word/2010/wordml" xmlns:w15="http://schemas.microsoft.com/office/word/2012/wordml" xmlns:w16cex="http://schemas.microsoft.com/office/word/2018/wordml/cex" xmlns:w16cid="http://schemas.microsoft.com/office/word/2016/wordml/cid" xmlns:w16="http://schemas.microsoft.com/office/word/2018/wordml" xmlns:w16du="http://schemas.microsoft.com/office/word/2023/wordml/word16du" xmlns:w16sdtdh="http://schemas.microsoft.com/office/word/2020/wordml/sdtdatahash" xmlns:w16sdtfl="http://schemas.microsoft.com/office/word/2024/wordml/sdtformatlock" xmlns:w16se="http://schemas.microsoft.com/office/word/2015/wordml/symex" xmlns:wpg="http://schemas.microsoft.com/office/word/2010/wordprocessingGroup" xmlns:wpi="http://schemas.microsoft.com/office/word/2010/wordprocessingInk" xmlns:wne="http://schemas.microsoft.com/office/word/2006/wordml" xmlns:wps="http://schemas.microsoft.com/office/word/2010/wordprocessingShape" mc:Ignorable="w14 w15 w16se w16cid w16 w16cex w16sdtdh w16sdtfl w16du wp14">
+<w:numbering xmlns:wpc="http://schemas.microsoft.com/office/word/2010/wordprocessingCanvas" xmlns:cx="http://schemas.microsoft.com/office/drawing/2014/chartex" xmlns:cx1="http://schemas.microsoft.com/office/drawing/2015/9/8/chartex" xmlns:cx2="http://schemas.microsoft.com/office/drawing/2015/10/21/chartex" xmlns:cx3="http://schemas.microsoft.com/office/drawing/2016/5/9/chartex" xmlns:cx4="http://schemas.microsoft.com/office/drawing/2016/5/10/chartex" xmlns:cx5="http://schemas.microsoft.com/office/drawing/2016/5/11/chartex" xmlns:cx6="http://schemas.microsoft.com/office/drawing/2016/5/12/chartex" xmlns:cx7="http://schemas.microsoft.com/office/drawing/2016/5/13/chartex" xmlns:cx8="http://schemas.microsoft.com/office/drawing/2016/5/14/chartex" xmlns:mc="http://schemas.openxmlformats.org/markup-compatibility/2006" xmlns:aink="http://schemas.microsoft.com/office/drawing/2016/ink" xmlns:am3d="http://schemas.microsoft.com/office/drawing/2017/model3d" xmlns:o="urn:schemas-microsoft-com:office:office" xmlns:oel="http://schemas.microsoft.com/office/2019/extlst" xmlns:r="http://schemas.openxmlformats.org/officeDocument/2006/relationships" xmlns:m="http://schemas.openxmlformats.org/officeDocument/2006/math" xmlns:v="urn:schemas-microsoft-com:vml" xmlns:wp14="http://schemas.microsoft.com/office/word/2010/wordprocessingDrawing" xmlns:wp="http://schemas.openxmlformats.org/drawingml/2006/wordprocessingDrawing" xmlns:w10="urn:schemas-microsoft-com:office:word" xmlns:w="http://schemas.openxmlformats.org/wordprocessingml/2006/main" xmlns:w14="http://schemas.microsoft.com/office/word/2010/wordml" xmlns:w15="http://schemas.microsoft.com/office/word/2012/wordml" xmlns:w16cei="http://schemas.microsoft.com/office/word/2026/wordml/cei" xmlns:w16cex="http://schemas.microsoft.com/office/word/2018/wordml/cex" xmlns:w16cid="http://schemas.microsoft.com/office/word/2016/wordml/cid" xmlns:w16="http://schemas.microsoft.com/office/word/2018/wordml" xmlns:w16du="http://schemas.microsoft.com/office/word/2023/wordml/word16du" xmlns:w16sdtdh="http://schemas.microsoft.com/office/word/2020/wordml/sdtdatahash" xmlns:w16sdtfl="http://schemas.microsoft.com/office/word/2024/wordml/sdtformatlock" xmlns:w16se="http://schemas.microsoft.com/office/word/2015/wordml/symex" xmlns:wpg="http://schemas.microsoft.com/office/word/2010/wordprocessingGroup" xmlns:wpi="http://schemas.microsoft.com/office/word/2010/wordprocessingInk" xmlns:wne="http://schemas.microsoft.com/office/word/2006/wordml" xmlns:wps="http://schemas.microsoft.com/office/word/2010/wordprocessingShape" mc:Ignorable="w14 w15 w16se w16cid w16 w16cex w16sdtdh w16sdtfl w16du wp14">
   <w:abstractNum w:abstractNumId="0" w15:restartNumberingAfterBreak="0">
     <w:nsid w:val="03272987"/>
     <w:multiLevelType w:val="multilevel"/>

</xml_diff>